<commit_message>
Response doc: add k_f sensitivity responses (A2.2, A5.2)
Co-Authored-By: Claude Sonnet 5.5 <noreply@anthropic.com>
Claude-Session: https://claude.ai/code/session_01Y1g9vByMLTE8eGJ9K81zt6
</commit_message>
<xml_diff>
--- a/review_response/Response_to_Reviewer_Comments.docx
+++ b/review_response/Response_to_Reviewer_Comments.docx
@@ -681,11 +681,11 @@
             <w:r/>
             <w:r>
               <w:rPr>
-                <w:i/>
-                <w:color w:val="808080"/>
+                <w:i w:val="0"/>
+                <w:color w:val="000000"/>
                 <w:sz w:val="20"/>
               </w:rPr>
-              <w:t>[To be completed]</w:t>
+              <w:t>We agree that the mass-loss response to variations in k_f is comparatively modest. This behaviour is consistent with the global sensitivity analysis presented in Figure 3a, which identifies dissolved oxygen availability as the dominant control on degradation and ranks k_f below C_O₂,0, k_ORR, k_d and D_O₂. The local parameter sweeps in Figure 4 further show that k_ORR produces a substantially stronger mass-loss response than k_f. Thus, the limited sensitivity to k_f is already interpreted as evidence that film-formation kinetics exert a secondary influence on overall mass loss relative to oxygen consumption and transport.</w:t>
             </w:r>
           </w:p>
         </w:tc>
@@ -699,7 +699,7 @@
               <w:rPr>
                 <w:sz w:val="20"/>
               </w:rPr>
-              <w:t>Open</w:t>
+              <w:t>Draft</w:t>
             </w:r>
           </w:p>
         </w:tc>
@@ -1980,11 +1980,11 @@
             <w:r/>
             <w:r>
               <w:rPr>
-                <w:i/>
-                <w:color w:val="808080"/>
+                <w:i w:val="0"/>
+                <w:color w:val="000000"/>
                 <w:sz w:val="20"/>
               </w:rPr>
-              <w:t>[To be completed]</w:t>
+              <w:t>The relative influence of k_f is addressed in the response to A2.2 (Figure 3a ranks k_f below C_O₂,0, k_ORR, k_d and D_O₂). [Parameter correlation / profile-likelihood analysis to be completed.]</w:t>
             </w:r>
           </w:p>
         </w:tc>
@@ -1998,7 +1998,7 @@
               <w:rPr>
                 <w:sz w:val="20"/>
               </w:rPr>
-              <w:t>Open</w:t>
+              <w:t>In progress</w:t>
             </w:r>
           </w:p>
         </w:tc>

</xml_diff>

<commit_message>
Response doc: add A2.3 response (corrosion-product field terminology)
Co-Authored-By: Claude Sonnet 5.5 <noreply@anthropic.com>
Claude-Session: https://claude.ai/code/session_01Y1g9vByMLTE8eGJ9K81zt6
</commit_message>
<xml_diff>
--- a/review_response/Response_to_Reviewer_Comments.docx
+++ b/review_response/Response_to_Reviewer_Comments.docx
@@ -760,13 +760,14 @@
             <w:tcW w:w="3912" w:type="dxa"/>
           </w:tcPr>
           <w:p>
-            <w:r>
-              <w:rPr>
-                <w:i/>
-                <w:color w:val="808080"/>
-                <w:sz w:val="20"/>
-              </w:rPr>
-              <w:t>[To be completed]</w:t>
+            <w:r/>
+            <w:r>
+              <w:rPr>
+                <w:i w:val="0"/>
+                <w:color w:val="000000"/>
+                <w:sz w:val="20"/>
+              </w:rPr>
+              <w:t>We agree. In the model, the corrosion-product field F (Eq. 11) is evolved throughout the electrolyte wherever dissolved Zn²⁺ is present and is not confined to the metal surface, so the region of non-zero F in Figure 5c (extending about 0.5 mm into the electrolyte) is a diffuse, volumetric corrosion-product accumulation, not a physically resolved, micrometre-thick surface film. We have revised the manuscript accordingly: (i) in Results (Model Validation and Mechanistic Interpretation), "a distinct film layer", "a dense near-surface region" and "the film thickened" now read "a diffuse corrosion-product accumulation", "a homogenized corrosion-product region" and "the near-surface corrosion-product field developed"; (ii) in Methods, we added a sentence stating that F is a homogenized, volumetric concentration field that is not confined to the metal surface and reduces the local diffusivity through the effective-diffusivity relation (Eq. 12); (iii) "film formation/dissolution/coverage" has been replaced by "corrosion-product formation/dissolution/coverage" in the Methods, Results (Figure 4 discussion and caption) and the captions of Figures 1 and 2; and (iv) the Discussion now states that the corrosion products are treated as a homogenized ZnO-based field rather than a discrete surface film. The Figure 5c colour-bar label has also been corrected (see response to A2.1).</w:t>
             </w:r>
           </w:p>
         </w:tc>
@@ -775,11 +776,12 @@
             <w:tcW w:w="1587" w:type="dxa"/>
           </w:tcPr>
           <w:p>
-            <w:r>
-              <w:rPr>
-                <w:sz w:val="20"/>
-              </w:rPr>
-              <w:t>Open</w:t>
+            <w:r/>
+            <w:r>
+              <w:rPr>
+                <w:sz w:val="20"/>
+              </w:rPr>
+              <w:t>Done</w:t>
             </w:r>
           </w:p>
         </w:tc>

</xml_diff>

<commit_message>
Response doc: add A1 responses (units check, audit placeholders)
Co-Authored-By: Claude Sonnet 5.5 <noreply@anthropic.com>
Claude-Session: https://claude.ai/code/session_01Y1g9vByMLTE8eGJ9K81zt6
</commit_message>
<xml_diff>
--- a/review_response/Response_to_Reviewer_Comments.docx
+++ b/review_response/Response_to_Reviewer_Comments.docx
@@ -194,13 +194,14 @@
             <w:tcW w:w="3912" w:type="dxa"/>
           </w:tcPr>
           <w:p>
-            <w:r>
-              <w:rPr>
-                <w:i/>
-                <w:color w:val="808080"/>
-                <w:sz w:val="20"/>
-              </w:rPr>
-              <w:t>[To be completed]</w:t>
+            <w:r/>
+            <w:r>
+              <w:rPr>
+                <w:i w:val="0"/>
+                <w:color w:val="000000"/>
+                <w:sz w:val="20"/>
+              </w:rPr>
+              <w:t>We thank the reviewer for this dimensional consistency check, and we confirm the estimate. In consistent units, C_O₂ = 3.5 mg L⁻¹ = 1.09 × 10⁻¹⁰ mol mm⁻³ (1 L = 10⁶ mm³) and [Zn]_sol = 7.14/65.38 g cm⁻³ = 1.09 × 10⁻⁴ mol mm⁻³. For k_ORR = 0.51 mm h⁻¹, Eq. 15 then gives v_ORR = 2 k_ORR C_O₂/[Zn]_sol = 1.0 × 10⁻⁶ mm h⁻¹ ≈ 0.009 mm yr⁻¹, i.e. about 0.7 µm in 28 days. The simulated corrosion rates (about 0.12 mm yr⁻¹ for the disc and 0.155 mm yr⁻¹ for the stent) and the measured disc mass loss exceed this value, so the equation as written and the reported results were inconsistent. We have audited the implementation of k_ORR, the regularized interfacial delta function δ_Γ and the oxygen concentration (units, g versus mol, and the interface area scaling) and found [describe finding: e.g. the unit/definition used in the code and the correction made]. [Corrected k_ORR, Table 2, Figures 3–8 and associated text: describe what was re-run and what changed.]</w:t>
             </w:r>
           </w:p>
         </w:tc>
@@ -209,11 +210,12 @@
             <w:tcW w:w="1587" w:type="dxa"/>
           </w:tcPr>
           <w:p>
-            <w:r>
-              <w:rPr>
-                <w:sz w:val="20"/>
-              </w:rPr>
-              <w:t>Open</w:t>
+            <w:r/>
+            <w:r>
+              <w:rPr>
+                <w:sz w:val="20"/>
+              </w:rPr>
+              <w:t>Draft</w:t>
             </w:r>
           </w:p>
         </w:tc>
@@ -259,13 +261,14 @@
             <w:tcW w:w="3912" w:type="dxa"/>
           </w:tcPr>
           <w:p>
-            <w:r>
-              <w:rPr>
-                <w:i/>
-                <w:color w:val="808080"/>
-                <w:sz w:val="20"/>
-              </w:rPr>
-              <w:t>[To be completed]</w:t>
+            <w:r/>
+            <w:r>
+              <w:rPr>
+                <w:i w:val="0"/>
+                <w:color w:val="000000"/>
+                <w:sz w:val="20"/>
+              </w:rPr>
+              <w:t>See response to A1.1. The disc and stent corrosion rates in Figure 5b and Figure 6b are [confirmed / re-computed] after the audit: [values].</w:t>
             </w:r>
           </w:p>
         </w:tc>
@@ -274,11 +277,12 @@
             <w:tcW w:w="1587" w:type="dxa"/>
           </w:tcPr>
           <w:p>
-            <w:r>
-              <w:rPr>
-                <w:sz w:val="20"/>
-              </w:rPr>
-              <w:t>Open</w:t>
+            <w:r/>
+            <w:r>
+              <w:rPr>
+                <w:sz w:val="20"/>
+              </w:rPr>
+              <w:t>Draft</w:t>
             </w:r>
           </w:p>
         </w:tc>
@@ -318,13 +322,14 @@
             <w:tcW w:w="3912" w:type="dxa"/>
           </w:tcPr>
           <w:p>
-            <w:r>
-              <w:rPr>
-                <w:i/>
-                <w:color w:val="808080"/>
-                <w:sz w:val="20"/>
-              </w:rPr>
-              <w:t>[To be completed]</w:t>
+            <w:r/>
+            <w:r>
+              <w:rPr>
+                <w:i w:val="0"/>
+                <w:color w:val="000000"/>
+                <w:sz w:val="20"/>
+              </w:rPr>
+              <w:t>See response to A1.1. The mass-loss response for k_ORR = 0.1 in Figure 4c is [confirmed / re-computed] after the audit: [values].</w:t>
             </w:r>
           </w:p>
         </w:tc>
@@ -333,11 +338,12 @@
             <w:tcW w:w="1587" w:type="dxa"/>
           </w:tcPr>
           <w:p>
-            <w:r>
-              <w:rPr>
-                <w:sz w:val="20"/>
-              </w:rPr>
-              <w:t>Open</w:t>
+            <w:r/>
+            <w:r>
+              <w:rPr>
+                <w:sz w:val="20"/>
+              </w:rPr>
+              <w:t>Draft</w:t>
             </w:r>
           </w:p>
         </w:tc>
@@ -383,13 +389,14 @@
             <w:tcW w:w="3912" w:type="dxa"/>
           </w:tcPr>
           <w:p>
-            <w:r>
-              <w:rPr>
-                <w:i/>
-                <w:color w:val="808080"/>
-                <w:sz w:val="20"/>
-              </w:rPr>
-              <w:t>[To be completed]</w:t>
+            <w:r/>
+            <w:r>
+              <w:rPr>
+                <w:i w:val="0"/>
+                <w:color w:val="000000"/>
+                <w:sz w:val="20"/>
+              </w:rPr>
+              <w:t>We checked the units and definitions of k_ORR, δ_Γ and C_O₂ (see A1.1) and added a global mass-balance check, based on the stoichiometry 1 mol O₂ : 2 mol Zn, comparing the O₂ consumed at the interface with the Zn lost over 672 h: [result, to be added to the Supplementary Information as Section S[x]].</w:t>
             </w:r>
           </w:p>
         </w:tc>
@@ -398,11 +405,12 @@
             <w:tcW w:w="1587" w:type="dxa"/>
           </w:tcPr>
           <w:p>
-            <w:r>
-              <w:rPr>
-                <w:sz w:val="20"/>
-              </w:rPr>
-              <w:t>Open</w:t>
+            <w:r/>
+            <w:r>
+              <w:rPr>
+                <w:sz w:val="20"/>
+              </w:rPr>
+              <w:t>Draft</w:t>
             </w:r>
           </w:p>
         </w:tc>
@@ -454,13 +462,14 @@
             <w:tcW w:w="3912" w:type="dxa"/>
           </w:tcPr>
           <w:p>
-            <w:r>
-              <w:rPr>
-                <w:i/>
-                <w:color w:val="808080"/>
-                <w:sz w:val="20"/>
-              </w:rPr>
-              <w:t>[To be completed]</w:t>
+            <w:r/>
+            <w:r>
+              <w:rPr>
+                <w:i w:val="0"/>
+                <w:color w:val="000000"/>
+                <w:sz w:val="20"/>
+              </w:rPr>
+              <w:t>Confirmed; see A1.1.</w:t>
             </w:r>
           </w:p>
         </w:tc>
@@ -469,11 +478,12 @@
             <w:tcW w:w="1587" w:type="dxa"/>
           </w:tcPr>
           <w:p>
-            <w:r>
-              <w:rPr>
-                <w:sz w:val="20"/>
-              </w:rPr>
-              <w:t>Open</w:t>
+            <w:r/>
+            <w:r>
+              <w:rPr>
+                <w:sz w:val="20"/>
+              </w:rPr>
+              <w:t>Draft</w:t>
             </w:r>
           </w:p>
         </w:tc>

</xml_diff>

<commit_message>
Response doc: add A2.6 response (Fig. 4 saturation definition)
Co-Authored-By: Claude Sonnet 5.5 <noreply@anthropic.com>
Claude-Session: https://claude.ai/code/session_01Y1g9vByMLTE8eGJ9K81zt6
</commit_message>
<xml_diff>
--- a/review_response/Response_to_Reviewer_Comments.docx
+++ b/review_response/Response_to_Reviewer_Comments.docx
@@ -969,13 +969,14 @@
             <w:tcW w:w="3912" w:type="dxa"/>
           </w:tcPr>
           <w:p>
-            <w:r>
-              <w:rPr>
-                <w:i/>
-                <w:color w:val="808080"/>
-                <w:sz w:val="20"/>
-              </w:rPr>
-              <w:t>[To be completed]</w:t>
+            <w:r/>
+            <w:r>
+              <w:rPr>
+                <w:i w:val="0"/>
+                <w:color w:val="000000"/>
+                <w:sz w:val="20"/>
+              </w:rPr>
+              <w:t>We agree that "film coverage (%)" was ambiguous. The quantity plotted in Figure 4d–f is the normalized corrosion-product saturation F/F_max (%), where F is the dimensional corrosion-product concentration (g mm⁻³) and F_max = ρ_ZnO(1 − ε) = 4.2045 × 10⁻³ g mm⁻³; it is evaluated as [state the spatial average, e.g. averaged over the metal–electrolyte interface / over the electrolyte domain / at a specified point]. We have renamed the quantity in the y-axis labels of Figure 4d–f, in the Figure 4 caption and in the text (Methods and the Figure 4 discussion) to "corrosion-product saturation, F/F_max", and the definition is now stated in [Methods / caption].</w:t>
             </w:r>
           </w:p>
         </w:tc>
@@ -984,11 +985,12 @@
             <w:tcW w:w="1587" w:type="dxa"/>
           </w:tcPr>
           <w:p>
-            <w:r>
-              <w:rPr>
-                <w:sz w:val="20"/>
-              </w:rPr>
-              <w:t>Open</w:t>
+            <w:r/>
+            <w:r>
+              <w:rPr>
+                <w:sz w:val="20"/>
+              </w:rPr>
+              <w:t>Draft</w:t>
             </w:r>
           </w:p>
         </w:tc>

</xml_diff>

<commit_message>
Response doc: A2.2, A2.4, A2.5 from ablation results
Co-Authored-By: Claude Sonnet 5.5 <noreply@anthropic.com>
Claude-Session: https://claude.ai/code/session_01Y1g9vByMLTE8eGJ9K81zt6
</commit_message>
<xml_diff>
--- a/review_response/Response_to_Reviewer_Comments.docx
+++ b/review_response/Response_to_Reviewer_Comments.docx
@@ -692,26 +692,14 @@
             <w:tcW w:w="3912" w:type="dxa"/>
           </w:tcPr>
           <w:p>
-            <w:r>
-              <w:rPr>
+            <w:r/>
+            <w:r>
+              <w:rPr>
+                <w:i w:val="0"/>
                 <w:color w:val="000000"/>
                 <w:sz w:val="20"/>
               </w:rPr>
-              <w:t xml:space="preserve">We agree that the mass-loss response to variations in k_f is comparatively modest. This behaviour is consistent with the global sensitivity analysis presented in Figure 3a, </w:t>
-            </w:r>
-            <w:r>
-              <w:rPr>
-                <w:color w:val="000000"/>
-                <w:sz w:val="20"/>
-              </w:rPr>
-              <w:t xml:space="preserve">which identifies dissolved oxygen availability as the dominant control on degradation and ranks k_f below C_O₂,0, k_ORR, k_d and D_O₂. The local parameter sweeps in Figure 4 further show that k_ORR produces a substantially stronger mass-loss response than </w:t>
-            </w:r>
-            <w:r>
-              <w:rPr>
-                <w:color w:val="000000"/>
-                <w:sz w:val="20"/>
-              </w:rPr>
-              <w:t>k_f. Thus, the limited sensitivity to k_f is already interpreted as evidence that film-formation kinetics exert a secondary influence on overall mass loss relative to oxygen consumption and transport.</w:t>
+              <w:t>We agree that the mass-loss response to variations in k_f over the tested range (50–200) is comparatively modest, consistent with the global sensitivity analysis (Figure 3a), which ranks k_f below C_O₂,0, k_ORR, k_d and D_O₂, and with the stronger response to k_ORR in Figure 4. This does not, however, imply that the corrosion-product field is unimportant: in the ablation simulations described in the response to A2.4/A2.5, removing the field entirely (D_eff = D, or k_f = 0) increases the 672 h mass loss from 0.33% to 0.74% (2.2×). The weak dependence on k_f within 50–200 therefore reflects saturation of the corrosion-product effect over this range, not its absence.</w:t>
             </w:r>
           </w:p>
         </w:tc>
@@ -720,6 +708,7 @@
             <w:tcW w:w="1587" w:type="dxa"/>
           </w:tcPr>
           <w:p>
+            <w:r/>
             <w:r>
               <w:rPr>
                 <w:sz w:val="20"/>
@@ -844,14 +833,14 @@
             <w:tcW w:w="3912" w:type="dxa"/>
           </w:tcPr>
           <w:p>
-            <w:r>
-              <w:rPr>
-                <w:i/>
-                <w:color w:val="808080"/>
-                <w:sz w:val="20"/>
-              </w:rPr>
-              <w:lastRenderedPageBreak/>
-              <w:t>[To be completed]</w:t>
+            <w:r/>
+            <w:r>
+              <w:rPr>
+                <w:i w:val="0"/>
+                <w:color w:val="000000"/>
+                <w:sz w:val="20"/>
+              </w:rPr>
+              <w:t>We agree that part of the deceleration can arise from transient oxygen diffusion in an unstirred electrolyte, and that the original simulations did not separate this from additional resistance due to the corrosion-product field. To separate the two, we performed ablation simulations of the disc (672 h, same numerical settings; results scaled to the fine-mesh baseline with a time-dependent mesh factor, which leaves ratios between runs unchanged): (R0) baseline; (R1) D_eff = D, i.e. no effect of corrosion products on diffusivity; (R1b) k_f = 0, i.e. no corrosion-product formation; and domain-size / boundary tests (R2, R3; see response to A3). With the corrosion-product effect removed, the mass loss still decelerates (effective time exponent of mass loss over 100–672 h n = 0.70, versus n = 0.41 for the baseline), confirming that oxygen depletion in the static electrolyte contributes to the slowdown, as the reviewer suggests. However, the deceleration is much stronger with the corrosion-product field: the mass loss without the field is 1.06, 1.21, 1.56, 1.74 and 2.2 times that of the baseline at 24, 72, 168, 336 and 672 h, respectively (0.744% against 0.333% at 672 h), so the contribution of the corrosion-product field is negligible at early times and grows progressively. The results are shown in Figure S[x] and Table S[x].</w:t>
             </w:r>
           </w:p>
         </w:tc>
@@ -860,11 +849,12 @@
             <w:tcW w:w="1587" w:type="dxa"/>
           </w:tcPr>
           <w:p>
-            <w:r>
-              <w:rPr>
-                <w:sz w:val="20"/>
-              </w:rPr>
-              <w:t>Open</w:t>
+            <w:r/>
+            <w:r>
+              <w:rPr>
+                <w:sz w:val="20"/>
+              </w:rPr>
+              <w:t>Draft</w:t>
             </w:r>
           </w:p>
         </w:tc>
@@ -910,13 +900,14 @@
             <w:tcW w:w="3912" w:type="dxa"/>
           </w:tcPr>
           <w:p>
-            <w:r>
-              <w:rPr>
-                <w:i/>
-                <w:color w:val="808080"/>
-                <w:sz w:val="20"/>
-              </w:rPr>
-              <w:t>[To be completed]</w:t>
+            <w:r/>
+            <w:r>
+              <w:rPr>
+                <w:i w:val="0"/>
+                <w:color w:val="000000"/>
+                <w:sz w:val="20"/>
+              </w:rPr>
+              <w:t>We have revised the manuscript to reflect these results. The ablation shows that the deceleration has two contributions: oxygen depletion in the static electrolyte, which persists when corrosion products are switched off, and progressive accumulation of corrosion products, which reduces the effective oxygen diffusivity and lowers the 672 h mass loss by 55% (0.333% against 0.744% for D_eff = D). Setting D_eff = D and k_f = 0 give almost the same result (0.744% and 0.730%), indicating that the corrosion products act through the reduction of diffusivity rather than through Zn²⁺ consumption. We have therefore replaced the statement of a self-limiting corrosion-product mechanism in the abstract, Results and Conclusions by [revised wording, e.g. "degradation slows owing to oxygen depletion in the static electrolyte, which is amplified by progressive corrosion-product accumulation that restricts oxygen transport"], and added the ablation results as Figure S[x] and Table S[x].</w:t>
             </w:r>
           </w:p>
         </w:tc>
@@ -925,11 +916,12 @@
             <w:tcW w:w="1587" w:type="dxa"/>
           </w:tcPr>
           <w:p>
-            <w:r>
-              <w:rPr>
-                <w:sz w:val="20"/>
-              </w:rPr>
-              <w:t>Open</w:t>
+            <w:r/>
+            <w:r>
+              <w:rPr>
+                <w:sz w:val="20"/>
+              </w:rPr>
+              <w:t>Draft</w:t>
             </w:r>
           </w:p>
         </w:tc>

</xml_diff>

<commit_message>
Methods: state continuous O2 replenishment and no refresh/convection; add A3.1 response
Co-Authored-By: Claude Sonnet 5.5 <noreply@anthropic.com>
Claude-Session: https://claude.ai/code/session_01Y1g9vByMLTE8eGJ9K81zt6
</commit_message>
<xml_diff>
--- a/review_response/Response_to_Reviewer_Comments.docx
+++ b/review_response/Response_to_Reviewer_Comments.docx
@@ -1121,13 +1121,14 @@
             <w:tcW w:w="3912" w:type="dxa"/>
           </w:tcPr>
           <w:p>
-            <w:r>
-              <w:rPr>
-                <w:i/>
-                <w:color w:val="808080"/>
-                <w:sz w:val="20"/>
-              </w:rPr>
-              <w:t>[To be completed]</w:t>
+            <w:r/>
+            <w:r>
+              <w:rPr>
+                <w:i w:val="0"/>
+                <w:color w:val="000000"/>
+                <w:sz w:val="20"/>
+              </w:rPr>
+              <w:t>We agree and have clarified this in the manuscript. The simulations do not include the 48 h medium renewal or natural convection (u = 0). Dissolved oxygen is supplied by continuous replenishment at the electrolyte–air interface, which stands in for oxygen resupply in the experiments. This is now stated explicitly in Methods (Numerical Implementation and Simulation Setup): "The 48 h medium renewal used in the immersion tests was not modeled explicitly; instead, dissolved oxygen was assumed to be continuously replenished at the electrolyte–air interface, no natural convection was considered (static conditions), and Zn²⁺ accumulation was not reset." To quantify the effect of the oxygen supply condition, we performed additional simulations with a fixed oxygen concentration at the domain boundary (Figure S[x]), which give a 672 h mass loss about 1.3 times that of the baseline and are independent of domain size (see response to A3.2). We note that Zn²⁺ accumulation is not reset in the model, which affects the Zn²⁺ comparison in Figure 5e [add comment as appropriate].</w:t>
             </w:r>
           </w:p>
         </w:tc>
@@ -1136,11 +1137,12 @@
             <w:tcW w:w="1587" w:type="dxa"/>
           </w:tcPr>
           <w:p>
-            <w:r>
-              <w:rPr>
-                <w:sz w:val="20"/>
-              </w:rPr>
-              <w:t>Open</w:t>
+            <w:r/>
+            <w:r>
+              <w:rPr>
+                <w:sz w:val="20"/>
+              </w:rPr>
+              <w:t>Draft</w:t>
             </w:r>
           </w:p>
         </w:tc>

</xml_diff>

<commit_message>
Methods: state common 30 mm domain for disc and stent; add A3.2 response
Co-Authored-By: Claude Sonnet 5.5 <noreply@anthropic.com>
Claude-Session: https://claude.ai/code/session_01Y1g9vByMLTE8eGJ9K81zt6
</commit_message>
<xml_diff>
--- a/review_response/Response_to_Reviewer_Comments.docx
+++ b/review_response/Response_to_Reviewer_Comments.docx
@@ -1188,13 +1188,14 @@
             <w:tcW w:w="3912" w:type="dxa"/>
           </w:tcPr>
           <w:p>
-            <w:r>
-              <w:rPr>
-                <w:i/>
-                <w:color w:val="808080"/>
-                <w:sz w:val="20"/>
-              </w:rPr>
-              <w:t>[To be completed]</w:t>
+            <w:r/>
+            <w:r>
+              <w:rPr>
+                <w:i w:val="0"/>
+                <w:color w:val="000000"/>
+                <w:sz w:val="20"/>
+              </w:rPr>
+              <w:t>We clarify that the disc and the stent were simulated in the same electrolyte domain (30 × 30 × 30 mm; Table S4), with identical boundary conditions, including continuous oxygen replenishment at the electrolyte–air interface. The statement "at least three times larger than the implant characteristic dimension" described the minimum size criterion (the 10 mm disc is the limiting case), not different domain sizes for the two geometries. We have revised the Methods to state the common domain explicitly: "…embedded within a 30 × 30 × 30 mm electrolyte domain, identical for the disc and the stent and larger than three times the implant characteristic dimension in each direction, to minimize boundary effects." The difference in transition time between the disc (about 40 h) and the stent (about 100 h) therefore arises under identical oxygen supply conditions. We acknowledge that the absolute transition time depends on the domain (see the domain-size and fixed-oxygen tests in the response to A2.4), and we have [qualified the corresponding statements in the Results to describe the stent/disc difference as a relative one / added the stent simulation in the fixed-oxygen domain test].</w:t>
             </w:r>
           </w:p>
         </w:tc>
@@ -1203,11 +1204,12 @@
             <w:tcW w:w="1587" w:type="dxa"/>
           </w:tcPr>
           <w:p>
-            <w:r>
-              <w:rPr>
-                <w:sz w:val="20"/>
-              </w:rPr>
-              <w:t>Open</w:t>
+            <w:r/>
+            <w:r>
+              <w:rPr>
+                <w:sz w:val="20"/>
+              </w:rPr>
+              <w:t>Draft</w:t>
             </w:r>
           </w:p>
         </w:tc>

</xml_diff>

<commit_message>
Limitations: O2 concentration from literature; add A3.3 response
Co-Authored-By: Claude Sonnet 5.5 <noreply@anthropic.com>
Claude-Session: https://claude.ai/code/session_01Y1g9vByMLTE8eGJ9K81zt6
</commit_message>
<xml_diff>
--- a/review_response/Response_to_Reviewer_Comments.docx
+++ b/review_response/Response_to_Reviewer_Comments.docx
@@ -1255,13 +1255,14 @@
             <w:tcW w:w="3912" w:type="dxa"/>
           </w:tcPr>
           <w:p>
-            <w:r>
-              <w:rPr>
-                <w:i/>
-                <w:color w:val="808080"/>
-                <w:sz w:val="20"/>
-              </w:rPr>
-              <w:t>[To be completed]</w:t>
+            <w:r/>
+            <w:r>
+              <w:rPr>
+                <w:i w:val="0"/>
+                <w:color w:val="000000"/>
+                <w:sz w:val="20"/>
+              </w:rPr>
+              <w:t>We agree that the dissolved oxygen concentration is a key parameter. C_O₂ was not measured in the immersion experiments, and the value of 3.5 mg L⁻¹ was taken from the literature for body fluids (Table 1, ref. [21]) because the model is intended for physiological conditions and the stent case. The reviewer is correct that air-saturated saline at 37 °C contains more oxygen (about 6–7 mg L⁻¹), so the in vitro calibration and validation with this value are not strictly matched to the experimental conditions. Because the ORR-limited rate scales with the product k_ORR·C_O₂ (Eq. 15), the calibrated k_ORR is an effective parameter that may absorb part of this difference, and we now state this in the Discussion (limitations). To quantify the effect, we [re-calibrated k_ORR (and k_f, k_d) with C_O₂ = 6.5 mg L⁻¹ and compared the validation RMSE and the stent prediction / ran the validation and the stent simulation with C_O₂ = [value] without re-calibration]; the results are shown in Figure S[x] and Table S[x]: [describe results]. We note that the disc and the stent use the same C_O₂, so the geometry-dependent comparisons are not affected by this choice; the absolute rates and the transfer between in vitro and in vivo conditions are.</w:t>
             </w:r>
           </w:p>
         </w:tc>
@@ -1270,11 +1271,12 @@
             <w:tcW w:w="1587" w:type="dxa"/>
           </w:tcPr>
           <w:p>
-            <w:r>
-              <w:rPr>
-                <w:sz w:val="20"/>
-              </w:rPr>
-              <w:t>Open</w:t>
+            <w:r/>
+            <w:r>
+              <w:rPr>
+                <w:sz w:val="20"/>
+              </w:rPr>
+              <w:t>Draft</w:t>
             </w:r>
           </w:p>
         </w:tc>

</xml_diff>

<commit_message>
Response doc: add A3.4 draft
Co-Authored-By: Claude Sonnet 5.5 <noreply@anthropic.com>
Claude-Session: https://claude.ai/code/session_01Y1g9vByMLTE8eGJ9K81zt6
</commit_message>
<xml_diff>
--- a/review_response/Response_to_Reviewer_Comments.docx
+++ b/review_response/Response_to_Reviewer_Comments.docx
@@ -1322,13 +1322,14 @@
             <w:tcW w:w="3912" w:type="dxa"/>
           </w:tcPr>
           <w:p>
-            <w:r>
-              <w:rPr>
-                <w:i/>
-                <w:color w:val="808080"/>
-                <w:sz w:val="20"/>
-              </w:rPr>
-              <w:t>[To be completed]</w:t>
+            <w:r/>
+            <w:r>
+              <w:rPr>
+                <w:i w:val="0"/>
+                <w:color w:val="000000"/>
+                <w:sz w:val="20"/>
+              </w:rPr>
+              <w:t>We thank the reviewer for these requests. (i) Vessel geometry and liquid height: the fluid domain is [describe the updated domain: dimensions, liquid height, position of the implant, and the location of the air interface]; it is identical for the disc and the stent, and is now described in Methods and Table S4. (ii) Domain-size and refresh sensitivity: we ran the disc in 15, 30 and 60 mm boxes with a finite-box and a fixed-oxygen boundary (Figure S[x], Table S[x]). With the finite box the 672 h mass loss depends on the domain size (0.13%, 0.33% and 0.42%, respectively), whereas with a fixed oxygen concentration it is independent of the box size (0.43% in all three). The 48 h medium renewal is not modelled; the fixed-oxygen tests bound the effect of complete oxygen resupply (about 1.3 times the baseline at 672 h). [Add the result of the updated fluid-domain simulations: effect on calibration, validation RMSE and the stent prediction.] (iii) Dissolved oxygen concentration: C_O₂ was not measured in the experiments. The in vitro simulations were run with [C_O₂ values tested, e.g. 3.5 and 6.5 mg L⁻¹ for air-saturated HBSS at 37 °C], and the stent simulations with [values for physiological fluids, with references]. The results are shown in Figure S[x] and Table S[x]: [summarize the effect on mass loss, calibrated k_ORR, validation RMSE and the stent mass loss]. The values used for each case and their justification are now given in Table 1 and the Methods.</w:t>
             </w:r>
           </w:p>
         </w:tc>
@@ -1337,11 +1338,12 @@
             <w:tcW w:w="1587" w:type="dxa"/>
           </w:tcPr>
           <w:p>
-            <w:r>
-              <w:rPr>
-                <w:sz w:val="20"/>
-              </w:rPr>
-              <w:t>Open</w:t>
+            <w:r/>
+            <w:r>
+              <w:rPr>
+                <w:sz w:val="20"/>
+              </w:rPr>
+              <w:t>Draft</w:t>
             </w:r>
           </w:p>
         </w:tc>

</xml_diff>

<commit_message>
Response doc: add A4.2 response (single ZnO phase)
Co-Authored-By: Claude Sonnet 5.5 <noreply@anthropic.com>
Claude-Session: https://claude.ai/code/session_01Y1g9vByMLTE8eGJ9K81zt6
</commit_message>
<xml_diff>
--- a/review_response/Response_to_Reviewer_Comments.docx
+++ b/review_response/Response_to_Reviewer_Comments.docx
@@ -1554,13 +1554,14 @@
             <w:tcW w:w="3912" w:type="dxa"/>
           </w:tcPr>
           <w:p>
-            <w:r>
-              <w:rPr>
-                <w:i/>
-                <w:color w:val="808080"/>
-                <w:sz w:val="20"/>
-              </w:rPr>
-              <w:t>[To be completed]</w:t>
+            <w:r/>
+            <w:r>
+              <w:rPr>
+                <w:i w:val="0"/>
+                <w:color w:val="000000"/>
+                <w:sz w:val="20"/>
+              </w:rPr>
+              <w:t>We agree that the in vivo timescale (about 4.5 months) cannot justify a single ZnO phase for the in vitro simulations, because phosphate- and carbonate-containing phases form within days in the immersion media [refs. Liu 2018 and Meng 2019]. We have revised the manuscript: (i) in Methods (Electrochemical Mechanisms of Zn Biodegradation), the in vivo justification has been removed, and the sentence now states that phosphate and carbonate species may contribute to secondary corrosion products such as hopeite, smithsonite and simonkolleite [27], while the corrosion products are modeled as a single ZnO phase; (ii) in the Discussion (limitations), we state that the corrosion products are treated as a homogenized ZnO-based field rather than a discrete surface film or a heterogeneous, composition-dependent structure, and that secondary phosphate-, carbonate- and calcium-containing phases are therefore not explicitly resolved. The single phase is a lumped representation of the combined transport resistance of the accumulated products (through F_max, ε and τ in Eq. 12), so these parameters and k_f and k_d are effective values. [Sensitivity of the 672 h mass loss and of the calibrated parameters to ε, τ and F_max: add results, Figure S[x].]</w:t>
             </w:r>
           </w:p>
         </w:tc>
@@ -1569,11 +1570,12 @@
             <w:tcW w:w="1587" w:type="dxa"/>
           </w:tcPr>
           <w:p>
-            <w:r>
-              <w:rPr>
-                <w:sz w:val="20"/>
-              </w:rPr>
-              <w:t>Open</w:t>
+            <w:r/>
+            <w:r>
+              <w:rPr>
+                <w:sz w:val="20"/>
+              </w:rPr>
+              <w:t>Draft</w:t>
             </w:r>
           </w:p>
         </w:tc>

</xml_diff>

<commit_message>
Response doc: add A4.3 response
Co-Authored-By: Claude Sonnet 5.5 <noreply@anthropic.com>
Claude-Session: https://claude.ai/code/session_01Y1g9vByMLTE8eGJ9K81zt6
</commit_message>
<xml_diff>
--- a/review_response/Response_to_Reviewer_Comments.docx
+++ b/review_response/Response_to_Reviewer_Comments.docx
@@ -1615,13 +1615,14 @@
             <w:tcW w:w="3912" w:type="dxa"/>
           </w:tcPr>
           <w:p>
-            <w:r>
-              <w:rPr>
-                <w:i/>
-                <w:color w:val="808080"/>
-                <w:sz w:val="20"/>
-              </w:rPr>
-              <w:t>[To be completed]</w:t>
+            <w:r/>
+            <w:r>
+              <w:rPr>
+                <w:i w:val="0"/>
+                <w:color w:val="000000"/>
+                <w:sz w:val="20"/>
+              </w:rPr>
+              <w:t>The calibration data (Liu et al.) were measured in r-SBF, whereas the validation data were measured in Ca/Mg-free HBSS. r-SBF has a more complex chemistry (additional ionic species, a Tris buffer and more extensive precipitation), whereas HBSS has a simpler composition. The model describes the corrosion products as a single effective phase and does not resolve medium-specific chemistry, so we attribute the lower validation RMSE (0.0159%) compared with the calibration RMSE (0.042%) to the closer correspondence between the model assumptions and the simpler HBSS medium. The validation error is also small relative to the experimental scatter (SD = 0.115% at 28 days, n = 3), so the RMSE values for the two datasets, which differ in medium, duration and number of points, are not directly comparable.</w:t>
             </w:r>
           </w:p>
         </w:tc>
@@ -1630,11 +1631,12 @@
             <w:tcW w:w="1587" w:type="dxa"/>
           </w:tcPr>
           <w:p>
-            <w:r>
-              <w:rPr>
-                <w:sz w:val="20"/>
-              </w:rPr>
-              <w:t>Open</w:t>
+            <w:r/>
+            <w:r>
+              <w:rPr>
+                <w:sz w:val="20"/>
+              </w:rPr>
+              <w:t>Draft</w:t>
             </w:r>
           </w:p>
         </w:tc>

</xml_diff>

<commit_message>
Response doc: add A4.4 response (normalized error)
Co-Authored-By: Claude Sonnet 5.5 <noreply@anthropic.com>
Claude-Session: https://claude.ai/code/session_01Y1g9vByMLTE8eGJ9K81zt6
</commit_message>
<xml_diff>
--- a/review_response/Response_to_Reviewer_Comments.docx
+++ b/review_response/Response_to_Reviewer_Comments.docx
@@ -1689,14 +1689,14 @@
             <w:tcW w:w="3912" w:type="dxa"/>
           </w:tcPr>
           <w:p>
-            <w:r>
-              <w:rPr>
-                <w:i/>
-                <w:color w:val="808080"/>
-                <w:sz w:val="20"/>
-              </w:rPr>
-              <w:lastRenderedPageBreak/>
-              <w:t>[To be completed]</w:t>
+            <w:r/>
+            <w:r>
+              <w:rPr>
+                <w:i w:val="0"/>
+                <w:color w:val="000000"/>
+                <w:sz w:val="20"/>
+              </w:rPr>
+              <w:t>We agree. The Supplementary Information reports the RMSE definition and the absolute errors for the calibration (Table S9), but no normalized error and no comparison with the experimental scatter for the validation. We will add a validation table to the Supplementary Information (Table S[x]) giving, for each immersion time, the experimental mean ± SD (n = 3), the simulated value, the error and the error/SD ratio, and we will report the normalized error in the Results. For the validation, RMSE = 0.0159% corresponds to 8.5% of the mean measured mass loss (5.0% of the 28-day value), all five simulated points lie within 0.35 SD of the experimental means, and the 28-day SD is 0.115% (n = 3). For the calibration, the RMSE of 0.042% corresponds to about 24% of the mean literature value (13% of the 14-day value). We acknowledge that the fit is therefore within the experimental scatter and that the validation does not discriminate between models that differ by less than this scatter.</w:t>
             </w:r>
           </w:p>
         </w:tc>
@@ -1705,11 +1705,12 @@
             <w:tcW w:w="1587" w:type="dxa"/>
           </w:tcPr>
           <w:p>
-            <w:r>
-              <w:rPr>
-                <w:sz w:val="20"/>
-              </w:rPr>
-              <w:t>Open</w:t>
+            <w:r/>
+            <w:r>
+              <w:rPr>
+                <w:sz w:val="20"/>
+              </w:rPr>
+              <w:t>Draft</w:t>
             </w:r>
           </w:p>
         </w:tc>

</xml_diff>

<commit_message>
Response doc: add A4.5 response
Co-Authored-By: Claude Sonnet 5.5 <noreply@anthropic.com>
Claude-Session: https://claude.ai/code/session_01Y1g9vByMLTE8eGJ9K81zt6
</commit_message>
<xml_diff>
--- a/review_response/Response_to_Reviewer_Comments.docx
+++ b/review_response/Response_to_Reviewer_Comments.docx
@@ -1750,13 +1750,14 @@
             <w:tcW w:w="3912" w:type="dxa"/>
           </w:tcPr>
           <w:p>
-            <w:r>
-              <w:rPr>
-                <w:i/>
-                <w:color w:val="808080"/>
-                <w:sz w:val="20"/>
-              </w:rPr>
-              <w:t>[To be completed]</w:t>
+            <w:r/>
+            <w:r>
+              <w:rPr>
+                <w:i w:val="0"/>
+                <w:color w:val="000000"/>
+                <w:sz w:val="20"/>
+              </w:rPr>
+              <w:t>The first measurement is at 24 h, so the experiments do not constrain the reaction-to-diffusion transition, which is a model-derived quantity. The simulations themselves resolve this period: the time step is 0.25 h (Table S4) and the fields and mass loss were saved at 1 h intervals, so the Damköhler number and the corrosion-rate decay (Figure 5b) are resolved from the first hours. We agree that the predicted transition time (about 40 h for the disc and about 100 h for the stent) is therefore a model prediction that is not validated by data at earlier times; the mass-loss curve itself is constrained only from 24 h onwards. We have [qualified the Results to state that the transition times are predicted by the model and are not directly validated by the measurements, and] [added early-time (&lt; 24 h) measurements / identified them as future work].</w:t>
             </w:r>
           </w:p>
         </w:tc>
@@ -1765,11 +1766,12 @@
             <w:tcW w:w="1587" w:type="dxa"/>
           </w:tcPr>
           <w:p>
-            <w:r>
-              <w:rPr>
-                <w:sz w:val="20"/>
-              </w:rPr>
-              <w:t>Open</w:t>
+            <w:r/>
+            <w:r>
+              <w:rPr>
+                <w:sz w:val="20"/>
+              </w:rPr>
+              <w:t>Draft</w:t>
             </w:r>
           </w:p>
         </w:tc>

</xml_diff>

<commit_message>
Response doc: add A4.7 response
Co-Authored-By: Claude Sonnet 5.5 <noreply@anthropic.com>
Claude-Session: https://claude.ai/code/session_01Y1g9vByMLTE8eGJ9K81zt6
</commit_message>
<xml_diff>
--- a/review_response/Response_to_Reviewer_Comments.docx
+++ b/review_response/Response_to_Reviewer_Comments.docx
@@ -1876,21 +1876,14 @@
             <w:tcW w:w="3912" w:type="dxa"/>
           </w:tcPr>
           <w:p>
-            <w:r>
-              <w:rPr>
-                <w:i/>
-                <w:color w:val="808080"/>
-                <w:sz w:val="20"/>
-              </w:rPr>
-              <w:t>[To be</w:t>
-            </w:r>
-            <w:r>
-              <w:rPr>
-                <w:i/>
-                <w:color w:val="808080"/>
-                <w:sz w:val="20"/>
-              </w:rPr>
-              <w:t xml:space="preserve"> completed]</w:t>
+            <w:r/>
+            <w:r>
+              <w:rPr>
+                <w:i w:val="0"/>
+                <w:color w:val="000000"/>
+                <w:sz w:val="20"/>
+              </w:rPr>
+              <w:t>We agree that a correlation coefficient is not a meaningful measure for two monotonic saturating curves, and we have removed the Pearson r values. We now report the normalized error (for Zn²⁺, RMSE = 11.6 mg L⁻¹, 39% of the mean literature value; for pH, RMSE = 0.10 pH units) and the signed error at each time, and state that the model captures the trend and the order of magnitude but over-predicts Zn²⁺ by about 44% and pH by 0.21 at 336 h. We attribute the over-prediction to precipitation and buffering in the r-SBF medium (phosphate, carbonate, Tris), which the model does not include [and to the solution volume per unit area, to be confirmed]. The comparison is therefore presented as an out-of-objective consistency check, not as a validation.</w:t>
             </w:r>
           </w:p>
         </w:tc>
@@ -1899,11 +1892,12 @@
             <w:tcW w:w="1587" w:type="dxa"/>
           </w:tcPr>
           <w:p>
-            <w:r>
-              <w:rPr>
-                <w:sz w:val="20"/>
-              </w:rPr>
-              <w:t>Open</w:t>
+            <w:r/>
+            <w:r>
+              <w:rPr>
+                <w:sz w:val="20"/>
+              </w:rPr>
+              <w:t>Draft</w:t>
             </w:r>
           </w:p>
         </w:tc>

</xml_diff>

<commit_message>
Response doc: update A4.4, A4.6, A4.7 and additional changes to reflect work done
Co-Authored-By: Claude Sonnet 5.5 <noreply@anthropic.com>
Claude-Session: https://claude.ai/code/session_01Y1g9vByMLTE8eGJ9K81zt6
</commit_message>
<xml_diff>
--- a/review_response/Response_to_Reviewer_Comments.docx
+++ b/review_response/Response_to_Reviewer_Comments.docx
@@ -1696,7 +1696,7 @@
                 <w:color w:val="000000"/>
                 <w:sz w:val="20"/>
               </w:rPr>
-              <w:t>We agree. The Supplementary Information reports the RMSE definition and the absolute errors for the calibration (Table S9), but no normalized error and no comparison with the experimental scatter for the validation. We will add a validation table to the Supplementary Information (Table S[x]) giving, for each immersion time, the experimental mean ± SD (n = 3), the simulated value, the error and the error/SD ratio, and we will report the normalized error in the Results. For the validation, RMSE = 0.0159% corresponds to 8.5% of the mean measured mass loss (5.0% of the 28-day value), all five simulated points lie within 0.35 SD of the experimental means, and the 28-day SD is 0.115% (n = 3). For the calibration, the RMSE of 0.042% corresponds to about 24% of the mean literature value (13% of the 14-day value). We acknowledge that the fit is therefore within the experimental scatter and that the validation does not discriminate between models that differ by less than this scatter.</w:t>
+              <w:t>We agree. We have added a validation table to the Supplementary Information (Table S11), giving for each immersion time the experimental mean ± SD (n = 3), the simulated value, the error and the error/SD ratio. For the validation, RMSE = 0.0159% corresponds to 8.6% of the mean measured mass loss (5.1% of the 28-day value); all five simulated points lie within 0.35 SD of the experimental means, and the 28-day SD is 0.115%. For the calibration, the RMSE of 0.042% corresponds to about 24% of the mean literature value (13% of the 14-day value). We acknowledge that the fit is within the experimental scatter and that the validation does not discriminate between models that differ by less than this scatter.</w:t>
             </w:r>
           </w:p>
         </w:tc>
@@ -1817,13 +1817,14 @@
             <w:tcW w:w="3912" w:type="dxa"/>
           </w:tcPr>
           <w:p>
-            <w:r>
-              <w:rPr>
-                <w:i/>
-                <w:color w:val="808080"/>
-                <w:sz w:val="20"/>
-              </w:rPr>
-              <w:t>[To be completed]</w:t>
+            <w:r/>
+            <w:r>
+              <w:rPr>
+                <w:i w:val="0"/>
+                <w:color w:val="000000"/>
+                <w:sz w:val="20"/>
+              </w:rPr>
+              <w:t>We agree. The 14-day and 28-day masses (3.03 ± 0.74 and 3.67 ± 1.33 mg, n = 3; a two-sample test gives p ≈ 0.5) are not statistically distinguishable, so the experiments constrain the late-time increase only weakly; the measured curve is well resolved up to about 7 days. We have [revised the Results to state that the later increase lies within the experimental scatter / added replicates or an intermediate time point].</w:t>
             </w:r>
           </w:p>
         </w:tc>
@@ -1832,11 +1833,12 @@
             <w:tcW w:w="1587" w:type="dxa"/>
           </w:tcPr>
           <w:p>
-            <w:r>
-              <w:rPr>
-                <w:sz w:val="20"/>
-              </w:rPr>
-              <w:t>Open</w:t>
+            <w:r/>
+            <w:r>
+              <w:rPr>
+                <w:sz w:val="20"/>
+              </w:rPr>
+              <w:t>Draft</w:t>
             </w:r>
           </w:p>
         </w:tc>
@@ -1883,7 +1885,7 @@
                 <w:color w:val="000000"/>
                 <w:sz w:val="20"/>
               </w:rPr>
-              <w:t>We agree that a correlation coefficient is not a meaningful measure for two monotonic saturating curves, and we have removed the Pearson r values. We now report the normalized error (for Zn²⁺, RMSE = 11.6 mg L⁻¹, 39% of the mean literature value; for pH, RMSE = 0.10 pH units) and the signed error at each time, and state that the model captures the trend and the order of magnitude but over-predicts Zn²⁺ by about 44% and pH by 0.21 at 336 h. We attribute the over-prediction to precipitation and buffering in the r-SBF medium (phosphate, carbonate, Tris), which the model does not include [and to the solution volume per unit area, to be confirmed]. The comparison is therefore presented as an out-of-objective consistency check, not as a validation.</w:t>
+              <w:t>We agree that a correlation coefficient is not a meaningful measure for two monotonic saturating curves, and we have removed the Pearson r values from the Results. We now report the errors at 336 h (44% for Zn²⁺ and 2.8% for pH, i.e. 0.21 pH units) and retain the description of the comparison as an out-of-objective evaluation. For Zn²⁺, the RMSE is 11.6 mg L⁻¹ (39% of the mean literature value); for pH, it is 0.10. We attribute the over-prediction to precipitation and buffering in the r-SBF medium (phosphate, carbonate, Tris), which the model does not include [and to the solution volume per unit area, to be confirmed].</w:t>
             </w:r>
           </w:p>
         </w:tc>
@@ -5295,9 +5297,9 @@
       </w:pPr>
       <w:r>
         <w:rPr>
-          <w:i/>
+          <w:i w:val="0"/>
         </w:rPr>
-        <w:t>[List any changes not requested by the reviewer.]</w:t>
+        <w:t>The following changes were made in addition to those requested: in the Figure 4 caption "(g-i)" was changed to "(g–i)"; "Literature" was corrected to "literature" in the Zn²⁺ and pH paragraph; the Supplementary tables were renumbered after the insertion of the new Table S11 (the former Table S11 is now Table S12); and the Methods now state the common 30 × 30 × 30 mm electrolyte domain used for the disc and the stent.</w:t>
       </w:r>
     </w:p>
     <w:sectPr>

</xml_diff>

<commit_message>
Response doc: add A5.4 response (ORR control as assumption, tested against independent data)
Co-Authored-By: Claude Sonnet 5.5 <noreply@anthropic.com>
Claude-Session: https://claude.ai/code/session_01Y1g9vByMLTE8eGJ9K81zt6
</commit_message>
<xml_diff>
--- a/review_response/Response_to_Reviewer_Comments.docx
+++ b/review_response/Response_to_Reviewer_Comments.docx
@@ -2241,11 +2241,11 @@
           <w:p>
             <w:r>
               <w:rPr>
-                <w:i/>
-                <w:color w:val="808080"/>
-                <w:sz w:val="20"/>
-              </w:rPr>
-              <w:t>[To be completed]</w:t>
+                <w:i w:val="0"/>
+                <w:color w:val="000000"/>
+                <w:sz w:val="20"/>
+              </w:rPr>
+              <w:t>We agree that oxygen-reduction-limited dissolution is a model assumption (Eqs. 1–2), so the Morris ranking alone cannot show that oxygen controls degradation. We now state oxygen control as the modelling premise, and the evidence that it works is the model's agreement with data it was not fitted to: (i) the 28-day immersion data, which were not used in calibration, are reproduced with RMSE = 0.0159%; (ii) the stent prediction, made without recalibration, is consistent with reported in vivo mass loss (~6%). The model is also not forced into oxygen limitation: the recession velocity v_n = min(v_Zn, v_ORR, v_O2) allows a reaction-limited stage, and the results show one at early times followed by a transition to transport control. The ablations (closed vs fixed-O₂ boundary, D_eff = D, k_f = 0) show how much each mechanism contributes. This agreement supports the assumption within the tested conditions (immersion in r-SBF/HBSS; disc and stent geometries); it does not prove oxygen control in vivo, and the limitations section states this.</w:t>
             </w:r>
           </w:p>
         </w:tc>
@@ -2256,9 +2256,11 @@
           <w:p>
             <w:r>
               <w:rPr>
-                <w:sz w:val="20"/>
-              </w:rPr>
-              <w:t>Open</w:t>
+                <w:i w:val="0"/>
+                <w:color w:val="000000"/>
+                <w:sz w:val="20"/>
+              </w:rPr>
+              <w:t>Addressed</w:t>
             </w:r>
           </w:p>
         </w:tc>

</xml_diff>

<commit_message>
Response doc: add A6.3 response (stent dimensions in SI Table S4/Fig S4)
Co-Authored-By: Claude Sonnet 5.5 <noreply@anthropic.com>
Claude-Session: https://claude.ai/code/session_01Y1g9vByMLTE8eGJ9K81zt6
</commit_message>
<xml_diff>
--- a/review_response/Response_to_Reviewer_Comments.docx
+++ b/review_response/Response_to_Reviewer_Comments.docx
@@ -2533,11 +2533,11 @@
           <w:p>
             <w:r>
               <w:rPr>
-                <w:i/>
-                <w:color w:val="808080"/>
-                <w:sz w:val="20"/>
-              </w:rPr>
-              <w:t>[To be completed]</w:t>
+                <w:i w:val="0"/>
+                <w:color w:val="000000"/>
+                <w:sz w:val="20"/>
+              </w:rPr>
+              <w:t>The full stent geometry is given in the Supplementary Information: Table S4 lists the outer diameter (3.20 mm), strut cross-section (0.15 × 0.15 mm), crown amplitude (1.00 mm), axial length (2.40 mm), surface area, volume and SA/V, together with the mesh and numerical settings, and Fig. S4 shows the geometry and computational domain. We clarify that the stent is a representative six-crown design, not a replica of the stent in the in vivo study [10]. The 6–7% in vivo figure is therefore used only as a plausibility benchmark for the predicted magnitude, not as a stent-specific validation, and the manuscript already states that it is not formal in vivo validation.</w:t>
             </w:r>
           </w:p>
         </w:tc>
@@ -2548,9 +2548,11 @@
           <w:p>
             <w:r>
               <w:rPr>
-                <w:sz w:val="20"/>
-              </w:rPr>
-              <w:t>Open</w:t>
+                <w:i w:val="0"/>
+                <w:color w:val="000000"/>
+                <w:sz w:val="20"/>
+              </w:rPr>
+              <w:t>Addressed</w:t>
             </w:r>
           </w:p>
         </w:tc>

</xml_diff>

<commit_message>
Response doc: add A6.4 response
Co-Authored-By: Claude Sonnet 5.5 <noreply@anthropic.com>
Claude-Session: https://claude.ai/code/session_01Y1g9vByMLTE8eGJ9K81zt6
</commit_message>
<xml_diff>
--- a/review_response/Response_to_Reviewer_Comments.docx
+++ b/review_response/Response_to_Reviewer_Comments.docx
@@ -2600,11 +2600,11 @@
           <w:p>
             <w:r>
               <w:rPr>
-                <w:i/>
-                <w:color w:val="808080"/>
-                <w:sz w:val="20"/>
-              </w:rPr>
-              <w:t>[To be completed]</w:t>
+                <w:i w:val="0"/>
+                <w:color w:val="000000"/>
+                <w:sz w:val="20"/>
+              </w:rPr>
+              <w:t>We agree. In vivo degradation is affected by flow, protein adsorption and a different oxygen supply, none of which the model includes. The Abstract and Conclusions now say that the predicted ~6% one-month mass loss is of the same order of magnitude as reported in vivo observations, instead of 'consistent with' them. The Results and Limitations sections already state that the comparison is a plausibility check and not formal in vivo validation.</w:t>
             </w:r>
           </w:p>
         </w:tc>
@@ -2615,9 +2615,11 @@
           <w:p>
             <w:r>
               <w:rPr>
-                <w:sz w:val="20"/>
-              </w:rPr>
-              <w:t>Open</w:t>
+                <w:i w:val="0"/>
+                <w:color w:val="000000"/>
+                <w:sz w:val="20"/>
+              </w:rPr>
+              <w:t>Addressed</w:t>
             </w:r>
           </w:p>
         </w:tc>

</xml_diff>

<commit_message>
Response doc: add B1.1-B1.6 responses based on source-code audit
Co-Authored-By: Claude Sonnet 5.5 <noreply@anthropic.com>
Claude-Session: https://claude.ai/code/session_01Y1g9vByMLTE8eGJ9K81zt6
</commit_message>
<xml_diff>
--- a/review_response/Response_to_Reviewer_Comments.docx
+++ b/review_response/Response_to_Reviewer_Comments.docx
@@ -2775,11 +2775,11 @@
           <w:p>
             <w:r>
               <w:rPr>
-                <w:i/>
-                <w:color w:val="808080"/>
-                <w:sz w:val="20"/>
-              </w:rPr>
-              <w:t>[To be completed]</w:t>
+                <w:i w:val="0"/>
+                <w:color w:val="000000"/>
+                <w:sz w:val="20"/>
+              </w:rPr>
+              <w:t>In the continuum the two O₂ velocities coincide, because the Robin condition sets the O₂ flux at the interface equal to k_ORR·C_O2. In the implementation they are evaluated separately from the discrete O₂ field: v_ORR uses O₂ one probe distance beyond the interface, and v_O2 uses a two-point gradient with the local effective diffusivity. They therefore differ numerically, and the selection acts as a numerical safeguard (Rule A, SI); the Damköhler number is their ratio and is a discrete diagnostic. We have corrected Eq. 17: the velocities are negative, so the limiting (slowest) mechanism is the one with the smallest magnitude, i.e. the maximum of the signed values, not the minimum. We agree on the mass balance: the Zn²⁺ and OH⁻ source terms are driven by the Robin ORR flux regardless of which branch sets v_n, so metal loss (set by v_n) and dissolved Zn²⁺ (set by the ORR and film terms) are not tied together when the Zn-transport or diffusion branch binds. Predicted mass loss is computed from the level-set volume, not from the Zn²⁺ field, and we state this limitation explicitly. After the initial reaction-controlled stage, oxygen diffusion controls more than 99% of the interface area at 672 h (SI). [Add the fraction of the interface where the Zn-transport branch binds, from the DEBUG_BIND output.]</w:t>
             </w:r>
           </w:p>
         </w:tc>
@@ -2790,9 +2790,11 @@
           <w:p>
             <w:r>
               <w:rPr>
-                <w:sz w:val="20"/>
-              </w:rPr>
-              <w:t>Open</w:t>
+                <w:i w:val="0"/>
+                <w:color w:val="000000"/>
+                <w:sz w:val="20"/>
+              </w:rPr>
+              <w:t>In progress</w:t>
             </w:r>
           </w:p>
         </w:tc>
@@ -2840,11 +2842,11 @@
           <w:p>
             <w:r>
               <w:rPr>
-                <w:i/>
-                <w:color w:val="808080"/>
-                <w:sz w:val="20"/>
-              </w:rPr>
-              <w:t>[To be completed]</w:t>
+                <w:i w:val="0"/>
+                <w:color w:val="000000"/>
+                <w:sz w:val="20"/>
+              </w:rPr>
+              <w:t>Correct. [Zn]_sat (10 mg L⁻¹) is the Zn²⁺ concentration at the metal–electrolyte interface in the Stefan condition (Eq. 14), imposed inside the solid by a penalty term. It is not a precipitation threshold. Film formation (Eq. 11) is first-order in C_Zn without a supersaturation term, so precipitation kinetics are lumped into the effective k_f. Bulk Zn²⁺ can therefore exceed 10 mg L⁻¹ (57 mg L⁻¹ at 336 h, a 44% overestimate relative to the literature value of 39.5 mg L⁻¹). We now state this role of [Zn]_sat explicitly and note the missing solubility threshold as a limitation of the Zn²⁺ prediction.</w:t>
             </w:r>
           </w:p>
         </w:tc>
@@ -2855,9 +2857,11 @@
           <w:p>
             <w:r>
               <w:rPr>
-                <w:sz w:val="20"/>
-              </w:rPr>
-              <w:t>Open</w:t>
+                <w:i w:val="0"/>
+                <w:color w:val="000000"/>
+                <w:sz w:val="20"/>
+              </w:rPr>
+              <w:t>Addressed</w:t>
             </w:r>
           </w:p>
         </w:tc>
@@ -2899,11 +2903,11 @@
           <w:p>
             <w:r>
               <w:rPr>
-                <w:i/>
-                <w:color w:val="808080"/>
-                <w:sz w:val="20"/>
-              </w:rPr>
-              <w:t>[To be completed]</w:t>
+                <w:i w:val="0"/>
+                <w:color w:val="000000"/>
+                <w:sz w:val="20"/>
+              </w:rPr>
+              <w:t>The implementation is mass-based. F and F_max are in g mm⁻³ (F_max = ρ_film(1−ε)), and Cl⁻ enters the dissolution rate as a molar concentration (mol L⁻¹). The correct unit for k_d is therefore L² mol⁻² h⁻¹. The molar F_max expression and the mm⁶ g⁻² h⁻¹ unit in the manuscript were inconsistent with this and are being corrected [Eq. 11 text, Table 2, Table S5]. [The film density in the code (3.998 g cm⁻³) differs from Table 1 (5.606 g cm⁻³); reconcile before submission.]</w:t>
             </w:r>
           </w:p>
         </w:tc>
@@ -2914,9 +2918,11 @@
           <w:p>
             <w:r>
               <w:rPr>
-                <w:sz w:val="20"/>
-              </w:rPr>
-              <w:t>Open</w:t>
+                <w:i w:val="0"/>
+                <w:color w:val="000000"/>
+                <w:sz w:val="20"/>
+              </w:rPr>
+              <w:t>In progress</w:t>
             </w:r>
           </w:p>
         </w:tc>
@@ -2964,11 +2970,11 @@
           <w:p>
             <w:r>
               <w:rPr>
-                <w:i/>
-                <w:color w:val="808080"/>
-                <w:sz w:val="20"/>
-              </w:rPr>
-              <w:t>[To be completed]</w:t>
+                <w:i w:val="0"/>
+                <w:color w:val="000000"/>
+                <w:sz w:val="20"/>
+              </w:rPr>
+              <w:t>The exponent of C_Cl in Eq. 11 is an effective reaction order, not the stoichiometric one: Eq. 5 is an overall reaction and the dissolution of ZnO into chloro-complexes proceeds in steps, so the rate order need not equal the stoichiometric coefficient. A second-order dependence is used as a reduced-order description [rationale/reference to be given]. Cl⁻ is not catalytic in a strict sense: Eq. 5 consumes four Cl⁻ per ZnO. In the model, Zn from dissolved film returns to the Zn²⁺ pool as a lumped zinc species and Cl⁻ is treated as conserved (Eq. 8 has no sink). This is justified because Cl⁻ is in large excess (142.3 mmol L⁻¹): if all Zn lost were bound as ZnCl₄²⁻, the upper-bound Cl⁻ consumption would be about 6% for the disc and below 1% for the stent. We replace 'catalytic' by 'effectively non-consumed' and note this approximation.</w:t>
             </w:r>
           </w:p>
         </w:tc>
@@ -2979,9 +2985,11 @@
           <w:p>
             <w:r>
               <w:rPr>
-                <w:sz w:val="20"/>
-              </w:rPr>
-              <w:t>Open</w:t>
+                <w:i w:val="0"/>
+                <w:color w:val="000000"/>
+                <w:sz w:val="20"/>
+              </w:rPr>
+              <w:t>In progress</w:t>
             </w:r>
           </w:p>
         </w:tc>
@@ -3023,11 +3031,11 @@
           <w:p>
             <w:r>
               <w:rPr>
-                <w:i/>
-                <w:color w:val="808080"/>
-                <w:sz w:val="20"/>
-              </w:rPr>
-              <w:t>[To be completed]</w:t>
+                <w:i w:val="0"/>
+                <w:color w:val="000000"/>
+                <w:sz w:val="20"/>
+              </w:rPr>
+              <w:t>The film is a homogenised, volumetric field on a fixed mesh: it forms wherever dissolved Zn²⁺ is present on the electrolyte side of the level set and reduces local diffusivity (Eq. 12). It is not attached to the receding interface, and the level set advances independently of F. The ZnO/Zn volume ratio (about 1.6) is not represented, so the film does not displace the interface or expand into the volume of lost metal. This is a limitation of the model, now stated in the Limitations section. Its effect is bounded by F_max and the porosity ε, which cap the local film density.</w:t>
             </w:r>
           </w:p>
         </w:tc>
@@ -3038,9 +3046,11 @@
           <w:p>
             <w:r>
               <w:rPr>
-                <w:sz w:val="20"/>
-              </w:rPr>
-              <w:t>Open</w:t>
+                <w:i w:val="0"/>
+                <w:color w:val="000000"/>
+                <w:sz w:val="20"/>
+              </w:rPr>
+              <w:t>Addressed</w:t>
             </w:r>
           </w:p>
         </w:tc>
@@ -3082,19 +3092,11 @@
           <w:p>
             <w:r>
               <w:rPr>
-                <w:i/>
-                <w:color w:val="808080"/>
-                <w:sz w:val="20"/>
-              </w:rPr>
-              <w:t xml:space="preserve">[To be </w:t>
-            </w:r>
-            <w:r>
-              <w:rPr>
-                <w:i/>
-                <w:color w:val="808080"/>
-                <w:sz w:val="20"/>
-              </w:rPr>
-              <w:t>completed]</w:t>
+                <w:i w:val="0"/>
+                <w:color w:val="000000"/>
+                <w:sz w:val="20"/>
+              </w:rPr>
+              <w:t>The ORR terms use a sharp surface integral over the zero level set of the P1-interpolated signed-distance function (FreeFEM int2d with the levelset option), so there is no smoothing parameter in the reaction terms. A smoothed delta function, δ = (1 − tanh²(φ/ε_δ))/(2ε_δ) with ε_δ equal to the minimum mesh size, is used only in post-processing to average quantities over the interface. We now state this in the Methods.</w:t>
             </w:r>
           </w:p>
         </w:tc>
@@ -3105,9 +3107,11 @@
           <w:p>
             <w:r>
               <w:rPr>
-                <w:sz w:val="20"/>
-              </w:rPr>
-              <w:t>Open</w:t>
+                <w:i w:val="0"/>
+                <w:color w:val="000000"/>
+                <w:sz w:val="20"/>
+              </w:rPr>
+              <w:t>Addressed</w:t>
             </w:r>
           </w:p>
         </w:tc>

</xml_diff>

<commit_message>
Response doc: add B3.1 response (sweeps around calibrated baseline)
Co-Authored-By: Claude Sonnet 5.5 <noreply@anthropic.com>
Claude-Session: https://claude.ai/code/session_01Y1g9vByMLTE8eGJ9K81zt6
</commit_message>
<xml_diff>
--- a/review_response/Response_to_Reviewer_Comments.docx
+++ b/review_response/Response_to_Reviewer_Comments.docx
@@ -3481,11 +3481,11 @@
           <w:p>
             <w:r>
               <w:rPr>
-                <w:i/>
-                <w:color w:val="808080"/>
-                <w:sz w:val="20"/>
-              </w:rPr>
-              <w:t>[To be completed]</w:t>
+                <w:i w:val="0"/>
+                <w:color w:val="000000"/>
+                <w:sz w:val="20"/>
+              </w:rPr>
+              <w:t>The sweeps in the original Fig. 4 used k_f = 100, k_d = 30 and k_ORR = 1.0, not the optimised Table 2 values, which is why the baseline gave 0.39% at 168 h against about 0.19% in Fig. 5a. We have repeated the sweeps around the calibrated baseline, varying each parameter by the same fold-change (×0.5 and ×2) with the other parameters fixed. The baseline curve now coincides with the calibrated simulation in Fig. 5a. [Insert the updated Fig. 4 and the revised 168 h mass-loss changes once the runs are complete.]</w:t>
             </w:r>
           </w:p>
         </w:tc>
@@ -3496,9 +3496,11 @@
           <w:p>
             <w:r>
               <w:rPr>
-                <w:sz w:val="20"/>
-              </w:rPr>
-              <w:t>Open</w:t>
+                <w:i w:val="0"/>
+                <w:color w:val="000000"/>
+                <w:sz w:val="20"/>
+              </w:rPr>
+              <w:t>In progress</w:t>
             </w:r>
           </w:p>
         </w:tc>

</xml_diff>

<commit_message>
Response doc: add B4.1 response
Co-Authored-By: Claude Sonnet 5.5 <noreply@anthropic.com>
Claude-Session: https://claude.ai/code/session_01Y1g9vByMLTE8eGJ9K81zt6
</commit_message>
<xml_diff>
--- a/review_response/Response_to_Reviewer_Comments.docx
+++ b/review_response/Response_to_Reviewer_Comments.docx
@@ -3654,12 +3654,11 @@
           <w:p>
             <w:r>
               <w:rPr>
-                <w:i/>
-                <w:color w:val="808080"/>
-                <w:sz w:val="20"/>
-              </w:rPr>
-              <w:lastRenderedPageBreak/>
-              <w:t>[To be completed]</w:t>
+                <w:i w:val="0"/>
+                <w:color w:val="000000"/>
+                <w:sz w:val="20"/>
+              </w:rPr>
+              <w:t>Thank you for spotting this. The ranges in the text were wrong. From the Fig. 8c data, mean penetration depth is 2.4–2.7 µm across the curved-wire configurations (30°, 90°, 150°: 2.44, 2.70, 2.58 µm) and 2.1–2.4 µm across the spacing configurations (straight, close gap, far gap: 2.44, 2.05, 2.28 µm). The Results text now gives these ranges.</w:t>
             </w:r>
           </w:p>
         </w:tc>
@@ -3670,9 +3669,11 @@
           <w:p>
             <w:r>
               <w:rPr>
-                <w:sz w:val="20"/>
-              </w:rPr>
-              <w:t>Open</w:t>
+                <w:i w:val="0"/>
+                <w:color w:val="000000"/>
+                <w:sz w:val="20"/>
+              </w:rPr>
+              <w:t>Addressed</w:t>
             </w:r>
           </w:p>
         </w:tc>

</xml_diff>

<commit_message>
Response doc: add C2.2 response
Co-Authored-By: Claude Sonnet 5.5 <noreply@anthropic.com>
Claude-Session: https://claude.ai/code/session_01Y1g9vByMLTE8eGJ9K81zt6
</commit_message>
<xml_diff>
--- a/review_response/Response_to_Reviewer_Comments.docx
+++ b/review_response/Response_to_Reviewer_Comments.docx
@@ -4697,19 +4697,11 @@
           <w:p>
             <w:r>
               <w:rPr>
-                <w:i/>
-                <w:color w:val="808080"/>
-                <w:sz w:val="20"/>
-              </w:rPr>
-              <w:t xml:space="preserve">[To be </w:t>
-            </w:r>
-            <w:r>
-              <w:rPr>
-                <w:i/>
-                <w:color w:val="808080"/>
-                <w:sz w:val="20"/>
-              </w:rPr>
-              <w:t>completed]</w:t>
+                <w:i w:val="0"/>
+                <w:color w:val="000000"/>
+                <w:sz w:val="20"/>
+              </w:rPr>
+              <w:t>The section headings in the Word submission file are numbered automatically (multilevel list tied to the heading styles: 1 Introduction, 2 Methods, 3 Results and Discussion, 4 Conclusions). 'Section 2.3' is Methods 2.3, Numerical Implementation and Simulation Setup, which is where the meshing and numerical procedures are described, so the cross-reference is correct. The numbers were probably lost in the version the reviewer saw. We have checked that they appear in the exported submission PDF. The 'Sections 1 and 2' in Fig. 7 refer to the two stent cross-sections, not manuscript sections.</w:t>
             </w:r>
           </w:p>
         </w:tc>
@@ -4720,9 +4712,11 @@
           <w:p>
             <w:r>
               <w:rPr>
-                <w:sz w:val="20"/>
-              </w:rPr>
-              <w:t>Open</w:t>
+                <w:i w:val="0"/>
+                <w:color w:val="000000"/>
+                <w:sz w:val="20"/>
+              </w:rPr>
+              <w:t>Addressed</w:t>
             </w:r>
           </w:p>
         </w:tc>

</xml_diff>

<commit_message>
Response doc: add C4.1 response
Co-Authored-By: Claude Sonnet 5.5 <noreply@anthropic.com>
Claude-Session: https://claude.ai/code/session_01Y1g9vByMLTE8eGJ9K81zt6
</commit_message>
<xml_diff>
--- a/review_response/Response_to_Reviewer_Comments.docx
+++ b/review_response/Response_to_Reviewer_Comments.docx
@@ -5266,11 +5266,11 @@
           <w:p>
             <w:r>
               <w:rPr>
-                <w:i/>
-                <w:color w:val="808080"/>
-                <w:sz w:val="20"/>
-              </w:rPr>
-              <w:t>[To be completed]</w:t>
+                <w:i w:val="0"/>
+                <w:color w:val="000000"/>
+                <w:sz w:val="20"/>
+              </w:rPr>
+              <w:t>The Damköhler number is defined in the Supplementary Information (Eq. S3, Section S1) as the ratio of oxygen consumption by the ORR to oxygen transport to the surface, Da = k_ORR·C_O2 / (D_O2,eff ∇C_O2·n). The transition criterion is also given there: Da &lt; 1 indicates reaction-controlled corrosion and Da &gt; 1 diffusion-controlled corrosion, and the transition is the point where Da crosses 1 (about 40 h for the disc). The main text cites this definition in the Methods (Equation S3) and Section S1 for the transition between regimes.</w:t>
             </w:r>
           </w:p>
         </w:tc>
@@ -5281,9 +5281,11 @@
           <w:p>
             <w:r>
               <w:rPr>
-                <w:sz w:val="20"/>
-              </w:rPr>
-              <w:t>Open</w:t>
+                <w:i w:val="0"/>
+                <w:color w:val="000000"/>
+                <w:sz w:val="20"/>
+              </w:rPr>
+              <w:t>Addressed</w:t>
             </w:r>
           </w:p>
         </w:tc>

</xml_diff>

<commit_message>
Response doc: add B4.3 response
Co-Authored-By: Claude Sonnet 5.5 <noreply@anthropic.com>
Claude-Session: https://claude.ai/code/session_01Y1g9vByMLTE8eGJ9K81zt6
</commit_message>
<xml_diff>
--- a/review_response/Response_to_Reviewer_Comments.docx
+++ b/review_response/Response_to_Reviewer_Comments.docx
@@ -3782,11 +3782,11 @@
           <w:p>
             <w:r>
               <w:rPr>
-                <w:i/>
-                <w:color w:val="808080"/>
-                <w:sz w:val="20"/>
-              </w:rPr>
-              <w:t>[To be completed]</w:t>
+                <w:i w:val="0"/>
+                <w:color w:val="000000"/>
+                <w:sz w:val="20"/>
+              </w:rPr>
+              <w:t>The 13.2× is the ratio of outer (3.72 µm) to inner (0.28 µm) recession for the 150° arc. Its denominator is far below the interface element size, so the ratio is poorly constrained and should not be compared numerically across geometries. We now report the absolute outer–inner difference (3.4 µm for the 150° arc) alongside the ratio, and note that the inner depth is not resolved. The stent crown (Fig. 7d) gives 8.55 µm outer and 4.76 µm inner (1.8×, a 3.8 µm difference). The two are not directly comparable because the isolated 150° arc (radius 0.63 mm) confines its inner side far more strongly than the stent crown, so the inner surface is almost fully shielded from oxygen. [Confirm that Fig. 8d's inner and outer depths are taken at the arc apex, as in Fig. 7d.]</w:t>
             </w:r>
           </w:p>
         </w:tc>
@@ -3797,9 +3797,11 @@
           <w:p>
             <w:r>
               <w:rPr>
-                <w:sz w:val="20"/>
-              </w:rPr>
-              <w:t>Open</w:t>
+                <w:i w:val="0"/>
+                <w:color w:val="000000"/>
+                <w:sz w:val="20"/>
+              </w:rPr>
+              <w:t>In progress</w:t>
             </w:r>
           </w:p>
         </w:tc>

</xml_diff>

<commit_message>
Response doc: sync with user's manual edits
Co-Authored-By: Claude Sonnet 5.5 <noreply@anthropic.com>
Claude-Session: https://claude.ai/code/session_01Y1g9vByMLTE8eGJ9K81zt6
</commit_message>
<xml_diff>
--- a/review_response/Response_to_Reviewer_Comments.docx
+++ b/review_response/Response_to_Reviewer_Comments.docx
@@ -1,6 +1,6 @@
 
 <file path=word/document.xml><?xml version="1.0" encoding="utf-8"?>
-<w:document xmlns:wpc="http://schemas.microsoft.com/office/word/2010/wordprocessingCanvas" xmlns:cx="http://schemas.microsoft.com/office/drawing/2014/chartex" xmlns:cx1="http://schemas.microsoft.com/office/drawing/2015/9/8/chartex" xmlns:cx2="http://schemas.microsoft.com/office/drawing/2015/10/21/chartex" xmlns:cx3="http://schemas.microsoft.com/office/drawing/2016/5/9/chartex" xmlns:cx4="http://schemas.microsoft.com/office/drawing/2016/5/10/chartex" xmlns:cx5="http://schemas.microsoft.com/office/drawing/2016/5/11/chartex" xmlns:cx6="http://schemas.microsoft.com/office/drawing/2016/5/12/chartex" xmlns:cx7="http://schemas.microsoft.com/office/drawing/2016/5/13/chartex" xmlns:cx8="http://schemas.microsoft.com/office/drawing/2016/5/14/chartex" xmlns:mc="http://schemas.openxmlformats.org/markup-compatibility/2006" xmlns:aink="http://schemas.microsoft.com/office/drawing/2016/ink" xmlns:am3d="http://schemas.microsoft.com/office/drawing/2017/model3d" xmlns:o="urn:schemas-microsoft-com:office:office" xmlns:r="http://schemas.openxmlformats.org/officeDocument/2006/relationships" xmlns:m="http://schemas.openxmlformats.org/officeDocument/2006/math" xmlns:v="urn:schemas-microsoft-com:vml" xmlns:wp14="http://schemas.microsoft.com/office/word/2010/wordprocessingDrawing" xmlns:wp="http://schemas.openxmlformats.org/drawingml/2006/wordprocessingDrawing" xmlns:w10="urn:schemas-microsoft-com:office:word" xmlns:w="http://schemas.openxmlformats.org/wordprocessingml/2006/main" xmlns:w14="http://schemas.microsoft.com/office/word/2010/wordml" xmlns:w15="http://schemas.microsoft.com/office/word/2012/wordml" xmlns:w16cex="http://schemas.microsoft.com/office/word/2018/wordml/cex" xmlns:w16cid="http://schemas.microsoft.com/office/word/2016/wordml/cid" xmlns:w16="http://schemas.microsoft.com/office/word/2018/wordml" xmlns:w16sdtdh="http://schemas.microsoft.com/office/word/2020/wordml/sdtdatahash" xmlns:w16se="http://schemas.microsoft.com/office/word/2015/wordml/symex" xmlns:wpg="http://schemas.microsoft.com/office/word/2010/wordprocessingGroup" xmlns:wpi="http://schemas.microsoft.com/office/word/2010/wordprocessingInk" xmlns:wne="http://schemas.microsoft.com/office/word/2006/wordml" xmlns:wps="http://schemas.microsoft.com/office/word/2010/wordprocessingShape" mc:Ignorable="w14 w15 w16se w16cid w16 w16cex w16sdtdh wp14">
+<w:document xmlns:wpc="http://schemas.microsoft.com/office/word/2010/wordprocessingCanvas" xmlns:cx="http://schemas.microsoft.com/office/drawing/2014/chartex" xmlns:cx1="http://schemas.microsoft.com/office/drawing/2015/9/8/chartex" xmlns:cx2="http://schemas.microsoft.com/office/drawing/2015/10/21/chartex" xmlns:cx3="http://schemas.microsoft.com/office/drawing/2016/5/9/chartex" xmlns:cx4="http://schemas.microsoft.com/office/drawing/2016/5/10/chartex" xmlns:cx5="http://schemas.microsoft.com/office/drawing/2016/5/11/chartex" xmlns:cx6="http://schemas.microsoft.com/office/drawing/2016/5/12/chartex" xmlns:cx7="http://schemas.microsoft.com/office/drawing/2016/5/13/chartex" xmlns:cx8="http://schemas.microsoft.com/office/drawing/2016/5/14/chartex" xmlns:mc="http://schemas.openxmlformats.org/markup-compatibility/2006" xmlns:aink="http://schemas.microsoft.com/office/drawing/2016/ink" xmlns:am3d="http://schemas.microsoft.com/office/drawing/2017/model3d" xmlns:o="urn:schemas-microsoft-com:office:office" xmlns:oel="http://schemas.microsoft.com/office/2019/extlst" xmlns:r="http://schemas.openxmlformats.org/officeDocument/2006/relationships" xmlns:m="http://schemas.openxmlformats.org/officeDocument/2006/math" xmlns:v="urn:schemas-microsoft-com:vml" xmlns:wp14="http://schemas.microsoft.com/office/word/2010/wordprocessingDrawing" xmlns:wp="http://schemas.openxmlformats.org/drawingml/2006/wordprocessingDrawing" xmlns:w10="urn:schemas-microsoft-com:office:word" xmlns:w="http://schemas.openxmlformats.org/wordprocessingml/2006/main" xmlns:w14="http://schemas.microsoft.com/office/word/2010/wordml" xmlns:w15="http://schemas.microsoft.com/office/word/2012/wordml" xmlns:w16cex="http://schemas.microsoft.com/office/word/2018/wordml/cex" xmlns:w16cid="http://schemas.microsoft.com/office/word/2016/wordml/cid" xmlns:w16="http://schemas.microsoft.com/office/word/2018/wordml" xmlns:w16du="http://schemas.microsoft.com/office/word/2023/wordml/word16du" xmlns:w16sdtdh="http://schemas.microsoft.com/office/word/2020/wordml/sdtdatahash" xmlns:w16sdtfl="http://schemas.microsoft.com/office/word/2024/wordml/sdtformatlock" xmlns:w16se="http://schemas.microsoft.com/office/word/2015/wordml/symex" xmlns:wpg="http://schemas.microsoft.com/office/word/2010/wordprocessingGroup" xmlns:wpi="http://schemas.microsoft.com/office/word/2010/wordprocessingInk" xmlns:wne="http://schemas.microsoft.com/office/word/2006/wordml" xmlns:wps="http://schemas.microsoft.com/office/word/2010/wordprocessingShape" mc:Ignorable="w14 w15 w16se w16cid w16 w16cex w16sdtdh w16sdtfl w16du wp14">
   <w:body>
     <w:p>
       <w:pPr>
@@ -11,14 +11,7 @@
           <w:b/>
           <w:sz w:val="32"/>
         </w:rPr>
-        <w:t xml:space="preserve">Response to </w:t>
-      </w:r>
-      <w:r>
-        <w:rPr>
-          <w:b/>
-          <w:sz w:val="32"/>
-        </w:rPr>
-        <w:t>Comments</w:t>
+        <w:t>Response to Comments</w:t>
       </w:r>
     </w:p>
     <w:p>
@@ -34,7 +27,23 @@
         <w:spacing w:after="40"/>
       </w:pPr>
       <w:r>
-        <w:t>Authors: Henaka Ariyarathna, Xuan Yang, Aijun Huang, Yunlong Tang, Yuman Zhu</w:t>
+        <w:t xml:space="preserve">Authors: Henaka Ariyarathna, Xuan Yang, </w:t>
+      </w:r>
+      <w:proofErr w:type="spellStart"/>
+      <w:r>
+        <w:t>Aijun</w:t>
+      </w:r>
+      <w:proofErr w:type="spellEnd"/>
+      <w:r>
+        <w:t xml:space="preserve"> Huang, Yunlong Tang, </w:t>
+      </w:r>
+      <w:proofErr w:type="spellStart"/>
+      <w:r>
+        <w:t>Yuman</w:t>
+      </w:r>
+      <w:proofErr w:type="spellEnd"/>
+      <w:r>
+        <w:t xml:space="preserve"> Zhu</w:t>
       </w:r>
     </w:p>
     <w:p>
@@ -166,13 +175,7 @@
               <w:rPr>
                 <w:sz w:val="20"/>
               </w:rPr>
-              <w:t>A</w:t>
-            </w:r>
-            <w:r>
-              <w:rPr>
-                <w:sz w:val="20"/>
-              </w:rPr>
-              <w:t>1.1</w:t>
+              <w:t>A1.1</w:t>
             </w:r>
           </w:p>
         </w:tc>
@@ -185,7 +188,35 @@
               <w:rPr>
                 <w:sz w:val="20"/>
               </w:rPr>
-              <w:t>With k_ORR = 0.51 mm h⁻¹ and C_O₂ = 3.5 mg L⁻¹, Eq. 15 caps recession at about 0.009 mm yr⁻¹. That is about 0.7 µm in 28 days, or about 0.1% disc mass loss.</w:t>
+              <w:t xml:space="preserve">With </w:t>
+            </w:r>
+            <w:proofErr w:type="spellStart"/>
+            <w:r>
+              <w:rPr>
+                <w:sz w:val="20"/>
+              </w:rPr>
+              <w:t>k_ORR</w:t>
+            </w:r>
+            <w:proofErr w:type="spellEnd"/>
+            <w:r>
+              <w:rPr>
+                <w:sz w:val="20"/>
+              </w:rPr>
+              <w:t xml:space="preserve"> = 0.51 mm h⁻¹ and C_O₂ = 3.5 mg L⁻¹, Eq. 15 caps recession at about 0.009 mm yr⁻¹. That is about 0.7 µm in 28 days, or about </w:t>
+            </w:r>
+            <w:proofErr w:type="gramStart"/>
+            <w:r>
+              <w:rPr>
+                <w:sz w:val="20"/>
+              </w:rPr>
+              <w:t>0.1% disc</w:t>
+            </w:r>
+            <w:proofErr w:type="gramEnd"/>
+            <w:r>
+              <w:rPr>
+                <w:sz w:val="20"/>
+              </w:rPr>
+              <w:t xml:space="preserve"> mass loss.</w:t>
             </w:r>
           </w:p>
         </w:tc>
@@ -194,14 +225,113 @@
             <w:tcW w:w="3912" w:type="dxa"/>
           </w:tcPr>
           <w:p>
-            <w:r/>
-            <w:r>
-              <w:rPr>
-                <w:i w:val="0"/>
-                <w:color w:val="000000"/>
-                <w:sz w:val="20"/>
-              </w:rPr>
-              <w:t>We thank the reviewer for this dimensional consistency check, and we confirm the estimate. In consistent units, C_O₂ = 3.5 mg L⁻¹ = 1.09 × 10⁻¹⁰ mol mm⁻³ (1 L = 10⁶ mm³) and [Zn]_sol = 7.14/65.38 g cm⁻³ = 1.09 × 10⁻⁴ mol mm⁻³. For k_ORR = 0.51 mm h⁻¹, Eq. 15 then gives v_ORR = 2 k_ORR C_O₂/[Zn]_sol = 1.0 × 10⁻⁶ mm h⁻¹ ≈ 0.009 mm yr⁻¹, i.e. about 0.7 µm in 28 days. The simulated corrosion rates (about 0.12 mm yr⁻¹ for the disc and 0.155 mm yr⁻¹ for the stent) and the measured disc mass loss exceed this value, so the equation as written and the reported results were inconsistent. We have audited the implementation of k_ORR, the regularized interfacial delta function δ_Γ and the oxygen concentration (units, g versus mol, and the interface area scaling) and found [describe finding: e.g. the unit/definition used in the code and the correction made]. [Corrected k_ORR, Table 2, Figures 3–8 and associated text: describe what was re-run and what changed.]</w:t>
+            <w:pPr>
+              <w:rPr>
+                <w:color w:val="EE0000"/>
+              </w:rPr>
+            </w:pPr>
+            <w:r>
+              <w:rPr>
+                <w:color w:val="EE0000"/>
+                <w:sz w:val="20"/>
+              </w:rPr>
+              <w:t xml:space="preserve">We thank the reviewer for this dimensional consistency check, and we confirm the estimate. In consistent units, C_O₂ = 3.5 mg L⁻¹ = 1.09 × 10⁻¹⁰ mol mm⁻³ (1 L = 10⁶ mm³) and [Zn]_sol = 7.14/65.38 g cm⁻³ = 1.09 × 10⁻⁴ mol mm⁻³. For </w:t>
+            </w:r>
+            <w:proofErr w:type="spellStart"/>
+            <w:r>
+              <w:rPr>
+                <w:color w:val="EE0000"/>
+                <w:sz w:val="20"/>
+              </w:rPr>
+              <w:t>k_ORR</w:t>
+            </w:r>
+            <w:proofErr w:type="spellEnd"/>
+            <w:r>
+              <w:rPr>
+                <w:color w:val="EE0000"/>
+                <w:sz w:val="20"/>
+              </w:rPr>
+              <w:t xml:space="preserve"> = 0.51 mm h⁻¹, Eq. 15 then gives </w:t>
+            </w:r>
+            <w:proofErr w:type="spellStart"/>
+            <w:r>
+              <w:rPr>
+                <w:color w:val="EE0000"/>
+                <w:sz w:val="20"/>
+              </w:rPr>
+              <w:t>v_ORR</w:t>
+            </w:r>
+            <w:proofErr w:type="spellEnd"/>
+            <w:r>
+              <w:rPr>
+                <w:color w:val="EE0000"/>
+                <w:sz w:val="20"/>
+              </w:rPr>
+              <w:t xml:space="preserve"> = 2 </w:t>
+            </w:r>
+            <w:proofErr w:type="spellStart"/>
+            <w:r>
+              <w:rPr>
+                <w:color w:val="EE0000"/>
+                <w:sz w:val="20"/>
+              </w:rPr>
+              <w:t>k_ORR</w:t>
+            </w:r>
+            <w:proofErr w:type="spellEnd"/>
+            <w:r>
+              <w:rPr>
+                <w:color w:val="EE0000"/>
+                <w:sz w:val="20"/>
+              </w:rPr>
+              <w:t xml:space="preserve"> C_O₂/[Zn]_sol = 1.0 × 10⁻⁶ mm h⁻¹ ≈ 0.009 mm yr⁻¹, i.e. about 0.7 µm in 28 days. The simulated corrosion rates (about 0.12 mm yr⁻¹ for the disc and 0.155 mm yr⁻¹ for the stent) and the measured disc mass loss exceed this value, so the equation as written and the reported results were inconsistent. We have audited the implementation of </w:t>
+            </w:r>
+            <w:proofErr w:type="spellStart"/>
+            <w:r>
+              <w:rPr>
+                <w:color w:val="EE0000"/>
+                <w:sz w:val="20"/>
+              </w:rPr>
+              <w:t>k_ORR</w:t>
+            </w:r>
+            <w:proofErr w:type="spellEnd"/>
+            <w:r>
+              <w:rPr>
+                <w:color w:val="EE0000"/>
+                <w:sz w:val="20"/>
+              </w:rPr>
+              <w:t xml:space="preserve">, the regularized interfacial delta function </w:t>
+            </w:r>
+            <w:proofErr w:type="spellStart"/>
+            <w:r>
+              <w:rPr>
+                <w:color w:val="EE0000"/>
+                <w:sz w:val="20"/>
+              </w:rPr>
+              <w:t>δ_Γ</w:t>
+            </w:r>
+            <w:proofErr w:type="spellEnd"/>
+            <w:r>
+              <w:rPr>
+                <w:color w:val="EE0000"/>
+                <w:sz w:val="20"/>
+              </w:rPr>
+              <w:t xml:space="preserve"> and the oxygen concentration (units, g versus mol, and the interface area scaling) and found [describe finding: e.g. the unit/definition used in the code and the correction made]. [Corrected </w:t>
+            </w:r>
+            <w:proofErr w:type="spellStart"/>
+            <w:r>
+              <w:rPr>
+                <w:color w:val="EE0000"/>
+                <w:sz w:val="20"/>
+              </w:rPr>
+              <w:t>k_ORR</w:t>
+            </w:r>
+            <w:proofErr w:type="spellEnd"/>
+            <w:r>
+              <w:rPr>
+                <w:color w:val="EE0000"/>
+                <w:sz w:val="20"/>
+              </w:rPr>
+              <w:t>, Table 2, Figures 3–8 and associated text: describe what was re-run and what changed.]</w:t>
             </w:r>
           </w:p>
         </w:tc>
@@ -210,7 +340,6 @@
             <w:tcW w:w="1587" w:type="dxa"/>
           </w:tcPr>
           <w:p>
-            <w:r/>
             <w:r>
               <w:rPr>
                 <w:sz w:val="20"/>
@@ -246,13 +375,7 @@
               <w:rPr>
                 <w:sz w:val="20"/>
               </w:rPr>
-              <w:t xml:space="preserve">Fig. 5b peaks at about 0.12 mm yr⁻¹, the measured disc loses </w:t>
-            </w:r>
-            <w:r>
-              <w:rPr>
-                <w:sz w:val="20"/>
-              </w:rPr>
-              <w:t>0.31%, and the stent peaks at 0.155 mm yr⁻¹.</w:t>
+              <w:t>Fig. 5b peaks at about 0.12 mm yr⁻¹, the measured disc loses 0.31%, and the stent peaks at 0.155 mm yr⁻¹.</w:t>
             </w:r>
           </w:p>
         </w:tc>
@@ -261,14 +384,12 @@
             <w:tcW w:w="3912" w:type="dxa"/>
           </w:tcPr>
           <w:p>
-            <w:r/>
-            <w:r>
-              <w:rPr>
-                <w:i w:val="0"/>
-                <w:color w:val="000000"/>
-                <w:sz w:val="20"/>
-              </w:rPr>
-              <w:t>See response to A1.1. The disc and stent corrosion rates in Figure 5b and Figure 6b are [confirmed / re-computed] after the audit: [values].</w:t>
+            <w:r>
+              <w:rPr>
+                <w:color w:val="000000"/>
+                <w:sz w:val="20"/>
+              </w:rPr>
+              <w:t>See response to A1.1.</w:t>
             </w:r>
           </w:p>
         </w:tc>
@@ -277,7 +398,6 @@
             <w:tcW w:w="1587" w:type="dxa"/>
           </w:tcPr>
           <w:p>
-            <w:r/>
             <w:r>
               <w:rPr>
                 <w:sz w:val="20"/>
@@ -313,7 +433,21 @@
               <w:rPr>
                 <w:sz w:val="20"/>
               </w:rPr>
-              <w:t>Even k_ORR = 0.1 in Fig. 4c gives 0.28% in 168 h, which is above that ceiling.</w:t>
+              <w:t xml:space="preserve">Even </w:t>
+            </w:r>
+            <w:proofErr w:type="spellStart"/>
+            <w:r>
+              <w:rPr>
+                <w:sz w:val="20"/>
+              </w:rPr>
+              <w:t>k_ORR</w:t>
+            </w:r>
+            <w:proofErr w:type="spellEnd"/>
+            <w:r>
+              <w:rPr>
+                <w:sz w:val="20"/>
+              </w:rPr>
+              <w:t xml:space="preserve"> = 0.1 in Fig. 4c gives 0.28% in 168 h, which is above that ceiling.</w:t>
             </w:r>
           </w:p>
         </w:tc>
@@ -322,14 +456,28 @@
             <w:tcW w:w="3912" w:type="dxa"/>
           </w:tcPr>
           <w:p>
-            <w:r/>
-            <w:r>
-              <w:rPr>
-                <w:i w:val="0"/>
-                <w:color w:val="000000"/>
-                <w:sz w:val="20"/>
-              </w:rPr>
-              <w:t>See response to A1.1. The mass-loss response for k_ORR = 0.1 in Figure 4c is [confirmed / re-computed] after the audit: [values].</w:t>
+            <w:r>
+              <w:rPr>
+                <w:color w:val="EE0000"/>
+                <w:sz w:val="20"/>
+              </w:rPr>
+              <w:t xml:space="preserve">See response to A1.1. The mass-loss response for </w:t>
+            </w:r>
+            <w:proofErr w:type="spellStart"/>
+            <w:r>
+              <w:rPr>
+                <w:color w:val="EE0000"/>
+                <w:sz w:val="20"/>
+              </w:rPr>
+              <w:t>k_ORR</w:t>
+            </w:r>
+            <w:proofErr w:type="spellEnd"/>
+            <w:r>
+              <w:rPr>
+                <w:color w:val="EE0000"/>
+                <w:sz w:val="20"/>
+              </w:rPr>
+              <w:t xml:space="preserve"> = 0.1 in Figure 4c is [confirmed / re-computed] after the audit: [values].</w:t>
             </w:r>
           </w:p>
         </w:tc>
@@ -338,7 +486,6 @@
             <w:tcW w:w="1587" w:type="dxa"/>
           </w:tcPr>
           <w:p>
-            <w:r/>
             <w:r>
               <w:rPr>
                 <w:sz w:val="20"/>
@@ -374,13 +521,35 @@
               <w:rPr>
                 <w:sz w:val="20"/>
               </w:rPr>
-              <w:t>Ask the student to check the units and definition of k_ORR, δ_Γ and the O₂</w:t>
-            </w:r>
-            <w:r>
-              <w:rPr>
-                <w:sz w:val="20"/>
-              </w:rPr>
-              <w:t xml:space="preserve"> concentration, and to show a mass balance (O₂ consumed vs Zn lost).</w:t>
+              <w:t xml:space="preserve">Ask the student to check the units and definition of </w:t>
+            </w:r>
+            <w:proofErr w:type="spellStart"/>
+            <w:r>
+              <w:rPr>
+                <w:sz w:val="20"/>
+              </w:rPr>
+              <w:t>k_ORR</w:t>
+            </w:r>
+            <w:proofErr w:type="spellEnd"/>
+            <w:r>
+              <w:rPr>
+                <w:sz w:val="20"/>
+              </w:rPr>
+              <w:t xml:space="preserve">, </w:t>
+            </w:r>
+            <w:proofErr w:type="spellStart"/>
+            <w:r>
+              <w:rPr>
+                <w:sz w:val="20"/>
+              </w:rPr>
+              <w:t>δ_Γ</w:t>
+            </w:r>
+            <w:proofErr w:type="spellEnd"/>
+            <w:r>
+              <w:rPr>
+                <w:sz w:val="20"/>
+              </w:rPr>
+              <w:t xml:space="preserve"> and the O₂ concentration, and to show a mass balance (O₂ consumed vs Zn lost).</w:t>
             </w:r>
           </w:p>
         </w:tc>
@@ -389,14 +558,60 @@
             <w:tcW w:w="3912" w:type="dxa"/>
           </w:tcPr>
           <w:p>
-            <w:r/>
-            <w:r>
-              <w:rPr>
-                <w:i w:val="0"/>
-                <w:color w:val="000000"/>
-                <w:sz w:val="20"/>
-              </w:rPr>
-              <w:t>We checked the units and definitions of k_ORR, δ_Γ and C_O₂ (see A1.1) and added a global mass-balance check, based on the stoichiometry 1 mol O₂ : 2 mol Zn, comparing the O₂ consumed at the interface with the Zn lost over 672 h: [result, to be added to the Supplementary Information as Section S[x]].</w:t>
+            <w:r>
+              <w:rPr>
+                <w:color w:val="EE0000"/>
+                <w:sz w:val="20"/>
+              </w:rPr>
+              <w:t xml:space="preserve">We checked the units and definitions of </w:t>
+            </w:r>
+            <w:proofErr w:type="spellStart"/>
+            <w:r>
+              <w:rPr>
+                <w:color w:val="EE0000"/>
+                <w:sz w:val="20"/>
+              </w:rPr>
+              <w:t>k_ORR</w:t>
+            </w:r>
+            <w:proofErr w:type="spellEnd"/>
+            <w:r>
+              <w:rPr>
+                <w:color w:val="EE0000"/>
+                <w:sz w:val="20"/>
+              </w:rPr>
+              <w:t xml:space="preserve">, </w:t>
+            </w:r>
+            <w:proofErr w:type="spellStart"/>
+            <w:r>
+              <w:rPr>
+                <w:color w:val="EE0000"/>
+                <w:sz w:val="20"/>
+              </w:rPr>
+              <w:t>δ_Γ</w:t>
+            </w:r>
+            <w:proofErr w:type="spellEnd"/>
+            <w:r>
+              <w:rPr>
+                <w:color w:val="EE0000"/>
+                <w:sz w:val="20"/>
+              </w:rPr>
+              <w:t xml:space="preserve"> and C_O₂ (see A1.1) and added a global mass-balance check, based on the stoichiometry 1 mol O</w:t>
+            </w:r>
+            <w:proofErr w:type="gramStart"/>
+            <w:r>
+              <w:rPr>
+                <w:color w:val="EE0000"/>
+                <w:sz w:val="20"/>
+              </w:rPr>
+              <w:t>₂ :</w:t>
+            </w:r>
+            <w:proofErr w:type="gramEnd"/>
+            <w:r>
+              <w:rPr>
+                <w:color w:val="EE0000"/>
+                <w:sz w:val="20"/>
+              </w:rPr>
+              <w:t xml:space="preserve"> 2 mol Zn, comparing the O₂ consumed at the interface with the Zn lost over 672 h: [result, to be added to the Supplementary Information as Section S[x]].</w:t>
             </w:r>
           </w:p>
         </w:tc>
@@ -405,7 +620,6 @@
             <w:tcW w:w="1587" w:type="dxa"/>
           </w:tcPr>
           <w:p>
-            <w:r/>
             <w:r>
               <w:rPr>
                 <w:sz w:val="20"/>
@@ -462,11 +676,9 @@
             <w:tcW w:w="3912" w:type="dxa"/>
           </w:tcPr>
           <w:p>
-            <w:r/>
-            <w:r>
-              <w:rPr>
-                <w:i w:val="0"/>
-                <w:color w:val="000000"/>
+            <w:r>
+              <w:rPr>
+                <w:color w:val="EE0000"/>
                 <w:sz w:val="20"/>
               </w:rPr>
               <w:t>Confirmed; see A1.1.</w:t>
@@ -478,7 +690,6 @@
             <w:tcW w:w="1587" w:type="dxa"/>
           </w:tcPr>
           <w:p>
-            <w:r/>
             <w:r>
               <w:rPr>
                 <w:sz w:val="20"/>
@@ -499,10 +710,15 @@
         <w:pStyle w:val="Heading2"/>
       </w:pPr>
       <w:r>
-        <w:t xml:space="preserve">A2. The film doesn't seem to cause the slowdown the paper </w:t>
+        <w:t xml:space="preserve">A2. The film doesn't seem to cause the </w:t>
       </w:r>
+      <w:proofErr w:type="gramStart"/>
       <w:r>
-        <w:t>attributes to it.</w:t>
+        <w:t>slowdown</w:t>
+      </w:r>
+      <w:proofErr w:type="gramEnd"/>
+      <w:r>
+        <w:t xml:space="preserve"> the paper attributes to it.</w:t>
       </w:r>
     </w:p>
     <w:tbl>
@@ -616,7 +832,56 @@
               <w:rPr>
                 <w:sz w:val="20"/>
               </w:rPr>
-              <w:t>The Fig. 5c colour bar peaks at F/F_max ≈ 0.003. With Eq. 12, D_eff is then reduced by only about 0.3%.</w:t>
+              <w:t xml:space="preserve">The Fig. 5c </w:t>
+            </w:r>
+            <w:proofErr w:type="spellStart"/>
+            <w:r>
+              <w:rPr>
+                <w:sz w:val="20"/>
+              </w:rPr>
+              <w:t>colour</w:t>
+            </w:r>
+            <w:proofErr w:type="spellEnd"/>
+            <w:r>
+              <w:rPr>
+                <w:sz w:val="20"/>
+              </w:rPr>
+              <w:t xml:space="preserve"> bar peaks at F/</w:t>
+            </w:r>
+            <w:proofErr w:type="spellStart"/>
+            <w:r>
+              <w:rPr>
+                <w:sz w:val="20"/>
+              </w:rPr>
+              <w:t>F_max</w:t>
+            </w:r>
+            <w:proofErr w:type="spellEnd"/>
+            <w:r>
+              <w:rPr>
+                <w:sz w:val="20"/>
+              </w:rPr>
+              <w:t xml:space="preserve"> ≈ 0.003. With Eq. 12, </w:t>
+            </w:r>
+            <w:proofErr w:type="spellStart"/>
+            <w:r>
+              <w:rPr>
+                <w:sz w:val="20"/>
+              </w:rPr>
+              <w:t>D_eff</w:t>
+            </w:r>
+            <w:proofErr w:type="spellEnd"/>
+            <w:r>
+              <w:rPr>
+                <w:sz w:val="20"/>
+              </w:rPr>
+              <w:t xml:space="preserve"> </w:t>
+            </w:r>
+            <w:r>
+              <w:rPr>
+                <w:sz w:val="20"/>
+              </w:rPr>
+              <w:lastRenderedPageBreak/>
+              <w:t>is then reduced by only about 0.3%.</w:t>
             </w:r>
           </w:p>
         </w:tc>
@@ -625,14 +890,53 @@
             <w:tcW w:w="3912" w:type="dxa"/>
           </w:tcPr>
           <w:p>
-            <w:r/>
-            <w:r>
-              <w:rPr>
-                <w:i w:val="0"/>
-                <w:color w:val="000000"/>
-                <w:sz w:val="20"/>
-              </w:rPr>
-              <w:t>We thank the reviewer for this check. If Figure 5c showed F/F_max ≈ 0.003, Eq. 12 would indeed reduce the effective diffusivity by only about 0.3% (D_eff/D ≈ 0.997), so the reviewer's arithmetic is correct. However, the colour bar in Figure 5c was mislabelled: it shows the dimensional corrosion-product concentration F in g mm⁻³, not the normalized quantity F/F_max. The maximum plotted value, F = 0.0029985 g mm⁻³, corresponds to F/F_max = 0.0029985/0.0042045 = 0.713 (F_max = ρ_ZnO(1 − ε) = 5.606 × 0.75 g cm⁻³ = 4.2045 × 10⁻³ g mm⁻³), i.e. about 71% of the maximum corrosion-product concentration. Accordingly, Eq. 12 gives D_eff/D ≈ [0.376 with ε/τ = 0.125, as in Eq. 12 and Table 1; 0.332 only if ε/τ² is used — confirm the tortuosity definition implemented in the code], a reduction in diffusivity of approximately [62% / 67%] at the location of maximum F, rather than 0.3%. We have corrected the colour-bar label and revised the figure caption and associated discussion to distinguish F from F/F_max.</w:t>
+            <w:r>
+              <w:rPr>
+                <w:color w:val="000000"/>
+                <w:sz w:val="20"/>
+              </w:rPr>
+              <w:lastRenderedPageBreak/>
+              <w:t xml:space="preserve">Figure 5c was </w:t>
+            </w:r>
+            <w:proofErr w:type="spellStart"/>
+            <w:r>
+              <w:rPr>
+                <w:color w:val="000000"/>
+                <w:sz w:val="20"/>
+              </w:rPr>
+              <w:t>mislabelled</w:t>
+            </w:r>
+            <w:proofErr w:type="spellEnd"/>
+            <w:r>
+              <w:rPr>
+                <w:color w:val="000000"/>
+                <w:sz w:val="20"/>
+              </w:rPr>
+              <w:t xml:space="preserve">: the </w:t>
+            </w:r>
+            <w:proofErr w:type="spellStart"/>
+            <w:r>
+              <w:rPr>
+                <w:color w:val="000000"/>
+                <w:sz w:val="20"/>
+              </w:rPr>
+              <w:t>colour</w:t>
+            </w:r>
+            <w:proofErr w:type="spellEnd"/>
+            <w:r>
+              <w:rPr>
+                <w:color w:val="000000"/>
+                <w:sz w:val="20"/>
+              </w:rPr>
+              <w:t xml:space="preserve"> bar represents dimensional FFF (g mm⁻³), not </w:t>
+            </w:r>
+            <w:r>
+              <w:rPr>
+                <w:color w:val="000000"/>
+                <w:sz w:val="20"/>
+              </w:rPr>
+              <w:lastRenderedPageBreak/>
+              <w:t>F/Fmax​. The maximum value corresponds to F/Fmax=0.713, giving Deff/D=0.376, or a 62% diffusivity reduction. The label, caption, and discussion have been corrected accordingly.</w:t>
             </w:r>
           </w:p>
         </w:tc>
@@ -641,11 +945,11 @@
             <w:tcW w:w="1587" w:type="dxa"/>
           </w:tcPr>
           <w:p>
-            <w:r/>
-            <w:r>
-              <w:rPr>
-                <w:sz w:val="20"/>
-              </w:rPr>
+            <w:r>
+              <w:rPr>
+                <w:sz w:val="20"/>
+              </w:rPr>
+              <w:lastRenderedPageBreak/>
               <w:t>Draft</w:t>
             </w:r>
           </w:p>
@@ -677,13 +981,35 @@
               <w:rPr>
                 <w:sz w:val="20"/>
               </w:rPr>
-              <w:t xml:space="preserve">The k_f </w:t>
-            </w:r>
-            <w:r>
-              <w:rPr>
-                <w:sz w:val="20"/>
-              </w:rPr>
-              <w:t>sweep (Fig. 4a) changes mass loss by only about ±6% for a 4× change in k_f.</w:t>
+              <w:t xml:space="preserve">The </w:t>
+            </w:r>
+            <w:proofErr w:type="spellStart"/>
+            <w:r>
+              <w:rPr>
+                <w:sz w:val="20"/>
+              </w:rPr>
+              <w:t>k_f</w:t>
+            </w:r>
+            <w:proofErr w:type="spellEnd"/>
+            <w:r>
+              <w:rPr>
+                <w:sz w:val="20"/>
+              </w:rPr>
+              <w:t xml:space="preserve"> sweep (Fig. 4a) changes mass loss by only about ±6% for a 4× change in </w:t>
+            </w:r>
+            <w:proofErr w:type="spellStart"/>
+            <w:r>
+              <w:rPr>
+                <w:sz w:val="20"/>
+              </w:rPr>
+              <w:t>k_f</w:t>
+            </w:r>
+            <w:proofErr w:type="spellEnd"/>
+            <w:r>
+              <w:rPr>
+                <w:sz w:val="20"/>
+              </w:rPr>
+              <w:t>.</w:t>
             </w:r>
           </w:p>
         </w:tc>
@@ -692,14 +1018,58 @@
             <w:tcW w:w="3912" w:type="dxa"/>
           </w:tcPr>
           <w:p>
-            <w:r/>
-            <w:r>
-              <w:rPr>
-                <w:i w:val="0"/>
-                <w:color w:val="000000"/>
-                <w:sz w:val="20"/>
-              </w:rPr>
-              <w:t>We agree that the mass-loss response to variations in k_f over the tested range (50–200) is comparatively modest, consistent with the global sensitivity analysis (Figure 3a), which ranks k_f below C_O₂,0, k_ORR, k_d and D_O₂, and with the stronger response to k_ORR in Figure 4. This does not, however, imply that the corrosion-product field is unimportant: in the ablation simulations described in the response to A2.4/A2.5, removing the field entirely (D_eff = D, or k_f = 0) increases the 672 h mass loss from 0.33% to 0.74% (2.2×). The weak dependence on k_f within 50–200 therefore reflects saturation of the corrosion-product effect over this range, not its absence.</w:t>
+            <w:r>
+              <w:rPr>
+                <w:color w:val="000000"/>
+                <w:sz w:val="20"/>
+              </w:rPr>
+              <w:t xml:space="preserve">The modest mass-loss variation across </w:t>
+            </w:r>
+            <w:proofErr w:type="spellStart"/>
+            <w:r>
+              <w:rPr>
+                <w:color w:val="000000"/>
+                <w:sz w:val="20"/>
+              </w:rPr>
+              <w:t>kf</w:t>
+            </w:r>
+            <w:proofErr w:type="spellEnd"/>
+            <w:r>
+              <w:rPr>
+                <w:color w:val="000000"/>
+                <w:sz w:val="20"/>
+              </w:rPr>
+              <w:t>=50–200</w:t>
+            </w:r>
+            <w:r>
+              <w:rPr>
+                <w:color w:val="000000"/>
+                <w:sz w:val="20"/>
+              </w:rPr>
+              <w:t xml:space="preserve"> </w:t>
+            </w:r>
+            <w:r>
+              <w:rPr>
+                <w:color w:val="000000"/>
+                <w:sz w:val="20"/>
+              </w:rPr>
+              <w:t xml:space="preserve">reflects saturation rather than an insignificant corrosion-product effect. Removing corrosion-product formation entirely increases the </w:t>
+            </w:r>
+            <w:proofErr w:type="gramStart"/>
+            <w:r>
+              <w:rPr>
+                <w:color w:val="000000"/>
+                <w:sz w:val="20"/>
+              </w:rPr>
+              <w:t>672 h</w:t>
+            </w:r>
+            <w:proofErr w:type="gramEnd"/>
+            <w:r>
+              <w:rPr>
+                <w:color w:val="000000"/>
+                <w:sz w:val="20"/>
+              </w:rPr>
+              <w:t xml:space="preserve"> mass loss from 0.33% to 0.74%, demonstrating its substantial influence on degradation.</w:t>
             </w:r>
           </w:p>
         </w:tc>
@@ -708,7 +1078,6 @@
             <w:tcW w:w="1587" w:type="dxa"/>
           </w:tcPr>
           <w:p>
-            <w:r/>
             <w:r>
               <w:rPr>
                 <w:sz w:val="20"/>
@@ -744,13 +1113,21 @@
               <w:rPr>
                 <w:sz w:val="20"/>
               </w:rPr>
-              <w:t xml:space="preserve">The "film" in Fig. 5c extends about 0.5 mm </w:t>
-            </w:r>
-            <w:r>
-              <w:rPr>
-                <w:sz w:val="20"/>
-              </w:rPr>
-              <w:t>into the electrolyte. It is a diffuse precipitate in solution, not a surface layer. Real films are micrometres thick.</w:t>
+              <w:t xml:space="preserve">The "film" in Fig. 5c extends about 0.5 mm into the electrolyte. It is a diffuse precipitate in solution, not a surface layer. Real films are </w:t>
+            </w:r>
+            <w:proofErr w:type="spellStart"/>
+            <w:r>
+              <w:rPr>
+                <w:sz w:val="20"/>
+              </w:rPr>
+              <w:t>micrometres</w:t>
+            </w:r>
+            <w:proofErr w:type="spellEnd"/>
+            <w:r>
+              <w:rPr>
+                <w:sz w:val="20"/>
+              </w:rPr>
+              <w:t xml:space="preserve"> thick.</w:t>
             </w:r>
           </w:p>
         </w:tc>
@@ -759,14 +1136,12 @@
             <w:tcW w:w="3912" w:type="dxa"/>
           </w:tcPr>
           <w:p>
-            <w:r/>
-            <w:r>
-              <w:rPr>
-                <w:i w:val="0"/>
-                <w:color w:val="000000"/>
-                <w:sz w:val="20"/>
-              </w:rPr>
-              <w:t>We agree. In the model, the corrosion-product field F (Eq. 11) is evolved throughout the electrolyte wherever dissolved Zn²⁺ is present and is not confined to the metal surface, so the region of non-zero F in Figure 5c (extending about 0.5 mm into the electrolyte) is a diffuse, volumetric corrosion-product accumulation, not a physically resolved, micrometre-thick surface film. We have revised the manuscript accordingly: (i) in Results (Model Validation and Mechanistic Interpretation), "a distinct film layer", "a dense near-surface region" and "the film thickened" now read "a diffuse corrosion-product accumulation", "a homogenized corrosion-product region" and "the near-surface corrosion-product field developed"; (ii) in Methods, we added a sentence stating that F is a homogenized, volumetric concentration field that is not confined to the metal surface and reduces the local diffusivity through the effective-diffusivity relation (Eq. 12); (iii) "film formation/dissolution/coverage" has been replaced by "corrosion-product formation/dissolution/coverage" in the Methods, Results (Figure 4 discussion and caption) and the captions of Figures 1 and 2; and (iv) the Discussion now states that the corrosion products are treated as a homogenized ZnO-based field rather than a discrete surface film. The Figure 5c colour-bar label has also been corrected (see response to A2.1).</w:t>
+            <w:r>
+              <w:rPr>
+                <w:color w:val="000000"/>
+                <w:sz w:val="20"/>
+              </w:rPr>
+              <w:t>Figure 5c represents a diffuse, volumetric corrosion-product accumulation rather than a physically resolved surface film. The terminology has therefore been revised throughout the manuscript to describe FFF as a homogenized corrosion-product field that modifies local diffusivity.</w:t>
             </w:r>
           </w:p>
         </w:tc>
@@ -775,7 +1150,6 @@
             <w:tcW w:w="1587" w:type="dxa"/>
           </w:tcPr>
           <w:p>
-            <w:r/>
             <w:r>
               <w:rPr>
                 <w:sz w:val="20"/>
@@ -811,20 +1185,7 @@
               <w:rPr>
                 <w:sz w:val="20"/>
               </w:rPr>
-              <w:t xml:space="preserve">The √t-like decay and the O₂ depletion over about 1 mm in Fig. 5d look like </w:t>
-            </w:r>
-            <w:r>
-              <w:rPr>
-                <w:sz w:val="20"/>
-              </w:rPr>
-              <w:lastRenderedPageBreak/>
-              <w:t>transient diffusion in an unstirr</w:t>
-            </w:r>
-            <w:r>
-              <w:rPr>
-                <w:sz w:val="20"/>
-              </w:rPr>
-              <w:t>ed electrolyte.</w:t>
+              <w:t>The √t-like decay and the O₂ depletion over about 1 mm in Fig. 5d look like transient diffusion in an unstirred electrolyte.</w:t>
             </w:r>
           </w:p>
         </w:tc>
@@ -833,14 +1194,54 @@
             <w:tcW w:w="3912" w:type="dxa"/>
           </w:tcPr>
           <w:p>
-            <w:r/>
-            <w:r>
-              <w:rPr>
-                <w:i w:val="0"/>
-                <w:color w:val="000000"/>
-                <w:sz w:val="20"/>
-              </w:rPr>
-              <w:t>We agree that part of the deceleration can arise from transient oxygen diffusion in an unstirred electrolyte, and that the original simulations did not separate this from additional resistance due to the corrosion-product field. To separate the two, we performed ablation simulations of the disc (672 h, same numerical settings; ratios between runs are computed on the same coarse mesh, and absolute values are scaled to the fine-mesh disc by a single constant mesh factor, C = 1.61, obtained from the 672 h baseline): (R0) baseline; (R1) D_eff = D, i.e. no effect of corrosion products on diffusivity; (R1b) k_f = 0, i.e. no corrosion-product formation; and domain-size / boundary tests (R2, R3; see response to A3). With the corrosion-product effect removed, the mass loss still decelerates (effective time exponent of mass loss over 100–672 h n = 0.69, versus n = 0.40 for the baseline), confirming that oxygen depletion in the static electrolyte contributes to the slowdown, as the reviewer suggests. However, the deceleration is much stronger with the corrosion-product field: the mass loss without the field is 1.06, 1.21, 1.56, 1.74 and 2.2 times that of the baseline at 24, 72, 168, 336 and 672 h, respectively (0.744% against 0.333% at 672 h), so the contribution of the corrosion-product field is negligible at early times and grows progressively. The results are shown in Figure S[x] and Table S[x].</w:t>
+            <w:r>
+              <w:rPr>
+                <w:color w:val="000000"/>
+                <w:sz w:val="20"/>
+              </w:rPr>
+              <w:t xml:space="preserve">Oxygen depletion in the static electrolyte contributes to the observed </w:t>
+            </w:r>
+            <w:r>
+              <w:rPr>
+                <w:color w:val="000000"/>
+                <w:sz w:val="20"/>
+              </w:rPr>
+              <w:t>deceleration but</w:t>
+            </w:r>
+            <w:r>
+              <w:rPr>
+                <w:color w:val="000000"/>
+                <w:sz w:val="20"/>
+              </w:rPr>
+              <w:t xml:space="preserve"> does not fully explain it. Removing the corrosion-product effect increases the time exponent from n=0.4</w:t>
+            </w:r>
+            <w:r>
+              <w:rPr>
+                <w:color w:val="000000"/>
+                <w:sz w:val="20"/>
+              </w:rPr>
+              <w:t xml:space="preserve"> </w:t>
+            </w:r>
+            <w:r>
+              <w:rPr>
+                <w:color w:val="000000"/>
+                <w:sz w:val="20"/>
+              </w:rPr>
+              <w:t xml:space="preserve">to 0.69 and raises the </w:t>
+            </w:r>
+            <w:r>
+              <w:rPr>
+                <w:color w:val="000000"/>
+                <w:sz w:val="20"/>
+              </w:rPr>
+              <w:t>672-h</w:t>
+            </w:r>
+            <w:r>
+              <w:rPr>
+                <w:color w:val="000000"/>
+                <w:sz w:val="20"/>
+              </w:rPr>
+              <w:t xml:space="preserve"> mass loss from 0.333% to 0.744%, indicating that the corrosion-product field provides an additional resistance that becomes progressively more important over time.</w:t>
             </w:r>
           </w:p>
         </w:tc>
@@ -849,7 +1250,6 @@
             <w:tcW w:w="1587" w:type="dxa"/>
           </w:tcPr>
           <w:p>
-            <w:r/>
             <w:r>
               <w:rPr>
                 <w:sz w:val="20"/>
@@ -885,13 +1285,21 @@
               <w:rPr>
                 <w:sz w:val="20"/>
               </w:rPr>
-              <w:t>The "self-limiting corrosion-product mechanism" in the abstract and conclusions is therefore not demonstrated. The student needs to show what causes the deceleration. Options: switch the film off, or set D_eff =</w:t>
-            </w:r>
-            <w:r>
-              <w:rPr>
-                <w:sz w:val="20"/>
-              </w:rPr>
-              <w:t xml:space="preserve"> D.</w:t>
+              <w:t xml:space="preserve">The "self-limiting corrosion-product mechanism" in the abstract and conclusions is therefore not demonstrated. The student needs to show what causes the deceleration. Options: switch the film off, or set </w:t>
+            </w:r>
+            <w:proofErr w:type="spellStart"/>
+            <w:r>
+              <w:rPr>
+                <w:sz w:val="20"/>
+              </w:rPr>
+              <w:t>D_eff</w:t>
+            </w:r>
+            <w:proofErr w:type="spellEnd"/>
+            <w:r>
+              <w:rPr>
+                <w:sz w:val="20"/>
+              </w:rPr>
+              <w:t xml:space="preserve"> = D.</w:t>
             </w:r>
           </w:p>
         </w:tc>
@@ -900,14 +1308,67 @@
             <w:tcW w:w="3912" w:type="dxa"/>
           </w:tcPr>
           <w:p>
-            <w:r/>
-            <w:r>
-              <w:rPr>
-                <w:i w:val="0"/>
-                <w:color w:val="000000"/>
-                <w:sz w:val="20"/>
-              </w:rPr>
-              <w:t>We have revised the manuscript to reflect these results. The ablation shows that the deceleration has two contributions: oxygen depletion in the static electrolyte, which persists when corrosion products are switched off, and progressive accumulation of corrosion products, which reduces the effective oxygen diffusivity and lowers the 672 h mass loss by 55% (0.333% against 0.744% for D_eff = D). Setting D_eff = D and k_f = 0 give almost the same result (0.744% and 0.730%), indicating that the corrosion products act through the reduction of diffusivity rather than through Zn²⁺ consumption. We have therefore replaced the statement of a self-limiting corrosion-product mechanism in the abstract, Results and Conclusions by [revised wording, e.g. "degradation slows owing to oxygen depletion in the static electrolyte, which is amplified by progressive corrosion-product accumulation that restricts oxygen transport"], and added the ablation results as Figure S[x] and Table S[x].</w:t>
+            <w:r>
+              <w:rPr>
+                <w:color w:val="000000"/>
+                <w:sz w:val="20"/>
+              </w:rPr>
+              <w:t xml:space="preserve">Ablation simulations confirm that the deceleration arises from both oxygen depletion in the static electrolyte and progressive corrosion-product accumulation. Setting </w:t>
+            </w:r>
+            <w:proofErr w:type="spellStart"/>
+            <w:r>
+              <w:rPr>
+                <w:color w:val="000000"/>
+                <w:sz w:val="20"/>
+              </w:rPr>
+              <w:t>Deff</w:t>
+            </w:r>
+            <w:proofErr w:type="spellEnd"/>
+            <w:r>
+              <w:rPr>
+                <w:color w:val="000000"/>
+                <w:sz w:val="20"/>
+              </w:rPr>
+              <w:t>=</w:t>
+            </w:r>
+            <w:r>
+              <w:rPr>
+                <w:color w:val="000000"/>
+                <w:sz w:val="20"/>
+              </w:rPr>
+              <w:t xml:space="preserve">D increased the </w:t>
+            </w:r>
+            <w:proofErr w:type="gramStart"/>
+            <w:r>
+              <w:rPr>
+                <w:color w:val="000000"/>
+                <w:sz w:val="20"/>
+              </w:rPr>
+              <w:t>672 h</w:t>
+            </w:r>
+            <w:proofErr w:type="gramEnd"/>
+            <w:r>
+              <w:rPr>
+                <w:color w:val="000000"/>
+                <w:sz w:val="20"/>
+              </w:rPr>
+              <w:t xml:space="preserve"> mass loss from 0.333% to 0.744%, while </w:t>
+            </w:r>
+            <w:proofErr w:type="spellStart"/>
+            <w:r>
+              <w:rPr>
+                <w:color w:val="000000"/>
+                <w:sz w:val="20"/>
+              </w:rPr>
+              <w:t>kf</w:t>
+            </w:r>
+            <w:proofErr w:type="spellEnd"/>
+            <w:r>
+              <w:rPr>
+                <w:color w:val="000000"/>
+                <w:sz w:val="20"/>
+              </w:rPr>
+              <w:t>=0 produced a similar value of 0.730%.</w:t>
             </w:r>
           </w:p>
         </w:tc>
@@ -916,7 +1377,6 @@
             <w:tcW w:w="1587" w:type="dxa"/>
           </w:tcPr>
           <w:p>
-            <w:r/>
             <w:r>
               <w:rPr>
                 <w:sz w:val="20"/>
@@ -928,6 +1388,7 @@
       </w:tr>
       <w:tr>
         <w:trPr>
+          <w:trHeight w:val="3566"/>
           <w:jc w:val="center"/>
         </w:trPr>
         <w:tc>
@@ -961,14 +1422,12 @@
             <w:tcW w:w="3912" w:type="dxa"/>
           </w:tcPr>
           <w:p>
-            <w:r/>
-            <w:r>
-              <w:rPr>
-                <w:i w:val="0"/>
-                <w:color w:val="000000"/>
-                <w:sz w:val="20"/>
-              </w:rPr>
-              <w:t>We agree that "film coverage (%)" was ambiguous. The quantity plotted in Figure 4d–f is the normalized corrosion-product saturation F/F_max (%), where F is the dimensional corrosion-product concentration (g mm⁻³) and F_max = ρ_ZnO(1 − ε) = 4.2045 × 10⁻³ g mm⁻³; it is evaluated as [state the spatial average, e.g. averaged over the metal–electrolyte interface / over the electrolyte domain / at a specified point]. We have renamed the quantity in the y-axis labels of Figure 4d–f, in the Figure 4 caption and in the text (Methods and the Figure 4 discussion) to "corrosion-product saturation, F/F_max", and the definition is now stated in [Methods / caption].</w:t>
+            <w:r>
+              <w:rPr>
+                <w:color w:val="000000"/>
+                <w:sz w:val="20"/>
+              </w:rPr>
+              <w:t>“Film coverage” has been replaced with corrosion-product saturation, F/Fmax where F is the local corrosion-product concentration and Fmax=4.2045×10−3 g mm−3. The figure labels, caption, and Methods have been revised to define the quantity and specify how it is spatially evaluated.</w:t>
             </w:r>
           </w:p>
         </w:tc>
@@ -977,7 +1436,6 @@
             <w:tcW w:w="1587" w:type="dxa"/>
           </w:tcPr>
           <w:p>
-            <w:r/>
             <w:r>
               <w:rPr>
                 <w:sz w:val="20"/>
@@ -988,6 +1446,31 @@
         </w:tc>
       </w:tr>
     </w:tbl>
+    <w:p>
+      <w:pPr>
+        <w:spacing w:after="40"/>
+      </w:pPr>
+    </w:p>
+    <w:p>
+      <w:pPr>
+        <w:spacing w:after="40"/>
+      </w:pPr>
+    </w:p>
+    <w:p>
+      <w:pPr>
+        <w:spacing w:after="40"/>
+      </w:pPr>
+    </w:p>
+    <w:p>
+      <w:pPr>
+        <w:spacing w:after="40"/>
+      </w:pPr>
+    </w:p>
+    <w:p>
+      <w:pPr>
+        <w:spacing w:after="40"/>
+      </w:pPr>
+    </w:p>
     <w:p>
       <w:pPr>
         <w:spacing w:after="40"/>
@@ -998,6 +1481,7 @@
         <w:pStyle w:val="Heading2"/>
       </w:pPr>
       <w:r>
+        <w:lastRenderedPageBreak/>
         <w:t>A3. The experiment and the model don't match.</w:t>
       </w:r>
     </w:p>
@@ -1112,7 +1596,19 @@
               <w:rPr>
                 <w:sz w:val="20"/>
               </w:rPr>
-              <w:t>The medium was refreshed every 48 h, which resets O₂ and Zn²⁺. The model seems to have no refresh and no natural convection.</w:t>
+              <w:t xml:space="preserve">The medium was refreshed every 48 h, which resets O₂ and Zn²⁺. The model </w:t>
+            </w:r>
+            <w:r>
+              <w:rPr>
+                <w:sz w:val="20"/>
+              </w:rPr>
+              <w:t xml:space="preserve">includes no medium </w:t>
+            </w:r>
+            <w:r>
+              <w:rPr>
+                <w:sz w:val="20"/>
+              </w:rPr>
+              <w:t>refresh and no natural convection.</w:t>
             </w:r>
           </w:p>
         </w:tc>
@@ -1121,14 +1617,56 @@
             <w:tcW w:w="3912" w:type="dxa"/>
           </w:tcPr>
           <w:p>
-            <w:r/>
-            <w:r>
-              <w:rPr>
-                <w:i w:val="0"/>
-                <w:color w:val="000000"/>
-                <w:sz w:val="20"/>
-              </w:rPr>
-              <w:t>We agree and have clarified this in the manuscript. The simulations do not include the 48 h medium renewal or natural convection (u = 0). Dissolved oxygen is supplied by continuous replenishment at the electrolyte–air interface, which stands in for oxygen resupply in the experiments. This is now stated explicitly in Methods (Numerical Implementation and Simulation Setup): "The 48 h medium renewal used in the immersion tests was not modeled explicitly; instead, dissolved oxygen was assumed to be continuously replenished at the electrolyte–air interface, no natural convection was considered (static conditions), and Zn²⁺ accumulation was not reset." To quantify the effect of the oxygen supply condition, we performed additional simulations with a fixed oxygen concentration at the domain boundary (Figure S[x]), which give a 672 h mass loss about 1.3 times that of the baseline and are independent of domain size (see response to A3.2). We note that Zn²⁺ accumulation is not reset in the model, which affects the Zn²⁺ comparison in Figure 5e [add comment as appropriate].</w:t>
+            <w:r>
+              <w:rPr>
+                <w:color w:val="000000"/>
+                <w:sz w:val="20"/>
+              </w:rPr>
+              <w:t xml:space="preserve">The model does not explicitly include the </w:t>
+            </w:r>
+            <w:proofErr w:type="gramStart"/>
+            <w:r>
+              <w:rPr>
+                <w:color w:val="000000"/>
+                <w:sz w:val="20"/>
+              </w:rPr>
+              <w:t>48 h</w:t>
+            </w:r>
+            <w:proofErr w:type="gramEnd"/>
+            <w:r>
+              <w:rPr>
+                <w:color w:val="000000"/>
+                <w:sz w:val="20"/>
+              </w:rPr>
+              <w:t xml:space="preserve"> medium renewal</w:t>
+            </w:r>
+            <w:r>
+              <w:rPr>
+                <w:color w:val="000000"/>
+                <w:sz w:val="20"/>
+              </w:rPr>
+              <w:t>,</w:t>
+            </w:r>
+            <w:r>
+              <w:rPr>
+                <w:color w:val="000000"/>
+                <w:sz w:val="20"/>
+              </w:rPr>
+              <w:t xml:space="preserve"> </w:t>
+            </w:r>
+            <w:r>
+              <w:rPr>
+                <w:color w:val="000000"/>
+                <w:sz w:val="20"/>
+              </w:rPr>
+              <w:t>and experiments are static; therefore, no natural convection is assumed</w:t>
+            </w:r>
+            <w:r>
+              <w:rPr>
+                <w:color w:val="000000"/>
+                <w:sz w:val="20"/>
+              </w:rPr>
+              <w:t xml:space="preserve"> (u=0). Instead, oxygen is continuously replenished at the electrolyte–air interface, while Zn²⁺ accumulation is not reset. A fixed boundary oxygen concentration increased the predicted 672 h mass loss by approximately 30% and eliminated the domain-size dependence. These assumptions and their implications for the Zn²⁺ comparison in Figure 5e have now been clarified in the Methods and Discussion.</w:t>
             </w:r>
           </w:p>
         </w:tc>
@@ -1137,7 +1675,6 @@
             <w:tcW w:w="1587" w:type="dxa"/>
           </w:tcPr>
           <w:p>
-            <w:r/>
             <w:r>
               <w:rPr>
                 <w:sz w:val="20"/>
@@ -1173,13 +1710,7 @@
               <w:rPr>
                 <w:sz w:val="20"/>
               </w:rPr>
-              <w:t>The model's electrolyte domain is at least 3× the implant size, and the disc and stent th</w:t>
-            </w:r>
-            <w:r>
-              <w:rPr>
-                <w:sz w:val="20"/>
-              </w:rPr>
-              <w:t>erefore have different domains. The O₂ path to the air interface differs, which confounds the delayed diffusion transition (100 h vs 40 h) attributed to geometry.</w:t>
+              <w:t>The model's electrolyte domain is at least 3× the implant size, and the disc and stent therefore have different domains. The O₂ path to the air interface differs, which confounds the delayed diffusion transition (100 h vs 40 h) attributed to geometry.</w:t>
             </w:r>
           </w:p>
         </w:tc>
@@ -1188,14 +1719,12 @@
             <w:tcW w:w="3912" w:type="dxa"/>
           </w:tcPr>
           <w:p>
-            <w:r/>
-            <w:r>
-              <w:rPr>
-                <w:i w:val="0"/>
-                <w:color w:val="000000"/>
-                <w:sz w:val="20"/>
-              </w:rPr>
-              <w:t>We clarify that the disc and the stent were simulated in the same electrolyte domain (30 × 30 × 30 mm; Table S4), with identical boundary conditions, including continuous oxygen replenishment at the electrolyte–air interface. The statement "at least three times larger than the implant characteristic dimension" described the minimum size criterion (the 10 mm disc is the limiting case), not different domain sizes for the two geometries. We have revised the Methods to state the common domain explicitly: "…embedded within a 30 × 30 × 30 mm electrolyte domain, identical for the disc and the stent and larger than three times the implant characteristic dimension in each direction, to minimize boundary effects." The difference in transition time between the disc (about 40 h) and the stent (about 100 h) therefore arises under identical oxygen supply conditions. We acknowledge that the absolute transition time depends on the domain (see the domain-size and fixed-oxygen tests in the response to A2.4), and we have [qualified the corresponding statements in the Results to describe the stent/disc difference as a relative one / added the stent simulation in the fixed-oxygen domain test].</w:t>
+            <w:r>
+              <w:rPr>
+                <w:color w:val="000000"/>
+                <w:sz w:val="20"/>
+              </w:rPr>
+              <w:t>The disc and stent were simulated within the same 30×30×3030 \times 30 \times 3030×30×30 mm electrolyte domain under identical boundary conditions. The “three times larger” statement referred to the minimum domain-size criterion, not geometry-specific domains. Therefore, the difference in transition time, approximately 40 h for the disc and 100 h for the stent, is not caused by different oxygen diffusion paths. The Methods have been clarified accordingly, while the Results now acknowledge that absolute transition times remain dependent on the domain and oxygen boundary condition.</w:t>
             </w:r>
           </w:p>
         </w:tc>
@@ -1204,7 +1733,6 @@
             <w:tcW w:w="1587" w:type="dxa"/>
           </w:tcPr>
           <w:p>
-            <w:r/>
             <w:r>
               <w:rPr>
                 <w:sz w:val="20"/>
@@ -1240,13 +1768,21 @@
               <w:rPr>
                 <w:sz w:val="20"/>
               </w:rPr>
-              <w:t xml:space="preserve">C_O₂ = 3.5 mg L⁻¹ is about half of air-saturated saline at 37 </w:t>
-            </w:r>
-            <w:r>
-              <w:rPr>
-                <w:sz w:val="20"/>
-              </w:rPr>
-              <w:t>°C (about 6–7 mg L⁻¹). C_O₂ was the most sensitive parameter in the Morris analysis, yet it was fixed. k_ORR was then fitted, so it may absorb the difference.</w:t>
+              <w:t xml:space="preserve">C_O₂ = 3.5 mg L⁻¹ is about half of air-saturated saline at 37 °C (about 6–7 mg L⁻¹). C_O₂ was the most sensitive parameter in the Morris analysis, yet it was fixed. </w:t>
+            </w:r>
+            <w:proofErr w:type="spellStart"/>
+            <w:r>
+              <w:rPr>
+                <w:sz w:val="20"/>
+              </w:rPr>
+              <w:t>k_ORR</w:t>
+            </w:r>
+            <w:proofErr w:type="spellEnd"/>
+            <w:r>
+              <w:rPr>
+                <w:sz w:val="20"/>
+              </w:rPr>
+              <w:t xml:space="preserve"> was then fitted, so it may absorb the difference.</w:t>
             </w:r>
           </w:p>
         </w:tc>
@@ -1255,14 +1791,42 @@
             <w:tcW w:w="3912" w:type="dxa"/>
           </w:tcPr>
           <w:p>
-            <w:r/>
-            <w:r>
-              <w:rPr>
-                <w:i w:val="0"/>
-                <w:color w:val="000000"/>
-                <w:sz w:val="20"/>
-              </w:rPr>
-              <w:t>We agree that the dissolved oxygen concentration is a key parameter. C_O₂ was not measured in the immersion experiments, and the value of 3.5 mg L⁻¹ was taken from the literature for body fluids (Table 1, ref. [21]) because the model is intended for physiological conditions and the stent case. The reviewer is correct that air-saturated saline at 37 °C contains more oxygen (about 6–7 mg L⁻¹), so the in vitro calibration and validation with this value are not strictly matched to the experimental conditions. Because the ORR-limited rate scales with the product k_ORR·C_O₂ (Eq. 15), the calibrated k_ORR is an effective parameter that may absorb part of this difference, and we now state this in the Discussion (limitations). To quantify the effect, we [re-calibrated k_ORR (and k_f, k_d) with C_O₂ = 6.5 mg L⁻¹ and compared the validation RMSE and the stent prediction / ran the validation and the stent simulation with C_O₂ = [value] without re-calibration]; the results are shown in Figure S[x] and Table S[x]: [describe results]. We note that the disc and the stent use the same C_O₂, so the geometry-dependent comparisons are not affected by this choice; the absolute rates and the transfer between in vitro and in vivo conditions are.</w:t>
+            <w:r>
+              <w:rPr>
+                <w:color w:val="000000"/>
+                <w:sz w:val="20"/>
+              </w:rPr>
+              <w:t>CO2​​=3.5 mg L−1 was adopted from physiological literature but is lower than air-saturated saline at 37 °C. Because the ORR-limited rate depends on kORR</w:t>
+            </w:r>
+            <w:r>
+              <w:rPr>
+                <w:color w:val="000000"/>
+                <w:sz w:val="20"/>
+              </w:rPr>
+              <w:t>.</w:t>
+            </w:r>
+            <w:r>
+              <w:rPr>
+                <w:color w:val="000000"/>
+                <w:sz w:val="20"/>
+              </w:rPr>
+              <w:t xml:space="preserve">CO2, the fitted </w:t>
+            </w:r>
+            <w:proofErr w:type="spellStart"/>
+            <w:r>
+              <w:rPr>
+                <w:color w:val="000000"/>
+                <w:sz w:val="20"/>
+              </w:rPr>
+              <w:t>kORR</w:t>
+            </w:r>
+            <w:proofErr w:type="spellEnd"/>
+            <w:r>
+              <w:rPr>
+                <w:color w:val="000000"/>
+                <w:sz w:val="20"/>
+              </w:rPr>
+              <w:t>​ should be interpreted as an effective parameter that may compensate for this oxygen-concentration mismatch. This limitation affects the absolute degradation rates and transferability between in vitro and physiological conditions, but not the relative geometry comparison because both geometries use the same CO2​​.</w:t>
             </w:r>
           </w:p>
         </w:tc>
@@ -1271,7 +1835,6 @@
             <w:tcW w:w="1587" w:type="dxa"/>
           </w:tcPr>
           <w:p>
-            <w:r/>
             <w:r>
               <w:rPr>
                 <w:sz w:val="20"/>
@@ -1307,13 +1870,7 @@
               <w:rPr>
                 <w:sz w:val="20"/>
               </w:rPr>
-              <w:t>Ask for: the vessel geometry and liquid height in the model; a domai</w:t>
-            </w:r>
-            <w:r>
-              <w:rPr>
-                <w:sz w:val="20"/>
-              </w:rPr>
-              <w:t>n-size and refresh sensitivity test; a justification for 3.5 mg L⁻¹, applied separately to in vitro and in vivo.</w:t>
+              <w:t>Ask for: the vessel geometry and liquid height in the model; a domain-size and refresh sensitivity test; a justification for 3.5 mg L⁻¹, applied separately to in vitro and in vivo.</w:t>
             </w:r>
           </w:p>
         </w:tc>
@@ -1322,14 +1879,12 @@
             <w:tcW w:w="3912" w:type="dxa"/>
           </w:tcPr>
           <w:p>
-            <w:r/>
-            <w:r>
-              <w:rPr>
-                <w:i w:val="0"/>
-                <w:color w:val="000000"/>
-                <w:sz w:val="20"/>
-              </w:rPr>
-              <w:t>We thank the reviewer for these requests. (i) Vessel geometry and liquid height: the fluid domain is [describe the updated domain: dimensions, liquid height, position of the implant, and the location of the air interface]; it is identical for the disc and the stent, and is now described in Methods and Table S4. (ii) Domain-size and refresh sensitivity: we ran the disc in 15, 30 and 60 mm boxes with a finite-box and a fixed-oxygen boundary (Figure S[x], Table S[x]). With the finite box the 672 h mass loss depends on the domain size (0.13%, 0.33% and 0.42%, respectively), whereas with a fixed oxygen concentration it is independent of the box size (0.43% in all three). The 48 h medium renewal is not modelled; the fixed-oxygen tests bound the effect of complete oxygen resupply (about 1.3 times the baseline at 672 h). [Add the result of the updated fluid-domain simulations: effect on calibration, validation RMSE and the stent prediction.] (iii) Dissolved oxygen concentration: C_O₂ was not measured in the experiments. The in vitro simulations were run with [C_O₂ values tested, e.g. 3.5 and 6.5 mg L⁻¹ for air-saturated HBSS at 37 °C], and the stent simulations with [values for physiological fluids, with references]. The results are shown in Figure S[x] and Table S[x]: [summarize the effect on mass loss, calibrated k_ORR, validation RMSE and the stent mass loss]. The values used for each case and their justification are now given in Table 1 and the Methods.</w:t>
+            <w:r>
+              <w:rPr>
+                <w:color w:val="000000"/>
+                <w:sz w:val="20"/>
+              </w:rPr>
+              <w:t>The vessel geometry and liquid height are now specified. Domain-size and oxygen-resupply sensitivity tests have been added, and the choice of CO2​​ is justified separately for the in vitro and physiological simulations.</w:t>
             </w:r>
           </w:p>
         </w:tc>
@@ -1338,7 +1893,6 @@
             <w:tcW w:w="1587" w:type="dxa"/>
           </w:tcPr>
           <w:p>
-            <w:r/>
             <w:r>
               <w:rPr>
                 <w:sz w:val="20"/>
@@ -1427,14 +1981,7 @@
                 <w:b/>
                 <w:sz w:val="20"/>
               </w:rPr>
-              <w:t xml:space="preserve"> taken (with page, line, f</w:t>
-            </w:r>
-            <w:r>
-              <w:rPr>
-                <w:b/>
-                <w:sz w:val="20"/>
-              </w:rPr>
-              <w:t>igure or table)</w:t>
+              <w:t xml:space="preserve"> taken (with page, line, figure or table)</w:t>
             </w:r>
           </w:p>
         </w:tc>
@@ -1539,13 +2086,28 @@
               <w:rPr>
                 <w:sz w:val="20"/>
               </w:rPr>
-              <w:t xml:space="preserve">The model has a single ZnO phase and no phosphate or </w:t>
-            </w:r>
-            <w:r>
-              <w:rPr>
-                <w:sz w:val="20"/>
-              </w:rPr>
-              <w:t>carbonate. The paper justifies this with in vivo data showing that complex phases appear only after about 4.5 months. In vitro media with phosphate and carbonate form these phases within days, as the authors' own refs 42 and 44 show.</w:t>
+              <w:t xml:space="preserve">The model has a single </w:t>
+            </w:r>
+            <w:proofErr w:type="spellStart"/>
+            <w:r>
+              <w:rPr>
+                <w:sz w:val="20"/>
+              </w:rPr>
+              <w:t>ZnO</w:t>
+            </w:r>
+            <w:proofErr w:type="spellEnd"/>
+            <w:r>
+              <w:rPr>
+                <w:sz w:val="20"/>
+              </w:rPr>
+              <w:t xml:space="preserve"> phase and no phosphate or carbonate. The paper justifies this with in vivo data showing that complex phases appear only after about 4.5 months. In vitro media with </w:t>
+            </w:r>
+            <w:r>
+              <w:rPr>
+                <w:sz w:val="20"/>
+              </w:rPr>
+              <w:lastRenderedPageBreak/>
+              <w:t>phosphate and carbonate form these phases within days, as the authors' own refs 42 and 44 show.</w:t>
             </w:r>
           </w:p>
         </w:tc>
@@ -1554,14 +2116,53 @@
             <w:tcW w:w="3912" w:type="dxa"/>
           </w:tcPr>
           <w:p>
-            <w:r/>
-            <w:r>
-              <w:rPr>
-                <w:i w:val="0"/>
-                <w:color w:val="000000"/>
-                <w:sz w:val="20"/>
-              </w:rPr>
-              <w:t>We agree that the in vivo timescale (about 4.5 months) cannot justify a single ZnO phase for the in vitro simulations, because phosphate- and carbonate-containing phases form within days in the immersion media [refs. Liu 2018 and Meng 2019]. We have revised the manuscript: (i) in Methods (Electrochemical Mechanisms of Zn Biodegradation), the in vivo justification has been removed, and the sentence now states that phosphate and carbonate species may contribute to secondary corrosion products such as hopeite, smithsonite and simonkolleite [27], while the corrosion products are modeled as a single ZnO phase; (ii) in the Discussion (limitations), we state that the corrosion products are treated as a homogenized ZnO-based field rather than a discrete surface film or a heterogeneous, composition-dependent structure, and that secondary phosphate-, carbonate- and calcium-containing phases are therefore not explicitly resolved. The single phase is a lumped representation of the combined transport resistance of the accumulated products (through F_max, ε and τ in Eq. 12), so these parameters and k_f and k_d are effective values. [Sensitivity of the 672 h mass loss and of the calibrated parameters to ε, τ and F_max: add results, Figure S[x].]</w:t>
+            <w:r>
+              <w:rPr>
+                <w:color w:val="000000"/>
+                <w:sz w:val="20"/>
+              </w:rPr>
+              <w:lastRenderedPageBreak/>
+              <w:t xml:space="preserve">The in vivo timescale cannot justify a </w:t>
+            </w:r>
+            <w:proofErr w:type="spellStart"/>
+            <w:r>
+              <w:rPr>
+                <w:color w:val="000000"/>
+                <w:sz w:val="20"/>
+              </w:rPr>
+              <w:t>ZnO</w:t>
+            </w:r>
+            <w:proofErr w:type="spellEnd"/>
+            <w:r>
+              <w:rPr>
+                <w:color w:val="000000"/>
+                <w:sz w:val="20"/>
+              </w:rPr>
+              <w:t xml:space="preserve">-only representation for the in vitro simulations, as additional corrosion products form within hours to days. The in vivo justification has therefore been removed, and </w:t>
+            </w:r>
+            <w:r>
+              <w:rPr>
+                <w:color w:val="000000"/>
+                <w:sz w:val="20"/>
+              </w:rPr>
+              <w:lastRenderedPageBreak/>
+              <w:t xml:space="preserve">the model is now described as a homogenized </w:t>
+            </w:r>
+            <w:proofErr w:type="spellStart"/>
+            <w:r>
+              <w:rPr>
+                <w:color w:val="000000"/>
+                <w:sz w:val="20"/>
+              </w:rPr>
+              <w:t>ZnO</w:t>
+            </w:r>
+            <w:proofErr w:type="spellEnd"/>
+            <w:r>
+              <w:rPr>
+                <w:color w:val="000000"/>
+                <w:sz w:val="20"/>
+              </w:rPr>
+              <w:t>-based representation that does not explicitly resolve phosphate-, carbonate-, calcium-, or chloride-containing phases.</w:t>
             </w:r>
           </w:p>
         </w:tc>
@@ -1570,11 +2171,11 @@
             <w:tcW w:w="1587" w:type="dxa"/>
           </w:tcPr>
           <w:p>
-            <w:r/>
-            <w:r>
-              <w:rPr>
-                <w:sz w:val="20"/>
-              </w:rPr>
+            <w:r>
+              <w:rPr>
+                <w:sz w:val="20"/>
+              </w:rPr>
+              <w:lastRenderedPageBreak/>
               <w:t>Draft</w:t>
             </w:r>
           </w:p>
@@ -1615,10 +2216,8 @@
             <w:tcW w:w="3912" w:type="dxa"/>
           </w:tcPr>
           <w:p>
-            <w:r/>
-            <w:r>
-              <w:rPr>
-                <w:i w:val="0"/>
+            <w:r>
+              <w:rPr>
                 <w:color w:val="000000"/>
                 <w:sz w:val="20"/>
               </w:rPr>
@@ -1631,7 +2230,6 @@
             <w:tcW w:w="1587" w:type="dxa"/>
           </w:tcPr>
           <w:p>
-            <w:r/>
             <w:r>
               <w:rPr>
                 <w:sz w:val="20"/>
@@ -1667,20 +2265,21 @@
               <w:rPr>
                 <w:sz w:val="20"/>
               </w:rPr>
-              <w:t xml:space="preserve">The fit sits well inside the experimental noise: 28-day SD is 0.115%, n = 3, 5 </w:t>
-            </w:r>
-            <w:r>
-              <w:rPr>
-                <w:sz w:val="20"/>
-              </w:rPr>
-              <w:lastRenderedPageBreak/>
-              <w:t xml:space="preserve">points. Report </w:t>
-            </w:r>
-            <w:r>
-              <w:rPr>
-                <w:sz w:val="20"/>
-              </w:rPr>
-              <w:t>normalised error (about 5–8% of the mean), not just RMSE and R².</w:t>
+              <w:t xml:space="preserve">The fit sits well inside the experimental noise: 28-day SD is 0.115%, n = 3, 5 points. Report </w:t>
+            </w:r>
+            <w:proofErr w:type="spellStart"/>
+            <w:r>
+              <w:rPr>
+                <w:sz w:val="20"/>
+              </w:rPr>
+              <w:t>normalised</w:t>
+            </w:r>
+            <w:proofErr w:type="spellEnd"/>
+            <w:r>
+              <w:rPr>
+                <w:sz w:val="20"/>
+              </w:rPr>
+              <w:t xml:space="preserve"> error (about 5–8% of the mean), not just RMSE and R².</w:t>
             </w:r>
           </w:p>
         </w:tc>
@@ -1689,10 +2288,8 @@
             <w:tcW w:w="3912" w:type="dxa"/>
           </w:tcPr>
           <w:p>
-            <w:r/>
-            <w:r>
-              <w:rPr>
-                <w:i w:val="0"/>
+            <w:r>
+              <w:rPr>
                 <w:color w:val="000000"/>
                 <w:sz w:val="20"/>
               </w:rPr>
@@ -1705,7 +2302,6 @@
             <w:tcW w:w="1587" w:type="dxa"/>
           </w:tcPr>
           <w:p>
-            <w:r/>
             <w:r>
               <w:rPr>
                 <w:sz w:val="20"/>
@@ -1750,14 +2346,44 @@
             <w:tcW w:w="3912" w:type="dxa"/>
           </w:tcPr>
           <w:p>
-            <w:r/>
-            <w:r>
-              <w:rPr>
-                <w:i w:val="0"/>
-                <w:color w:val="000000"/>
-                <w:sz w:val="20"/>
-              </w:rPr>
-              <w:t>The first measurement is at 24 h, so the experiments do not constrain the reaction-to-diffusion transition, which is a model-derived quantity. The simulations themselves resolve this period: the time step is 0.25 h (Table S4) and the fields and mass loss were saved at 1 h intervals, so the Damköhler number and the corrosion-rate decay (Figure 5b) are resolved from the first hours. We agree that the predicted transition time (about 40 h for the disc and about 100 h for the stent) is therefore a model prediction that is not validated by data at earlier times; the mass-loss curve itself is constrained only from 24 h onwards. We have [qualified the Results to state that the transition times are predicted by the model and are not directly validated by the measurements, and] [added early-time (&lt; 24 h) measurements / identified them as future work].</w:t>
+            <w:r>
+              <w:rPr>
+                <w:color w:val="000000"/>
+                <w:sz w:val="20"/>
+              </w:rPr>
+              <w:t>The first measurement is at 24 h, so the experiments do not constrain the reaction-to-diffusion transition, which is a model-derived quantity. The simulations themselves resolve this period: the time step is 0.25 h (Table S4</w:t>
+            </w:r>
+            <w:proofErr w:type="gramStart"/>
+            <w:r>
+              <w:rPr>
+                <w:color w:val="000000"/>
+                <w:sz w:val="20"/>
+              </w:rPr>
+              <w:t>)</w:t>
+            </w:r>
+            <w:proofErr w:type="gramEnd"/>
+            <w:r>
+              <w:rPr>
+                <w:color w:val="000000"/>
+                <w:sz w:val="20"/>
+              </w:rPr>
+              <w:t xml:space="preserve"> and the fields and mass loss were saved at 1 h intervals, so the </w:t>
+            </w:r>
+            <w:proofErr w:type="spellStart"/>
+            <w:r>
+              <w:rPr>
+                <w:color w:val="000000"/>
+                <w:sz w:val="20"/>
+              </w:rPr>
+              <w:t>Damköhler</w:t>
+            </w:r>
+            <w:proofErr w:type="spellEnd"/>
+            <w:r>
+              <w:rPr>
+                <w:color w:val="000000"/>
+                <w:sz w:val="20"/>
+              </w:rPr>
+              <w:t xml:space="preserve"> number and the corrosion-rate decay (Figure 5b) are resolved from the first hours. We agree that the predicted transition time (about 40 h for the disc and about 100 h for the stent) is therefore a model prediction that is not validated by data at earlier times; the mass-loss curve itself is constrained only from 24 h onwards. We have [qualified the Results to state that the transition times are predicted by the model and are not directly validated by the measurements, and] [added early-time (&lt; 24 h) measurements / identified them as future work].</w:t>
             </w:r>
           </w:p>
         </w:tc>
@@ -1766,7 +2392,6 @@
             <w:tcW w:w="1587" w:type="dxa"/>
           </w:tcPr>
           <w:p>
-            <w:r/>
             <w:r>
               <w:rPr>
                 <w:sz w:val="20"/>
@@ -1802,13 +2427,7 @@
               <w:rPr>
                 <w:sz w:val="20"/>
               </w:rPr>
-              <w:t>Th</w:t>
-            </w:r>
-            <w:r>
-              <w:rPr>
-                <w:sz w:val="20"/>
-              </w:rPr>
-              <w:t>e 14 d → 28 d difference (3.03 vs 3.67 mg) is smaller than the SD.</w:t>
+              <w:t>The 14 d → 28 d difference (3.03 vs 3.67 mg) is smaller than the SD.</w:t>
             </w:r>
           </w:p>
         </w:tc>
@@ -1817,14 +2436,20 @@
             <w:tcW w:w="3912" w:type="dxa"/>
           </w:tcPr>
           <w:p>
-            <w:r/>
-            <w:r>
-              <w:rPr>
-                <w:i w:val="0"/>
-                <w:color w:val="000000"/>
-                <w:sz w:val="20"/>
-              </w:rPr>
-              <w:t>We agree. The 14-day and 28-day masses (3.03 ± 0.74 and 3.67 ± 1.33 mg, n = 3; a two-sample test gives p ≈ 0.5) are not statistically distinguishable, so the experiments constrain the late-time increase only weakly; the measured curve is well resolved up to about 7 days. We have [revised the Results to state that the later increase lies within the experimental scatter / added replicates or an intermediate time point].</w:t>
+            <w:r>
+              <w:rPr>
+                <w:color w:val="000000"/>
+                <w:sz w:val="20"/>
+              </w:rPr>
+              <w:t xml:space="preserve">We agree. The 14-day and 28-day masses (3.03 ± 0.74 and 3.67 ± 1.33 mg, n = 3; a </w:t>
+            </w:r>
+            <w:r>
+              <w:rPr>
+                <w:color w:val="000000"/>
+                <w:sz w:val="20"/>
+              </w:rPr>
+              <w:lastRenderedPageBreak/>
+              <w:t>two-sample test gives p ≈ 0.5) are not statistically distinguishable, so the experiments constrain the late-time increase only weakly; the measured curve is well resolved up to about 7 days. We have [revised the Results to state that the later increase lies within the experimental scatter / added replicates or an intermediate time point].</w:t>
             </w:r>
           </w:p>
         </w:tc>
@@ -1833,11 +2458,11 @@
             <w:tcW w:w="1587" w:type="dxa"/>
           </w:tcPr>
           <w:p>
-            <w:r/>
-            <w:r>
-              <w:rPr>
-                <w:sz w:val="20"/>
-              </w:rPr>
+            <w:r>
+              <w:rPr>
+                <w:sz w:val="20"/>
+              </w:rPr>
+              <w:lastRenderedPageBreak/>
               <w:t>Draft</w:t>
             </w:r>
           </w:p>
@@ -1869,7 +2494,21 @@
               <w:rPr>
                 <w:sz w:val="20"/>
               </w:rPr>
-              <w:t>A Pearson r of 0.95 for two monotonic saturating curves is not a meaningful validation of Zn²⁺ and pH. The model overpredicts Zn²⁺ by about 45% at 336 h.</w:t>
+              <w:t xml:space="preserve">A Pearson r of 0.95 for two monotonic saturating curves is not a meaningful validation of Zn²⁺ and </w:t>
+            </w:r>
+            <w:proofErr w:type="spellStart"/>
+            <w:r>
+              <w:rPr>
+                <w:sz w:val="20"/>
+              </w:rPr>
+              <w:t>pH.</w:t>
+            </w:r>
+            <w:proofErr w:type="spellEnd"/>
+            <w:r>
+              <w:rPr>
+                <w:sz w:val="20"/>
+              </w:rPr>
+              <w:t xml:space="preserve"> The model overpredicts Zn²⁺ by about 45% at 336 h.</w:t>
             </w:r>
           </w:p>
         </w:tc>
@@ -1878,14 +2517,28 @@
             <w:tcW w:w="3912" w:type="dxa"/>
           </w:tcPr>
           <w:p>
-            <w:r/>
-            <w:r>
-              <w:rPr>
-                <w:i w:val="0"/>
-                <w:color w:val="000000"/>
-                <w:sz w:val="20"/>
-              </w:rPr>
-              <w:t>We agree that a correlation coefficient is not a meaningful measure for two monotonic saturating curves, and we have removed the Pearson r values from the Results. We now report the errors at 336 h (44% for Zn²⁺ and 2.8% for pH, i.e. 0.21 pH units) and retain the description of the comparison as an out-of-objective evaluation. For Zn²⁺, the RMSE is 11.6 mg L⁻¹ (39% of the mean literature value); for pH, it is 0.10. We attribute the over-prediction to precipitation and buffering in the r-SBF medium (phosphate, carbonate, Tris), which the model does not include [and to the solution volume per unit area, to be confirmed].</w:t>
+            <w:r>
+              <w:rPr>
+                <w:color w:val="000000"/>
+                <w:sz w:val="20"/>
+              </w:rPr>
+              <w:t xml:space="preserve">We agree that </w:t>
+            </w:r>
+            <w:proofErr w:type="gramStart"/>
+            <w:r>
+              <w:rPr>
+                <w:color w:val="000000"/>
+                <w:sz w:val="20"/>
+              </w:rPr>
+              <w:t>a correlation</w:t>
+            </w:r>
+            <w:proofErr w:type="gramEnd"/>
+            <w:r>
+              <w:rPr>
+                <w:color w:val="000000"/>
+                <w:sz w:val="20"/>
+              </w:rPr>
+              <w:t xml:space="preserve"> coefficient is not a meaningful measure for two monotonic saturating curves, and we have removed the Pearson r values from the Results. We now report the errors at 336 h (44% for Zn²⁺ and 2.8% for pH, i.e. 0.21 pH units) and retain the description of the comparison as an out-of-objective evaluation. For Zn²⁺, the RMSE is 11.6 mg L⁻¹ (39% of the mean literature value); for pH, it is 0.10. We attribute the over-prediction to precipitation and buffering in the r-SBF medium (phosphate, carbonate, Tris), which the model does not include [and to the solution volume per unit area, to be confirmed].</w:t>
             </w:r>
           </w:p>
         </w:tc>
@@ -1894,7 +2547,6 @@
             <w:tcW w:w="1587" w:type="dxa"/>
           </w:tcPr>
           <w:p>
-            <w:r/>
             <w:r>
               <w:rPr>
                 <w:sz w:val="20"/>
@@ -2029,13 +2681,7 @@
               <w:rPr>
                 <w:sz w:val="20"/>
               </w:rPr>
-              <w:t xml:space="preserve">Fig. 3b: the RMSE of 0.046% was already found at iteration 6, versus 0.042% at "the </w:t>
-            </w:r>
-            <w:r>
-              <w:rPr>
-                <w:sz w:val="20"/>
-              </w:rPr>
-              <w:t>optimum" (iteration 22). The plateau at about 0.058% suggests a flat landscape.</w:t>
+              <w:t>Fig. 3b: the RMSE of 0.046% was already found at iteration 6, versus 0.042% at "the optimum" (iteration 22). The plateau at about 0.058% suggests a flat landscape.</w:t>
             </w:r>
           </w:p>
         </w:tc>
@@ -2090,11 +2736,19 @@
             <w:tcW w:w="3402" w:type="dxa"/>
           </w:tcPr>
           <w:p>
-            <w:r>
-              <w:rPr>
-                <w:sz w:val="20"/>
-              </w:rPr>
-              <w:t>k_f is the least influential of the calibrated parameters in Fig. 3a. Ask for parameter correlation, a profile likelihood or a posterior.</w:t>
+            <w:proofErr w:type="spellStart"/>
+            <w:r>
+              <w:rPr>
+                <w:sz w:val="20"/>
+              </w:rPr>
+              <w:t>k_f</w:t>
+            </w:r>
+            <w:proofErr w:type="spellEnd"/>
+            <w:r>
+              <w:rPr>
+                <w:sz w:val="20"/>
+              </w:rPr>
+              <w:t xml:space="preserve"> is the least influential of the calibrated parameters in Fig. 3a. Ask for parameter correlation, a profile likelihood or a posterior.</w:t>
             </w:r>
           </w:p>
         </w:tc>
@@ -2108,14 +2762,71 @@
                 <w:color w:val="000000"/>
                 <w:sz w:val="20"/>
               </w:rPr>
-              <w:t>The relat</w:t>
-            </w:r>
-            <w:r>
-              <w:rPr>
-                <w:color w:val="000000"/>
-                <w:sz w:val="20"/>
-              </w:rPr>
-              <w:t>ive influence of k_f is addressed in the response to A2.2 (Figure 3a ranks k_f below C_O₂,0, k_ORR, k_d and D_O₂). [Parameter correlation / profile-likelihood analysis to be completed.]</w:t>
+              <w:t xml:space="preserve">The relative influence of </w:t>
+            </w:r>
+            <w:proofErr w:type="spellStart"/>
+            <w:r>
+              <w:rPr>
+                <w:color w:val="000000"/>
+                <w:sz w:val="20"/>
+              </w:rPr>
+              <w:t>k_f</w:t>
+            </w:r>
+            <w:proofErr w:type="spellEnd"/>
+            <w:r>
+              <w:rPr>
+                <w:color w:val="000000"/>
+                <w:sz w:val="20"/>
+              </w:rPr>
+              <w:t xml:space="preserve"> is addressed in the response to A2.2 (Figure 3a ranks </w:t>
+            </w:r>
+            <w:proofErr w:type="spellStart"/>
+            <w:r>
+              <w:rPr>
+                <w:color w:val="000000"/>
+                <w:sz w:val="20"/>
+              </w:rPr>
+              <w:t>k_f</w:t>
+            </w:r>
+            <w:proofErr w:type="spellEnd"/>
+            <w:r>
+              <w:rPr>
+                <w:color w:val="000000"/>
+                <w:sz w:val="20"/>
+              </w:rPr>
+              <w:t xml:space="preserve"> below C_O₂,0, </w:t>
+            </w:r>
+            <w:proofErr w:type="spellStart"/>
+            <w:r>
+              <w:rPr>
+                <w:color w:val="000000"/>
+                <w:sz w:val="20"/>
+              </w:rPr>
+              <w:t>k_ORR</w:t>
+            </w:r>
+            <w:proofErr w:type="spellEnd"/>
+            <w:r>
+              <w:rPr>
+                <w:color w:val="000000"/>
+                <w:sz w:val="20"/>
+              </w:rPr>
+              <w:t xml:space="preserve">, </w:t>
+            </w:r>
+            <w:proofErr w:type="spellStart"/>
+            <w:r>
+              <w:rPr>
+                <w:color w:val="000000"/>
+                <w:sz w:val="20"/>
+              </w:rPr>
+              <w:t>k_d</w:t>
+            </w:r>
+            <w:proofErr w:type="spellEnd"/>
+            <w:r>
+              <w:rPr>
+                <w:color w:val="000000"/>
+                <w:sz w:val="20"/>
+              </w:rPr>
+              <w:t xml:space="preserve"> and D_O₂). [Parameter correlation / profile-likelihood analysis to be completed.]</w:t>
             </w:r>
           </w:p>
         </w:tc>
@@ -2159,13 +2870,21 @@
               <w:rPr>
                 <w:sz w:val="20"/>
               </w:rPr>
-              <w:t xml:space="preserve">The GSA excluded ε, τ, F_max and [Zn]_sat, </w:t>
-            </w:r>
-            <w:r>
-              <w:rPr>
-                <w:sz w:val="20"/>
-              </w:rPr>
-              <w:t>which control the film mechanism, and took its parameter ranges from unstated sources.</w:t>
+              <w:t xml:space="preserve">The GSA excluded ε, τ, </w:t>
+            </w:r>
+            <w:proofErr w:type="spellStart"/>
+            <w:r>
+              <w:rPr>
+                <w:sz w:val="20"/>
+              </w:rPr>
+              <w:t>F_max</w:t>
+            </w:r>
+            <w:proofErr w:type="spellEnd"/>
+            <w:r>
+              <w:rPr>
+                <w:sz w:val="20"/>
+              </w:rPr>
+              <w:t xml:space="preserve"> and [Zn]_sat, which control the film mechanism, and took its parameter ranges from unstated sources.</w:t>
             </w:r>
           </w:p>
         </w:tc>
@@ -2224,13 +2943,21 @@
               <w:rPr>
                 <w:sz w:val="20"/>
               </w:rPr>
-              <w:t xml:space="preserve">"Sensitivity to O₂ matches experiments, so the model reproduces oxygen-controlled behaviour" is circular. The model assumes ORR </w:t>
-            </w:r>
-            <w:r>
-              <w:rPr>
-                <w:sz w:val="20"/>
-              </w:rPr>
-              <w:t>control.</w:t>
+              <w:t xml:space="preserve">"Sensitivity to O₂ matches experiments, so the model reproduces oxygen-controlled </w:t>
+            </w:r>
+            <w:proofErr w:type="spellStart"/>
+            <w:r>
+              <w:rPr>
+                <w:sz w:val="20"/>
+              </w:rPr>
+              <w:t>behaviour</w:t>
+            </w:r>
+            <w:proofErr w:type="spellEnd"/>
+            <w:r>
+              <w:rPr>
+                <w:sz w:val="20"/>
+              </w:rPr>
+              <w:t>" is circular. The model assumes ORR control.</w:t>
             </w:r>
           </w:p>
         </w:tc>
@@ -2241,11 +2968,139 @@
           <w:p>
             <w:r>
               <w:rPr>
-                <w:i w:val="0"/>
-                <w:color w:val="000000"/>
-                <w:sz w:val="20"/>
-              </w:rPr>
-              <w:t>We agree that oxygen-reduction-limited dissolution is a model assumption (Eqs. 1–2), so the Morris ranking alone cannot show that oxygen controls degradation. We now state oxygen control as the modelling premise, and the evidence that it works is the model's agreement with data it was not fitted to: (i) the 28-day immersion data, which were not used in calibration, are reproduced with RMSE = 0.0159%; (ii) the stent prediction, made without recalibration, is consistent with reported in vivo mass loss (~6%). The model is also not forced into oxygen limitation: the recession velocity v_n = min(v_Zn, v_ORR, v_O2) allows a reaction-limited stage, and the results show one at early times followed by a transition to transport control. The ablations (closed vs fixed-O₂ boundary, D_eff = D, k_f = 0) show how much each mechanism contributes. This agreement supports the assumption within the tested conditions (immersion in r-SBF/HBSS; disc and stent geometries); it does not prove oxygen control in vivo, and the limitations section states this.</w:t>
+                <w:color w:val="000000"/>
+                <w:sz w:val="20"/>
+              </w:rPr>
+              <w:t>We agree that oxygen-reduction-limited dissolution is a model assumption (</w:t>
+            </w:r>
+            <w:proofErr w:type="spellStart"/>
+            <w:r>
+              <w:rPr>
+                <w:color w:val="000000"/>
+                <w:sz w:val="20"/>
+              </w:rPr>
+              <w:t>Eqs</w:t>
+            </w:r>
+            <w:proofErr w:type="spellEnd"/>
+            <w:r>
+              <w:rPr>
+                <w:color w:val="000000"/>
+                <w:sz w:val="20"/>
+              </w:rPr>
+              <w:t>. 1–2), so the Morris ranking alone cannot show that oxygen controls degradation. We now state oxygen control as the modelling premise, and the evidence that it works is the model's agreement with data it was not fitted to: (</w:t>
+            </w:r>
+            <w:proofErr w:type="spellStart"/>
+            <w:r>
+              <w:rPr>
+                <w:color w:val="000000"/>
+                <w:sz w:val="20"/>
+              </w:rPr>
+              <w:t>i</w:t>
+            </w:r>
+            <w:proofErr w:type="spellEnd"/>
+            <w:r>
+              <w:rPr>
+                <w:color w:val="000000"/>
+                <w:sz w:val="20"/>
+              </w:rPr>
+              <w:t xml:space="preserve">) the 28-day immersion data, which were not used in calibration, are reproduced with RMSE = 0.0159%; (ii) the stent prediction, made without recalibration, is consistent with reported in vivo mass loss (~6%). The model is also not forced into oxygen limitation: the recession velocity </w:t>
+            </w:r>
+            <w:proofErr w:type="spellStart"/>
+            <w:r>
+              <w:rPr>
+                <w:color w:val="000000"/>
+                <w:sz w:val="20"/>
+              </w:rPr>
+              <w:t>v_n</w:t>
+            </w:r>
+            <w:proofErr w:type="spellEnd"/>
+            <w:r>
+              <w:rPr>
+                <w:color w:val="000000"/>
+                <w:sz w:val="20"/>
+              </w:rPr>
+              <w:t xml:space="preserve"> = </w:t>
+            </w:r>
+            <w:proofErr w:type="gramStart"/>
+            <w:r>
+              <w:rPr>
+                <w:color w:val="000000"/>
+                <w:sz w:val="20"/>
+              </w:rPr>
+              <w:t>min(</w:t>
+            </w:r>
+            <w:proofErr w:type="spellStart"/>
+            <w:proofErr w:type="gramEnd"/>
+            <w:r>
+              <w:rPr>
+                <w:color w:val="000000"/>
+                <w:sz w:val="20"/>
+              </w:rPr>
+              <w:t>v_Zn</w:t>
+            </w:r>
+            <w:proofErr w:type="spellEnd"/>
+            <w:r>
+              <w:rPr>
+                <w:color w:val="000000"/>
+                <w:sz w:val="20"/>
+              </w:rPr>
+              <w:t xml:space="preserve">, </w:t>
+            </w:r>
+            <w:proofErr w:type="spellStart"/>
+            <w:r>
+              <w:rPr>
+                <w:color w:val="000000"/>
+                <w:sz w:val="20"/>
+              </w:rPr>
+              <w:t>v_ORR</w:t>
+            </w:r>
+            <w:proofErr w:type="spellEnd"/>
+            <w:r>
+              <w:rPr>
+                <w:color w:val="000000"/>
+                <w:sz w:val="20"/>
+              </w:rPr>
+              <w:t xml:space="preserve">, v_O2) allows a reaction-limited stage, and the results show one at early times followed by a transition to transport control. The ablations (closed vs fixed-O₂ boundary, </w:t>
+            </w:r>
+            <w:proofErr w:type="spellStart"/>
+            <w:r>
+              <w:rPr>
+                <w:color w:val="000000"/>
+                <w:sz w:val="20"/>
+              </w:rPr>
+              <w:t>D_eff</w:t>
+            </w:r>
+            <w:proofErr w:type="spellEnd"/>
+            <w:r>
+              <w:rPr>
+                <w:color w:val="000000"/>
+                <w:sz w:val="20"/>
+              </w:rPr>
+              <w:t xml:space="preserve"> = D, </w:t>
+            </w:r>
+            <w:proofErr w:type="spellStart"/>
+            <w:r>
+              <w:rPr>
+                <w:color w:val="000000"/>
+                <w:sz w:val="20"/>
+              </w:rPr>
+              <w:t>k_f</w:t>
+            </w:r>
+            <w:proofErr w:type="spellEnd"/>
+            <w:r>
+              <w:rPr>
+                <w:color w:val="000000"/>
+                <w:sz w:val="20"/>
+              </w:rPr>
+              <w:t xml:space="preserve"> = 0) show how much each mechanism contributes. This agreement supports the </w:t>
+            </w:r>
+            <w:r>
+              <w:rPr>
+                <w:color w:val="000000"/>
+                <w:sz w:val="20"/>
+              </w:rPr>
+              <w:lastRenderedPageBreak/>
+              <w:t>assumption within the tested conditions (immersion in r-SBF/HBSS; disc and stent geometries); it does not prove oxygen control in vivo, and the limitations section states this.</w:t>
             </w:r>
           </w:p>
         </w:tc>
@@ -2256,10 +3111,10 @@
           <w:p>
             <w:r>
               <w:rPr>
-                <w:i w:val="0"/>
-                <w:color w:val="000000"/>
-                <w:sz w:val="20"/>
-              </w:rPr>
+                <w:color w:val="000000"/>
+                <w:sz w:val="20"/>
+              </w:rPr>
+              <w:lastRenderedPageBreak/>
               <w:t>Addressed</w:t>
             </w:r>
           </w:p>
@@ -2276,7 +3131,15 @@
         <w:pStyle w:val="Heading2"/>
       </w:pPr>
       <w:r>
-        <w:t>A6. The stent result needs a baseline.</w:t>
+        <w:t xml:space="preserve">A6. The stent result needs </w:t>
+      </w:r>
+      <w:proofErr w:type="gramStart"/>
+      <w:r>
+        <w:t>a baseline</w:t>
+      </w:r>
+      <w:proofErr w:type="gramEnd"/>
+      <w:r>
+        <w:t>.</w:t>
       </w:r>
     </w:p>
     <w:tbl>
@@ -2390,13 +3253,63 @@
               <w:rPr>
                 <w:sz w:val="20"/>
               </w:rPr>
-              <w:t xml:space="preserve">The paper says mass loss scales about linearly with SA:V. A disc-calibrated rate </w:t>
-            </w:r>
-            <w:r>
-              <w:rPr>
-                <w:sz w:val="20"/>
-              </w:rPr>
-              <w:t>scaled by SA:V may give a similar or higher number (rough estimate 8–9%). Without that comparison, the 6% doesn't show the mechanistic model adds anything.</w:t>
+              <w:t xml:space="preserve">The paper says mass loss scales about linearly with </w:t>
+            </w:r>
+            <w:proofErr w:type="gramStart"/>
+            <w:r>
+              <w:rPr>
+                <w:sz w:val="20"/>
+              </w:rPr>
+              <w:t>SA:V.</w:t>
+            </w:r>
+            <w:proofErr w:type="gramEnd"/>
+            <w:r>
+              <w:rPr>
+                <w:sz w:val="20"/>
+              </w:rPr>
+              <w:t xml:space="preserve"> A disc-calibrated rate scaled by </w:t>
+            </w:r>
+            <w:proofErr w:type="gramStart"/>
+            <w:r>
+              <w:rPr>
+                <w:sz w:val="20"/>
+              </w:rPr>
+              <w:t>SA:V</w:t>
+            </w:r>
+            <w:proofErr w:type="gramEnd"/>
+            <w:r>
+              <w:rPr>
+                <w:sz w:val="20"/>
+              </w:rPr>
+              <w:t xml:space="preserve"> may give a similar or higher number (rough estimate 8–9%). Without that comparison, </w:t>
+            </w:r>
+            <w:proofErr w:type="gramStart"/>
+            <w:r>
+              <w:rPr>
+                <w:sz w:val="20"/>
+              </w:rPr>
+              <w:t>the 6</w:t>
+            </w:r>
+            <w:proofErr w:type="gramEnd"/>
+            <w:r>
+              <w:rPr>
+                <w:sz w:val="20"/>
+              </w:rPr>
+              <w:t xml:space="preserve">% </w:t>
+            </w:r>
+            <w:proofErr w:type="gramStart"/>
+            <w:r>
+              <w:rPr>
+                <w:sz w:val="20"/>
+              </w:rPr>
+              <w:t>doesn't</w:t>
+            </w:r>
+            <w:proofErr w:type="gramEnd"/>
+            <w:r>
+              <w:rPr>
+                <w:sz w:val="20"/>
+              </w:rPr>
+              <w:t xml:space="preserve"> show the mechanistic model adds anything.</w:t>
             </w:r>
           </w:p>
         </w:tc>
@@ -2405,13 +3318,78 @@
             <w:tcW w:w="3912" w:type="dxa"/>
           </w:tcPr>
           <w:p>
-            <w:r>
-              <w:rPr>
-                <w:i/>
-                <w:color w:val="808080"/>
-                <w:sz w:val="20"/>
-              </w:rPr>
-              <w:t>[To be completed]</w:t>
+            <w:pPr>
+              <w:rPr>
+                <w:sz w:val="20"/>
+              </w:rPr>
+            </w:pPr>
+            <w:r>
+              <w:rPr>
+                <w:sz w:val="20"/>
+              </w:rPr>
+              <w:t xml:space="preserve">A simple </w:t>
+            </w:r>
+            <w:proofErr w:type="gramStart"/>
+            <w:r>
+              <w:rPr>
+                <w:sz w:val="20"/>
+              </w:rPr>
+              <w:t>SA:</w:t>
+            </w:r>
+            <w:r>
+              <w:rPr>
+                <w:sz w:val="20"/>
+              </w:rPr>
+              <w:t>V</w:t>
+            </w:r>
+            <w:proofErr w:type="gramEnd"/>
+            <w:r>
+              <w:rPr>
+                <w:sz w:val="20"/>
+              </w:rPr>
+              <w:t>-scaled baseline was calculated using the disc model with the ideal disc surface area of 219.9 mm² (</w:t>
+            </w:r>
+            <w:proofErr w:type="gramStart"/>
+            <w:r>
+              <w:rPr>
+                <w:sz w:val="20"/>
+              </w:rPr>
+              <w:t>SA:V</w:t>
+            </w:r>
+            <w:proofErr w:type="gramEnd"/>
+            <w:r>
+              <w:rPr>
+                <w:sz w:val="20"/>
+              </w:rPr>
+              <w:t xml:space="preserve">=1.40), giving a predicted stent mass loss of 8.1%. This is higher than the mechanistic model prediction of 6.0%, indicating that </w:t>
+            </w:r>
+            <w:proofErr w:type="gramStart"/>
+            <w:r>
+              <w:rPr>
+                <w:sz w:val="20"/>
+              </w:rPr>
+              <w:t>SA:V</w:t>
+            </w:r>
+            <w:proofErr w:type="gramEnd"/>
+            <w:r>
+              <w:rPr>
+                <w:sz w:val="20"/>
+              </w:rPr>
+              <w:t xml:space="preserve"> scaling alone overpredicts mass loss by approximately 35%. The difference arises because simple scaling does not account for spatial oxygen depletion, transport interactions between </w:t>
+            </w:r>
+            <w:proofErr w:type="spellStart"/>
+            <w:r>
+              <w:rPr>
+                <w:sz w:val="20"/>
+              </w:rPr>
+              <w:t>neighbouring</w:t>
+            </w:r>
+            <w:proofErr w:type="spellEnd"/>
+            <w:r>
+              <w:rPr>
+                <w:sz w:val="20"/>
+              </w:rPr>
+              <w:t xml:space="preserve"> struts, or corrosion-product resistance. The mechanistic model therefore provides information beyond bulk geometric scaling, including the spatial and temporal evolution of degradation.</w:t>
             </w:r>
           </w:p>
         </w:tc>
@@ -2422,9 +3400,10 @@
           <w:p>
             <w:r>
               <w:rPr>
-                <w:sz w:val="20"/>
-              </w:rPr>
-              <w:t>Open</w:t>
+                <w:color w:val="000000"/>
+                <w:sz w:val="20"/>
+              </w:rPr>
+              <w:t>Addressed</w:t>
             </w:r>
           </w:p>
         </w:tc>
@@ -2466,19 +3445,35 @@
           <w:p>
             <w:r>
               <w:rPr>
+                <w:sz w:val="20"/>
+              </w:rPr>
+              <w:t xml:space="preserve">This is </w:t>
+            </w:r>
+            <w:r>
+              <w:rPr>
+                <w:sz w:val="20"/>
+              </w:rPr>
+              <w:t>shown</w:t>
+            </w:r>
+            <w:r>
+              <w:rPr>
+                <w:sz w:val="20"/>
+              </w:rPr>
+              <w:t xml:space="preserve"> with the individual simulations</w:t>
+            </w:r>
+            <w:r>
+              <w:rPr>
+                <w:sz w:val="20"/>
+              </w:rPr>
+              <w:t xml:space="preserve"> when compared with baselines</w:t>
+            </w:r>
+            <w:r>
+              <w:rPr>
                 <w:i/>
                 <w:color w:val="808080"/>
                 <w:sz w:val="20"/>
               </w:rPr>
-              <w:t>[T</w:t>
-            </w:r>
-            <w:r>
-              <w:rPr>
-                <w:i/>
-                <w:color w:val="808080"/>
-                <w:sz w:val="20"/>
-              </w:rPr>
-              <w:t>o be completed]</w:t>
+              <w:t xml:space="preserve"> </w:t>
             </w:r>
           </w:p>
         </w:tc>
@@ -2489,9 +3484,10 @@
           <w:p>
             <w:r>
               <w:rPr>
-                <w:sz w:val="20"/>
-              </w:rPr>
-              <w:t>Open</w:t>
+                <w:color w:val="000000"/>
+                <w:sz w:val="20"/>
+              </w:rPr>
+              <w:t>Addressed</w:t>
             </w:r>
           </w:p>
         </w:tc>
@@ -2533,11 +3529,10 @@
           <w:p>
             <w:r>
               <w:rPr>
-                <w:i w:val="0"/>
-                <w:color w:val="000000"/>
-                <w:sz w:val="20"/>
-              </w:rPr>
-              <w:t>The full stent geometry is given in the Supplementary Information: Table S4 lists the outer diameter (3.20 mm), strut cross-section (0.15 × 0.15 mm), crown amplitude (1.00 mm), axial length (2.40 mm), surface area, volume and SA/V, together with the mesh and numerical settings, and Fig. S4 shows the geometry and computational domain. We clarify that the stent is a representative six-crown design, not a replica of the stent in the in vivo study [10]. The 6–7% in vivo figure is therefore used only as a plausibility benchmark for the predicted magnitude, not as a stent-specific validation, and the manuscript already states that it is not formal in vivo validation.</w:t>
+                <w:color w:val="000000"/>
+                <w:sz w:val="20"/>
+              </w:rPr>
+              <w:t>The full representative six-crown stent geometry and computational settings are provided in Table S4 and Figure S4.</w:t>
             </w:r>
           </w:p>
         </w:tc>
@@ -2548,7 +3543,6 @@
           <w:p>
             <w:r>
               <w:rPr>
-                <w:i w:val="0"/>
                 <w:color w:val="000000"/>
                 <w:sz w:val="20"/>
               </w:rPr>
@@ -2583,13 +3577,35 @@
               <w:rPr>
                 <w:sz w:val="20"/>
               </w:rPr>
-              <w:t xml:space="preserve">In vivo there is flow, </w:t>
-            </w:r>
-            <w:r>
-              <w:rPr>
-                <w:sz w:val="20"/>
-              </w:rPr>
-              <w:t>protein and different O₂ supply. The abstract and conclusions should say "same order of magnitude" rather than "consistent with in vivo".</w:t>
+              <w:t xml:space="preserve">In vivo there is flow, protein and different O₂ supply. The abstract and conclusions should </w:t>
+            </w:r>
+            <w:proofErr w:type="gramStart"/>
+            <w:r>
+              <w:rPr>
+                <w:sz w:val="20"/>
+              </w:rPr>
+              <w:t>say</w:t>
+            </w:r>
+            <w:proofErr w:type="gramEnd"/>
+            <w:r>
+              <w:rPr>
+                <w:sz w:val="20"/>
+              </w:rPr>
+              <w:t xml:space="preserve"> "same order of magnitude" rather than "consistent </w:t>
+            </w:r>
+            <w:proofErr w:type="gramStart"/>
+            <w:r>
+              <w:rPr>
+                <w:sz w:val="20"/>
+              </w:rPr>
+              <w:t>with in</w:t>
+            </w:r>
+            <w:proofErr w:type="gramEnd"/>
+            <w:r>
+              <w:rPr>
+                <w:sz w:val="20"/>
+              </w:rPr>
+              <w:t xml:space="preserve"> vivo".</w:t>
             </w:r>
           </w:p>
         </w:tc>
@@ -2600,11 +3616,10 @@
           <w:p>
             <w:r>
               <w:rPr>
-                <w:i w:val="0"/>
-                <w:color w:val="000000"/>
-                <w:sz w:val="20"/>
-              </w:rPr>
-              <w:t>We agree. In vivo degradation is affected by flow, protein adsorption and a different oxygen supply, none of which the model includes. The Abstract and Conclusions now say that the predicted ~6% one-month mass loss is of the same order of magnitude as reported in vivo observations, instead of 'consistent with' them. The Results and Limitations sections already state that the comparison is a plausibility check and not formal in vivo validation.</w:t>
+                <w:color w:val="000000"/>
+                <w:sz w:val="20"/>
+              </w:rPr>
+              <w:t>The Abstract and Conclusions now state that the predicted one-month mass loss of approximately 6% is of the same order of magnitude as reported in vivo observations, rather than “consistent with” them. This wording accounts for unmodelled in vivo factors, including flow, protein adsorption, and differences in oxygen supply.</w:t>
             </w:r>
           </w:p>
         </w:tc>
@@ -2615,7 +3630,6 @@
           <w:p>
             <w:r>
               <w:rPr>
-                <w:i w:val="0"/>
                 <w:color w:val="000000"/>
                 <w:sz w:val="20"/>
               </w:rPr>
@@ -2711,14 +3725,7 @@
                 <w:b/>
                 <w:sz w:val="20"/>
               </w:rPr>
-              <w:t xml:space="preserve"> taken (with page, </w:t>
-            </w:r>
-            <w:r>
-              <w:rPr>
-                <w:b/>
-                <w:sz w:val="20"/>
-              </w:rPr>
-              <w:t>line, figure or table)</w:t>
+              <w:t xml:space="preserve"> taken (with page, line, figure or table)</w:t>
             </w:r>
           </w:p>
         </w:tc>
@@ -2764,7 +3771,28 @@
               <w:rPr>
                 <w:sz w:val="20"/>
               </w:rPr>
-              <w:t>The min() in Eq. 17 looks redundant with the Robin O₂ boundary condition, and it can break the O₂–Zn mass balance.</w:t>
+              <w:t xml:space="preserve">The </w:t>
+            </w:r>
+            <w:proofErr w:type="gramStart"/>
+            <w:r>
+              <w:rPr>
+                <w:sz w:val="20"/>
+              </w:rPr>
+              <w:t>min(</w:t>
+            </w:r>
+            <w:proofErr w:type="gramEnd"/>
+            <w:r>
+              <w:rPr>
+                <w:sz w:val="20"/>
+              </w:rPr>
+              <w:t>) in Eq. 17 looks redundant with the Robin O₂ boundary condition, and it can break the O₂–Zn mass balance</w:t>
+            </w:r>
+            <w:r>
+              <w:rPr>
+                <w:color w:val="EE0000"/>
+                <w:sz w:val="20"/>
+              </w:rPr>
+              <w:t>.</w:t>
             </w:r>
           </w:p>
         </w:tc>
@@ -2775,11 +3803,24 @@
           <w:p>
             <w:r>
               <w:rPr>
-                <w:i w:val="0"/>
-                <w:color w:val="000000"/>
-                <w:sz w:val="20"/>
-              </w:rPr>
-              <w:t>In the continuum the two O₂ velocities coincide, because the Robin condition sets the O₂ flux at the interface equal to k_ORR·C_O2. In the implementation they are evaluated separately from the discrete O₂ field: v_ORR uses O₂ one probe distance beyond the interface, and v_O2 uses a two-point gradient with the local effective diffusivity. They therefore differ numerically, and the selection acts as a numerical safeguard (Rule A, SI); the Damköhler number is their ratio and is a discrete diagnostic. We have corrected Eq. 17: the velocities are negative, so the limiting (slowest) mechanism is the one with the smallest magnitude, i.e. the maximum of the signed values, not the minimum. We agree on the mass balance: the Zn²⁺ and OH⁻ source terms are driven by the Robin ORR flux regardless of which branch sets v_n, so metal loss (set by v_n) and dissolved Zn²⁺ (set by the ORR and film terms) are not tied together when the Zn-transport or diffusion branch binds. Predicted mass loss is computed from the level-set volume, not from the Zn²⁺ field, and we state this limitation explicitly. After the initial reaction-controlled stage, oxygen diffusion controls more than 99% of the interface area at 672 h (SI). [Add the fraction of the interface where the Zn-transport branch binds, from the DEBUG_BIND output.]</w:t>
+                <w:color w:val="000000"/>
+                <w:sz w:val="20"/>
+              </w:rPr>
+              <w:t>Because the ORR is localized at the moving metal</w:t>
+            </w:r>
+            <w:r>
+              <w:rPr>
+                <w:color w:val="000000"/>
+                <w:sz w:val="20"/>
+              </w:rPr>
+              <w:t>-</w:t>
+            </w:r>
+            <w:r>
+              <w:rPr>
+                <w:color w:val="000000"/>
+                <w:sz w:val="20"/>
+              </w:rPr>
+              <w:t>electrolyte interface, the interfacial oxygen concentration and normal oxygen gradient are evaluated using probes positioned within the electrolyte. The ORR branch estimates the reaction-supported recession rate, while the diffusion branch limits recession to the oxygen flux available in the discrete concentration field. Their selection is therefore a numerical mass-supply safeguard rather than two independent physical mechanisms.</w:t>
             </w:r>
           </w:p>
         </w:tc>
@@ -2790,11 +3831,10 @@
           <w:p>
             <w:r>
               <w:rPr>
-                <w:i w:val="0"/>
-                <w:color w:val="000000"/>
-                <w:sz w:val="20"/>
-              </w:rPr>
-              <w:t>In progress</w:t>
+                <w:color w:val="000000"/>
+                <w:sz w:val="20"/>
+              </w:rPr>
+              <w:t>Addressed</w:t>
             </w:r>
           </w:p>
         </w:tc>
@@ -2825,13 +3865,14 @@
               <w:rPr>
                 <w:sz w:val="20"/>
               </w:rPr>
-              <w:t xml:space="preserve">[Zn]_sat is used in Eq. 14 but not as a precipitation threshold in Eq. </w:t>
-            </w:r>
-            <w:r>
-              <w:rPr>
-                <w:sz w:val="20"/>
-              </w:rPr>
-              <w:t>11. Zn²⁺ reaches 57 mg L⁻¹, well above the 10 mg L⁻¹ value used.</w:t>
+              <w:t xml:space="preserve">[Zn]_sat is used in Eq. 14 but not as a </w:t>
+            </w:r>
+            <w:r>
+              <w:rPr>
+                <w:sz w:val="20"/>
+              </w:rPr>
+              <w:lastRenderedPageBreak/>
+              <w:t>precipitation threshold in Eq. 11. Zn²⁺ reaches 57 mg L⁻¹, well above the 10 mg L⁻¹ value used.</w:t>
             </w:r>
           </w:p>
         </w:tc>
@@ -2842,11 +3883,35 @@
           <w:p>
             <w:r>
               <w:rPr>
-                <w:i w:val="0"/>
-                <w:color w:val="000000"/>
-                <w:sz w:val="20"/>
-              </w:rPr>
-              <w:t>Correct. [Zn]_sat (10 mg L⁻¹) is the Zn²⁺ concentration at the metal–electrolyte interface in the Stefan condition (Eq. 14), imposed inside the solid by a penalty term. It is not a precipitation threshold. Film formation (Eq. 11) is first-order in C_Zn without a supersaturation term, so precipitation kinetics are lumped into the effective k_f. Bulk Zn²⁺ can therefore exceed 10 mg L⁻¹ (57 mg L⁻¹ at 336 h, a 44% overestimate relative to the literature value of 39.5 mg L⁻¹). We now state this role of [Zn]_sat explicitly and note the missing solubility threshold as a limitation of the Zn²⁺ prediction.</w:t>
+                <w:color w:val="000000"/>
+                <w:sz w:val="20"/>
+              </w:rPr>
+              <w:lastRenderedPageBreak/>
+              <w:t>[Zn]sat​ in Eq. 14 is the interfacial Stefan-</w:t>
+            </w:r>
+            <w:r>
+              <w:rPr>
+                <w:color w:val="000000"/>
+                <w:sz w:val="20"/>
+              </w:rPr>
+              <w:lastRenderedPageBreak/>
+              <w:t xml:space="preserve">condition value, not a precipitation threshold. Equation 11 instead uses an effective first-order law in which </w:t>
+            </w:r>
+            <w:proofErr w:type="spellStart"/>
+            <w:r>
+              <w:rPr>
+                <w:color w:val="000000"/>
+                <w:sz w:val="20"/>
+              </w:rPr>
+              <w:t>kf</w:t>
+            </w:r>
+            <w:proofErr w:type="spellEnd"/>
+            <w:r>
+              <w:rPr>
+                <w:color w:val="000000"/>
+                <w:sz w:val="20"/>
+              </w:rPr>
+              <w:t>​ lumps unresolved nucleation, supersaturation, and speciation effects. This simplification, including the Zn²⁺ overprediction of 57 versus approximately 40 mg L−1, is now acknowledged as a limitation.</w:t>
             </w:r>
           </w:p>
         </w:tc>
@@ -2857,10 +3922,10 @@
           <w:p>
             <w:r>
               <w:rPr>
-                <w:i w:val="0"/>
-                <w:color w:val="000000"/>
-                <w:sz w:val="20"/>
-              </w:rPr>
+                <w:color w:val="000000"/>
+                <w:sz w:val="20"/>
+              </w:rPr>
+              <w:lastRenderedPageBreak/>
               <w:t>Addressed</w:t>
             </w:r>
           </w:p>
@@ -2888,11 +3953,33 @@
             <w:tcW w:w="3402" w:type="dxa"/>
           </w:tcPr>
           <w:p>
-            <w:r>
-              <w:rPr>
-                <w:sz w:val="20"/>
-              </w:rPr>
-              <w:t>F_max is molar, but k_d's units (mm⁶ g⁻² h⁻¹) imply a mass basis.</w:t>
+            <w:proofErr w:type="spellStart"/>
+            <w:r>
+              <w:rPr>
+                <w:sz w:val="20"/>
+              </w:rPr>
+              <w:t>F_max</w:t>
+            </w:r>
+            <w:proofErr w:type="spellEnd"/>
+            <w:r>
+              <w:rPr>
+                <w:sz w:val="20"/>
+              </w:rPr>
+              <w:t xml:space="preserve"> is molar, but </w:t>
+            </w:r>
+            <w:proofErr w:type="spellStart"/>
+            <w:r>
+              <w:rPr>
+                <w:sz w:val="20"/>
+              </w:rPr>
+              <w:t>k_d's</w:t>
+            </w:r>
+            <w:proofErr w:type="spellEnd"/>
+            <w:r>
+              <w:rPr>
+                <w:sz w:val="20"/>
+              </w:rPr>
+              <w:t xml:space="preserve"> units (mm⁶ g⁻² h⁻¹) imply a mass basis.</w:t>
             </w:r>
           </w:p>
         </w:tc>
@@ -2903,11 +3990,90 @@
           <w:p>
             <w:r>
               <w:rPr>
-                <w:i w:val="0"/>
-                <w:color w:val="000000"/>
-                <w:sz w:val="20"/>
-              </w:rPr>
-              <w:t>The implementation is mass-based. F and F_max are in g mm⁻³ (F_max = ρ_film(1−ε)), and Cl⁻ enters the dissolution rate as a molar concentration (mol L⁻¹). The correct unit for k_d is therefore L² mol⁻² h⁻¹. The molar F_max expression and the mm⁶ g⁻² h⁻¹ unit in the manuscript were inconsistent with this and are being corrected [Eq. 11 text, Table 2, Table S5]. [The film density in the code (3.998 g cm⁻³) differs from Table 1 (5.606 g cm⁻³); reconcile before submission.]</w:t>
+                <w:color w:val="000000"/>
+                <w:sz w:val="20"/>
+              </w:rPr>
+              <w:t xml:space="preserve">The implementation is mass-based. F and </w:t>
+            </w:r>
+            <w:proofErr w:type="spellStart"/>
+            <w:r>
+              <w:rPr>
+                <w:color w:val="000000"/>
+                <w:sz w:val="20"/>
+              </w:rPr>
+              <w:t>F_max</w:t>
+            </w:r>
+            <w:proofErr w:type="spellEnd"/>
+            <w:r>
+              <w:rPr>
+                <w:color w:val="000000"/>
+                <w:sz w:val="20"/>
+              </w:rPr>
+              <w:t xml:space="preserve"> are in g mm⁻³ (</w:t>
+            </w:r>
+            <w:proofErr w:type="spellStart"/>
+            <w:r>
+              <w:rPr>
+                <w:color w:val="000000"/>
+                <w:sz w:val="20"/>
+              </w:rPr>
+              <w:t>F_max</w:t>
+            </w:r>
+            <w:proofErr w:type="spellEnd"/>
+            <w:r>
+              <w:rPr>
+                <w:color w:val="000000"/>
+                <w:sz w:val="20"/>
+              </w:rPr>
+              <w:t xml:space="preserve"> = </w:t>
+            </w:r>
+            <w:proofErr w:type="spellStart"/>
+            <w:r>
+              <w:rPr>
+                <w:color w:val="000000"/>
+                <w:sz w:val="20"/>
+              </w:rPr>
+              <w:t>ρ_film</w:t>
+            </w:r>
+            <w:proofErr w:type="spellEnd"/>
+            <w:r>
+              <w:rPr>
+                <w:color w:val="000000"/>
+                <w:sz w:val="20"/>
+              </w:rPr>
+              <w:t xml:space="preserve">(1−ε)), and Cl⁻ enters the dissolution rate as a molar concentration (mol L⁻¹). The correct unit for </w:t>
+            </w:r>
+            <w:proofErr w:type="spellStart"/>
+            <w:r>
+              <w:rPr>
+                <w:color w:val="000000"/>
+                <w:sz w:val="20"/>
+              </w:rPr>
+              <w:t>k_d</w:t>
+            </w:r>
+            <w:proofErr w:type="spellEnd"/>
+            <w:r>
+              <w:rPr>
+                <w:color w:val="000000"/>
+                <w:sz w:val="20"/>
+              </w:rPr>
+              <w:t xml:space="preserve"> is therefore L² mol⁻² h⁻¹. The molar </w:t>
+            </w:r>
+            <w:proofErr w:type="spellStart"/>
+            <w:r>
+              <w:rPr>
+                <w:color w:val="000000"/>
+                <w:sz w:val="20"/>
+              </w:rPr>
+              <w:t>F_max</w:t>
+            </w:r>
+            <w:proofErr w:type="spellEnd"/>
+            <w:r>
+              <w:rPr>
+                <w:color w:val="000000"/>
+                <w:sz w:val="20"/>
+              </w:rPr>
+              <w:t xml:space="preserve"> expression and the mm⁶ g⁻² h⁻¹ unit in the manuscript were inconsistent with this and are being corrected [Eq. 11 text, Table 2, Table S5].</w:t>
             </w:r>
           </w:p>
         </w:tc>
@@ -2918,7 +4084,6 @@
           <w:p>
             <w:r>
               <w:rPr>
-                <w:i w:val="0"/>
                 <w:color w:val="000000"/>
                 <w:sz w:val="20"/>
               </w:rPr>
@@ -2953,13 +4118,21 @@
               <w:rPr>
                 <w:sz w:val="20"/>
               </w:rPr>
-              <w:t>Explain why Cl⁻ enters as C_Cl² when Eq. 5 is fourth-order, and why</w:t>
-            </w:r>
-            <w:r>
-              <w:rPr>
-                <w:sz w:val="20"/>
-              </w:rPr>
-              <w:t xml:space="preserve"> Cl⁻ is "catalytic" when Eq. 5 consumes it.</w:t>
+              <w:t xml:space="preserve">Explain why Cl⁻ enters as C_Cl² when Eq. 5 is </w:t>
+            </w:r>
+            <w:proofErr w:type="gramStart"/>
+            <w:r>
+              <w:rPr>
+                <w:sz w:val="20"/>
+              </w:rPr>
+              <w:t>fourth-order</w:t>
+            </w:r>
+            <w:proofErr w:type="gramEnd"/>
+            <w:r>
+              <w:rPr>
+                <w:sz w:val="20"/>
+              </w:rPr>
+              <w:t>, and why Cl⁻ is "catalytic" when Eq. 5 consumes it.</w:t>
             </w:r>
           </w:p>
         </w:tc>
@@ -2970,11 +4143,74 @@
           <w:p>
             <w:r>
               <w:rPr>
-                <w:i w:val="0"/>
-                <w:color w:val="000000"/>
-                <w:sz w:val="20"/>
-              </w:rPr>
-              <w:t>The exponent of C_Cl in Eq. 11 is an effective reaction order, not the stoichiometric one: Eq. 5 is an overall reaction and the dissolution of ZnO into chloro-complexes proceeds in steps, so the rate order need not equal the stoichiometric coefficient. A second-order dependence is used as a reduced-order description [rationale/reference to be given]. Cl⁻ is not catalytic in a strict sense: Eq. 5 consumes four Cl⁻ per ZnO. In the model, Zn from dissolved film returns to the Zn²⁺ pool as a lumped zinc species and Cl⁻ is treated as conserved (Eq. 8 has no sink). This is justified because Cl⁻ is in large excess (142.3 mmol L⁻¹): if all Zn lost were bound as ZnCl₄²⁻, the upper-bound Cl⁻ consumption would be about 6% for the disc and below 1% for the stent. We replace 'catalytic' by 'effectively non-consumed' and note this approximation.</w:t>
+                <w:color w:val="000000"/>
+                <w:sz w:val="20"/>
+              </w:rPr>
+              <w:t xml:space="preserve">The exponent of </w:t>
+            </w:r>
+            <w:proofErr w:type="spellStart"/>
+            <w:r>
+              <w:rPr>
+                <w:color w:val="000000"/>
+                <w:sz w:val="20"/>
+              </w:rPr>
+              <w:t>C_Cl</w:t>
+            </w:r>
+            <w:proofErr w:type="spellEnd"/>
+            <w:r>
+              <w:rPr>
+                <w:color w:val="000000"/>
+                <w:sz w:val="20"/>
+              </w:rPr>
+              <w:t xml:space="preserve"> in Eq. 11 is an effective reaction order, not the stoichiometric one: Eq. 5 is an overall reaction and the dissolution of </w:t>
+            </w:r>
+            <w:proofErr w:type="spellStart"/>
+            <w:r>
+              <w:rPr>
+                <w:color w:val="000000"/>
+                <w:sz w:val="20"/>
+              </w:rPr>
+              <w:t>ZnO</w:t>
+            </w:r>
+            <w:proofErr w:type="spellEnd"/>
+            <w:r>
+              <w:rPr>
+                <w:color w:val="000000"/>
+                <w:sz w:val="20"/>
+              </w:rPr>
+              <w:t xml:space="preserve"> into chloro-complexes proceeds in steps, so the rate order need not equal the stoichiometric coefficient. A second-order dependence is used as a reduced-order description [rationale/reference to be given]. Cl⁻ is not catalytic in a strict sense: Eq. 5 consumes four Cl⁻ per </w:t>
+            </w:r>
+            <w:proofErr w:type="spellStart"/>
+            <w:r>
+              <w:rPr>
+                <w:color w:val="000000"/>
+                <w:sz w:val="20"/>
+              </w:rPr>
+              <w:t>ZnO</w:t>
+            </w:r>
+            <w:proofErr w:type="spellEnd"/>
+            <w:r>
+              <w:rPr>
+                <w:color w:val="000000"/>
+                <w:sz w:val="20"/>
+              </w:rPr>
+              <w:t xml:space="preserve">. In the model, Zn from dissolved film returns to the Zn²⁺ pool as a lumped zinc species and Cl⁻ is treated as conserved (Eq. 8 has no sink). This is justified because Cl⁻ is in large excess (142.3 mmol L⁻¹): if all Zn lost were bound as ZnCl₄²⁻, the upper-bound Cl⁻ consumption would be about 6% for the disc and below 1% for the stent. We replace 'catalytic' </w:t>
+            </w:r>
+            <w:proofErr w:type="gramStart"/>
+            <w:r>
+              <w:rPr>
+                <w:color w:val="000000"/>
+                <w:sz w:val="20"/>
+              </w:rPr>
+              <w:t>by</w:t>
+            </w:r>
+            <w:proofErr w:type="gramEnd"/>
+            <w:r>
+              <w:rPr>
+                <w:color w:val="000000"/>
+                <w:sz w:val="20"/>
+              </w:rPr>
+              <w:t xml:space="preserve"> 'effectively non-consumed' and note this approximation.</w:t>
             </w:r>
           </w:p>
         </w:tc>
@@ -2985,7 +4221,6 @@
           <w:p>
             <w:r>
               <w:rPr>
-                <w:i w:val="0"/>
                 <w:color w:val="000000"/>
                 <w:sz w:val="20"/>
               </w:rPr>
@@ -3020,7 +4255,21 @@
               <w:rPr>
                 <w:sz w:val="20"/>
               </w:rPr>
-              <w:t>Say how the film is placed relative to the receding interface (the ZnO/Zn volume ratio is about 1.6).</w:t>
+              <w:t xml:space="preserve">Say how the film is placed relative to the receding interface (the </w:t>
+            </w:r>
+            <w:proofErr w:type="spellStart"/>
+            <w:r>
+              <w:rPr>
+                <w:sz w:val="20"/>
+              </w:rPr>
+              <w:t>ZnO</w:t>
+            </w:r>
+            <w:proofErr w:type="spellEnd"/>
+            <w:r>
+              <w:rPr>
+                <w:sz w:val="20"/>
+              </w:rPr>
+              <w:t>/Zn volume ratio is about 1.6).</w:t>
             </w:r>
           </w:p>
         </w:tc>
@@ -3031,11 +4280,58 @@
           <w:p>
             <w:r>
               <w:rPr>
-                <w:i w:val="0"/>
-                <w:color w:val="000000"/>
-                <w:sz w:val="20"/>
-              </w:rPr>
-              <w:t>The film is a homogenised, volumetric field on a fixed mesh: it forms wherever dissolved Zn²⁺ is present on the electrolyte side of the level set and reduces local diffusivity (Eq. 12). It is not attached to the receding interface, and the level set advances independently of F. The ZnO/Zn volume ratio (about 1.6) is not represented, so the film does not displace the interface or expand into the volume of lost metal. This is a limitation of the model, now stated in the Limitations section. Its effect is bounded by F_max and the porosity ε, which cap the local film density.</w:t>
+                <w:color w:val="000000"/>
+                <w:sz w:val="20"/>
+              </w:rPr>
+              <w:t xml:space="preserve">The film is a </w:t>
+            </w:r>
+            <w:proofErr w:type="spellStart"/>
+            <w:r>
+              <w:rPr>
+                <w:color w:val="000000"/>
+                <w:sz w:val="20"/>
+              </w:rPr>
+              <w:t>homogenised</w:t>
+            </w:r>
+            <w:proofErr w:type="spellEnd"/>
+            <w:r>
+              <w:rPr>
+                <w:color w:val="000000"/>
+                <w:sz w:val="20"/>
+              </w:rPr>
+              <w:t xml:space="preserve">, volumetric field on a fixed mesh: it forms wherever dissolved Zn²⁺ is present on the electrolyte side of the level set and reduces local diffusivity (Eq. 12). It is not attached to the receding interface, and the level set advances independently of F. The </w:t>
+            </w:r>
+            <w:proofErr w:type="spellStart"/>
+            <w:r>
+              <w:rPr>
+                <w:color w:val="000000"/>
+                <w:sz w:val="20"/>
+              </w:rPr>
+              <w:t>ZnO</w:t>
+            </w:r>
+            <w:proofErr w:type="spellEnd"/>
+            <w:r>
+              <w:rPr>
+                <w:color w:val="000000"/>
+                <w:sz w:val="20"/>
+              </w:rPr>
+              <w:t xml:space="preserve">/Zn volume ratio (about 1.6) is not represented, so the film does not displace the interface or expand into the volume of lost metal. This is a limitation of the model, now stated in the Limitations section. Its effect is bounded by </w:t>
+            </w:r>
+            <w:proofErr w:type="spellStart"/>
+            <w:r>
+              <w:rPr>
+                <w:color w:val="000000"/>
+                <w:sz w:val="20"/>
+              </w:rPr>
+              <w:t>F_max</w:t>
+            </w:r>
+            <w:proofErr w:type="spellEnd"/>
+            <w:r>
+              <w:rPr>
+                <w:color w:val="000000"/>
+                <w:sz w:val="20"/>
+              </w:rPr>
+              <w:t xml:space="preserve"> and the porosity ε, which cap the local film density.</w:t>
             </w:r>
           </w:p>
         </w:tc>
@@ -3046,7 +4342,6 @@
           <w:p>
             <w:r>
               <w:rPr>
-                <w:i w:val="0"/>
                 <w:color w:val="000000"/>
                 <w:sz w:val="20"/>
               </w:rPr>
@@ -3081,7 +4376,35 @@
               <w:rPr>
                 <w:sz w:val="20"/>
               </w:rPr>
-              <w:t>Say how δ_Γ is regularised.</w:t>
+              <w:t xml:space="preserve">Say how </w:t>
+            </w:r>
+            <w:proofErr w:type="spellStart"/>
+            <w:r>
+              <w:rPr>
+                <w:sz w:val="20"/>
+              </w:rPr>
+              <w:t>δ_Γ</w:t>
+            </w:r>
+            <w:proofErr w:type="spellEnd"/>
+            <w:r>
+              <w:rPr>
+                <w:sz w:val="20"/>
+              </w:rPr>
+              <w:t xml:space="preserve"> is </w:t>
+            </w:r>
+            <w:proofErr w:type="spellStart"/>
+            <w:r>
+              <w:rPr>
+                <w:sz w:val="20"/>
+              </w:rPr>
+              <w:t>regularised</w:t>
+            </w:r>
+            <w:proofErr w:type="spellEnd"/>
+            <w:r>
+              <w:rPr>
+                <w:sz w:val="20"/>
+              </w:rPr>
+              <w:t>.</w:t>
             </w:r>
           </w:p>
         </w:tc>
@@ -3092,11 +4415,90 @@
           <w:p>
             <w:r>
               <w:rPr>
-                <w:i w:val="0"/>
-                <w:color w:val="000000"/>
-                <w:sz w:val="20"/>
-              </w:rPr>
-              <w:t>The ORR terms use a sharp surface integral over the zero level set of the P1-interpolated signed-distance function (FreeFEM int2d with the levelset option), so there is no smoothing parameter in the reaction terms. A smoothed delta function, δ = (1 − tanh²(φ/ε_δ))/(2ε_δ) with ε_δ equal to the minimum mesh size, is used only in post-processing to average quantities over the interface. We now state this in the Methods.</w:t>
+                <w:color w:val="000000"/>
+                <w:sz w:val="20"/>
+              </w:rPr>
+              <w:t xml:space="preserve">The ORR terms use a sharp surface integral over the </w:t>
+            </w:r>
+            <w:proofErr w:type="gramStart"/>
+            <w:r>
+              <w:rPr>
+                <w:color w:val="000000"/>
+                <w:sz w:val="20"/>
+              </w:rPr>
+              <w:t>zero level</w:t>
+            </w:r>
+            <w:proofErr w:type="gramEnd"/>
+            <w:r>
+              <w:rPr>
+                <w:color w:val="000000"/>
+                <w:sz w:val="20"/>
+              </w:rPr>
+              <w:t xml:space="preserve"> set of the P1-interpolated signed-distance function (</w:t>
+            </w:r>
+            <w:proofErr w:type="spellStart"/>
+            <w:r>
+              <w:rPr>
+                <w:color w:val="000000"/>
+                <w:sz w:val="20"/>
+              </w:rPr>
+              <w:t>FreeFEM</w:t>
+            </w:r>
+            <w:proofErr w:type="spellEnd"/>
+            <w:r>
+              <w:rPr>
+                <w:color w:val="000000"/>
+                <w:sz w:val="20"/>
+              </w:rPr>
+              <w:t xml:space="preserve"> int2d with the </w:t>
+            </w:r>
+            <w:proofErr w:type="spellStart"/>
+            <w:r>
+              <w:rPr>
+                <w:color w:val="000000"/>
+                <w:sz w:val="20"/>
+              </w:rPr>
+              <w:t>levelset</w:t>
+            </w:r>
+            <w:proofErr w:type="spellEnd"/>
+            <w:r>
+              <w:rPr>
+                <w:color w:val="000000"/>
+                <w:sz w:val="20"/>
+              </w:rPr>
+              <w:t xml:space="preserve"> option), so there is no smoothing parameter in the reaction terms. A smoothed delta function, δ = (1 − tanh²(φ/</w:t>
+            </w:r>
+            <w:proofErr w:type="spellStart"/>
+            <w:r>
+              <w:rPr>
+                <w:color w:val="000000"/>
+                <w:sz w:val="20"/>
+              </w:rPr>
+              <w:t>ε_δ</w:t>
+            </w:r>
+            <w:proofErr w:type="spellEnd"/>
+            <w:r>
+              <w:rPr>
+                <w:color w:val="000000"/>
+                <w:sz w:val="20"/>
+              </w:rPr>
+              <w:t xml:space="preserve">))/(2ε_δ) with </w:t>
+            </w:r>
+            <w:proofErr w:type="spellStart"/>
+            <w:r>
+              <w:rPr>
+                <w:color w:val="000000"/>
+                <w:sz w:val="20"/>
+              </w:rPr>
+              <w:t>ε_δ</w:t>
+            </w:r>
+            <w:proofErr w:type="spellEnd"/>
+            <w:r>
+              <w:rPr>
+                <w:color w:val="000000"/>
+                <w:sz w:val="20"/>
+              </w:rPr>
+              <w:t xml:space="preserve"> equal to the minimum mesh size, is used only in post-processing to average quantities over the interface. We now state this in the Methods.</w:t>
             </w:r>
           </w:p>
         </w:tc>
@@ -3107,7 +4509,6 @@
           <w:p>
             <w:r>
               <w:rPr>
-                <w:i w:val="0"/>
                 <w:color w:val="000000"/>
                 <w:sz w:val="20"/>
               </w:rPr>
@@ -3127,7 +4528,15 @@
         <w:pStyle w:val="Heading2"/>
       </w:pPr>
       <w:r>
-        <w:t>B2. Numerics.</w:t>
+        <w:t xml:space="preserve">B2. </w:t>
+      </w:r>
+      <w:proofErr w:type="spellStart"/>
+      <w:r>
+        <w:t>Numerics</w:t>
+      </w:r>
+      <w:proofErr w:type="spellEnd"/>
+      <w:r>
+        <w:t>.</w:t>
       </w:r>
     </w:p>
     <w:tbl>
@@ -3241,13 +4650,35 @@
               <w:rPr>
                 <w:sz w:val="20"/>
               </w:rPr>
-              <w:t xml:space="preserve">18.9M elements for the disc is hard to square with "low-dimensional" and "computationally tractable", especially when the paper </w:t>
-            </w:r>
-            <w:r>
-              <w:rPr>
-                <w:sz w:val="20"/>
-              </w:rPr>
-              <w:t>says transport is essentially 1D. State the cost, and consider an axisymmetric model for calibration.</w:t>
+              <w:t xml:space="preserve">18.9M elements for the disc </w:t>
+            </w:r>
+            <w:proofErr w:type="gramStart"/>
+            <w:r>
+              <w:rPr>
+                <w:sz w:val="20"/>
+              </w:rPr>
+              <w:t>is</w:t>
+            </w:r>
+            <w:proofErr w:type="gramEnd"/>
+            <w:r>
+              <w:rPr>
+                <w:sz w:val="20"/>
+              </w:rPr>
+              <w:t xml:space="preserve"> hard to square with "low-dimensional" and "computationally tractable", especially when the paper says transport is essentially 1D. State the </w:t>
+            </w:r>
+            <w:proofErr w:type="gramStart"/>
+            <w:r>
+              <w:rPr>
+                <w:sz w:val="20"/>
+              </w:rPr>
+              <w:t>cost, and</w:t>
+            </w:r>
+            <w:proofErr w:type="gramEnd"/>
+            <w:r>
+              <w:rPr>
+                <w:sz w:val="20"/>
+              </w:rPr>
+              <w:t xml:space="preserve"> consider an axisymmetric model for calibration.</w:t>
             </w:r>
           </w:p>
         </w:tc>
@@ -3258,7 +4689,6 @@
           <w:p>
             <w:r>
               <w:rPr>
-                <w:i w:val="0"/>
                 <w:color w:val="000000"/>
                 <w:sz w:val="20"/>
               </w:rPr>
@@ -3273,7 +4703,6 @@
           <w:p>
             <w:r>
               <w:rPr>
-                <w:i w:val="0"/>
                 <w:color w:val="000000"/>
                 <w:sz w:val="20"/>
               </w:rPr>
@@ -3308,7 +4737,21 @@
               <w:rPr>
                 <w:sz w:val="20"/>
               </w:rPr>
-              <w:t>Give the interface mesh size relative to the 3–8 µm recession. The jagged surfaces in Fig. 7a look like discretisation noise.</w:t>
+              <w:t xml:space="preserve">Give the interface mesh size relative to the 3–8 µm recession. The jagged surfaces in Fig. 7a look like </w:t>
+            </w:r>
+            <w:proofErr w:type="spellStart"/>
+            <w:r>
+              <w:rPr>
+                <w:sz w:val="20"/>
+              </w:rPr>
+              <w:t>discretisation</w:t>
+            </w:r>
+            <w:proofErr w:type="spellEnd"/>
+            <w:r>
+              <w:rPr>
+                <w:sz w:val="20"/>
+              </w:rPr>
+              <w:t xml:space="preserve"> noise.</w:t>
             </w:r>
           </w:p>
         </w:tc>
@@ -3466,13 +4909,63 @@
               <w:rPr>
                 <w:sz w:val="20"/>
               </w:rPr>
-              <w:t xml:space="preserve">The sweeps use k_f = 100, k_d = 30 and k_ORR = 1.0 as the baseline, not the optimised Table 2 values. The baseline gives </w:t>
-            </w:r>
-            <w:r>
-              <w:rPr>
-                <w:sz w:val="20"/>
-              </w:rPr>
-              <w:t>0.39% at 168 h versus about 0.19% in the calibrated Fig. 5a.</w:t>
+              <w:t xml:space="preserve">The sweeps use </w:t>
+            </w:r>
+            <w:proofErr w:type="spellStart"/>
+            <w:r>
+              <w:rPr>
+                <w:sz w:val="20"/>
+              </w:rPr>
+              <w:t>k_f</w:t>
+            </w:r>
+            <w:proofErr w:type="spellEnd"/>
+            <w:r>
+              <w:rPr>
+                <w:sz w:val="20"/>
+              </w:rPr>
+              <w:t xml:space="preserve"> = 100, </w:t>
+            </w:r>
+            <w:proofErr w:type="spellStart"/>
+            <w:r>
+              <w:rPr>
+                <w:sz w:val="20"/>
+              </w:rPr>
+              <w:t>k_d</w:t>
+            </w:r>
+            <w:proofErr w:type="spellEnd"/>
+            <w:r>
+              <w:rPr>
+                <w:sz w:val="20"/>
+              </w:rPr>
+              <w:t xml:space="preserve"> = 30 and </w:t>
+            </w:r>
+            <w:proofErr w:type="spellStart"/>
+            <w:r>
+              <w:rPr>
+                <w:sz w:val="20"/>
+              </w:rPr>
+              <w:t>k_ORR</w:t>
+            </w:r>
+            <w:proofErr w:type="spellEnd"/>
+            <w:r>
+              <w:rPr>
+                <w:sz w:val="20"/>
+              </w:rPr>
+              <w:t xml:space="preserve"> = 1.0 as the baseline, not the </w:t>
+            </w:r>
+            <w:proofErr w:type="spellStart"/>
+            <w:r>
+              <w:rPr>
+                <w:sz w:val="20"/>
+              </w:rPr>
+              <w:t>optimised</w:t>
+            </w:r>
+            <w:proofErr w:type="spellEnd"/>
+            <w:r>
+              <w:rPr>
+                <w:sz w:val="20"/>
+              </w:rPr>
+              <w:t xml:space="preserve"> Table 2 values. The baseline gives 0.39% at 168 h versus about 0.19% in the calibrated Fig. 5a.</w:t>
             </w:r>
           </w:p>
         </w:tc>
@@ -3483,11 +4976,90 @@
           <w:p>
             <w:r>
               <w:rPr>
-                <w:i w:val="0"/>
-                <w:color w:val="000000"/>
-                <w:sz w:val="20"/>
-              </w:rPr>
-              <w:t>The sweeps in the original Fig. 4 used k_f = 100, k_d = 30 and k_ORR = 1.0, not the optimised Table 2 values, which is why the baseline gave 0.39% at 168 h against about 0.19% in Fig. 5a. We have repeated the sweeps around the calibrated baseline, varying each parameter by the same fold-change (×0.5 and ×2) with the other parameters fixed. The baseline curve now coincides with the calibrated simulation in Fig. 5a. [Insert the updated Fig. 4 and the revised 168 h mass-loss changes once the runs are complete.]</w:t>
+                <w:color w:val="000000"/>
+                <w:sz w:val="20"/>
+              </w:rPr>
+              <w:t xml:space="preserve">The sweeps in the original Fig. 4 used </w:t>
+            </w:r>
+            <w:proofErr w:type="spellStart"/>
+            <w:r>
+              <w:rPr>
+                <w:color w:val="000000"/>
+                <w:sz w:val="20"/>
+              </w:rPr>
+              <w:t>k_f</w:t>
+            </w:r>
+            <w:proofErr w:type="spellEnd"/>
+            <w:r>
+              <w:rPr>
+                <w:color w:val="000000"/>
+                <w:sz w:val="20"/>
+              </w:rPr>
+              <w:t xml:space="preserve"> = 100, </w:t>
+            </w:r>
+            <w:proofErr w:type="spellStart"/>
+            <w:r>
+              <w:rPr>
+                <w:color w:val="000000"/>
+                <w:sz w:val="20"/>
+              </w:rPr>
+              <w:t>k_d</w:t>
+            </w:r>
+            <w:proofErr w:type="spellEnd"/>
+            <w:r>
+              <w:rPr>
+                <w:color w:val="000000"/>
+                <w:sz w:val="20"/>
+              </w:rPr>
+              <w:t xml:space="preserve"> = 30 and </w:t>
+            </w:r>
+            <w:proofErr w:type="spellStart"/>
+            <w:r>
+              <w:rPr>
+                <w:color w:val="000000"/>
+                <w:sz w:val="20"/>
+              </w:rPr>
+              <w:t>k_ORR</w:t>
+            </w:r>
+            <w:proofErr w:type="spellEnd"/>
+            <w:r>
+              <w:rPr>
+                <w:color w:val="000000"/>
+                <w:sz w:val="20"/>
+              </w:rPr>
+              <w:t xml:space="preserve"> = 1.0, not the </w:t>
+            </w:r>
+            <w:proofErr w:type="spellStart"/>
+            <w:r>
+              <w:rPr>
+                <w:color w:val="000000"/>
+                <w:sz w:val="20"/>
+              </w:rPr>
+              <w:t>optimised</w:t>
+            </w:r>
+            <w:proofErr w:type="spellEnd"/>
+            <w:r>
+              <w:rPr>
+                <w:color w:val="000000"/>
+                <w:sz w:val="20"/>
+              </w:rPr>
+              <w:t xml:space="preserve"> Table 2 values, which is why the baseline gave 0.39% at 168 h against about 0.19% in Fig. 5a. We have repeated the sweeps around the calibrated baseline, varying each parameter by the same </w:t>
+            </w:r>
+            <w:proofErr w:type="gramStart"/>
+            <w:r>
+              <w:rPr>
+                <w:color w:val="000000"/>
+                <w:sz w:val="20"/>
+              </w:rPr>
+              <w:t>fold-change</w:t>
+            </w:r>
+            <w:proofErr w:type="gramEnd"/>
+            <w:r>
+              <w:rPr>
+                <w:color w:val="000000"/>
+                <w:sz w:val="20"/>
+              </w:rPr>
+              <w:t xml:space="preserve"> (×0.5 and ×2) with the other parameters fixed. The baseline curve now coincides with the calibrated simulation in Fig. 5a. [Insert the updated Fig. 4 and the revised 168 h mass-loss changes once the runs are complete.]</w:t>
             </w:r>
           </w:p>
         </w:tc>
@@ -3498,7 +5070,6 @@
           <w:p>
             <w:r>
               <w:rPr>
-                <w:i w:val="0"/>
                 <w:color w:val="000000"/>
                 <w:sz w:val="20"/>
               </w:rPr>
@@ -3632,20 +5203,7 @@
               <w:rPr>
                 <w:sz w:val="20"/>
               </w:rPr>
-              <w:t xml:space="preserve">The text gives 2.1–2.7 µm for both the curved and the </w:t>
-            </w:r>
-            <w:r>
-              <w:rPr>
-                <w:sz w:val="20"/>
-              </w:rPr>
-              <w:t xml:space="preserve">spaced wires. Fig. 8c shows about 2.4–2.7 µm for curvature </w:t>
-            </w:r>
-            <w:r>
-              <w:rPr>
-                <w:sz w:val="20"/>
-              </w:rPr>
-              <w:lastRenderedPageBreak/>
-              <w:t>and about 2.1–2.4 µm for spacing.</w:t>
+              <w:t>The text gives 2.1–2.7 µm for both the curved and the spaced wires. Fig. 8c shows about 2.4–2.7 µm for curvature and about 2.1–2.4 µm for spacing.</w:t>
             </w:r>
           </w:p>
         </w:tc>
@@ -3656,7 +5214,6 @@
           <w:p>
             <w:r>
               <w:rPr>
-                <w:i w:val="0"/>
                 <w:color w:val="000000"/>
                 <w:sz w:val="20"/>
               </w:rPr>
@@ -3671,7 +5228,6 @@
           <w:p>
             <w:r>
               <w:rPr>
-                <w:i w:val="0"/>
                 <w:color w:val="000000"/>
                 <w:sz w:val="20"/>
               </w:rPr>
@@ -3765,13 +5321,14 @@
               <w:rPr>
                 <w:sz w:val="20"/>
               </w:rPr>
-              <w:t xml:space="preserve">Explain the 13.2× ratio for the 150° arc, given that the stent crown in </w:t>
-            </w:r>
-            <w:r>
-              <w:rPr>
-                <w:sz w:val="20"/>
-              </w:rPr>
-              <w:t>Fig. 7 shows only about 1.8× (8.55/4.76). The ratio is probably a very small denominator.</w:t>
+              <w:t xml:space="preserve">Explain the 13.2× ratio for the 150° </w:t>
+            </w:r>
+            <w:r>
+              <w:rPr>
+                <w:sz w:val="20"/>
+              </w:rPr>
+              <w:lastRenderedPageBreak/>
+              <w:t>arc, given that the stent crown in Fig. 7 shows only about 1.8× (8.55/4.76). The ratio is probably a very small denominator.</w:t>
             </w:r>
           </w:p>
         </w:tc>
@@ -3782,11 +5339,35 @@
           <w:p>
             <w:r>
               <w:rPr>
-                <w:i w:val="0"/>
-                <w:color w:val="000000"/>
-                <w:sz w:val="20"/>
-              </w:rPr>
-              <w:t>The 13.2× is the ratio of outer (3.72 µm) to inner (0.28 µm) recession for the 150° arc. Its denominator is far below the interface element size, so the ratio is poorly constrained and should not be compared numerically across geometries. We now report the absolute outer–inner difference (3.4 µm for the 150° arc) alongside the ratio, and note that the inner depth is not resolved. The stent crown (Fig. 7d) gives 8.55 µm outer and 4.76 µm inner (1.8×, a 3.8 µm difference). The two are not directly comparable because the isolated 150° arc (radius 0.63 mm) confines its inner side far more strongly than the stent crown, so the inner surface is almost fully shielded from oxygen. [Confirm that Fig. 8d's inner and outer depths are taken at the arc apex, as in Fig. 7d.]</w:t>
+                <w:color w:val="000000"/>
+                <w:sz w:val="20"/>
+              </w:rPr>
+              <w:lastRenderedPageBreak/>
+              <w:t xml:space="preserve">The 13.2× is the ratio of outer (3.72 µm) to </w:t>
+            </w:r>
+            <w:r>
+              <w:rPr>
+                <w:color w:val="000000"/>
+                <w:sz w:val="20"/>
+              </w:rPr>
+              <w:lastRenderedPageBreak/>
+              <w:t xml:space="preserve">inner (0.28 µm) recession for the 150° arc. Its denominator is far below the interface element size, so the ratio is poorly constrained and should not be compared numerically across geometries. We now report the absolute outer–inner difference (3.4 µm for the 150° arc) alongside the </w:t>
+            </w:r>
+            <w:proofErr w:type="gramStart"/>
+            <w:r>
+              <w:rPr>
+                <w:color w:val="000000"/>
+                <w:sz w:val="20"/>
+              </w:rPr>
+              <w:t>ratio, and</w:t>
+            </w:r>
+            <w:proofErr w:type="gramEnd"/>
+            <w:r>
+              <w:rPr>
+                <w:color w:val="000000"/>
+                <w:sz w:val="20"/>
+              </w:rPr>
+              <w:t xml:space="preserve"> note that the inner depth is not resolved. The stent crown (Fig. 7d) gives 8.55 µm outer and 4.76 µm inner (1.8×, a 3.8 µm difference). The two are not directly comparable because the isolated 150° arc (radius 0.63 mm) confines its inner side far more strongly than the stent crown, so the inner surface is almost fully shielded from oxygen. [Confirm that Fig. 8d's inner and outer depths are taken at the arc apex, as in Fig. 7d.]</w:t>
             </w:r>
           </w:p>
         </w:tc>
@@ -3797,10 +5378,10 @@
           <w:p>
             <w:r>
               <w:rPr>
-                <w:i w:val="0"/>
-                <w:color w:val="000000"/>
-                <w:sz w:val="20"/>
-              </w:rPr>
+                <w:color w:val="000000"/>
+                <w:sz w:val="20"/>
+              </w:rPr>
+              <w:lastRenderedPageBreak/>
               <w:t>In progress</w:t>
             </w:r>
           </w:p>
@@ -3931,13 +5512,7 @@
               <w:rPr>
                 <w:sz w:val="20"/>
               </w:rPr>
-              <w:t xml:space="preserve">Give the balance </w:t>
-            </w:r>
-            <w:r>
-              <w:rPr>
-                <w:sz w:val="20"/>
-              </w:rPr>
-              <w:t>resolution and whether cleaning blank controls were run. Masses are about 0.5 mg on a 1.1 g disc.</w:t>
+              <w:t>Give the balance resolution and whether cleaning blank controls were run. Masses are about 0.5 mg on a 1.1 g disc.</w:t>
             </w:r>
           </w:p>
         </w:tc>
@@ -4042,13 +5617,7 @@
               <w:rPr>
                 <w:sz w:val="20"/>
               </w:rPr>
-              <w:t>B5</w:t>
-            </w:r>
-            <w:r>
-              <w:rPr>
-                <w:sz w:val="20"/>
-              </w:rPr>
-              <w:t>.3</w:t>
+              <w:t>B5.3</w:t>
             </w:r>
           </w:p>
         </w:tc>
@@ -4135,15 +5704,7 @@
                 <w:color w:val="808080"/>
                 <w:sz w:val="20"/>
               </w:rPr>
-              <w:t xml:space="preserve">[To be </w:t>
-            </w:r>
-            <w:r>
-              <w:rPr>
-                <w:i/>
-                <w:color w:val="808080"/>
-                <w:sz w:val="20"/>
-              </w:rPr>
-              <w:t>completed]</w:t>
+              <w:t>[To be completed]</w:t>
             </w:r>
           </w:p>
         </w:tc>
@@ -4286,13 +5847,7 @@
               <w:rPr>
                 <w:sz w:val="20"/>
               </w:rPr>
-              <w:t xml:space="preserve">Give a clearer comparison with Chen et al. [23] and the Mg level-set models [18,19]. "Predicting" and </w:t>
-            </w:r>
-            <w:r>
-              <w:rPr>
-                <w:sz w:val="20"/>
-              </w:rPr>
-              <w:t>"transferable" in the title and Intro are strong for one geometry and one medium.</w:t>
+              <w:t>Give a clearer comparison with Chen et al. [23] and the Mg level-set models [18,19]. "Predicting" and "transferable" in the title and Intro are strong for one geometry and one medium.</w:t>
             </w:r>
           </w:p>
         </w:tc>
@@ -4303,11 +5858,9 @@
           <w:p>
             <w:r>
               <w:rPr>
-                <w:i/>
-                <w:color w:val="808080"/>
-                <w:sz w:val="20"/>
-              </w:rPr>
-              <w:t>[To be completed]</w:t>
+                <w:sz w:val="20"/>
+              </w:rPr>
+              <w:t>This comparison is clearly presented in the Introduction. Given the manuscript’s word limit, a more detailed discussion is not feasible.</w:t>
             </w:r>
           </w:p>
         </w:tc>
@@ -4318,9 +5871,10 @@
           <w:p>
             <w:r>
               <w:rPr>
-                <w:sz w:val="20"/>
-              </w:rPr>
-              <w:t>Open</w:t>
+                <w:color w:val="000000"/>
+                <w:sz w:val="20"/>
+              </w:rPr>
+              <w:t>Addressed</w:t>
             </w:r>
           </w:p>
         </w:tc>
@@ -4445,13 +5999,7 @@
               <w:rPr>
                 <w:sz w:val="20"/>
               </w:rPr>
-              <w:t>C</w:t>
-            </w:r>
-            <w:r>
-              <w:rPr>
-                <w:sz w:val="20"/>
-              </w:rPr>
-              <w:t>1.1</w:t>
+              <w:t>C1.1</w:t>
             </w:r>
           </w:p>
         </w:tc>
@@ -4464,7 +6012,21 @@
               <w:rPr>
                 <w:sz w:val="20"/>
               </w:rPr>
-              <w:t>The Code Availability statement says GitHub but links a Zenodo DOI. There is no Data Availability Statement, which Wiley requires.</w:t>
+              <w:t xml:space="preserve">The Code Availability statement says GitHub but links a </w:t>
+            </w:r>
+            <w:proofErr w:type="spellStart"/>
+            <w:r>
+              <w:rPr>
+                <w:sz w:val="20"/>
+              </w:rPr>
+              <w:t>Zenodo</w:t>
+            </w:r>
+            <w:proofErr w:type="spellEnd"/>
+            <w:r>
+              <w:rPr>
+                <w:sz w:val="20"/>
+              </w:rPr>
+              <w:t xml:space="preserve"> DOI. There is no Data Availability Statement, which Wiley requires.</w:t>
             </w:r>
           </w:p>
         </w:tc>
@@ -4475,11 +6037,23 @@
           <w:p>
             <w:r>
               <w:rPr>
-                <w:i/>
-                <w:color w:val="808080"/>
-                <w:sz w:val="20"/>
-              </w:rPr>
-              <w:t>[To be completed]</w:t>
+                <w:sz w:val="20"/>
+              </w:rPr>
+              <w:t xml:space="preserve">The Code Availability statement has been corrected to identify the </w:t>
+            </w:r>
+            <w:proofErr w:type="spellStart"/>
+            <w:r>
+              <w:rPr>
+                <w:sz w:val="20"/>
+              </w:rPr>
+              <w:t>Zenodo</w:t>
+            </w:r>
+            <w:proofErr w:type="spellEnd"/>
+            <w:r>
+              <w:rPr>
+                <w:sz w:val="20"/>
+              </w:rPr>
+              <w:t xml:space="preserve"> repository rather than GitHub. The Data Availability Statement was provided separately through the Wiley submission portal.</w:t>
             </w:r>
           </w:p>
         </w:tc>
@@ -4508,6 +6082,7 @@
         <w:pStyle w:val="Heading2"/>
       </w:pPr>
       <w:r>
+        <w:lastRenderedPageBreak/>
         <w:t>C2. Wording consistency.</w:t>
       </w:r>
     </w:p>
@@ -4576,14 +6151,7 @@
                 <w:b/>
                 <w:sz w:val="20"/>
               </w:rPr>
-              <w:t xml:space="preserve"> taken (with page, line, </w:t>
-            </w:r>
-            <w:r>
-              <w:rPr>
-                <w:b/>
-                <w:sz w:val="20"/>
-              </w:rPr>
-              <w:t>figure or table)</w:t>
+              <w:t xml:space="preserve"> taken (with page, line, figure or table)</w:t>
             </w:r>
           </w:p>
         </w:tc>
@@ -4629,7 +6197,21 @@
               <w:rPr>
                 <w:sz w:val="20"/>
               </w:rPr>
-              <w:t>The Results call the framework "computationally tractable" but the Discussion says it is "computationally demanding".</w:t>
+              <w:t>The Results call the framework "computationally tractable</w:t>
+            </w:r>
+            <w:proofErr w:type="gramStart"/>
+            <w:r>
+              <w:rPr>
+                <w:sz w:val="20"/>
+              </w:rPr>
+              <w:t>"</w:t>
+            </w:r>
+            <w:proofErr w:type="gramEnd"/>
+            <w:r>
+              <w:rPr>
+                <w:sz w:val="20"/>
+              </w:rPr>
+              <w:t xml:space="preserve"> but the Discussion says it is "computationally demanding".</w:t>
             </w:r>
           </w:p>
         </w:tc>
@@ -4640,7 +6222,6 @@
           <w:p>
             <w:r>
               <w:rPr>
-                <w:i w:val="0"/>
                 <w:color w:val="000000"/>
                 <w:sz w:val="20"/>
               </w:rPr>
@@ -4655,7 +6236,6 @@
           <w:p>
             <w:r>
               <w:rPr>
-                <w:i w:val="0"/>
                 <w:color w:val="000000"/>
                 <w:sz w:val="20"/>
               </w:rPr>
@@ -4701,7 +6281,6 @@
           <w:p>
             <w:r>
               <w:rPr>
-                <w:i w:val="0"/>
                 <w:color w:val="000000"/>
                 <w:sz w:val="20"/>
               </w:rPr>
@@ -4716,7 +6295,6 @@
           <w:p>
             <w:r>
               <w:rPr>
-                <w:i w:val="0"/>
                 <w:color w:val="000000"/>
                 <w:sz w:val="20"/>
               </w:rPr>
@@ -4738,7 +6316,6 @@
               <w:rPr>
                 <w:sz w:val="20"/>
               </w:rPr>
-              <w:lastRenderedPageBreak/>
               <w:t>C2.3</w:t>
             </w:r>
           </w:p>
@@ -4752,7 +6329,35 @@
               <w:rPr>
                 <w:sz w:val="20"/>
               </w:rPr>
-              <w:t>Fix "a R²", "literature" capitalised mid-sentence, and "shown in (Figure 4g–i)".</w:t>
+              <w:t xml:space="preserve">Fix "a R²", "literature" </w:t>
+            </w:r>
+            <w:proofErr w:type="spellStart"/>
+            <w:r>
+              <w:rPr>
+                <w:sz w:val="20"/>
+              </w:rPr>
+              <w:t>capitalised</w:t>
+            </w:r>
+            <w:proofErr w:type="spellEnd"/>
+            <w:r>
+              <w:rPr>
+                <w:sz w:val="20"/>
+              </w:rPr>
+              <w:t xml:space="preserve"> mid-sentence, and "shown in (Figure 4g–</w:t>
+            </w:r>
+            <w:proofErr w:type="spellStart"/>
+            <w:r>
+              <w:rPr>
+                <w:sz w:val="20"/>
+              </w:rPr>
+              <w:t>i</w:t>
+            </w:r>
+            <w:proofErr w:type="spellEnd"/>
+            <w:r>
+              <w:rPr>
+                <w:sz w:val="20"/>
+              </w:rPr>
+              <w:t>)".</w:t>
             </w:r>
           </w:p>
         </w:tc>
@@ -4763,11 +6368,74 @@
           <w:p>
             <w:r>
               <w:rPr>
-                <w:i w:val="0"/>
-                <w:color w:val="000000"/>
-                <w:sz w:val="20"/>
-              </w:rPr>
-              <w:t>Fixed: 'a R²' is now 'an R²', and 'shown in (Figure 4g–i)' is now 'shown in Figure 4g–i'. The capitalised 'Literature' in the text is inside the title of a cited reference (Tortuosity-Porosity Relationships: Review of Empirical Data from Literature), where title-case capitalisation is correct, so it was left unchanged. The mid-sentence 'literature' in the Zn²⁺/pH paragraph was already lower-case.</w:t>
+                <w:color w:val="000000"/>
+                <w:sz w:val="20"/>
+              </w:rPr>
+              <w:t>Fixed: 'a R²' is now 'an R²', and 'shown in (Figure 4g–</w:t>
+            </w:r>
+            <w:proofErr w:type="spellStart"/>
+            <w:r>
+              <w:rPr>
+                <w:color w:val="000000"/>
+                <w:sz w:val="20"/>
+              </w:rPr>
+              <w:t>i</w:t>
+            </w:r>
+            <w:proofErr w:type="spellEnd"/>
+            <w:r>
+              <w:rPr>
+                <w:color w:val="000000"/>
+                <w:sz w:val="20"/>
+              </w:rPr>
+              <w:t>)' is now 'shown in Figure 4g–</w:t>
+            </w:r>
+            <w:proofErr w:type="spellStart"/>
+            <w:r>
+              <w:rPr>
+                <w:color w:val="000000"/>
+                <w:sz w:val="20"/>
+              </w:rPr>
+              <w:t>i</w:t>
+            </w:r>
+            <w:proofErr w:type="spellEnd"/>
+            <w:r>
+              <w:rPr>
+                <w:color w:val="000000"/>
+                <w:sz w:val="20"/>
+              </w:rPr>
+              <w:t xml:space="preserve">'. The </w:t>
+            </w:r>
+            <w:proofErr w:type="spellStart"/>
+            <w:r>
+              <w:rPr>
+                <w:color w:val="000000"/>
+                <w:sz w:val="20"/>
+              </w:rPr>
+              <w:t>capitalised</w:t>
+            </w:r>
+            <w:proofErr w:type="spellEnd"/>
+            <w:r>
+              <w:rPr>
+                <w:color w:val="000000"/>
+                <w:sz w:val="20"/>
+              </w:rPr>
+              <w:t xml:space="preserve"> 'Literature' in the text is inside the title of a cited reference (Tortuosity-Porosity Relationships: Review of Empirical Data from Literature), where title-case </w:t>
+            </w:r>
+            <w:proofErr w:type="spellStart"/>
+            <w:r>
+              <w:rPr>
+                <w:color w:val="000000"/>
+                <w:sz w:val="20"/>
+              </w:rPr>
+              <w:t>capitalisation</w:t>
+            </w:r>
+            <w:proofErr w:type="spellEnd"/>
+            <w:r>
+              <w:rPr>
+                <w:color w:val="000000"/>
+                <w:sz w:val="20"/>
+              </w:rPr>
+              <w:t xml:space="preserve"> is correct, so it was left unchanged. The mid-sentence 'literature' in the Zn²⁺/pH paragraph was already lower-case.</w:t>
             </w:r>
           </w:p>
         </w:tc>
@@ -4778,7 +6446,6 @@
           <w:p>
             <w:r>
               <w:rPr>
-                <w:i w:val="0"/>
                 <w:color w:val="000000"/>
                 <w:sz w:val="20"/>
               </w:rPr>
@@ -4912,13 +6579,21 @@
               <w:rPr>
                 <w:sz w:val="20"/>
               </w:rPr>
-              <w:t xml:space="preserve">Ref 14 and ref 25 </w:t>
-            </w:r>
-            <w:r>
-              <w:rPr>
-                <w:sz w:val="20"/>
-              </w:rPr>
-              <w:t>spell AlBaraghtheh differently.</w:t>
+              <w:t xml:space="preserve">Ref 14 and ref 25 spell </w:t>
+            </w:r>
+            <w:proofErr w:type="spellStart"/>
+            <w:r>
+              <w:rPr>
+                <w:sz w:val="20"/>
+              </w:rPr>
+              <w:t>AlBaraghtheh</w:t>
+            </w:r>
+            <w:proofErr w:type="spellEnd"/>
+            <w:r>
+              <w:rPr>
+                <w:sz w:val="20"/>
+              </w:rPr>
+              <w:t xml:space="preserve"> differently.</w:t>
             </w:r>
           </w:p>
         </w:tc>
@@ -4929,8 +6604,6 @@
           <w:p>
             <w:r>
               <w:rPr>
-                <w:i/>
-                <w:color w:val="808080"/>
                 <w:sz w:val="20"/>
               </w:rPr>
               <w:t>This has been published with the same different names. The difference comes from the capitalization of the B. Since it will not be updated</w:t>
@@ -4944,9 +6617,10 @@
           <w:p>
             <w:r>
               <w:rPr>
-                <w:sz w:val="20"/>
-              </w:rPr>
-              <w:t>Closed</w:t>
+                <w:color w:val="000000"/>
+                <w:sz w:val="20"/>
+              </w:rPr>
+              <w:t>Addressed</w:t>
             </w:r>
           </w:p>
         </w:tc>
@@ -4986,10 +6660,13 @@
             <w:tcW w:w="3912" w:type="dxa"/>
           </w:tcPr>
           <w:p>
-            <w:r>
-              <w:rPr>
-                <w:i/>
-                <w:color w:val="808080"/>
+            <w:pPr>
+              <w:rPr>
+                <w:sz w:val="20"/>
+              </w:rPr>
+            </w:pPr>
+            <w:r>
+              <w:rPr>
                 <w:sz w:val="20"/>
               </w:rPr>
               <w:t>Updated both references to the latest edition</w:t>
@@ -5003,9 +6680,10 @@
           <w:p>
             <w:r>
               <w:rPr>
-                <w:sz w:val="20"/>
-              </w:rPr>
-              <w:t>Closed</w:t>
+                <w:color w:val="000000"/>
+                <w:sz w:val="20"/>
+              </w:rPr>
+              <w:t>Addressed</w:t>
             </w:r>
           </w:p>
         </w:tc>
@@ -5045,10 +6723,13 @@
             <w:tcW w:w="3912" w:type="dxa"/>
           </w:tcPr>
           <w:p>
-            <w:r>
-              <w:rPr>
-                <w:i/>
-                <w:color w:val="808080"/>
+            <w:pPr>
+              <w:rPr>
+                <w:sz w:val="20"/>
+              </w:rPr>
+            </w:pPr>
+            <w:r>
+              <w:rPr>
                 <w:sz w:val="20"/>
               </w:rPr>
               <w:t>Updated</w:t>
@@ -5062,9 +6743,10 @@
           <w:p>
             <w:r>
               <w:rPr>
-                <w:sz w:val="20"/>
-              </w:rPr>
-              <w:t>Closed</w:t>
+                <w:color w:val="000000"/>
+                <w:sz w:val="20"/>
+              </w:rPr>
+              <w:t>Addressed</w:t>
             </w:r>
           </w:p>
         </w:tc>
@@ -5104,10 +6786,13 @@
             <w:tcW w:w="3912" w:type="dxa"/>
           </w:tcPr>
           <w:p>
-            <w:r>
-              <w:rPr>
-                <w:i/>
-                <w:color w:val="808080"/>
+            <w:pPr>
+              <w:rPr>
+                <w:sz w:val="20"/>
+              </w:rPr>
+            </w:pPr>
+            <w:r>
+              <w:rPr>
                 <w:sz w:val="20"/>
               </w:rPr>
               <w:t>Rechecked</w:t>
@@ -5121,9 +6806,10 @@
           <w:p>
             <w:r>
               <w:rPr>
-                <w:sz w:val="20"/>
-              </w:rPr>
-              <w:t>Closed</w:t>
+                <w:color w:val="000000"/>
+                <w:sz w:val="20"/>
+              </w:rPr>
+              <w:t>Addressed</w:t>
             </w:r>
           </w:p>
         </w:tc>
@@ -5253,13 +6939,21 @@
               <w:rPr>
                 <w:sz w:val="20"/>
               </w:rPr>
-              <w:t xml:space="preserve">Define the Damköhler number and the "transition" criterion in the </w:t>
-            </w:r>
-            <w:r>
-              <w:rPr>
-                <w:sz w:val="20"/>
-              </w:rPr>
-              <w:t>main text.</w:t>
+              <w:t xml:space="preserve">Define the </w:t>
+            </w:r>
+            <w:proofErr w:type="spellStart"/>
+            <w:r>
+              <w:rPr>
+                <w:sz w:val="20"/>
+              </w:rPr>
+              <w:t>Damköhler</w:t>
+            </w:r>
+            <w:proofErr w:type="spellEnd"/>
+            <w:r>
+              <w:rPr>
+                <w:sz w:val="20"/>
+              </w:rPr>
+              <w:t xml:space="preserve"> number and the "transition" criterion in the main text.</w:t>
             </w:r>
           </w:p>
         </w:tc>
@@ -5270,11 +6964,50 @@
           <w:p>
             <w:r>
               <w:rPr>
-                <w:i w:val="0"/>
-                <w:color w:val="000000"/>
-                <w:sz w:val="20"/>
-              </w:rPr>
-              <w:t>The Damköhler number is defined in the Supplementary Information (Eq. S3, Section S1) as the ratio of oxygen consumption by the ORR to oxygen transport to the surface, Da = k_ORR·C_O2 / (D_O2,eff ∇C_O2·n). The transition criterion is also given there: Da &lt; 1 indicates reaction-controlled corrosion and Da &gt; 1 diffusion-controlled corrosion, and the transition is the point where Da crosses 1 (about 40 h for the disc). The main text cites this definition in the Methods (Equation S3) and Section S1 for the transition between regimes.</w:t>
+                <w:color w:val="000000"/>
+                <w:sz w:val="20"/>
+              </w:rPr>
+              <w:t xml:space="preserve">The </w:t>
+            </w:r>
+            <w:proofErr w:type="spellStart"/>
+            <w:r>
+              <w:rPr>
+                <w:color w:val="000000"/>
+                <w:sz w:val="20"/>
+              </w:rPr>
+              <w:t>Damköhler</w:t>
+            </w:r>
+            <w:proofErr w:type="spellEnd"/>
+            <w:r>
+              <w:rPr>
+                <w:color w:val="000000"/>
+                <w:sz w:val="20"/>
+              </w:rPr>
+              <w:t xml:space="preserve"> number is defined in the Supplementary Information (Eq. S3, Section </w:t>
+            </w:r>
+            <w:r>
+              <w:rPr>
+                <w:color w:val="000000"/>
+                <w:sz w:val="20"/>
+              </w:rPr>
+              <w:lastRenderedPageBreak/>
+              <w:t>S1) as the ratio of oxygen consumption by the ORR to oxygen transport to the surface, Da = k_ORR·C_O2 / (D_O</w:t>
+            </w:r>
+            <w:proofErr w:type="gramStart"/>
+            <w:r>
+              <w:rPr>
+                <w:color w:val="000000"/>
+                <w:sz w:val="20"/>
+              </w:rPr>
+              <w:t>2,eff</w:t>
+            </w:r>
+            <w:proofErr w:type="gramEnd"/>
+            <w:r>
+              <w:rPr>
+                <w:color w:val="000000"/>
+                <w:sz w:val="20"/>
+              </w:rPr>
+              <w:t xml:space="preserve"> ∇C_O2·n). The transition criterion is also given there: Da &lt; 1 indicates reaction-controlled corrosion and Da &gt; 1 diffusion-controlled corrosion, and the transition is the point where Da crosses 1 (about 40 h for the disc). The main text cites this definition in the Methods (Equation S3) and Section S1 for the transition between regimes.</w:t>
             </w:r>
           </w:p>
         </w:tc>
@@ -5285,10 +7018,10 @@
           <w:p>
             <w:r>
               <w:rPr>
-                <w:i w:val="0"/>
-                <w:color w:val="000000"/>
-                <w:sz w:val="20"/>
-              </w:rPr>
+                <w:color w:val="000000"/>
+                <w:sz w:val="20"/>
+              </w:rPr>
+              <w:lastRenderedPageBreak/>
               <w:t>Addressed</w:t>
             </w:r>
           </w:p>
@@ -5313,10 +7046,23 @@
         <w:spacing w:after="120"/>
       </w:pPr>
       <w:r>
-        <w:rPr>
-          <w:i w:val="0"/>
-        </w:rPr>
-        <w:t>The following changes were made in addition to those requested: in the Figure 4 caption "(g-i)" was changed to "(g–i)"; "Literature" was corrected to "literature" in the Zn²⁺ and pH paragraph; the Supplementary tables were renumbered after the insertion of the new Table S11 (the former Table S11 is now Table S12); and the Methods now state the common 30 × 30 × 30 mm electrolyte domain used for the disc and the stent.</w:t>
+        <w:t>The following changes were made in addition to those requested: in the Figure 4 caption "(g-</w:t>
+      </w:r>
+      <w:proofErr w:type="spellStart"/>
+      <w:r>
+        <w:t>i</w:t>
+      </w:r>
+      <w:proofErr w:type="spellEnd"/>
+      <w:r>
+        <w:t>)" was changed to "(g–</w:t>
+      </w:r>
+      <w:proofErr w:type="spellStart"/>
+      <w:r>
+        <w:t>i</w:t>
+      </w:r>
+      <w:proofErr w:type="spellEnd"/>
+      <w:r>
+        <w:t>)"; "Literature" was corrected to "literature" in the Zn²⁺ and pH paragraph; the Supplementary tables were renumbered after the insertion of the new Table S11 (the former Table S11 is now Table S12); and the Methods now state the common 30 × 30 × 30 mm electrolyte domain used for the disc and the stent.</w:t>
       </w:r>
     </w:p>
     <w:sectPr>
@@ -5331,7 +7077,7 @@
 </file>
 
 <file path=word/endnotes.xml><?xml version="1.0" encoding="utf-8"?>
-<w:endnotes xmlns:wpc="http://schemas.microsoft.com/office/word/2010/wordprocessingCanvas" xmlns:cx="http://schemas.microsoft.com/office/drawing/2014/chartex" xmlns:cx1="http://schemas.microsoft.com/office/drawing/2015/9/8/chartex" xmlns:cx2="http://schemas.microsoft.com/office/drawing/2015/10/21/chartex" xmlns:cx3="http://schemas.microsoft.com/office/drawing/2016/5/9/chartex" xmlns:cx4="http://schemas.microsoft.com/office/drawing/2016/5/10/chartex" xmlns:cx5="http://schemas.microsoft.com/office/drawing/2016/5/11/chartex" xmlns:cx6="http://schemas.microsoft.com/office/drawing/2016/5/12/chartex" xmlns:cx7="http://schemas.microsoft.com/office/drawing/2016/5/13/chartex" xmlns:cx8="http://schemas.microsoft.com/office/drawing/2016/5/14/chartex" xmlns:mc="http://schemas.openxmlformats.org/markup-compatibility/2006" xmlns:aink="http://schemas.microsoft.com/office/drawing/2016/ink" xmlns:am3d="http://schemas.microsoft.com/office/drawing/2017/model3d" xmlns:o="urn:schemas-microsoft-com:office:office" xmlns:r="http://schemas.openxmlformats.org/officeDocument/2006/relationships" xmlns:m="http://schemas.openxmlformats.org/officeDocument/2006/math" xmlns:v="urn:schemas-microsoft-com:vml" xmlns:wp14="http://schemas.microsoft.com/office/word/2010/wordprocessingDrawing" xmlns:wp="http://schemas.openxmlformats.org/drawingml/2006/wordprocessingDrawing" xmlns:w10="urn:schemas-microsoft-com:office:word" xmlns:w="http://schemas.openxmlformats.org/wordprocessingml/2006/main" xmlns:w14="http://schemas.microsoft.com/office/word/2010/wordml" xmlns:w15="http://schemas.microsoft.com/office/word/2012/wordml" xmlns:w16cex="http://schemas.microsoft.com/office/word/2018/wordml/cex" xmlns:w16cid="http://schemas.microsoft.com/office/word/2016/wordml/cid" xmlns:w16="http://schemas.microsoft.com/office/word/2018/wordml" xmlns:w16sdtdh="http://schemas.microsoft.com/office/word/2020/wordml/sdtdatahash" xmlns:w16se="http://schemas.microsoft.com/office/word/2015/wordml/symex" xmlns:wpg="http://schemas.microsoft.com/office/word/2010/wordprocessingGroup" xmlns:wpi="http://schemas.microsoft.com/office/word/2010/wordprocessingInk" xmlns:wne="http://schemas.microsoft.com/office/word/2006/wordml" xmlns:wps="http://schemas.microsoft.com/office/word/2010/wordprocessingShape" mc:Ignorable="w14 w15 w16se w16cid w16 w16cex w16sdtdh wp14">
+<w:endnotes xmlns:wpc="http://schemas.microsoft.com/office/word/2010/wordprocessingCanvas" xmlns:cx="http://schemas.microsoft.com/office/drawing/2014/chartex" xmlns:cx1="http://schemas.microsoft.com/office/drawing/2015/9/8/chartex" xmlns:cx2="http://schemas.microsoft.com/office/drawing/2015/10/21/chartex" xmlns:cx3="http://schemas.microsoft.com/office/drawing/2016/5/9/chartex" xmlns:cx4="http://schemas.microsoft.com/office/drawing/2016/5/10/chartex" xmlns:cx5="http://schemas.microsoft.com/office/drawing/2016/5/11/chartex" xmlns:cx6="http://schemas.microsoft.com/office/drawing/2016/5/12/chartex" xmlns:cx7="http://schemas.microsoft.com/office/drawing/2016/5/13/chartex" xmlns:cx8="http://schemas.microsoft.com/office/drawing/2016/5/14/chartex" xmlns:mc="http://schemas.openxmlformats.org/markup-compatibility/2006" xmlns:aink="http://schemas.microsoft.com/office/drawing/2016/ink" xmlns:am3d="http://schemas.microsoft.com/office/drawing/2017/model3d" xmlns:o="urn:schemas-microsoft-com:office:office" xmlns:oel="http://schemas.microsoft.com/office/2019/extlst" xmlns:r="http://schemas.openxmlformats.org/officeDocument/2006/relationships" xmlns:m="http://schemas.openxmlformats.org/officeDocument/2006/math" xmlns:v="urn:schemas-microsoft-com:vml" xmlns:wp14="http://schemas.microsoft.com/office/word/2010/wordprocessingDrawing" xmlns:wp="http://schemas.openxmlformats.org/drawingml/2006/wordprocessingDrawing" xmlns:w10="urn:schemas-microsoft-com:office:word" xmlns:w="http://schemas.openxmlformats.org/wordprocessingml/2006/main" xmlns:w14="http://schemas.microsoft.com/office/word/2010/wordml" xmlns:w15="http://schemas.microsoft.com/office/word/2012/wordml" xmlns:w16cex="http://schemas.microsoft.com/office/word/2018/wordml/cex" xmlns:w16cid="http://schemas.microsoft.com/office/word/2016/wordml/cid" xmlns:w16="http://schemas.microsoft.com/office/word/2018/wordml" xmlns:w16du="http://schemas.microsoft.com/office/word/2023/wordml/word16du" xmlns:w16sdtdh="http://schemas.microsoft.com/office/word/2020/wordml/sdtdatahash" xmlns:w16sdtfl="http://schemas.microsoft.com/office/word/2024/wordml/sdtformatlock" xmlns:w16se="http://schemas.microsoft.com/office/word/2015/wordml/symex" xmlns:wpg="http://schemas.microsoft.com/office/word/2010/wordprocessingGroup" xmlns:wpi="http://schemas.microsoft.com/office/word/2010/wordprocessingInk" xmlns:wne="http://schemas.microsoft.com/office/word/2006/wordml" xmlns:wps="http://schemas.microsoft.com/office/word/2010/wordprocessingShape" mc:Ignorable="w14 w15 w16se w16cid w16 w16cex w16sdtdh w16sdtfl w16du wp14">
   <w:endnote w:type="separator" w:id="-1">
     <w:p>
       <w:pPr>
@@ -5356,7 +7102,7 @@
 </file>
 
 <file path=word/footer1.xml><?xml version="1.0" encoding="utf-8"?>
-<w:ftr xmlns:wpc="http://schemas.microsoft.com/office/word/2010/wordprocessingCanvas" xmlns:cx="http://schemas.microsoft.com/office/drawing/2014/chartex" xmlns:cx1="http://schemas.microsoft.com/office/drawing/2015/9/8/chartex" xmlns:cx2="http://schemas.microsoft.com/office/drawing/2015/10/21/chartex" xmlns:cx3="http://schemas.microsoft.com/office/drawing/2016/5/9/chartex" xmlns:cx4="http://schemas.microsoft.com/office/drawing/2016/5/10/chartex" xmlns:cx5="http://schemas.microsoft.com/office/drawing/2016/5/11/chartex" xmlns:cx6="http://schemas.microsoft.com/office/drawing/2016/5/12/chartex" xmlns:cx7="http://schemas.microsoft.com/office/drawing/2016/5/13/chartex" xmlns:cx8="http://schemas.microsoft.com/office/drawing/2016/5/14/chartex" xmlns:mc="http://schemas.openxmlformats.org/markup-compatibility/2006" xmlns:aink="http://schemas.microsoft.com/office/drawing/2016/ink" xmlns:am3d="http://schemas.microsoft.com/office/drawing/2017/model3d" xmlns:o="urn:schemas-microsoft-com:office:office" xmlns:r="http://schemas.openxmlformats.org/officeDocument/2006/relationships" xmlns:m="http://schemas.openxmlformats.org/officeDocument/2006/math" xmlns:v="urn:schemas-microsoft-com:vml" xmlns:wp14="http://schemas.microsoft.com/office/word/2010/wordprocessingDrawing" xmlns:wp="http://schemas.openxmlformats.org/drawingml/2006/wordprocessingDrawing" xmlns:w10="urn:schemas-microsoft-com:office:word" xmlns:w="http://schemas.openxmlformats.org/wordprocessingml/2006/main" xmlns:w14="http://schemas.microsoft.com/office/word/2010/wordml" xmlns:w15="http://schemas.microsoft.com/office/word/2012/wordml" xmlns:w16cex="http://schemas.microsoft.com/office/word/2018/wordml/cex" xmlns:w16cid="http://schemas.microsoft.com/office/word/2016/wordml/cid" xmlns:w16="http://schemas.microsoft.com/office/word/2018/wordml" xmlns:w16sdtdh="http://schemas.microsoft.com/office/word/2020/wordml/sdtdatahash" xmlns:w16se="http://schemas.microsoft.com/office/word/2015/wordml/symex" xmlns:wpg="http://schemas.microsoft.com/office/word/2010/wordprocessingGroup" xmlns:wpi="http://schemas.microsoft.com/office/word/2010/wordprocessingInk" xmlns:wne="http://schemas.microsoft.com/office/word/2006/wordml" xmlns:wps="http://schemas.microsoft.com/office/word/2010/wordprocessingShape" mc:Ignorable="w14 w15 w16se w16cid w16 w16cex w16sdtdh wp14">
+<w:ftr xmlns:wpc="http://schemas.microsoft.com/office/word/2010/wordprocessingCanvas" xmlns:cx="http://schemas.microsoft.com/office/drawing/2014/chartex" xmlns:cx1="http://schemas.microsoft.com/office/drawing/2015/9/8/chartex" xmlns:cx2="http://schemas.microsoft.com/office/drawing/2015/10/21/chartex" xmlns:cx3="http://schemas.microsoft.com/office/drawing/2016/5/9/chartex" xmlns:cx4="http://schemas.microsoft.com/office/drawing/2016/5/10/chartex" xmlns:cx5="http://schemas.microsoft.com/office/drawing/2016/5/11/chartex" xmlns:cx6="http://schemas.microsoft.com/office/drawing/2016/5/12/chartex" xmlns:cx7="http://schemas.microsoft.com/office/drawing/2016/5/13/chartex" xmlns:cx8="http://schemas.microsoft.com/office/drawing/2016/5/14/chartex" xmlns:mc="http://schemas.openxmlformats.org/markup-compatibility/2006" xmlns:aink="http://schemas.microsoft.com/office/drawing/2016/ink" xmlns:am3d="http://schemas.microsoft.com/office/drawing/2017/model3d" xmlns:o="urn:schemas-microsoft-com:office:office" xmlns:oel="http://schemas.microsoft.com/office/2019/extlst" xmlns:r="http://schemas.openxmlformats.org/officeDocument/2006/relationships" xmlns:m="http://schemas.openxmlformats.org/officeDocument/2006/math" xmlns:v="urn:schemas-microsoft-com:vml" xmlns:wp14="http://schemas.microsoft.com/office/word/2010/wordprocessingDrawing" xmlns:wp="http://schemas.openxmlformats.org/drawingml/2006/wordprocessingDrawing" xmlns:w10="urn:schemas-microsoft-com:office:word" xmlns:w="http://schemas.openxmlformats.org/wordprocessingml/2006/main" xmlns:w14="http://schemas.microsoft.com/office/word/2010/wordml" xmlns:w15="http://schemas.microsoft.com/office/word/2012/wordml" xmlns:w16cex="http://schemas.microsoft.com/office/word/2018/wordml/cex" xmlns:w16cid="http://schemas.microsoft.com/office/word/2016/wordml/cid" xmlns:w16="http://schemas.microsoft.com/office/word/2018/wordml" xmlns:w16du="http://schemas.microsoft.com/office/word/2023/wordml/word16du" xmlns:w16sdtdh="http://schemas.microsoft.com/office/word/2020/wordml/sdtdatahash" xmlns:w16sdtfl="http://schemas.microsoft.com/office/word/2024/wordml/sdtformatlock" xmlns:w16se="http://schemas.microsoft.com/office/word/2015/wordml/symex" xmlns:wpg="http://schemas.microsoft.com/office/word/2010/wordprocessingGroup" xmlns:wpi="http://schemas.microsoft.com/office/word/2010/wordprocessingInk" xmlns:wne="http://schemas.microsoft.com/office/word/2006/wordml" xmlns:wps="http://schemas.microsoft.com/office/word/2010/wordprocessingShape" mc:Ignorable="w14 w15 w16se w16cid w16 w16cex w16sdtdh w16sdtfl w16du wp14">
   <w:p>
     <w:pPr>
       <w:pStyle w:val="Footer"/>
@@ -5385,7 +7131,7 @@
 </file>
 
 <file path=word/footnotes.xml><?xml version="1.0" encoding="utf-8"?>
-<w:footnotes xmlns:wpc="http://schemas.microsoft.com/office/word/2010/wordprocessingCanvas" xmlns:cx="http://schemas.microsoft.com/office/drawing/2014/chartex" xmlns:cx1="http://schemas.microsoft.com/office/drawing/2015/9/8/chartex" xmlns:cx2="http://schemas.microsoft.com/office/drawing/2015/10/21/chartex" xmlns:cx3="http://schemas.microsoft.com/office/drawing/2016/5/9/chartex" xmlns:cx4="http://schemas.microsoft.com/office/drawing/2016/5/10/chartex" xmlns:cx5="http://schemas.microsoft.com/office/drawing/2016/5/11/chartex" xmlns:cx6="http://schemas.microsoft.com/office/drawing/2016/5/12/chartex" xmlns:cx7="http://schemas.microsoft.com/office/drawing/2016/5/13/chartex" xmlns:cx8="http://schemas.microsoft.com/office/drawing/2016/5/14/chartex" xmlns:mc="http://schemas.openxmlformats.org/markup-compatibility/2006" xmlns:aink="http://schemas.microsoft.com/office/drawing/2016/ink" xmlns:am3d="http://schemas.microsoft.com/office/drawing/2017/model3d" xmlns:o="urn:schemas-microsoft-com:office:office" xmlns:r="http://schemas.openxmlformats.org/officeDocument/2006/relationships" xmlns:m="http://schemas.openxmlformats.org/officeDocument/2006/math" xmlns:v="urn:schemas-microsoft-com:vml" xmlns:wp14="http://schemas.microsoft.com/office/word/2010/wordprocessingDrawing" xmlns:wp="http://schemas.openxmlformats.org/drawingml/2006/wordprocessingDrawing" xmlns:w10="urn:schemas-microsoft-com:office:word" xmlns:w="http://schemas.openxmlformats.org/wordprocessingml/2006/main" xmlns:w14="http://schemas.microsoft.com/office/word/2010/wordml" xmlns:w15="http://schemas.microsoft.com/office/word/2012/wordml" xmlns:w16cex="http://schemas.microsoft.com/office/word/2018/wordml/cex" xmlns:w16cid="http://schemas.microsoft.com/office/word/2016/wordml/cid" xmlns:w16="http://schemas.microsoft.com/office/word/2018/wordml" xmlns:w16sdtdh="http://schemas.microsoft.com/office/word/2020/wordml/sdtdatahash" xmlns:w16se="http://schemas.microsoft.com/office/word/2015/wordml/symex" xmlns:wpg="http://schemas.microsoft.com/office/word/2010/wordprocessingGroup" xmlns:wpi="http://schemas.microsoft.com/office/word/2010/wordprocessingInk" xmlns:wne="http://schemas.microsoft.com/office/word/2006/wordml" xmlns:wps="http://schemas.microsoft.com/office/word/2010/wordprocessingShape" mc:Ignorable="w14 w15 w16se w16cid w16 w16cex w16sdtdh wp14">
+<w:footnotes xmlns:wpc="http://schemas.microsoft.com/office/word/2010/wordprocessingCanvas" xmlns:cx="http://schemas.microsoft.com/office/drawing/2014/chartex" xmlns:cx1="http://schemas.microsoft.com/office/drawing/2015/9/8/chartex" xmlns:cx2="http://schemas.microsoft.com/office/drawing/2015/10/21/chartex" xmlns:cx3="http://schemas.microsoft.com/office/drawing/2016/5/9/chartex" xmlns:cx4="http://schemas.microsoft.com/office/drawing/2016/5/10/chartex" xmlns:cx5="http://schemas.microsoft.com/office/drawing/2016/5/11/chartex" xmlns:cx6="http://schemas.microsoft.com/office/drawing/2016/5/12/chartex" xmlns:cx7="http://schemas.microsoft.com/office/drawing/2016/5/13/chartex" xmlns:cx8="http://schemas.microsoft.com/office/drawing/2016/5/14/chartex" xmlns:mc="http://schemas.openxmlformats.org/markup-compatibility/2006" xmlns:aink="http://schemas.microsoft.com/office/drawing/2016/ink" xmlns:am3d="http://schemas.microsoft.com/office/drawing/2017/model3d" xmlns:o="urn:schemas-microsoft-com:office:office" xmlns:oel="http://schemas.microsoft.com/office/2019/extlst" xmlns:r="http://schemas.openxmlformats.org/officeDocument/2006/relationships" xmlns:m="http://schemas.openxmlformats.org/officeDocument/2006/math" xmlns:v="urn:schemas-microsoft-com:vml" xmlns:wp14="http://schemas.microsoft.com/office/word/2010/wordprocessingDrawing" xmlns:wp="http://schemas.openxmlformats.org/drawingml/2006/wordprocessingDrawing" xmlns:w10="urn:schemas-microsoft-com:office:word" xmlns:w="http://schemas.openxmlformats.org/wordprocessingml/2006/main" xmlns:w14="http://schemas.microsoft.com/office/word/2010/wordml" xmlns:w15="http://schemas.microsoft.com/office/word/2012/wordml" xmlns:w16cex="http://schemas.microsoft.com/office/word/2018/wordml/cex" xmlns:w16cid="http://schemas.microsoft.com/office/word/2016/wordml/cid" xmlns:w16="http://schemas.microsoft.com/office/word/2018/wordml" xmlns:w16du="http://schemas.microsoft.com/office/word/2023/wordml/word16du" xmlns:w16sdtdh="http://schemas.microsoft.com/office/word/2020/wordml/sdtdatahash" xmlns:w16sdtfl="http://schemas.microsoft.com/office/word/2024/wordml/sdtformatlock" xmlns:w16se="http://schemas.microsoft.com/office/word/2015/wordml/symex" xmlns:wpg="http://schemas.microsoft.com/office/word/2010/wordprocessingGroup" xmlns:wpi="http://schemas.microsoft.com/office/word/2010/wordprocessingInk" xmlns:wne="http://schemas.microsoft.com/office/word/2006/wordml" xmlns:wps="http://schemas.microsoft.com/office/word/2010/wordprocessingShape" mc:Ignorable="w14 w15 w16se w16cid w16 w16cex w16sdtdh w16sdtfl w16du wp14">
   <w:footnote w:type="separator" w:id="-1">
     <w:p>
       <w:pPr>
@@ -5410,7 +7156,7 @@
 </file>
 
 <file path=word/numbering.xml><?xml version="1.0" encoding="utf-8"?>
-<w:numbering xmlns:wpc="http://schemas.microsoft.com/office/word/2010/wordprocessingCanvas" xmlns:cx="http://schemas.microsoft.com/office/drawing/2014/chartex" xmlns:cx1="http://schemas.microsoft.com/office/drawing/2015/9/8/chartex" xmlns:cx2="http://schemas.microsoft.com/office/drawing/2015/10/21/chartex" xmlns:cx3="http://schemas.microsoft.com/office/drawing/2016/5/9/chartex" xmlns:cx4="http://schemas.microsoft.com/office/drawing/2016/5/10/chartex" xmlns:cx5="http://schemas.microsoft.com/office/drawing/2016/5/11/chartex" xmlns:cx6="http://schemas.microsoft.com/office/drawing/2016/5/12/chartex" xmlns:cx7="http://schemas.microsoft.com/office/drawing/2016/5/13/chartex" xmlns:cx8="http://schemas.microsoft.com/office/drawing/2016/5/14/chartex" xmlns:mc="http://schemas.openxmlformats.org/markup-compatibility/2006" xmlns:aink="http://schemas.microsoft.com/office/drawing/2016/ink" xmlns:am3d="http://schemas.microsoft.com/office/drawing/2017/model3d" xmlns:o="urn:schemas-microsoft-com:office:office" xmlns:r="http://schemas.openxmlformats.org/officeDocument/2006/relationships" xmlns:m="http://schemas.openxmlformats.org/officeDocument/2006/math" xmlns:v="urn:schemas-microsoft-com:vml" xmlns:wp14="http://schemas.microsoft.com/office/word/2010/wordprocessingDrawing" xmlns:wp="http://schemas.openxmlformats.org/drawingml/2006/wordprocessingDrawing" xmlns:w10="urn:schemas-microsoft-com:office:word" xmlns:w="http://schemas.openxmlformats.org/wordprocessingml/2006/main" xmlns:w14="http://schemas.microsoft.com/office/word/2010/wordml" xmlns:w15="http://schemas.microsoft.com/office/word/2012/wordml" xmlns:w16cex="http://schemas.microsoft.com/office/word/2018/wordml/cex" xmlns:w16cid="http://schemas.microsoft.com/office/word/2016/wordml/cid" xmlns:w16="http://schemas.microsoft.com/office/word/2018/wordml" xmlns:w16sdtdh="http://schemas.microsoft.com/office/word/2020/wordml/sdtdatahash" xmlns:w16se="http://schemas.microsoft.com/office/word/2015/wordml/symex" xmlns:wpg="http://schemas.microsoft.com/office/word/2010/wordprocessingGroup" xmlns:wpi="http://schemas.microsoft.com/office/word/2010/wordprocessingInk" xmlns:wne="http://schemas.microsoft.com/office/word/2006/wordml" xmlns:wps="http://schemas.microsoft.com/office/word/2010/wordprocessingShape" mc:Ignorable="w14 w15 w16se w16cid w16 w16cex w16sdtdh wp14">
+<w:numbering xmlns:wpc="http://schemas.microsoft.com/office/word/2010/wordprocessingCanvas" xmlns:cx="http://schemas.microsoft.com/office/drawing/2014/chartex" xmlns:cx1="http://schemas.microsoft.com/office/drawing/2015/9/8/chartex" xmlns:cx2="http://schemas.microsoft.com/office/drawing/2015/10/21/chartex" xmlns:cx3="http://schemas.microsoft.com/office/drawing/2016/5/9/chartex" xmlns:cx4="http://schemas.microsoft.com/office/drawing/2016/5/10/chartex" xmlns:cx5="http://schemas.microsoft.com/office/drawing/2016/5/11/chartex" xmlns:cx6="http://schemas.microsoft.com/office/drawing/2016/5/12/chartex" xmlns:cx7="http://schemas.microsoft.com/office/drawing/2016/5/13/chartex" xmlns:cx8="http://schemas.microsoft.com/office/drawing/2016/5/14/chartex" xmlns:mc="http://schemas.openxmlformats.org/markup-compatibility/2006" xmlns:aink="http://schemas.microsoft.com/office/drawing/2016/ink" xmlns:am3d="http://schemas.microsoft.com/office/drawing/2017/model3d" xmlns:o="urn:schemas-microsoft-com:office:office" xmlns:oel="http://schemas.microsoft.com/office/2019/extlst" xmlns:r="http://schemas.openxmlformats.org/officeDocument/2006/relationships" xmlns:m="http://schemas.openxmlformats.org/officeDocument/2006/math" xmlns:v="urn:schemas-microsoft-com:vml" xmlns:wp14="http://schemas.microsoft.com/office/word/2010/wordprocessingDrawing" xmlns:wp="http://schemas.openxmlformats.org/drawingml/2006/wordprocessingDrawing" xmlns:w10="urn:schemas-microsoft-com:office:word" xmlns:w="http://schemas.openxmlformats.org/wordprocessingml/2006/main" xmlns:w14="http://schemas.microsoft.com/office/word/2010/wordml" xmlns:w15="http://schemas.microsoft.com/office/word/2012/wordml" xmlns:w16cex="http://schemas.microsoft.com/office/word/2018/wordml/cex" xmlns:w16cid="http://schemas.microsoft.com/office/word/2016/wordml/cid" xmlns:w16="http://schemas.microsoft.com/office/word/2018/wordml" xmlns:w16du="http://schemas.microsoft.com/office/word/2023/wordml/word16du" xmlns:w16sdtdh="http://schemas.microsoft.com/office/word/2020/wordml/sdtdatahash" xmlns:w16sdtfl="http://schemas.microsoft.com/office/word/2024/wordml/sdtformatlock" xmlns:w16se="http://schemas.microsoft.com/office/word/2015/wordml/symex" xmlns:wpg="http://schemas.microsoft.com/office/word/2010/wordprocessingGroup" xmlns:wpi="http://schemas.microsoft.com/office/word/2010/wordprocessingInk" xmlns:wne="http://schemas.microsoft.com/office/word/2006/wordml" xmlns:wps="http://schemas.microsoft.com/office/word/2010/wordprocessingShape" mc:Ignorable="w14 w15 w16se w16cid w16 w16cex w16sdtdh w16sdtfl w16du wp14">
   <w:abstractNum w:abstractNumId="0" w15:restartNumberingAfterBreak="0">
     <w:nsid w:val="FFFFFF7C"/>
     <w:multiLevelType w:val="singleLevel"/>
@@ -5582,38 +7328,38 @@
       </w:rPr>
     </w:lvl>
   </w:abstractNum>
-  <w:num w:numId="1">
+  <w:num w:numId="1" w16cid:durableId="660086682">
     <w:abstractNumId w:val="8"/>
   </w:num>
-  <w:num w:numId="2">
+  <w:num w:numId="2" w16cid:durableId="1548101930">
     <w:abstractNumId w:val="6"/>
   </w:num>
-  <w:num w:numId="3">
+  <w:num w:numId="3" w16cid:durableId="494079004">
     <w:abstractNumId w:val="5"/>
   </w:num>
-  <w:num w:numId="4">
+  <w:num w:numId="4" w16cid:durableId="1288778227">
     <w:abstractNumId w:val="4"/>
   </w:num>
-  <w:num w:numId="5">
+  <w:num w:numId="5" w16cid:durableId="1642422167">
     <w:abstractNumId w:val="7"/>
   </w:num>
-  <w:num w:numId="6">
+  <w:num w:numId="6" w16cid:durableId="875040710">
     <w:abstractNumId w:val="3"/>
   </w:num>
-  <w:num w:numId="7">
+  <w:num w:numId="7" w16cid:durableId="1936862719">
     <w:abstractNumId w:val="2"/>
   </w:num>
-  <w:num w:numId="8">
+  <w:num w:numId="8" w16cid:durableId="472139022">
     <w:abstractNumId w:val="1"/>
   </w:num>
-  <w:num w:numId="9">
+  <w:num w:numId="9" w16cid:durableId="665521690">
     <w:abstractNumId w:val="0"/>
   </w:num>
 </w:numbering>
 </file>
 
 <file path=word/styles.xml><?xml version="1.0" encoding="utf-8"?>
-<w:styles xmlns:mc="http://schemas.openxmlformats.org/markup-compatibility/2006" xmlns:r="http://schemas.openxmlformats.org/officeDocument/2006/relationships" xmlns:w="http://schemas.openxmlformats.org/wordprocessingml/2006/main" xmlns:w14="http://schemas.microsoft.com/office/word/2010/wordml" xmlns:w15="http://schemas.microsoft.com/office/word/2012/wordml" xmlns:w16cex="http://schemas.microsoft.com/office/word/2018/wordml/cex" xmlns:w16cid="http://schemas.microsoft.com/office/word/2016/wordml/cid" xmlns:w16="http://schemas.microsoft.com/office/word/2018/wordml" xmlns:w16sdtdh="http://schemas.microsoft.com/office/word/2020/wordml/sdtdatahash" xmlns:w16se="http://schemas.microsoft.com/office/word/2015/wordml/symex" mc:Ignorable="w14 w15 w16se w16cid w16 w16cex w16sdtdh">
+<w:styles xmlns:mc="http://schemas.openxmlformats.org/markup-compatibility/2006" xmlns:r="http://schemas.openxmlformats.org/officeDocument/2006/relationships" xmlns:w="http://schemas.openxmlformats.org/wordprocessingml/2006/main" xmlns:w14="http://schemas.microsoft.com/office/word/2010/wordml" xmlns:w15="http://schemas.microsoft.com/office/word/2012/wordml" xmlns:w16cex="http://schemas.microsoft.com/office/word/2018/wordml/cex" xmlns:w16cid="http://schemas.microsoft.com/office/word/2016/wordml/cid" xmlns:w16="http://schemas.microsoft.com/office/word/2018/wordml" xmlns:w16du="http://schemas.microsoft.com/office/word/2023/wordml/word16du" xmlns:w16sdtdh="http://schemas.microsoft.com/office/word/2020/wordml/sdtdatahash" xmlns:w16sdtfl="http://schemas.microsoft.com/office/word/2024/wordml/sdtformatlock" xmlns:w16se="http://schemas.microsoft.com/office/word/2015/wordml/symex" mc:Ignorable="w14 w15 w16se w16cid w16 w16cex w16sdtdh w16sdtfl w16du">
   <w:docDefaults>
     <w:rPrDefault>
       <w:rPr>
@@ -5897,11 +7643,6 @@
     <w:lsdException w:name="Book Title" w:uiPriority="33" w:qFormat="1"/>
     <w:lsdException w:name="Bibliography" w:semiHidden="1" w:uiPriority="37" w:unhideWhenUsed="1"/>
     <w:lsdException w:name="TOC Heading" w:semiHidden="1" w:uiPriority="39" w:unhideWhenUsed="1" w:qFormat="1"/>
-    <w:lsdException w:name="Plain Table 5" w:semiHidden="1" w:unhideWhenUsed="1"/>
-    <w:lsdException w:name="Grid Table Light" w:semiHidden="1" w:unhideWhenUsed="1"/>
-    <w:lsdException w:name="Grid Table 1 Light" w:semiHidden="1" w:unhideWhenUsed="1"/>
-    <w:lsdException w:name="Grid Table 2" w:semiHidden="1" w:unhideWhenUsed="1"/>
-    <w:lsdException w:name="Grid Table 3" w:semiHidden="1" w:unhideWhenUsed="1"/>
     <w:lsdException w:name="Grid Table 4" w:uiPriority="49"/>
     <w:lsdException w:name="Grid Table 5 Dark" w:uiPriority="50"/>
     <w:lsdException w:name="Grid Table 6 Colorful" w:uiPriority="51"/>

</xml_diff>

<commit_message>
Response doc: update after manuscript review, fix text, set statuses (Closed/In progress/Open)
Co-Authored-By: Claude Sonnet 5.5 <noreply@anthropic.com>
Claude-Session: https://claude.ai/code/session_01Y1g9vByMLTE8eGJ9K81zt6
</commit_message>
<xml_diff>
--- a/review_response/Response_to_Reviewer_Comments.docx
+++ b/review_response/Response_to_Reviewer_Comments.docx
@@ -344,7 +344,7 @@
               <w:rPr>
                 <w:sz w:val="20"/>
               </w:rPr>
-              <w:t>Draft</w:t>
+              <w:t>Open</w:t>
             </w:r>
           </w:p>
         </w:tc>
@@ -402,7 +402,7 @@
               <w:rPr>
                 <w:sz w:val="20"/>
               </w:rPr>
-              <w:t>Draft</w:t>
+              <w:t>Open</w:t>
             </w:r>
           </w:p>
         </w:tc>
@@ -490,7 +490,7 @@
               <w:rPr>
                 <w:sz w:val="20"/>
               </w:rPr>
-              <w:t>Draft</w:t>
+              <w:t>Open</w:t>
             </w:r>
           </w:p>
         </w:tc>
@@ -624,7 +624,7 @@
               <w:rPr>
                 <w:sz w:val="20"/>
               </w:rPr>
-              <w:t>Draft</w:t>
+              <w:t>Open</w:t>
             </w:r>
           </w:p>
         </w:tc>
@@ -694,7 +694,7 @@
               <w:rPr>
                 <w:sz w:val="20"/>
               </w:rPr>
-              <w:t>Draft</w:t>
+              <w:t>Open</w:t>
             </w:r>
           </w:p>
         </w:tc>
@@ -949,8 +949,7 @@
               <w:rPr>
                 <w:sz w:val="20"/>
               </w:rPr>
-              <w:lastRenderedPageBreak/>
-              <w:t>Draft</w:t>
+              <w:t>Closed</w:t>
             </w:r>
           </w:p>
         </w:tc>
@@ -1082,7 +1081,7 @@
               <w:rPr>
                 <w:sz w:val="20"/>
               </w:rPr>
-              <w:t>Draft</w:t>
+              <w:t>Closed</w:t>
             </w:r>
           </w:p>
         </w:tc>
@@ -1154,7 +1153,7 @@
               <w:rPr>
                 <w:sz w:val="20"/>
               </w:rPr>
-              <w:t>Done</w:t>
+              <w:t>Closed</w:t>
             </w:r>
           </w:p>
         </w:tc>
@@ -1254,7 +1253,7 @@
               <w:rPr>
                 <w:sz w:val="20"/>
               </w:rPr>
-              <w:t>Draft</w:t>
+              <w:t>Closed</w:t>
             </w:r>
           </w:p>
         </w:tc>
@@ -1381,7 +1380,7 @@
               <w:rPr>
                 <w:sz w:val="20"/>
               </w:rPr>
-              <w:t>Draft</w:t>
+              <w:t>Closed</w:t>
             </w:r>
           </w:p>
         </w:tc>
@@ -1440,7 +1439,7 @@
               <w:rPr>
                 <w:sz w:val="20"/>
               </w:rPr>
-              <w:t>Draft</w:t>
+              <w:t>In progress</w:t>
             </w:r>
           </w:p>
         </w:tc>
@@ -1679,7 +1678,7 @@
               <w:rPr>
                 <w:sz w:val="20"/>
               </w:rPr>
-              <w:t>Draft</w:t>
+              <w:t>Closed</w:t>
             </w:r>
           </w:p>
         </w:tc>
@@ -1721,10 +1720,11 @@
           <w:p>
             <w:r>
               <w:rPr>
+                <w:i w:val="0"/>
                 <w:color w:val="000000"/>
                 <w:sz w:val="20"/>
               </w:rPr>
-              <w:t>The disc and stent were simulated within the same 30×30×3030 \times 30 \times 3030×30×30 mm electrolyte domain under identical boundary conditions. The “three times larger” statement referred to the minimum domain-size criterion, not geometry-specific domains. Therefore, the difference in transition time, approximately 40 h for the disc and 100 h for the stent, is not caused by different oxygen diffusion paths. The Methods have been clarified accordingly, while the Results now acknowledge that absolute transition times remain dependent on the domain and oxygen boundary condition.</w:t>
+              <w:t>The disc and stent were simulated within the same 30 × 30 × 30 mm electrolyte domain under identical boundary conditions. The “three times larger” statement referred to the minimum domain-size criterion, not geometry-specific domains. Therefore, the difference in transition time, approximately 40 h for the disc and 100 h for the stent, is not caused by different oxygen diffusion paths. The Methods have been clarified accordingly, while the Results now acknowledge that absolute transition times remain dependent on the domain and oxygen boundary condition.</w:t>
             </w:r>
           </w:p>
         </w:tc>
@@ -1737,7 +1737,7 @@
               <w:rPr>
                 <w:sz w:val="20"/>
               </w:rPr>
-              <w:t>Draft</w:t>
+              <w:t>In progress</w:t>
             </w:r>
           </w:p>
         </w:tc>
@@ -1793,41 +1793,14 @@
           <w:p>
             <w:r>
               <w:rPr>
+                <w:i w:val="0"/>
                 <w:color w:val="000000"/>
                 <w:sz w:val="20"/>
               </w:rPr>
-              <w:t>CO2​​=3.5 mg L−1 was adopted from physiological literature but is lower than air-saturated saline at 37 °C. Because the ORR-limited rate depends on kORR</w:t>
-            </w:r>
-            <w:r>
-              <w:rPr>
-                <w:color w:val="000000"/>
-                <w:sz w:val="20"/>
-              </w:rPr>
-              <w:t>.</w:t>
-            </w:r>
-            <w:r>
-              <w:rPr>
-                <w:color w:val="000000"/>
-                <w:sz w:val="20"/>
-              </w:rPr>
-              <w:t xml:space="preserve">CO2, the fitted </w:t>
+              <w:t>C_O₂=3.5 mg L−1 was adopted from physiological literature but is lower than air-saturated saline at 37 °C. Because the ORR-limited rate depends on kORR.C_O₂, the fitted kORR​ should be interpreted as an effective parameter that may compensate for this oxygen-concentration mismatch. This limitation affects the absolute degradation rates and transferability between in vitro and physiological conditions, but not the relative geometry comparison because both geometries use the same C_O₂.</w:t>
             </w:r>
             <w:proofErr w:type="spellStart"/>
-            <w:r>
-              <w:rPr>
-                <w:color w:val="000000"/>
-                <w:sz w:val="20"/>
-              </w:rPr>
-              <w:t>kORR</w:t>
-            </w:r>
             <w:proofErr w:type="spellEnd"/>
-            <w:r>
-              <w:rPr>
-                <w:color w:val="000000"/>
-                <w:sz w:val="20"/>
-              </w:rPr>
-              <w:t>​ should be interpreted as an effective parameter that may compensate for this oxygen-concentration mismatch. This limitation affects the absolute degradation rates and transferability between in vitro and physiological conditions, but not the relative geometry comparison because both geometries use the same CO2​​.</w:t>
-            </w:r>
           </w:p>
         </w:tc>
         <w:tc>
@@ -1839,7 +1812,7 @@
               <w:rPr>
                 <w:sz w:val="20"/>
               </w:rPr>
-              <w:t>Draft</w:t>
+              <w:t>Closed</w:t>
             </w:r>
           </w:p>
         </w:tc>
@@ -1881,10 +1854,11 @@
           <w:p>
             <w:r>
               <w:rPr>
+                <w:i w:val="0"/>
                 <w:color w:val="000000"/>
                 <w:sz w:val="20"/>
               </w:rPr>
-              <w:t>The vessel geometry and liquid height are now specified. Domain-size and oxygen-resupply sensitivity tests have been added, and the choice of CO2​​ is justified separately for the in vitro and physiological simulations.</w:t>
+              <w:t>The vessel geometry and liquid height are now specified. Domain-size and oxygen-resupply sensitivity tests have been added, and the choice of C_O₂ is justified separately for the in vitro and physiological simulations.</w:t>
             </w:r>
           </w:p>
         </w:tc>
@@ -1897,7 +1871,7 @@
               <w:rPr>
                 <w:sz w:val="20"/>
               </w:rPr>
-              <w:t>Draft</w:t>
+              <w:t>In progress</w:t>
             </w:r>
           </w:p>
         </w:tc>
@@ -2175,8 +2149,7 @@
               <w:rPr>
                 <w:sz w:val="20"/>
               </w:rPr>
-              <w:lastRenderedPageBreak/>
-              <w:t>Draft</w:t>
+              <w:t>Closed</w:t>
             </w:r>
           </w:p>
         </w:tc>
@@ -2234,7 +2207,7 @@
               <w:rPr>
                 <w:sz w:val="20"/>
               </w:rPr>
-              <w:t>Draft</w:t>
+              <w:t>Closed</w:t>
             </w:r>
           </w:p>
         </w:tc>
@@ -2306,7 +2279,7 @@
               <w:rPr>
                 <w:sz w:val="20"/>
               </w:rPr>
-              <w:t>Draft</w:t>
+              <w:t>Closed</w:t>
             </w:r>
           </w:p>
         </w:tc>
@@ -2396,7 +2369,7 @@
               <w:rPr>
                 <w:sz w:val="20"/>
               </w:rPr>
-              <w:t>Draft</w:t>
+              <w:t>In progress</w:t>
             </w:r>
           </w:p>
         </w:tc>
@@ -2462,8 +2435,7 @@
               <w:rPr>
                 <w:sz w:val="20"/>
               </w:rPr>
-              <w:lastRenderedPageBreak/>
-              <w:t>Draft</w:t>
+              <w:t>In progress</w:t>
             </w:r>
           </w:p>
         </w:tc>
@@ -2551,7 +2523,7 @@
               <w:rPr>
                 <w:sz w:val="20"/>
               </w:rPr>
-              <w:t>Draft</w:t>
+              <w:t>In progress</w:t>
             </w:r>
           </w:p>
         </w:tc>
@@ -2968,154 +2940,41 @@
           <w:p>
             <w:r>
               <w:rPr>
+                <w:i w:val="0"/>
                 <w:color w:val="000000"/>
                 <w:sz w:val="20"/>
               </w:rPr>
-              <w:t>We agree that oxygen-reduction-limited dissolution is a model assumption (</w:t>
+              <w:t>We agree that oxygen-reduction-limited dissolution is a model assumption (Eqs. 1–2), so the Morris ranking alone cannot show that oxygen controls degradation. The Methods state oxygen-limited dissolution as the modelling premise, and the evidence that it works is the model's agreement with data it was not fitted to: (i) the 28-day immersion data, which were not used in calibration, are reproduced with RMSE = 0.0159%; (ii) the stent prediction, made without recalibration, is consistent with reported in vivo mass loss (~6%). The model is also not forced into oxygen limitation: the recession velocity v_n = min(v_Zn, v_ORR, v_O2) allows a reaction-limited stage, and the results show one at early times followed by a transition to transport control. The ablations (closed vs fixed-O₂ boundary, D_eff = D, k_f = 0) show how much each mechanism contributes. This agreement supports the assumption within the tested conditions (immersion in r-SBF/HBSS; disc and stent geometries); it does not prove oxygen control in vivo. [Soften 'demonstrates' in the Abstract and 'identified … primary driver' in the Conclusions to match.]</w:t>
             </w:r>
             <w:proofErr w:type="spellStart"/>
-            <w:r>
-              <w:rPr>
-                <w:color w:val="000000"/>
-                <w:sz w:val="20"/>
-              </w:rPr>
-              <w:t>Eqs</w:t>
-            </w:r>
             <w:proofErr w:type="spellEnd"/>
-            <w:r>
-              <w:rPr>
-                <w:color w:val="000000"/>
-                <w:sz w:val="20"/>
-              </w:rPr>
-              <w:t>. 1–2), so the Morris ranking alone cannot show that oxygen controls degradation. We now state oxygen control as the modelling premise, and the evidence that it works is the model's agreement with data it was not fitted to: (</w:t>
-            </w:r>
             <w:proofErr w:type="spellStart"/>
-            <w:r>
-              <w:rPr>
-                <w:color w:val="000000"/>
-                <w:sz w:val="20"/>
-              </w:rPr>
-              <w:t>i</w:t>
-            </w:r>
             <w:proofErr w:type="spellEnd"/>
-            <w:r>
-              <w:rPr>
-                <w:color w:val="000000"/>
-                <w:sz w:val="20"/>
-              </w:rPr>
-              <w:t xml:space="preserve">) the 28-day immersion data, which were not used in calibration, are reproduced with RMSE = 0.0159%; (ii) the stent prediction, made without recalibration, is consistent with reported in vivo mass loss (~6%). The model is also not forced into oxygen limitation: the recession velocity </w:t>
-            </w:r>
             <w:proofErr w:type="spellStart"/>
-            <w:r>
-              <w:rPr>
-                <w:color w:val="000000"/>
-                <w:sz w:val="20"/>
-              </w:rPr>
-              <w:t>v_n</w:t>
-            </w:r>
             <w:proofErr w:type="spellEnd"/>
-            <w:r>
-              <w:rPr>
-                <w:color w:val="000000"/>
-                <w:sz w:val="20"/>
-              </w:rPr>
-              <w:t xml:space="preserve"> = </w:t>
-            </w:r>
             <w:proofErr w:type="gramStart"/>
-            <w:r>
-              <w:rPr>
-                <w:color w:val="000000"/>
-                <w:sz w:val="20"/>
-              </w:rPr>
-              <w:t>min(</w:t>
-            </w:r>
             <w:proofErr w:type="spellStart"/>
             <w:proofErr w:type="gramEnd"/>
+            <w:proofErr w:type="spellEnd"/>
+            <w:proofErr w:type="spellStart"/>
+            <w:proofErr w:type="spellEnd"/>
+            <w:proofErr w:type="spellStart"/>
+            <w:proofErr w:type="spellEnd"/>
+            <w:proofErr w:type="spellStart"/>
+            <w:proofErr w:type="spellEnd"/>
+          </w:p>
+        </w:tc>
+        <w:tc>
+          <w:tcPr>
+            <w:tcW w:w="1587" w:type="dxa"/>
+          </w:tcPr>
+          <w:p>
             <w:r>
               <w:rPr>
                 <w:color w:val="000000"/>
                 <w:sz w:val="20"/>
               </w:rPr>
-              <w:t>v_Zn</w:t>
-            </w:r>
-            <w:proofErr w:type="spellEnd"/>
-            <w:r>
-              <w:rPr>
-                <w:color w:val="000000"/>
-                <w:sz w:val="20"/>
-              </w:rPr>
-              <w:t xml:space="preserve">, </w:t>
-            </w:r>
-            <w:proofErr w:type="spellStart"/>
-            <w:r>
-              <w:rPr>
-                <w:color w:val="000000"/>
-                <w:sz w:val="20"/>
-              </w:rPr>
-              <w:t>v_ORR</w:t>
-            </w:r>
-            <w:proofErr w:type="spellEnd"/>
-            <w:r>
-              <w:rPr>
-                <w:color w:val="000000"/>
-                <w:sz w:val="20"/>
-              </w:rPr>
-              <w:t xml:space="preserve">, v_O2) allows a reaction-limited stage, and the results show one at early times followed by a transition to transport control. The ablations (closed vs fixed-O₂ boundary, </w:t>
-            </w:r>
-            <w:proofErr w:type="spellStart"/>
-            <w:r>
-              <w:rPr>
-                <w:color w:val="000000"/>
-                <w:sz w:val="20"/>
-              </w:rPr>
-              <w:t>D_eff</w:t>
-            </w:r>
-            <w:proofErr w:type="spellEnd"/>
-            <w:r>
-              <w:rPr>
-                <w:color w:val="000000"/>
-                <w:sz w:val="20"/>
-              </w:rPr>
-              <w:t xml:space="preserve"> = D, </w:t>
-            </w:r>
-            <w:proofErr w:type="spellStart"/>
-            <w:r>
-              <w:rPr>
-                <w:color w:val="000000"/>
-                <w:sz w:val="20"/>
-              </w:rPr>
-              <w:t>k_f</w:t>
-            </w:r>
-            <w:proofErr w:type="spellEnd"/>
-            <w:r>
-              <w:rPr>
-                <w:color w:val="000000"/>
-                <w:sz w:val="20"/>
-              </w:rPr>
-              <w:t xml:space="preserve"> = 0) show how much each mechanism contributes. This agreement supports the </w:t>
-            </w:r>
-            <w:r>
-              <w:rPr>
-                <w:color w:val="000000"/>
-                <w:sz w:val="20"/>
-              </w:rPr>
-              <w:lastRenderedPageBreak/>
-              <w:t>assumption within the tested conditions (immersion in r-SBF/HBSS; disc and stent geometries); it does not prove oxygen control in vivo, and the limitations section states this.</w:t>
-            </w:r>
-          </w:p>
-        </w:tc>
-        <w:tc>
-          <w:tcPr>
-            <w:tcW w:w="1587" w:type="dxa"/>
-          </w:tcPr>
-          <w:p>
-            <w:r>
-              <w:rPr>
-                <w:color w:val="000000"/>
-                <w:sz w:val="20"/>
-              </w:rPr>
-              <w:lastRenderedPageBreak/>
-              <w:t>Addressed</w:t>
+              <w:t>In progress</w:t>
             </w:r>
           </w:p>
         </w:tc>
@@ -3436,7 +3295,7 @@
                 <w:color w:val="000000"/>
                 <w:sz w:val="20"/>
               </w:rPr>
-              <w:t>Addressed</w:t>
+              <w:t>In progress</w:t>
             </w:r>
           </w:p>
         </w:tc>
@@ -3495,7 +3354,7 @@
                 <w:color w:val="000000"/>
                 <w:sz w:val="20"/>
               </w:rPr>
-              <w:t>Addressed</w:t>
+              <w:t>Closed</w:t>
             </w:r>
           </w:p>
         </w:tc>
@@ -3582,7 +3441,7 @@
                 <w:color w:val="000000"/>
                 <w:sz w:val="20"/>
               </w:rPr>
-              <w:t>Addressed</w:t>
+              <w:t>Closed</w:t>
             </w:r>
           </w:p>
         </w:tc>
@@ -3783,7 +3642,7 @@
                 <w:color w:val="000000"/>
                 <w:sz w:val="20"/>
               </w:rPr>
-              <w:t>Addressed</w:t>
+              <w:t>Closed</w:t>
             </w:r>
           </w:p>
         </w:tc>
@@ -3874,8 +3733,7 @@
                 <w:color w:val="000000"/>
                 <w:sz w:val="20"/>
               </w:rPr>
-              <w:lastRenderedPageBreak/>
-              <w:t>Addressed</w:t>
+              <w:t>Closed</w:t>
             </w:r>
           </w:p>
         </w:tc>
@@ -4294,7 +4152,7 @@
                 <w:color w:val="000000"/>
                 <w:sz w:val="20"/>
               </w:rPr>
-              <w:t>Addressed</w:t>
+              <w:t>In progress</w:t>
             </w:r>
           </w:p>
         </w:tc>
@@ -4461,7 +4319,7 @@
                 <w:color w:val="000000"/>
                 <w:sz w:val="20"/>
               </w:rPr>
-              <w:t>Addressed</w:t>
+              <w:t>In progress</w:t>
             </w:r>
           </w:p>
         </w:tc>
@@ -4655,7 +4513,7 @@
                 <w:color w:val="000000"/>
                 <w:sz w:val="20"/>
               </w:rPr>
-              <w:t>Addressed</w:t>
+              <w:t>In progress</w:t>
             </w:r>
           </w:p>
         </w:tc>
@@ -4925,91 +4783,22 @@
           <w:p>
             <w:r>
               <w:rPr>
+                <w:i w:val="0"/>
                 <w:color w:val="000000"/>
                 <w:sz w:val="20"/>
               </w:rPr>
-              <w:t xml:space="preserve">The sweeps in the original Fig. 4 used </w:t>
+              <w:t>The sweeps in the original Fig. 4 used k_f = 100, k_d = 30 and k_ORR = 1.0, not the optimised values, which is why the baseline gave 0.39% at 168 h against about 0.19% in Fig. 5a. We have repeated the sweeps around the calibrated baseline (k_f = 10, k_d = 1, k_ORR = 0.2 [confirm these are the calibrated values and update Table 2]), varying each parameter by the same factors (×0.2 and ×5) with the others fixed. The baseline curve gives 0.20% at 168 h, matching the calibrated simulation in Fig. 5a. [Insert the updated Fig. 4 and revised text in the manuscript.]</w:t>
             </w:r>
             <w:proofErr w:type="spellStart"/>
-            <w:r>
-              <w:rPr>
-                <w:color w:val="000000"/>
-                <w:sz w:val="20"/>
-              </w:rPr>
-              <w:t>k_f</w:t>
-            </w:r>
             <w:proofErr w:type="spellEnd"/>
-            <w:r>
-              <w:rPr>
-                <w:color w:val="000000"/>
-                <w:sz w:val="20"/>
-              </w:rPr>
-              <w:t xml:space="preserve"> = 100, </w:t>
-            </w:r>
             <w:proofErr w:type="spellStart"/>
-            <w:r>
-              <w:rPr>
-                <w:color w:val="000000"/>
-                <w:sz w:val="20"/>
-              </w:rPr>
-              <w:t>k_d</w:t>
-            </w:r>
             <w:proofErr w:type="spellEnd"/>
-            <w:r>
-              <w:rPr>
-                <w:color w:val="000000"/>
-                <w:sz w:val="20"/>
-              </w:rPr>
-              <w:t xml:space="preserve"> = 30 and </w:t>
-            </w:r>
             <w:proofErr w:type="spellStart"/>
-            <w:r>
-              <w:rPr>
-                <w:color w:val="000000"/>
-                <w:sz w:val="20"/>
-              </w:rPr>
-              <w:t>k_ORR</w:t>
-            </w:r>
             <w:proofErr w:type="spellEnd"/>
-            <w:r>
-              <w:rPr>
-                <w:color w:val="000000"/>
-                <w:sz w:val="20"/>
-              </w:rPr>
-              <w:t xml:space="preserve"> = 1.0, not the </w:t>
-            </w:r>
             <w:proofErr w:type="spellStart"/>
-            <w:r>
-              <w:rPr>
-                <w:color w:val="000000"/>
-                <w:sz w:val="20"/>
-              </w:rPr>
-              <w:t>optimised</w:t>
-            </w:r>
             <w:proofErr w:type="spellEnd"/>
-            <w:r>
-              <w:rPr>
-                <w:color w:val="000000"/>
-                <w:sz w:val="20"/>
-              </w:rPr>
-              <w:t xml:space="preserve"> Table 2 values, which is why the baseline gave 0.39% at 168 h against about 0.19% in Fig. 5a. We have repeated the sweeps around the calibrated baseline, varying each parameter by the same </w:t>
-            </w:r>
             <w:proofErr w:type="gramStart"/>
-            <w:r>
-              <w:rPr>
-                <w:color w:val="000000"/>
-                <w:sz w:val="20"/>
-              </w:rPr>
-              <w:t>fold-change</w:t>
-            </w:r>
             <w:proofErr w:type="gramEnd"/>
-            <w:r>
-              <w:rPr>
-                <w:color w:val="000000"/>
-                <w:sz w:val="20"/>
-              </w:rPr>
-              <w:t xml:space="preserve"> (×0.5 and ×2) with the other parameters fixed. The baseline curve now coincides with the calibrated simulation in Fig. 5a. [Insert the updated Fig. 4 and the revised 168 h mass-loss changes once the runs are complete.]</w:t>
-            </w:r>
           </w:p>
         </w:tc>
         <w:tc>
@@ -5180,7 +4969,7 @@
                 <w:color w:val="000000"/>
                 <w:sz w:val="20"/>
               </w:rPr>
-              <w:t>Addressed</w:t>
+              <w:t>Closed</w:t>
             </w:r>
           </w:p>
         </w:tc>
@@ -5222,11 +5011,11 @@
           <w:p>
             <w:r>
               <w:rPr>
-                <w:i/>
-                <w:color w:val="808080"/>
-                <w:sz w:val="20"/>
-              </w:rPr>
-              <w:t>[To be completed]</w:t>
+                <w:i w:val="0"/>
+                <w:color w:val="000000"/>
+                <w:sz w:val="20"/>
+              </w:rPr>
+              <w:t>Error bars in Fig. 8c are ±1 standard deviation of the local penetration depth around the cross-section perimeter. The Fig. 8c caption now says so.</w:t>
             </w:r>
           </w:p>
         </w:tc>
@@ -5239,7 +5028,7 @@
               <w:rPr>
                 <w:sz w:val="20"/>
               </w:rPr>
-              <w:t>Open</w:t>
+              <w:t>Closed</w:t>
             </w:r>
           </w:p>
         </w:tc>
@@ -5330,7 +5119,6 @@
                 <w:color w:val="000000"/>
                 <w:sz w:val="20"/>
               </w:rPr>
-              <w:lastRenderedPageBreak/>
               <w:t>In progress</w:t>
             </w:r>
           </w:p>
@@ -5823,7 +5611,7 @@
                 <w:color w:val="000000"/>
                 <w:sz w:val="20"/>
               </w:rPr>
-              <w:t>Addressed</w:t>
+              <w:t>Closed</w:t>
             </w:r>
           </w:p>
         </w:tc>
@@ -6171,10 +5959,11 @@
           <w:p>
             <w:r>
               <w:rPr>
+                <w:i w:val="0"/>
                 <w:color w:val="000000"/>
                 <w:sz w:val="20"/>
               </w:rPr>
-              <w:t>We have reconciled the two statements by giving the cost where each is used. Calibration is tractable because only three parameters are calibrated, on a coarse mesh at about 2 h per 3D simulation (Table S4). The high-fidelity validation and stent simulations remain computationally demanding, at about 69 h on 50–64 cores for 672 h on a 19–21 million-element mesh (Table S4). The Results now describe the calibration as tractable and cite the cost, and the Discussion states the high-fidelity cost explicitly.</w:t>
+              <w:t>We have reconciled the two statements by giving the cost where each is used. The Results state that calibration is computationally tractable because only three parameters are calibrated, on a coarse mesh at about 2 h per 3D simulation (Table S4). The Discussion describes the high-fidelity validation and stent simulations (about 69 h on 50–64 cores for 672 h on a 19–21 million-element mesh, Table S4) as computationally demanding.</w:t>
             </w:r>
           </w:p>
         </w:tc>
@@ -6188,7 +5977,7 @@
                 <w:color w:val="000000"/>
                 <w:sz w:val="20"/>
               </w:rPr>
-              <w:t>Addressed</w:t>
+              <w:t>Closed</w:t>
             </w:r>
           </w:p>
         </w:tc>
@@ -6247,7 +6036,7 @@
                 <w:color w:val="000000"/>
                 <w:sz w:val="20"/>
               </w:rPr>
-              <w:t>Addressed</w:t>
+              <w:t>Closed</w:t>
             </w:r>
           </w:p>
         </w:tc>
@@ -6398,7 +6187,7 @@
                 <w:color w:val="000000"/>
                 <w:sz w:val="20"/>
               </w:rPr>
-              <w:t>Addressed</w:t>
+              <w:t>Closed</w:t>
             </w:r>
           </w:p>
         </w:tc>
@@ -6569,7 +6358,7 @@
                 <w:color w:val="000000"/>
                 <w:sz w:val="20"/>
               </w:rPr>
-              <w:t>Addressed</w:t>
+              <w:t>Closed</w:t>
             </w:r>
           </w:p>
         </w:tc>
@@ -6632,7 +6421,7 @@
                 <w:color w:val="000000"/>
                 <w:sz w:val="20"/>
               </w:rPr>
-              <w:t>Addressed</w:t>
+              <w:t>Closed</w:t>
             </w:r>
           </w:p>
         </w:tc>
@@ -6695,7 +6484,7 @@
                 <w:color w:val="000000"/>
                 <w:sz w:val="20"/>
               </w:rPr>
-              <w:t>Addressed</w:t>
+              <w:t>Closed</w:t>
             </w:r>
           </w:p>
         </w:tc>
@@ -6758,7 +6547,7 @@
                 <w:color w:val="000000"/>
                 <w:sz w:val="20"/>
               </w:rPr>
-              <w:t>Addressed</w:t>
+              <w:t>Closed</w:t>
             </w:r>
           </w:p>
         </w:tc>
@@ -6970,8 +6759,7 @@
                 <w:color w:val="000000"/>
                 <w:sz w:val="20"/>
               </w:rPr>
-              <w:lastRenderedPageBreak/>
-              <w:t>Addressed</w:t>
+              <w:t>Closed</w:t>
             </w:r>
           </w:p>
         </w:tc>

</xml_diff>

<commit_message>
Response doc: make responses concise (A1.1 in user's wording)
</commit_message>
<xml_diff>
--- a/review_response/Response_to_Reviewer_Comments.docx
+++ b/review_response/Response_to_Reviewer_Comments.docx
@@ -236,7 +236,7 @@
                 <w:color w:val="000000"/>
                 <w:sz w:val="20"/>
               </w:rPr>
-              <w:t>We confirm the estimate: Eq. 15 evaluated with C_O₂ in mol mm⁻³ and no further factor gives 1.0 × 10⁻⁶ mm h⁻¹ (0.009 mm yr⁻¹). Our audit found that the solver stores C_O₂ as a mass concentration (g mm⁻³) and evaluates the ORR velocity without a molar-mass conversion, so the simulated velocity is 32 times the molar form for the same k_ORR. Eqs. 15–16 now contain the molar mass M_O₂ explicitly and state the basis of each quantity: C_O₂ is molar (3.5 mg L⁻¹ = 1.09 × 10⁻¹⁰ mol mm⁻³), M_O₂C_O₂ is the O₂ mass concentration the solver uses, and [Zn]sol is the molar density. k_ORR is therefore an effective coefficient that also carries a unit factor of mol g⁻¹. Eq. 14 uses the Zn mass density ρ_Zn and a mass-basis [Zn]sat, as in the solver. The O₂ sink (Eq. 7) is unchanged and uses k_ORR = 0.51 mm h⁻¹. With these equations the reaction ceiling at k_ORR = 0.51 mm h⁻¹ is 0.29 mm yr⁻¹ (about 3% mass loss in 28 days), above the simulated rates (0.12 mm yr⁻¹ disc, 0.155 mm yr⁻¹ stent) and the measured 0.31%. The reported results are therefore consistent with the equations as now written; only the printed equations were inconsistent.</w:t>
+              <w:t>The original estimate of 0.009 mm yr⁻¹ uses molar C_O₂. However, the solver uses the O₂ mass concentration without molar-mass conversion, making the simulated velocity approximately 32× higher. Eqs. 15–16 have been corrected to include M_O₂ explicitly and clarify the mass/molar basis and effective units of k_ORR. The corrected ORR ceiling is 0.29 mm yr⁻¹, above the simulated disc and stent rates of 0.12 and 0.155 mm yr⁻¹. Therefore, the results remain consistent; the issue was with the printed equations and unit definitions, not the simulations.</w:t>
             </w:r>
             <w:proofErr w:type="spellStart"/>
             <w:proofErr w:type="spellEnd"/>
@@ -307,7 +307,7 @@
                 <w:color w:val="000000"/>
                 <w:sz w:val="20"/>
               </w:rPr>
-              <w:t>See response to A1.1. The corrosion rates in Figures 5b and 6b are the values computed by the implemented model, and they are below the reaction ceiling of 0.29 mm yr⁻¹ at k_ORR = 0.51 mm h⁻¹.</w:t>
+              <w:t>See A1.1. The simulated corrosion rates in Figs. 5b and 6b (0.12 and 0.155 mm yr⁻¹) lie below the corrected ceiling of 0.29 mm yr⁻¹.</w:t>
             </w:r>
           </w:p>
         </w:tc>
@@ -380,7 +380,7 @@
                 <w:color w:val="000000"/>
                 <w:sz w:val="20"/>
               </w:rPr>
-              <w:t>Fig. 4 has been recomputed around the baseline values. At 168 h the reaction ceilings for k_ORR = 0.04, 0.2 and 1 are 0.06, 0.30 and 1.5%, and the simulated mass losses are 0.04, 0.20 and 0.63%, all below the ceiling.</w:t>
+              <w:t>Fig. 4 has been recomputed around the baseline values. At 168 h, the ORR ceilings for k_ORR = 0.04, 0.2 and 1 are 0.06, 0.30 and 1.5%, above the simulated mass losses of 0.04, 0.20 and 0.63%.</w:t>
             </w:r>
             <w:proofErr w:type="spellStart"/>
             <w:proofErr w:type="spellEnd"/>
@@ -469,7 +469,7 @@
                 <w:color w:val="000000"/>
                 <w:sz w:val="20"/>
               </w:rPr>
-              <w:t>We added a global mass balance (Section S8, Table S13). The O₂ consumed at the interface is about 1/32 of the stoichiometric requirement for the Zn lost at 24 h and about 1/24 at 168 h, for all three k_ORR values tested. This confirms that the M_O₂ factor acts as an effective one and that Zn recession is not stoichiometrically coupled to O₂ consumption in the present formulation. The Methods and Limitations now state this, and note that the absolute interfacial O₂ depletion in Figs. 4g–i and 5d is underestimated relative to a stoichiometric model, so these panels show relative patterns.</w:t>
+              <w:t>A global O₂ mass balance has been added (Section S8, Table S13). The O₂ consumed at the interface is about 1/32 of the stoichiometric requirement at 24 h and about 1/24 at 168 h, so the M_O₂ factor acts as an effective one and Zn recession is not stoichiometrically coupled to O₂ consumption. This is now stated in the Methods and Limitations.</w:t>
             </w:r>
             <w:proofErr w:type="spellStart"/>
             <w:proofErr w:type="spellEnd"/>
@@ -546,7 +546,7 @@
                 <w:color w:val="000000"/>
                 <w:sz w:val="20"/>
               </w:rPr>
-              <w:t>Confirmed. The estimate is correct for Eq. 15 as originally printed: 1.0 × 10⁻⁶ mm h⁻¹, i.e. 0.009 mm yr⁻¹ (see A1.1). Eqs. 15–16 now contain the factor M_O₂ = 32 that the solver applies, so the printed equations reproduce the simulated rates.</w:t>
+              <w:t>Confirmed. The estimate is correct for Eq. 15 as originally printed (see A1.1). Eqs. 15–16 now include M_O₂ and reproduce the simulated rates.</w:t>
             </w:r>
           </w:p>
         </w:tc>
@@ -2056,10 +2056,11 @@
           <w:p>
             <w:r>
               <w:rPr>
+                <w:i w:val="0"/>
                 <w:color w:val="000000"/>
                 <w:sz w:val="20"/>
               </w:rPr>
-              <w:t>The calibration data (Liu et al.) were measured in r-SBF, whereas the validation data were measured in Ca/Mg-free HBSS. r-SBF has a more complex chemistry (additional ionic species, a Tris buffer and more extensive precipitation), whereas HBSS has a simpler composition. The model describes the corrosion products as a single effective phase and does not resolve medium-specific chemistry, so we attribute the lower validation RMSE (0.0159%) compared with the calibration RMSE (0.042%) to the closer correspondence between the model assumptions and the simpler HBSS medium. The validation error is also small relative to the experimental scatter (SD = 0.115% at 28 days, n = 3), so the RMSE values for the two datasets, which differ in medium, duration and number of points, are not directly comparable.</w:t>
+              <w:t>The calibration data (Liu et al.) were measured in r-SBF and the validation data in Ca/Mg-free HBSS. r-SBF has more complex chemistry (extra ions, Tris buffer, more precipitation), whereas HBSS is simpler and closer to the single effective ZnO phase assumed by the model, which explains the lower validation RMSE (0.0159% vs 0.042%). The validation error is also small relative to the experimental scatter (SD = 0.115% at 28 days, n = 3), so the two RMSE values are not directly comparable.</w:t>
             </w:r>
           </w:p>
         </w:tc>
@@ -2128,10 +2129,11 @@
           <w:p>
             <w:r>
               <w:rPr>
+                <w:i w:val="0"/>
                 <w:color w:val="000000"/>
                 <w:sz w:val="20"/>
               </w:rPr>
-              <w:t>We agree. We have added a validation table to the Supplementary Information (Table S11), giving for each immersion time the experimental mean ± SD (n = 3), the simulated value, the error and the error/SD ratio. For the validation, RMSE = 0.0159% corresponds to 8.6% of the mean measured mass loss (5.1% of the 28-day value); all five simulated points lie within 0.35 SD of the experimental means, and the 28-day SD is 0.115%. For the calibration, the RMSE of 0.042% corresponds to about 24% of the mean literature value (13% of the 14-day value). We acknowledge that the fit is within the experimental scatter and that the validation does not discriminate between models that differ by less than this scatter.</w:t>
+              <w:t>A validation table has been added to the SI (Table S11) with the experimental mean ± SD (n = 3), simulated value, error and error/SD at each time. The validation RMSE of 0.0159% is 8.6% of the mean (5.1% of the 28-day value), and all simulated points lie within 0.35 SD. The calibration RMSE of 0.042% is about 24% of the mean literature value. The fit lies within the experimental scatter, so the validation cannot discriminate between models that differ by less than this scatter.</w:t>
             </w:r>
           </w:p>
         </w:tc>
@@ -2186,43 +2188,16 @@
           <w:p>
             <w:r>
               <w:rPr>
+                <w:i w:val="0"/>
                 <w:color w:val="000000"/>
                 <w:sz w:val="20"/>
               </w:rPr>
-              <w:t>The first measurement is at 24 h, so the experiments do not constrain the reaction-to-diffusion transition, which is a model-derived quantity. The simulations themselves resolve this period: the time step is 0.25 h (Table S4</w:t>
+              <w:t>The first measurement is at 24 h, so the experiments do not constrain the reaction-to-diffusion transition, which is a model prediction. The simulations resolve this period (Δt = 0.25 h, saved hourly), so the Damköhler number and corrosion rate (Fig. 5b) are resolved from the first hours. The predicted transition times (about 40 h for the disc, about 100 h for the stent) are therefore not validated at earlier times. [State this in the Results and add early (&lt; 24 h) measurements or flag them as future work.]</w:t>
             </w:r>
             <w:proofErr w:type="gramStart"/>
-            <w:r>
-              <w:rPr>
-                <w:color w:val="000000"/>
-                <w:sz w:val="20"/>
-              </w:rPr>
-              <w:t>)</w:t>
-            </w:r>
             <w:proofErr w:type="gramEnd"/>
-            <w:r>
-              <w:rPr>
-                <w:color w:val="000000"/>
-                <w:sz w:val="20"/>
-              </w:rPr>
-              <w:t xml:space="preserve"> and the fields and mass loss were saved at 1 h intervals, so the </w:t>
-            </w:r>
             <w:proofErr w:type="spellStart"/>
-            <w:r>
-              <w:rPr>
-                <w:color w:val="000000"/>
-                <w:sz w:val="20"/>
-              </w:rPr>
-              <w:t>Damköhler</w:t>
-            </w:r>
             <w:proofErr w:type="spellEnd"/>
-            <w:r>
-              <w:rPr>
-                <w:color w:val="000000"/>
-                <w:sz w:val="20"/>
-              </w:rPr>
-              <w:t xml:space="preserve"> number and the corrosion-rate decay (Figure 5b) are resolved from the first hours. We agree that the predicted transition time (about 40 h for the disc and about 100 h for the stent) is therefore a model prediction that is not validated by data at earlier times; the mass-loss curve itself is constrained only from 24 h onwards. We have [qualified the Results to state that the transition times are predicted by the model and are not directly validated by the measurements, and] [added early-time (&lt; 24 h) measurements / identified them as future work].</w:t>
-            </w:r>
           </w:p>
         </w:tc>
         <w:tc>
@@ -2276,18 +2251,11 @@
           <w:p>
             <w:r>
               <w:rPr>
+                <w:i w:val="0"/>
                 <w:color w:val="000000"/>
                 <w:sz w:val="20"/>
               </w:rPr>
-              <w:t xml:space="preserve">We agree. The 14-day and 28-day masses (3.03 ± 0.74 and 3.67 ± 1.33 mg, n = 3; a </w:t>
-            </w:r>
-            <w:r>
-              <w:rPr>
-                <w:color w:val="000000"/>
-                <w:sz w:val="20"/>
-              </w:rPr>
-              <w:lastRenderedPageBreak/>
-              <w:t>two-sample test gives p ≈ 0.5) are not statistically distinguishable, so the experiments constrain the late-time increase only weakly; the measured curve is well resolved up to about 7 days. We have [revised the Results to state that the later increase lies within the experimental scatter / added replicates or an intermediate time point].</w:t>
+              <w:t>The 14- and 28-day masses (3.03 ± 0.74 and 3.67 ± 1.33 mg, n = 3; p ≈ 0.5) are not statistically distinguishable, so the late-time increase is only weakly constrained; the curve is well resolved up to about 7 days. [Revise the Results to state that the later increase lies within the experimental scatter, or add replicates.]</w:t>
             </w:r>
           </w:p>
         </w:tc>
@@ -2356,27 +2324,14 @@
           <w:p>
             <w:r>
               <w:rPr>
+                <w:i w:val="0"/>
                 <w:color w:val="000000"/>
                 <w:sz w:val="20"/>
               </w:rPr>
-              <w:t xml:space="preserve">We agree that </w:t>
+              <w:t>Pearson r has been removed from the Results, since a correlation coefficient is not meaningful for two monotonic saturating curves. Errors at 336 h are reported instead (Zn²⁺ 44%, pH 2.8%, i.e. 0.21 pH units). [Revise the pH and Zn²⁺ discussion: the OH⁻ sources are not unit-consistent and the model has no buffer, so pH is qualitative.]</w:t>
             </w:r>
             <w:proofErr w:type="gramStart"/>
-            <w:r>
-              <w:rPr>
-                <w:color w:val="000000"/>
-                <w:sz w:val="20"/>
-              </w:rPr>
-              <w:t>a correlation</w:t>
-            </w:r>
             <w:proofErr w:type="gramEnd"/>
-            <w:r>
-              <w:rPr>
-                <w:color w:val="000000"/>
-                <w:sz w:val="20"/>
-              </w:rPr>
-              <w:t xml:space="preserve"> coefficient is not a meaningful measure for two monotonic saturating curves, and we have removed the Pearson r values from the Results. We now report the errors at 336 h (44% for Zn²⁺ and 2.8% for pH, i.e. 0.21 pH units) and retain the description of the comparison as an out-of-objective evaluation. For Zn²⁺, the RMSE is 11.6 mg L⁻¹ (39% of the mean literature value); for pH, it is 0.10. We attribute the over-prediction to precipitation and buffering in the r-SBF medium (phosphate, carbonate, Tris), which the model does not include [and to the solution volume per unit area, to be confirmed].</w:t>
-            </w:r>
           </w:p>
         </w:tc>
         <w:tc>
@@ -2596,75 +2551,20 @@
           <w:p>
             <w:r>
               <w:rPr>
+                <w:i w:val="0"/>
                 <w:color w:val="000000"/>
                 <w:sz w:val="20"/>
               </w:rPr>
-              <w:t xml:space="preserve">The relative influence of </w:t>
+              <w:t>k_f is the least influential of the three calibrated parameters (Fig. 3a), consistent with its bounded effect on mass loss (see A2.2). [Add parameter correlations and profile or bootstrap intervals once BO is re-run; k_ORR is expected to be well constrained and k_f and k_d only through their ratio.]</w:t>
             </w:r>
             <w:proofErr w:type="spellStart"/>
-            <w:r>
-              <w:rPr>
-                <w:color w:val="000000"/>
-                <w:sz w:val="20"/>
-              </w:rPr>
-              <w:t>k_f</w:t>
-            </w:r>
             <w:proofErr w:type="spellEnd"/>
-            <w:r>
-              <w:rPr>
-                <w:color w:val="000000"/>
-                <w:sz w:val="20"/>
-              </w:rPr>
-              <w:t xml:space="preserve"> is addressed in the response to A2.2 (Figure 3a ranks </w:t>
-            </w:r>
             <w:proofErr w:type="spellStart"/>
-            <w:r>
-              <w:rPr>
-                <w:color w:val="000000"/>
-                <w:sz w:val="20"/>
-              </w:rPr>
-              <w:t>k_f</w:t>
-            </w:r>
             <w:proofErr w:type="spellEnd"/>
-            <w:r>
-              <w:rPr>
-                <w:color w:val="000000"/>
-                <w:sz w:val="20"/>
-              </w:rPr>
-              <w:t xml:space="preserve"> below C_O₂,0, </w:t>
-            </w:r>
             <w:proofErr w:type="spellStart"/>
-            <w:r>
-              <w:rPr>
-                <w:color w:val="000000"/>
-                <w:sz w:val="20"/>
-              </w:rPr>
-              <w:t>k_ORR</w:t>
-            </w:r>
             <w:proofErr w:type="spellEnd"/>
-            <w:r>
-              <w:rPr>
-                <w:color w:val="000000"/>
-                <w:sz w:val="20"/>
-              </w:rPr>
-              <w:t xml:space="preserve">, </w:t>
-            </w:r>
             <w:proofErr w:type="spellStart"/>
-            <w:r>
-              <w:rPr>
-                <w:color w:val="000000"/>
-                <w:sz w:val="20"/>
-              </w:rPr>
-              <w:t>k_d</w:t>
-            </w:r>
             <w:proofErr w:type="spellEnd"/>
-            <w:r>
-              <w:rPr>
-                <w:color w:val="000000"/>
-                <w:sz w:val="20"/>
-              </w:rPr>
-              <w:t xml:space="preserve"> and D_O₂). [Parameter correlation / profile-likelihood analysis to be completed.]</w:t>
-            </w:r>
           </w:p>
         </w:tc>
         <w:tc>
@@ -2809,7 +2709,7 @@
                 <w:color w:val="000000"/>
                 <w:sz w:val="20"/>
               </w:rPr>
-              <w:t>We agree that oxygen-reduction-limited dissolution is a model assumption (Eqs. 1–2), so the Morris ranking alone cannot show that oxygen controls degradation. The Methods state oxygen-limited dissolution as the modelling premise, and the evidence that it works is the model's agreement with data it was not fitted to: (i) the 28-day immersion data, which were not used in calibration, are reproduced with RMSE = 0.0159%; (ii) the stent prediction, made without recalibration, is consistent with reported in vivo mass loss (~6%). The model is also not forced into oxygen limitation: the recession velocity v_n = min(v_Zn, v_ORR, v_O2) allows a reaction-limited stage, and the results show one at early times followed by a transition to transport control. The ablations (closed vs fixed-O₂ boundary, D_eff = D, k_f = 0) show how much each mechanism contributes. This agreement supports the assumption within the tested conditions (immersion in r-SBF/HBSS; disc and stent geometries); it does not prove oxygen control in vivo. [Soften 'demonstrates' in the Abstract and 'identified … primary driver' in the Conclusions to match.]</w:t>
+              <w:t>Oxygen-reduction-limited dissolution is a model assumption (Eqs. 1–2), so the Morris ranking alone does not show that oxygen controls degradation. The Methods state it as the modelling premise, and its support comes from data not used in calibration: the 28-day immersion data (RMSE = 0.0159%) and the stent prediction (about 6%). The model also allows a reaction-limited stage (v_n is the limiting of three velocities). This supports the assumption within the tested conditions but does not prove oxygen control in vivo. [Soften ‘demonstrates’ in the Abstract and ‘primary driver’ in the Conclusions.]</w:t>
             </w:r>
             <w:proofErr w:type="spellStart"/>
             <w:proofErr w:type="spellEnd"/>
@@ -3053,7 +2953,7 @@
                 <w:color w:val="000000"/>
                 <w:sz w:val="20"/>
               </w:rPr>
-              <w:t>We have repeated the SA:V comparison with consistent, geometrically derived areas. The disc area from the mesh (219.9 mm²) matches the ideal 10 × 2 mm geometry to 0.1% (SA:V = 1.40 mm⁻¹), and the stent mesh gives a volume of 0.361 mm³ and a surface area of 19.46 mm² (SA:V = 53.9 mm⁻¹). The SA:V ratio of the stent to the disc is therefore 38.5. Scaling the 672 h disc mass loss (0.333% simulated, 0.311% measured) by this ratio gives an SA:V-extrapolated stent mass loss of 12.8% (model-based) or 12.0% (experiment-based). The mechanistic model predicts 6.0%, about half of this, because oxygen transport is restricted in the dense stent geometry: the mean penetration depth is about 1.1 µm for the stent against 2.4 µm for the disc. The SA:V scaling therefore overpredicts, and the mechanistic model adds information beyond bulk geometric scaling. The areas and SA:V in Table S4 have been corrected to the mesh-derived values. [Reconcile the stent corrosion rate (0.0596 mm/yr at 672 h) with the 6% mass loss: with the mesh area it implies about 0.015 mm/yr.]</w:t>
+              <w:t>The disc area from the mesh (219.9 mm²) matches the ideal 10 × 2 mm geometry (SA:V = 1.40 mm⁻¹), and the stent mesh gives 0.361 mm³ and 19.46 mm² (SA:V = 53.9 mm⁻¹), a ratio of 38.5. Scaling the 672 h disc mass loss (0.333% simulated, 0.311% measured) gives an SA:V-extrapolated stent value of 12.8% (12.0% from experiment), about twice the model’s 6.0%. The model recedes less (mean depth 1.1 µm vs 2.4 µm for the disc) because oxygen transport is restricted in the dense stent geometry. Table S4 has been corrected. [Reconcile the stent corrosion rate (0.0596 mm yr⁻¹) with the 6% mass loss, which implies about 0.015 mm yr⁻¹.]</w:t>
             </w:r>
             <w:proofErr w:type="gramStart"/>
             <w:proofErr w:type="gramEnd"/>
@@ -3662,91 +3562,22 @@
           <w:p>
             <w:r>
               <w:rPr>
+                <w:i w:val="0"/>
                 <w:color w:val="000000"/>
                 <w:sz w:val="20"/>
               </w:rPr>
-              <w:t xml:space="preserve">The implementation is mass-based. F and </w:t>
+              <w:t>The implementation is mass-based: F and F_max are in g mm⁻³ (F_max = ρ_film(1−ε)), and Cl⁻ enters the dissolution rate as a molar concentration, so k_d has units L² mol⁻² h⁻¹. The molar F_max expression and the mm⁶ g⁻² h⁻¹ unit in the manuscript are being corrected. [Update the Eq. 11 text, Table 2 and Table S5.]</w:t>
             </w:r>
             <w:proofErr w:type="spellStart"/>
-            <w:r>
-              <w:rPr>
-                <w:color w:val="000000"/>
-                <w:sz w:val="20"/>
-              </w:rPr>
-              <w:t>F_max</w:t>
-            </w:r>
             <w:proofErr w:type="spellEnd"/>
-            <w:r>
-              <w:rPr>
-                <w:color w:val="000000"/>
-                <w:sz w:val="20"/>
-              </w:rPr>
-              <w:t xml:space="preserve"> are in g mm⁻³ (</w:t>
-            </w:r>
             <w:proofErr w:type="spellStart"/>
-            <w:r>
-              <w:rPr>
-                <w:color w:val="000000"/>
-                <w:sz w:val="20"/>
-              </w:rPr>
-              <w:t>F_max</w:t>
-            </w:r>
             <w:proofErr w:type="spellEnd"/>
-            <w:r>
-              <w:rPr>
-                <w:color w:val="000000"/>
-                <w:sz w:val="20"/>
-              </w:rPr>
-              <w:t xml:space="preserve"> = </w:t>
-            </w:r>
             <w:proofErr w:type="spellStart"/>
-            <w:r>
-              <w:rPr>
-                <w:color w:val="000000"/>
-                <w:sz w:val="20"/>
-              </w:rPr>
-              <w:t>ρ_film</w:t>
-            </w:r>
             <w:proofErr w:type="spellEnd"/>
-            <w:r>
-              <w:rPr>
-                <w:color w:val="000000"/>
-                <w:sz w:val="20"/>
-              </w:rPr>
-              <w:t xml:space="preserve">(1−ε)), and Cl⁻ enters the dissolution rate as a molar concentration (mol L⁻¹). The correct unit for </w:t>
-            </w:r>
             <w:proofErr w:type="spellStart"/>
-            <w:r>
-              <w:rPr>
-                <w:color w:val="000000"/>
-                <w:sz w:val="20"/>
-              </w:rPr>
-              <w:t>k_d</w:t>
-            </w:r>
             <w:proofErr w:type="spellEnd"/>
-            <w:r>
-              <w:rPr>
-                <w:color w:val="000000"/>
-                <w:sz w:val="20"/>
-              </w:rPr>
-              <w:t xml:space="preserve"> is therefore L² mol⁻² h⁻¹. The molar </w:t>
-            </w:r>
             <w:proofErr w:type="spellStart"/>
-            <w:r>
-              <w:rPr>
-                <w:color w:val="000000"/>
-                <w:sz w:val="20"/>
-              </w:rPr>
-              <w:t>F_max</w:t>
-            </w:r>
             <w:proofErr w:type="spellEnd"/>
-            <w:r>
-              <w:rPr>
-                <w:color w:val="000000"/>
-                <w:sz w:val="20"/>
-              </w:rPr>
-              <w:t xml:space="preserve"> expression and the mm⁶ g⁻² h⁻¹ unit in the manuscript were inconsistent with this and are being corrected [Eq. 11 text, Table 2, Table S5].</w:t>
-            </w:r>
           </w:p>
         </w:tc>
         <w:tc>
@@ -3815,75 +3646,20 @@
           <w:p>
             <w:r>
               <w:rPr>
+                <w:i w:val="0"/>
                 <w:color w:val="000000"/>
                 <w:sz w:val="20"/>
               </w:rPr>
-              <w:t xml:space="preserve">The exponent of </w:t>
+              <w:t>The C_Cl exponent in Eq. 11 is an effective reaction order, not the stoichiometric one, since Eq. 5 is an overall reaction. [Give the rationale or reference for the second-order dependence.] Cl⁻ is treated as conserved (Eq. 8 has no sink) because it is in large excess (142.3 mmol L⁻¹): the upper-bound consumption is about 6% for the disc and below 1% for the stent. ‘Catalytic’ is replaced by ‘effectively non-consumed’.</w:t>
             </w:r>
             <w:proofErr w:type="spellStart"/>
-            <w:r>
-              <w:rPr>
-                <w:color w:val="000000"/>
-                <w:sz w:val="20"/>
-              </w:rPr>
-              <w:t>C_Cl</w:t>
-            </w:r>
             <w:proofErr w:type="spellEnd"/>
-            <w:r>
-              <w:rPr>
-                <w:color w:val="000000"/>
-                <w:sz w:val="20"/>
-              </w:rPr>
-              <w:t xml:space="preserve"> in Eq. 11 is an effective reaction order, not the stoichiometric one: Eq. 5 is an overall reaction and the dissolution of </w:t>
-            </w:r>
             <w:proofErr w:type="spellStart"/>
-            <w:r>
-              <w:rPr>
-                <w:color w:val="000000"/>
-                <w:sz w:val="20"/>
-              </w:rPr>
-              <w:t>ZnO</w:t>
-            </w:r>
             <w:proofErr w:type="spellEnd"/>
-            <w:r>
-              <w:rPr>
-                <w:color w:val="000000"/>
-                <w:sz w:val="20"/>
-              </w:rPr>
-              <w:t xml:space="preserve"> into chloro-complexes proceeds in steps, so the rate order need not equal the stoichiometric coefficient. A second-order dependence is used as a reduced-order description [rationale/reference to be given]. Cl⁻ is not catalytic in a strict sense: Eq. 5 consumes four Cl⁻ per </w:t>
-            </w:r>
             <w:proofErr w:type="spellStart"/>
-            <w:r>
-              <w:rPr>
-                <w:color w:val="000000"/>
-                <w:sz w:val="20"/>
-              </w:rPr>
-              <w:t>ZnO</w:t>
-            </w:r>
             <w:proofErr w:type="spellEnd"/>
-            <w:r>
-              <w:rPr>
-                <w:color w:val="000000"/>
-                <w:sz w:val="20"/>
-              </w:rPr>
-              <w:t xml:space="preserve">. In the model, Zn from dissolved film returns to the Zn²⁺ pool as a lumped zinc species and Cl⁻ is treated as conserved (Eq. 8 has no sink). This is justified because Cl⁻ is in large excess (142.3 mmol L⁻¹): if all Zn lost were bound as ZnCl₄²⁻, the upper-bound Cl⁻ consumption would be about 6% for the disc and below 1% for the stent. We replace 'catalytic' </w:t>
-            </w:r>
             <w:proofErr w:type="gramStart"/>
-            <w:r>
-              <w:rPr>
-                <w:color w:val="000000"/>
-                <w:sz w:val="20"/>
-              </w:rPr>
-              <w:t>by</w:t>
-            </w:r>
             <w:proofErr w:type="gramEnd"/>
-            <w:r>
-              <w:rPr>
-                <w:color w:val="000000"/>
-                <w:sz w:val="20"/>
-              </w:rPr>
-              <w:t xml:space="preserve"> 'effectively non-consumed' and note this approximation.</w:t>
-            </w:r>
           </w:p>
         </w:tc>
         <w:tc>
@@ -3952,59 +3728,18 @@
           <w:p>
             <w:r>
               <w:rPr>
+                <w:i w:val="0"/>
                 <w:color w:val="000000"/>
                 <w:sz w:val="20"/>
               </w:rPr>
-              <w:t xml:space="preserve">The film is a </w:t>
+              <w:t>The film is a homogenised, volumetric field on a fixed mesh that forms wherever Zn²⁺ is present on the electrolyte side of the level set and reduces the local diffusivity (Eq. 12). It is not attached to the receding interface, and the ZnO/Zn volume ratio (about 1.6) is not represented. This is stated as a limitation.</w:t>
             </w:r>
             <w:proofErr w:type="spellStart"/>
-            <w:r>
-              <w:rPr>
-                <w:color w:val="000000"/>
-                <w:sz w:val="20"/>
-              </w:rPr>
-              <w:t>homogenised</w:t>
-            </w:r>
             <w:proofErr w:type="spellEnd"/>
-            <w:r>
-              <w:rPr>
-                <w:color w:val="000000"/>
-                <w:sz w:val="20"/>
-              </w:rPr>
-              <w:t xml:space="preserve">, volumetric field on a fixed mesh: it forms wherever dissolved Zn²⁺ is present on the electrolyte side of the level set and reduces local diffusivity (Eq. 12). It is not attached to the receding interface, and the level set advances independently of F. The </w:t>
-            </w:r>
             <w:proofErr w:type="spellStart"/>
-            <w:r>
-              <w:rPr>
-                <w:color w:val="000000"/>
-                <w:sz w:val="20"/>
-              </w:rPr>
-              <w:t>ZnO</w:t>
-            </w:r>
             <w:proofErr w:type="spellEnd"/>
-            <w:r>
-              <w:rPr>
-                <w:color w:val="000000"/>
-                <w:sz w:val="20"/>
-              </w:rPr>
-              <w:t xml:space="preserve">/Zn volume ratio (about 1.6) is not represented, so the film does not displace the interface or expand into the volume of lost metal. This is a limitation of the model, now stated in the Limitations section. Its effect is bounded by </w:t>
-            </w:r>
             <w:proofErr w:type="spellStart"/>
-            <w:r>
-              <w:rPr>
-                <w:color w:val="000000"/>
-                <w:sz w:val="20"/>
-              </w:rPr>
-              <w:t>F_max</w:t>
-            </w:r>
             <w:proofErr w:type="spellEnd"/>
-            <w:r>
-              <w:rPr>
-                <w:color w:val="000000"/>
-                <w:sz w:val="20"/>
-              </w:rPr>
-              <w:t xml:space="preserve"> and the porosity ε, which cap the local film density.</w:t>
-            </w:r>
           </w:p>
         </w:tc>
         <w:tc>
@@ -4087,91 +3822,22 @@
           <w:p>
             <w:r>
               <w:rPr>
+                <w:i w:val="0"/>
                 <w:color w:val="000000"/>
                 <w:sz w:val="20"/>
               </w:rPr>
-              <w:t xml:space="preserve">The ORR terms use a sharp surface integral over the </w:t>
+              <w:t>δ_Γ is a sharp surface integral over the zero level set of the P1 signed-distance function (FreeFEM int2d with the levelset option), with no smoothing parameter. A smoothed delta (width equal to the minimum mesh size) is used only in post-processing averages. This is stated in the Methods.</w:t>
             </w:r>
             <w:proofErr w:type="gramStart"/>
-            <w:r>
-              <w:rPr>
-                <w:color w:val="000000"/>
-                <w:sz w:val="20"/>
-              </w:rPr>
-              <w:t>zero level</w:t>
-            </w:r>
             <w:proofErr w:type="gramEnd"/>
-            <w:r>
-              <w:rPr>
-                <w:color w:val="000000"/>
-                <w:sz w:val="20"/>
-              </w:rPr>
-              <w:t xml:space="preserve"> set of the P1-interpolated signed-distance function (</w:t>
-            </w:r>
             <w:proofErr w:type="spellStart"/>
-            <w:r>
-              <w:rPr>
-                <w:color w:val="000000"/>
-                <w:sz w:val="20"/>
-              </w:rPr>
-              <w:t>FreeFEM</w:t>
-            </w:r>
             <w:proofErr w:type="spellEnd"/>
-            <w:r>
-              <w:rPr>
-                <w:color w:val="000000"/>
-                <w:sz w:val="20"/>
-              </w:rPr>
-              <w:t xml:space="preserve"> int2d with the </w:t>
-            </w:r>
             <w:proofErr w:type="spellStart"/>
-            <w:r>
-              <w:rPr>
-                <w:color w:val="000000"/>
-                <w:sz w:val="20"/>
-              </w:rPr>
-              <w:t>levelset</w:t>
-            </w:r>
             <w:proofErr w:type="spellEnd"/>
-            <w:r>
-              <w:rPr>
-                <w:color w:val="000000"/>
-                <w:sz w:val="20"/>
-              </w:rPr>
-              <w:t xml:space="preserve"> option), so there is no smoothing parameter in the reaction terms. A smoothed delta function, δ = (1 − tanh²(φ/</w:t>
-            </w:r>
             <w:proofErr w:type="spellStart"/>
-            <w:r>
-              <w:rPr>
-                <w:color w:val="000000"/>
-                <w:sz w:val="20"/>
-              </w:rPr>
-              <w:t>ε_δ</w:t>
-            </w:r>
             <w:proofErr w:type="spellEnd"/>
-            <w:r>
-              <w:rPr>
-                <w:color w:val="000000"/>
-                <w:sz w:val="20"/>
-              </w:rPr>
-              <w:t xml:space="preserve">))/(2ε_δ) with </w:t>
-            </w:r>
             <w:proofErr w:type="spellStart"/>
-            <w:r>
-              <w:rPr>
-                <w:color w:val="000000"/>
-                <w:sz w:val="20"/>
-              </w:rPr>
-              <w:t>ε_δ</w:t>
-            </w:r>
             <w:proofErr w:type="spellEnd"/>
-            <w:r>
-              <w:rPr>
-                <w:color w:val="000000"/>
-                <w:sz w:val="20"/>
-              </w:rPr>
-              <w:t xml:space="preserve"> equal to the minimum mesh size, is used only in post-processing to average quantities over the interface. We now state this in the Methods.</w:t>
-            </w:r>
           </w:p>
         </w:tc>
         <w:tc>
@@ -4361,10 +4027,11 @@
           <w:p>
             <w:r>
               <w:rPr>
+                <w:i w:val="0"/>
                 <w:color w:val="000000"/>
                 <w:sz w:val="20"/>
               </w:rPr>
-              <w:t>We agree that 'low-dimensional' is misleading next to a mesh of 18.9 million elements, and we have removed it, together with the 'three effective kinetic parameters' wording, from the Abstract. Parameter count and mesh size are separate: only three kinetic parameters are calibrated, but each simulation is a full 3D calculation. The 18.9-million-element mesh is used only for the final validation simulation (68.9 h on 50 cores, Table S4). Calibration used a 0.8-million-element mesh (about 2 h per simulation) mapped to the fine mesh with 0.004% error. We agree that disc transport is predominantly one-dimensional and that an axisymmetric model would be cheaper for calibration. We kept the 3D formulation so that calibration and the stent prediction use the identical model and mesh pipeline. [Add an axisymmetric check here if run.]</w:t>
+              <w:t>‘Low-dimensional’ and ‘three-parameter’ have been removed from the Abstract, since parameter count and mesh size are separate. The 18.9-million-element mesh is used only for the final validation run (68.9 h on 50 cores); calibration used a 0.8-million-element mesh (about 2 h per run), mapped to the fine mesh with 0.004% error. An axisymmetric model would be cheaper for calibration, but the 3D formulation was kept so that calibration and the stent prediction use the same model. [Delete this note if no axisymmetric check is run.]</w:t>
             </w:r>
           </w:p>
         </w:tc>
@@ -4652,7 +4319,7 @@
                 <w:color w:val="000000"/>
                 <w:sz w:val="20"/>
               </w:rPr>
-              <w:t>The sweeps in the original Fig. 4 used k_f = 100, k_d = 30 and k_ORR = 1.0, not the optimised values, which is why the baseline gave 0.39% at 168 h against about 0.19% in Fig. 5a. We have repeated the sweeps around the calibrated baseline (k_f = 10, k_d = 1, k_ORR = 0.2 [confirm these are the calibrated values and update Table 2]), varying each parameter by the same factors (×0.2 and ×5) with the others fixed. The baseline curve gives 0.20% at 168 h, matching the calibrated simulation in Fig. 5a. [Insert the updated Fig. 4 and revised text in the manuscript.]</w:t>
+              <w:t>The original sweeps used k_f = 100, k_d = 30 and k_ORR = 1.0, not the optimised values, giving 0.39% at 168 h against about 0.19% in Fig. 5a. Fig. 4 has been recomputed around the baseline values, varying each parameter by ×0.2 and ×5; the baseline now gives 0.20% at 168 h, matching Fig. 5a. [Confirm that the baseline equals the calibrated values in Table 2.]</w:t>
             </w:r>
             <w:proofErr w:type="spellStart"/>
             <w:proofErr w:type="spellEnd"/>
@@ -4817,10 +4484,11 @@
           <w:p>
             <w:r>
               <w:rPr>
+                <w:i w:val="0"/>
                 <w:color w:val="000000"/>
                 <w:sz w:val="20"/>
               </w:rPr>
-              <w:t>Thank you for spotting this. The ranges in the text were wrong. From the Fig. 8c data, mean penetration depth is 2.4–2.7 µm across the curved-wire configurations (30°, 90°, 150°: 2.44, 2.70, 2.58 µm) and 2.1–2.4 µm across the spacing configurations (straight, close gap, far gap: 2.44, 2.05, 2.28 µm). The Results text now gives these ranges.</w:t>
+              <w:t>The text ranges were wrong. From the Fig. 8c data, mean penetration depth is 2.4–2.7 µm for the curved wires and 2.1–2.4 µm for the spacing configurations. The Results now give these ranges.</w:t>
             </w:r>
           </w:p>
         </w:tc>
@@ -4880,7 +4548,7 @@
                 <w:color w:val="000000"/>
                 <w:sz w:val="20"/>
               </w:rPr>
-              <w:t>Error bars in Fig. 8c are ±1 standard deviation of the local penetration depth around the cross-section perimeter. The Fig. 8c caption now says so.</w:t>
+              <w:t>Error bars in Fig. 8c are ±1 SD of the local penetration depth around the cross-section perimeter. The caption now says so.</w:t>
             </w:r>
           </w:p>
         </w:tc>
@@ -4942,36 +4610,14 @@
           <w:p>
             <w:r>
               <w:rPr>
+                <w:i w:val="0"/>
                 <w:color w:val="000000"/>
                 <w:sz w:val="20"/>
               </w:rPr>
-              <w:lastRenderedPageBreak/>
-              <w:t xml:space="preserve">The 13.2× is the ratio of outer (3.72 µm) to </w:t>
-            </w:r>
-            <w:r>
-              <w:rPr>
-                <w:color w:val="000000"/>
-                <w:sz w:val="20"/>
-              </w:rPr>
-              <w:lastRenderedPageBreak/>
-              <w:t xml:space="preserve">inner (0.28 µm) recession for the 150° arc. Its denominator is far below the interface element size, so the ratio is poorly constrained and should not be compared numerically across geometries. We now report the absolute outer–inner difference (3.4 µm for the 150° arc) alongside the </w:t>
+              <w:t>The 13.2× ratio compares 3.72 µm (outer) with 0.28 µm (inner), a depth below the interface mesh size, so the ratio is poorly constrained. The absolute difference (3.4 µm) is reported alongside it. The stent crown (Fig. 7d) gives 8.55 and 4.76 µm (1.8×, a 3.8 µm difference); the isolated 150° arc (radius 0.63 mm) confines its inner side more strongly. [Confirm the depths are taken at the arc apex and add the absolute differences to the Results.]</w:t>
             </w:r>
             <w:proofErr w:type="gramStart"/>
-            <w:r>
-              <w:rPr>
-                <w:color w:val="000000"/>
-                <w:sz w:val="20"/>
-              </w:rPr>
-              <w:t>ratio, and</w:t>
-            </w:r>
             <w:proofErr w:type="gramEnd"/>
-            <w:r>
-              <w:rPr>
-                <w:color w:val="000000"/>
-                <w:sz w:val="20"/>
-              </w:rPr>
-              <w:t xml:space="preserve"> note that the inner depth is not resolved. The stent crown (Fig. 7d) gives 8.55 µm outer and 4.76 µm inner (1.8×, a 3.8 µm difference). The two are not directly comparable because the isolated 150° arc (radius 0.63 mm) confines its inner side far more strongly than the stent crown, so the inner surface is almost fully shielded from oxygen. [Confirm that Fig. 8d's inner and outer depths are taken at the arc apex, as in Fig. 7d.]</w:t>
-            </w:r>
           </w:p>
         </w:tc>
         <w:tc>
@@ -5828,7 +5474,7 @@
                 <w:color w:val="000000"/>
                 <w:sz w:val="20"/>
               </w:rPr>
-              <w:t>We have reconciled the two statements by giving the cost where each is used. The Results state that calibration is computationally tractable because only three parameters are calibrated, on a coarse mesh at about 2 h per 3D simulation (Table S4). The Discussion describes the high-fidelity validation and stent simulations (about 69 h on 50–64 cores for 672 h on a 19–21 million-element mesh, Table S4) as computationally demanding.</w:t>
+              <w:t>The Results state that calibration is computationally tractable (three parameters, coarse mesh, about 2 h per run; Table S4), and the Discussion describes the high-fidelity simulations as computationally demanding.</w:t>
             </w:r>
           </w:p>
         </w:tc>
@@ -5884,10 +5530,11 @@
           <w:p>
             <w:r>
               <w:rPr>
+                <w:i w:val="0"/>
                 <w:color w:val="000000"/>
                 <w:sz w:val="20"/>
               </w:rPr>
-              <w:t>The section headings in the Word submission file are numbered automatically (multilevel list tied to the heading styles: 1 Introduction, 2 Methods, 3 Results and Discussion, 4 Conclusions). 'Section 2.3' is Methods 2.3, Numerical Implementation and Simulation Setup, which is where the meshing and numerical procedures are described, so the cross-reference is correct. The numbers were probably lost in the version the reviewer saw. We have checked that they appear in the exported submission PDF. The 'Sections 1 and 2' in Fig. 7 refer to the two stent cross-sections, not manuscript sections.</w:t>
+              <w:t>Section headings are numbered automatically in the submission file, and ‘Section 2.3’ is Numerical Implementation and Simulation Setup. The numbers may have been lost in the reviewer’s version.</w:t>
             </w:r>
           </w:p>
         </w:tc>
@@ -5971,75 +5618,20 @@
           <w:p>
             <w:r>
               <w:rPr>
+                <w:i w:val="0"/>
                 <w:color w:val="000000"/>
                 <w:sz w:val="20"/>
               </w:rPr>
-              <w:t>Fixed: 'a R²' is now 'an R²', and 'shown in (Figure 4g–</w:t>
+              <w:t>‘a R²’ is now ‘an R²’ and ‘shown in (Figure 4g–i)’ is now ‘shown in Figure 4g–i’. The capitalised ‘Literature’ appears only in a reference title, so it is unchanged.</w:t>
             </w:r>
             <w:proofErr w:type="spellStart"/>
-            <w:r>
-              <w:rPr>
-                <w:color w:val="000000"/>
-                <w:sz w:val="20"/>
-              </w:rPr>
-              <w:t>i</w:t>
-            </w:r>
             <w:proofErr w:type="spellEnd"/>
-            <w:r>
-              <w:rPr>
-                <w:color w:val="000000"/>
-                <w:sz w:val="20"/>
-              </w:rPr>
-              <w:t>)' is now 'shown in Figure 4g–</w:t>
-            </w:r>
             <w:proofErr w:type="spellStart"/>
-            <w:r>
-              <w:rPr>
-                <w:color w:val="000000"/>
-                <w:sz w:val="20"/>
-              </w:rPr>
-              <w:t>i</w:t>
-            </w:r>
             <w:proofErr w:type="spellEnd"/>
-            <w:r>
-              <w:rPr>
-                <w:color w:val="000000"/>
-                <w:sz w:val="20"/>
-              </w:rPr>
-              <w:t xml:space="preserve">'. The </w:t>
-            </w:r>
             <w:proofErr w:type="spellStart"/>
-            <w:r>
-              <w:rPr>
-                <w:color w:val="000000"/>
-                <w:sz w:val="20"/>
-              </w:rPr>
-              <w:t>capitalised</w:t>
-            </w:r>
             <w:proofErr w:type="spellEnd"/>
-            <w:r>
-              <w:rPr>
-                <w:color w:val="000000"/>
-                <w:sz w:val="20"/>
-              </w:rPr>
-              <w:t xml:space="preserve"> 'Literature' in the text is inside the title of a cited reference (Tortuosity-Porosity Relationships: Review of Empirical Data from Literature), where title-case </w:t>
-            </w:r>
             <w:proofErr w:type="spellStart"/>
-            <w:r>
-              <w:rPr>
-                <w:color w:val="000000"/>
-                <w:sz w:val="20"/>
-              </w:rPr>
-              <w:t>capitalisation</w:t>
-            </w:r>
             <w:proofErr w:type="spellEnd"/>
-            <w:r>
-              <w:rPr>
-                <w:color w:val="000000"/>
-                <w:sz w:val="20"/>
-              </w:rPr>
-              <w:t xml:space="preserve"> is correct, so it was left unchanged. The mid-sentence 'literature' in the Zn²⁺/pH paragraph was already lower-case.</w:t>
-            </w:r>
           </w:p>
         </w:tc>
         <w:tc>
@@ -6567,51 +6159,16 @@
           <w:p>
             <w:r>
               <w:rPr>
+                <w:i w:val="0"/>
                 <w:color w:val="000000"/>
                 <w:sz w:val="20"/>
               </w:rPr>
-              <w:t xml:space="preserve">The </w:t>
+              <w:t>The Damköhler number is defined in the SI (Eq. S3, Section S1) as the ratio of oxygen consumption to oxygen transport. Da &lt; 1 indicates reaction control and Da &gt; 1 diffusion control; the transition is at Da = 1 (about 40 h for the disc). The main text cites Eq. S3 and Section S1.</w:t>
             </w:r>
             <w:proofErr w:type="spellStart"/>
-            <w:r>
-              <w:rPr>
-                <w:color w:val="000000"/>
-                <w:sz w:val="20"/>
-              </w:rPr>
-              <w:t>Damköhler</w:t>
-            </w:r>
             <w:proofErr w:type="spellEnd"/>
-            <w:r>
-              <w:rPr>
-                <w:color w:val="000000"/>
-                <w:sz w:val="20"/>
-              </w:rPr>
-              <w:t xml:space="preserve"> number is defined in the Supplementary Information (Eq. S3, Section </w:t>
-            </w:r>
-            <w:r>
-              <w:rPr>
-                <w:color w:val="000000"/>
-                <w:sz w:val="20"/>
-              </w:rPr>
-              <w:lastRenderedPageBreak/>
-              <w:t>S1) as the ratio of oxygen consumption by the ORR to oxygen transport to the surface, Da = k_ORR·C_O2 / (D_O</w:t>
-            </w:r>
             <w:proofErr w:type="gramStart"/>
-            <w:r>
-              <w:rPr>
-                <w:color w:val="000000"/>
-                <w:sz w:val="20"/>
-              </w:rPr>
-              <w:t>2,eff</w:t>
-            </w:r>
             <w:proofErr w:type="gramEnd"/>
-            <w:r>
-              <w:rPr>
-                <w:color w:val="000000"/>
-                <w:sz w:val="20"/>
-              </w:rPr>
-              <w:t xml:space="preserve"> ∇C_O2·n). The transition criterion is also given there: Da &lt; 1 indicates reaction-controlled corrosion and Da &gt; 1 diffusion-controlled corrosion, and the transition is the point where Da crosses 1 (about 40 h for the disc). The main text cites this definition in the Methods (Equation S3) and Section S1 for the transition between regimes.</w:t>
-            </w:r>
           </w:p>
         </w:tc>
         <w:tc>

</xml_diff>

<commit_message>
Response doc: merge user's status updates and edited rows (A1.1, A4.1, A4.2, A6.1); keep concise text
Co-Authored-By: Claude Sonnet 5.5 <noreply@anthropic.com>
Claude-Session: https://claude.ai/code/session_01Y1g9vByMLTE8eGJ9K81zt6
</commit_message>
<xml_diff>
--- a/review_response/Response_to_Reviewer_Comments.docx
+++ b/review_response/Response_to_Reviewer_Comments.docx
@@ -236,7 +236,10 @@
                 <w:color w:val="000000"/>
                 <w:sz w:val="20"/>
               </w:rPr>
-              <w:t>The original estimate of 0.009 mm yr⁻¹ uses molar C_O₂. However, the solver uses the O₂ mass concentration without molar-mass conversion, making the simulated velocity approximately 32× higher. Eqs. 15–16 have been corrected to include M_O₂ explicitly and clarify the mass/molar basis and effective units of k_ORR. The corrected ORR ceiling is 0.29 mm yr⁻¹, above the simulated disc and stent rates of 0.12 and 0.155 mm yr⁻¹. Therefore, the results remain consistent; the issue was with the printed equations and unit definitions, not the simulations.</w:t>
+              <w:t>The original estimate of 0.009 mm yr−10.009\ \mathrm{mm\,yr^{-1}}0.009 mmyr−1 uses molar CO2C_{O_2}CO2​​. However, the solver uses O₂ mass concentration without molar-mass conversion, making the simulated velocity approximately 32×32\times32× higher. Eqs. 15–16 have been corrected to include MO2M_{O_2}MO2​​ explicitly and clarify the mass/molar basis and effective units of kORRk_{\mathrm{ORR}}kORR​.</w:t>
+              <w:br/>
+              <w:br/>
+              <w:t>The corrected ORR ceiling is 0.29 mm yr−10.29\ \mathrm{mm\,yr^{-1}}0.29 mmyr−1, above the simulated disc and stent rates of 0.120.120.12 and 0.155 mm yr−10.155\ \mathrm{mm\,yr^{-1}}0.155 mmyr−1. Therefore, the results remain consistent; the issue was with the printed equations and unit definitions, not the simulations.</w:t>
             </w:r>
             <w:proofErr w:type="spellStart"/>
             <w:proofErr w:type="spellEnd"/>
@@ -1304,7 +1307,7 @@
               <w:rPr>
                 <w:sz w:val="20"/>
               </w:rPr>
-              <w:t>In progress</w:t>
+              <w:t>Closed</w:t>
             </w:r>
           </w:p>
         </w:tc>
@@ -1602,7 +1605,7 @@
               <w:rPr>
                 <w:sz w:val="20"/>
               </w:rPr>
-              <w:t>In progress</w:t>
+              <w:t>Closed</w:t>
             </w:r>
           </w:p>
         </w:tc>
@@ -1736,7 +1739,7 @@
               <w:rPr>
                 <w:sz w:val="20"/>
               </w:rPr>
-              <w:t>In progress</w:t>
+              <w:t>Closed</w:t>
             </w:r>
           </w:p>
         </w:tc>
@@ -1877,11 +1880,11 @@
           <w:p>
             <w:r>
               <w:rPr>
-                <w:i/>
-                <w:color w:val="808080"/>
-                <w:sz w:val="20"/>
-              </w:rPr>
-              <w:t>[To be completed]</w:t>
+                <w:i w:val="0"/>
+                <w:color w:val="000000"/>
+                <w:sz w:val="20"/>
+              </w:rPr>
+              <w:t>This is why there is a difference in RMSE.</w:t>
             </w:r>
           </w:p>
         </w:tc>
@@ -1957,52 +1960,16 @@
           <w:p>
             <w:r>
               <w:rPr>
+                <w:i w:val="0"/>
                 <w:color w:val="000000"/>
                 <w:sz w:val="20"/>
               </w:rPr>
-              <w:lastRenderedPageBreak/>
-              <w:t xml:space="preserve">The in vivo timescale cannot justify a </w:t>
+              <w:t>The in vivo timescale cannot justify a ZnO-only representation for the in vitro simulations, as additional corrosion products form within hours to days. The in vivo justification has therefore been removed, and the model is now described as a homogenized ZnO-based representation that does not explicitly resolve phosphate-, carbonate-, calcium-, or chloride-containing phases. This has been added to limitations</w:t>
             </w:r>
             <w:proofErr w:type="spellStart"/>
-            <w:r>
-              <w:rPr>
-                <w:color w:val="000000"/>
-                <w:sz w:val="20"/>
-              </w:rPr>
-              <w:t>ZnO</w:t>
-            </w:r>
             <w:proofErr w:type="spellEnd"/>
-            <w:r>
-              <w:rPr>
-                <w:color w:val="000000"/>
-                <w:sz w:val="20"/>
-              </w:rPr>
-              <w:t xml:space="preserve">-only representation for the in vitro simulations, as additional corrosion products form within hours to days. The in vivo justification has therefore been removed, and </w:t>
-            </w:r>
-            <w:r>
-              <w:rPr>
-                <w:color w:val="000000"/>
-                <w:sz w:val="20"/>
-              </w:rPr>
-              <w:lastRenderedPageBreak/>
-              <w:t xml:space="preserve">the model is now described as a homogenized </w:t>
-            </w:r>
             <w:proofErr w:type="spellStart"/>
-            <w:r>
-              <w:rPr>
-                <w:color w:val="000000"/>
-                <w:sz w:val="20"/>
-              </w:rPr>
-              <w:t>ZnO</w:t>
-            </w:r>
             <w:proofErr w:type="spellEnd"/>
-            <w:r>
-              <w:rPr>
-                <w:color w:val="000000"/>
-                <w:sz w:val="20"/>
-              </w:rPr>
-              <w:t>-based representation that does not explicitly resolve phosphate-, carbonate-, calcium-, or chloride-containing phases.</w:t>
-            </w:r>
           </w:p>
         </w:tc>
         <w:tc>
@@ -2073,7 +2040,7 @@
               <w:rPr>
                 <w:sz w:val="20"/>
               </w:rPr>
-              <w:t>Closed</w:t>
+              <w:t>Draft</w:t>
             </w:r>
           </w:p>
         </w:tc>
@@ -2209,7 +2176,7 @@
               <w:rPr>
                 <w:sz w:val="20"/>
               </w:rPr>
-              <w:t>In progress</w:t>
+              <w:t>Closed</w:t>
             </w:r>
           </w:p>
         </w:tc>
@@ -2343,7 +2310,7 @@
               <w:rPr>
                 <w:sz w:val="20"/>
               </w:rPr>
-              <w:t>In progress</w:t>
+              <w:t>Closed</w:t>
             </w:r>
           </w:p>
         </w:tc>
@@ -2953,7 +2920,7 @@
                 <w:color w:val="000000"/>
                 <w:sz w:val="20"/>
               </w:rPr>
-              <w:t>The disc area from the mesh (219.9 mm²) matches the ideal 10 × 2 mm geometry (SA:V = 1.40 mm⁻¹), and the stent mesh gives 0.361 mm³ and 19.46 mm² (SA:V = 53.9 mm⁻¹), a ratio of 38.5. Scaling the 672 h disc mass loss (0.333% simulated, 0.311% measured) gives an SA:V-extrapolated stent value of 12.8% (12.0% from experiment), about twice the model’s 6.0%. The model recedes less (mean depth 1.1 µm vs 2.4 µm for the disc) because oxygen transport is restricted in the dense stent geometry. Table S4 has been corrected. [Reconcile the stent corrosion rate (0.0596 mm yr⁻¹) with the 6% mass loss, which implies about 0.015 mm yr⁻¹.]</w:t>
+              <w:t>We have repeated the SA:V comparison with consistent, geometrically derived areas. The disc area from the mesh (219.9 mm²) matches the ideal 10 × 2 mm geometry to 0.1% (SA:V = 1.40 mm⁻¹), and the stent mesh gives a volume of 0.361 mm³ and a surface area of 19.46 mm² (SA:V = 53.9 mm⁻¹). The SA:V ratio of the stent to the disc is therefore 38.5. Scaling the 672 h disc mass loss (0.333% simulated, 0.311% measured) by this ratio gives an SA:V-extrapolated stent mass loss of 12.8% (model-based) or 12.0% (experiment-based). The mechanistic model predicts 6.0%, about half of this, because oxygen transport is restricted in the dense stent geometry: the mean penetration depth is about 1.1 µm for the stent against 2.4 µm for the disc. The SA:V scaling therefore overpredicts, and the mechanistic model adds information beyond bulk geometric scaling. The areas and SA:V in Table S4 have been corrected to the mesh-derived values.</w:t>
             </w:r>
             <w:proofErr w:type="gramStart"/>
             <w:proofErr w:type="gramEnd"/>

</xml_diff>

<commit_message>
Response doc: restore concise A1.1 and A6.1
</commit_message>
<xml_diff>
--- a/review_response/Response_to_Reviewer_Comments.docx
+++ b/review_response/Response_to_Reviewer_Comments.docx
@@ -236,10 +236,7 @@
                 <w:color w:val="000000"/>
                 <w:sz w:val="20"/>
               </w:rPr>
-              <w:t>The original estimate of 0.009 mm yr−10.009\ \mathrm{mm\,yr^{-1}}0.009 mmyr−1 uses molar CO2C_{O_2}CO2​​. However, the solver uses O₂ mass concentration without molar-mass conversion, making the simulated velocity approximately 32×32\times32× higher. Eqs. 15–16 have been corrected to include MO2M_{O_2}MO2​​ explicitly and clarify the mass/molar basis and effective units of kORRk_{\mathrm{ORR}}kORR​.</w:t>
-              <w:br/>
-              <w:br/>
-              <w:t>The corrected ORR ceiling is 0.29 mm yr−10.29\ \mathrm{mm\,yr^{-1}}0.29 mmyr−1, above the simulated disc and stent rates of 0.120.120.12 and 0.155 mm yr−10.155\ \mathrm{mm\,yr^{-1}}0.155 mmyr−1. Therefore, the results remain consistent; the issue was with the printed equations and unit definitions, not the simulations.</w:t>
+              <w:t>The original estimate of 0.009 mm yr⁻¹ uses molar C_O₂. However, the solver uses the O₂ mass concentration without molar-mass conversion, making the simulated velocity approximately 32× higher. Eqs. 15–16 have been corrected to include M_O₂ explicitly and clarify the mass/molar basis and effective units of k_ORR. The corrected ORR ceiling is 0.29 mm yr⁻¹, above the simulated disc and stent rates of 0.12 and 0.155 mm yr⁻¹. Therefore, the results remain consistent; the issue was with the printed equations and unit definitions, not the simulations.</w:t>
             </w:r>
             <w:proofErr w:type="spellStart"/>
             <w:proofErr w:type="spellEnd"/>
@@ -2920,7 +2917,7 @@
                 <w:color w:val="000000"/>
                 <w:sz w:val="20"/>
               </w:rPr>
-              <w:t>We have repeated the SA:V comparison with consistent, geometrically derived areas. The disc area from the mesh (219.9 mm²) matches the ideal 10 × 2 mm geometry to 0.1% (SA:V = 1.40 mm⁻¹), and the stent mesh gives a volume of 0.361 mm³ and a surface area of 19.46 mm² (SA:V = 53.9 mm⁻¹). The SA:V ratio of the stent to the disc is therefore 38.5. Scaling the 672 h disc mass loss (0.333% simulated, 0.311% measured) by this ratio gives an SA:V-extrapolated stent mass loss of 12.8% (model-based) or 12.0% (experiment-based). The mechanistic model predicts 6.0%, about half of this, because oxygen transport is restricted in the dense stent geometry: the mean penetration depth is about 1.1 µm for the stent against 2.4 µm for the disc. The SA:V scaling therefore overpredicts, and the mechanistic model adds information beyond bulk geometric scaling. The areas and SA:V in Table S4 have been corrected to the mesh-derived values.</w:t>
+              <w:t>The disc area from the mesh (219.9 mm²) matches the ideal 10 × 2 mm geometry (SA:V = 1.40 mm⁻¹), and the stent mesh gives 0.361 mm³ and 19.46 mm² (SA:V = 53.9 mm⁻¹), a ratio of 38.5. Scaling the 672 h disc mass loss (0.333% simulated, 0.311% measured) gives an SA:V-extrapolated stent value of 12.8% (12.0% from experiment), about twice the model’s 6.0%. The model recedes less (mean depth 1.1 µm vs 2.4 µm for the disc) because oxygen transport is restricted in the dense stent geometry. Table S4 has been corrected.</w:t>
             </w:r>
             <w:proofErr w:type="gramStart"/>
             <w:proofErr w:type="gramEnd"/>

</xml_diff>

<commit_message>
Response doc: close A4.6 with final response
</commit_message>
<xml_diff>
--- a/review_response/Response_to_Reviewer_Comments.docx
+++ b/review_response/Response_to_Reviewer_Comments.docx
@@ -2219,7 +2219,7 @@
                 <w:color w:val="000000"/>
                 <w:sz w:val="20"/>
               </w:rPr>
-              <w:t>The 14- and 28-day masses (3.03 ± 0.74 and 3.67 ± 1.33 mg, n = 3; p ≈ 0.5) are not statistically distinguishable, so the late-time increase is only weakly constrained; the curve is well resolved up to about 7 days. [Revise the Results to state that the later increase lies within the experimental scatter, or add replicates.]</w:t>
+              <w:t>The 14- and 28-day masses (3.03 ± 0.74 and 3.67 ± 1.33 mg, n = 3; p ≈ 0.5) are not statistically distinguishable, so the later change lies within the experimental scatter. The manuscript does not claim a plateau: it describes a high initial mass loss (about 67% of the 28-day loss in the first week) followed by deceleration.</w:t>
             </w:r>
           </w:p>
         </w:tc>
@@ -2232,7 +2232,7 @@
               <w:rPr>
                 <w:sz w:val="20"/>
               </w:rPr>
-              <w:t>In progress</w:t>
+              <w:t>Closed</w:t>
             </w:r>
           </w:p>
         </w:tc>

</xml_diff>

<commit_message>
Response doc: close B2.1
</commit_message>
<xml_diff>
--- a/review_response/Response_to_Reviewer_Comments.docx
+++ b/review_response/Response_to_Reviewer_Comments.docx
@@ -3995,7 +3995,7 @@
                 <w:color w:val="000000"/>
                 <w:sz w:val="20"/>
               </w:rPr>
-              <w:t>‘Low-dimensional’ and ‘three-parameter’ have been removed from the Abstract, since parameter count and mesh size are separate. The 18.9-million-element mesh is used only for the final validation run (68.9 h on 50 cores); calibration used a 0.8-million-element mesh (about 2 h per run), mapped to the fine mesh with 0.004% error. An axisymmetric model would be cheaper for calibration, but the 3D formulation was kept so that calibration and the stent prediction use the same model. [Delete this note if no axisymmetric check is run.]</w:t>
+              <w:t>‘Low-dimensional’ and ‘three-parameter’ have been removed from the Abstract, since parameter count and mesh size are separate. The 18.9-million-element mesh is used only for the final validation run (68.9 h on 50 cores); calibration used a coarse mesh (37,399 tetrahedra, about 20 min per evaluation on 4 cores), corrected to the fine mesh with a linear bias correction (Pearson r = 0.9986).</w:t>
             </w:r>
           </w:p>
         </w:tc>
@@ -4009,7 +4009,7 @@
                 <w:color w:val="000000"/>
                 <w:sz w:val="20"/>
               </w:rPr>
-              <w:t>In progress</w:t>
+              <w:t>Closed</w:t>
             </w:r>
           </w:p>
         </w:tc>

</xml_diff>

<commit_message>
Response doc: B2.2 draft (5 um interface mesh)
</commit_message>
<xml_diff>
--- a/review_response/Response_to_Reviewer_Comments.docx
+++ b/review_response/Response_to_Reviewer_Comments.docx
@@ -4065,11 +4065,11 @@
           <w:p>
             <w:r>
               <w:rPr>
-                <w:i/>
-                <w:color w:val="808080"/>
-                <w:sz w:val="20"/>
-              </w:rPr>
-              <w:t>[To be completed]</w:t>
+                <w:i w:val="0"/>
+                <w:color w:val="000000"/>
+                <w:sz w:val="20"/>
+              </w:rPr>
+              <w:t>The interface mesh size is 5 µm, comparable to the 3–8 µm recession (about one element). Mass loss and mean penetration are mesh-converged (&lt;1%, Section S2), but sub-element roughness in the local profiles is at the discretisation scale and is not interpreted physically. The conclusions rest on integrated depths and on outer/inner differences of several µm. [Confirm the stent minimum element size in Table S4 (currently 0.01 mm).]</w:t>
             </w:r>
           </w:p>
         </w:tc>
@@ -4082,7 +4082,7 @@
               <w:rPr>
                 <w:sz w:val="20"/>
               </w:rPr>
-              <w:t>Open</w:t>
+              <w:t>In progress</w:t>
             </w:r>
           </w:p>
         </w:tc>

</xml_diff>

<commit_message>
Table S4: stent minimum element size 0.005 mm; close B2.2
</commit_message>
<xml_diff>
--- a/review_response/Response_to_Reviewer_Comments.docx
+++ b/review_response/Response_to_Reviewer_Comments.docx
@@ -4069,7 +4069,7 @@
                 <w:color w:val="000000"/>
                 <w:sz w:val="20"/>
               </w:rPr>
-              <w:t>The interface mesh size is 5 µm, comparable to the 3–8 µm recession (about one element). Mass loss and mean penetration are mesh-converged (&lt;1%, Section S2), but sub-element roughness in the local profiles is at the discretisation scale and is not interpreted physically. The conclusions rest on integrated depths and on outer/inner differences of several µm. [Confirm the stent minimum element size in Table S4 (currently 0.01 mm).]</w:t>
+              <w:t>The interface mesh size is 5 µm, comparable to the 3–8 µm recession (about one element). Mass loss and mean penetration are mesh-converged (&lt;1%, Section S2), but sub-element roughness in the local profiles is at the discretisation scale and is not interpreted physically. The conclusions rest on integrated depths and on outer/inner differences of several µm. Table S4 now gives the stent minimum element size as 0.005 mm.</w:t>
             </w:r>
           </w:p>
         </w:tc>
@@ -4082,7 +4082,7 @@
               <w:rPr>
                 <w:sz w:val="20"/>
               </w:rPr>
-              <w:t>In progress</w:t>
+              <w:t>Closed</w:t>
             </w:r>
           </w:p>
         </w:tc>

</xml_diff>

<commit_message>
Fig 8d: add absolute differences (tracked copy); close B4.3
</commit_message>
<xml_diff>
--- a/review_response/Response_to_Reviewer_Comments.docx
+++ b/review_response/Response_to_Reviewer_Comments.docx
@@ -4578,7 +4578,7 @@
                 <w:color w:val="000000"/>
                 <w:sz w:val="20"/>
               </w:rPr>
-              <w:t>The 13.2× ratio compares 3.72 µm (outer) with 0.28 µm (inner), a depth below the interface mesh size, so the ratio is poorly constrained. The absolute difference (3.4 µm) is reported alongside it. The stent crown (Fig. 7d) gives 8.55 and 4.76 µm (1.8×, a 3.8 µm difference); the isolated 150° arc (radius 0.63 mm) confines its inner side more strongly. [Confirm the depths are taken at the arc apex and add the absolute differences to the Results.]</w:t>
+              <w:t>The 13.2× ratio compares 3.72 µm (outer) with 0.28 µm (inner), a depth below the interface mesh size, so the ratio is poorly constrained. The absolute differences are now reported alongside the ratios (3.4 µm for the 150° arc). The stent crown (Fig. 7d) gives 8.55 and 4.76 µm (1.8×, a 3.8 µm difference); the isolated 150° arc (radius 0.63 mm) confines its inner side more strongly.</w:t>
             </w:r>
             <w:proofErr w:type="gramStart"/>
             <w:proofErr w:type="gramEnd"/>
@@ -4594,7 +4594,7 @@
                 <w:color w:val="000000"/>
                 <w:sz w:val="20"/>
               </w:rPr>
-              <w:t>In progress</w:t>
+              <w:t>Closed</w:t>
             </w:r>
           </w:p>
         </w:tc>

</xml_diff>

<commit_message>
Limitations: ICP and mechanism tests not performed (tracked copy); close B5.3, B5.4
</commit_message>
<xml_diff>
--- a/review_response/Response_to_Reviewer_Comments.docx
+++ b/review_response/Response_to_Reviewer_Comments.docx
@@ -4853,11 +4853,11 @@
           <w:p>
             <w:r>
               <w:rPr>
-                <w:i/>
-                <w:color w:val="808080"/>
-                <w:sz w:val="20"/>
-              </w:rPr>
-              <w:t>[To be completed]</w:t>
+                <w:i w:val="0"/>
+                <w:color w:val="000000"/>
+                <w:sz w:val="20"/>
+              </w:rPr>
+              <w:t>ICP measurement of Zn²⁺ in the refreshed solution was not performed in this study. This is now stated in the Limitations as a needed independent check.</w:t>
             </w:r>
           </w:p>
         </w:tc>
@@ -4870,7 +4870,7 @@
               <w:rPr>
                 <w:sz w:val="20"/>
               </w:rPr>
-              <w:t>Open</w:t>
+              <w:t>Closed</w:t>
             </w:r>
           </w:p>
         </w:tc>
@@ -4912,11 +4912,11 @@
           <w:p>
             <w:r>
               <w:rPr>
-                <w:i/>
-                <w:color w:val="808080"/>
-                <w:sz w:val="20"/>
-              </w:rPr>
-              <w:t>[To be completed]</w:t>
+                <w:i w:val="0"/>
+                <w:color w:val="000000"/>
+                <w:sz w:val="20"/>
+              </w:rPr>
+              <w:t>A direct mechanism test (film thickness from FIB or SEM cross-sections, or a stirred or different-O₂ experiment) was not performed in this study. This is now stated in the Limitations.</w:t>
             </w:r>
           </w:p>
         </w:tc>
@@ -4929,7 +4929,7 @@
               <w:rPr>
                 <w:sz w:val="20"/>
               </w:rPr>
-              <w:t>Open</w:t>
+              <w:t>Closed</w:t>
             </w:r>
           </w:p>
         </w:tc>

</xml_diff>

<commit_message>
Response doc: close C1.1
</commit_message>
<xml_diff>
--- a/review_response/Response_to_Reviewer_Comments.docx
+++ b/review_response/Response_to_Reviewer_Comments.docx
@@ -5249,24 +5249,14 @@
           <w:p>
             <w:r>
               <w:rPr>
-                <w:sz w:val="20"/>
-              </w:rPr>
-              <w:t xml:space="preserve">The Code Availability statement has been corrected to identify the </w:t>
+                <w:i w:val="0"/>
+                <w:color w:val="000000"/>
+                <w:sz w:val="20"/>
+              </w:rPr>
+              <w:t>The Code Availability statement has been removed, and a Data Availability Statement (Zenodo repository, DOI 10.5281/zenodo.23053517) is now included in the manuscript.</w:t>
             </w:r>
             <w:proofErr w:type="spellStart"/>
-            <w:r>
-              <w:rPr>
-                <w:sz w:val="20"/>
-              </w:rPr>
-              <w:t>Zenodo</w:t>
-            </w:r>
             <w:proofErr w:type="spellEnd"/>
-            <w:r>
-              <w:rPr>
-                <w:sz w:val="20"/>
-              </w:rPr>
-              <w:t xml:space="preserve"> repository rather than GitHub. The Data Availability Statement was provided separately through the Wiley submission portal.</w:t>
-            </w:r>
           </w:p>
         </w:tc>
         <w:tc>
@@ -5278,7 +5268,7 @@
               <w:rPr>
                 <w:sz w:val="20"/>
               </w:rPr>
-              <w:t>Open</w:t>
+              <w:t>Closed</w:t>
             </w:r>
           </w:p>
         </w:tc>

</xml_diff>

<commit_message>
Response doc: A1.3, B3.1 consistent with plotted labels; close B3.1
</commit_message>
<xml_diff>
--- a/review_response/Response_to_Reviewer_Comments.docx
+++ b/review_response/Response_to_Reviewer_Comments.docx
@@ -380,7 +380,7 @@
                 <w:color w:val="000000"/>
                 <w:sz w:val="20"/>
               </w:rPr>
-              <w:t>Fig. 4 has been recomputed around the baseline values. At 168 h, the ORR ceilings for k_ORR = 0.04, 0.2 and 1 are 0.06, 0.30 and 1.5%, above the simulated mass losses of 0.04, 0.20 and 0.63%.</w:t>
+              <w:t>Fig. 4 has been recomputed around the baseline values. At 168 h, the ORR ceilings for k_ORR = 0.04, 0.16 and 1 are 0.06, 0.24 and 1.5%, above the simulated mass losses of 0.04, 0.20 and 0.63%.</w:t>
             </w:r>
             <w:proofErr w:type="spellStart"/>
             <w:proofErr w:type="spellEnd"/>
@@ -4283,7 +4283,7 @@
                 <w:color w:val="000000"/>
                 <w:sz w:val="20"/>
               </w:rPr>
-              <w:t>The original sweeps used k_f = 100, k_d = 30 and k_ORR = 1.0, not the optimised values, giving 0.39% at 168 h against about 0.19% in Fig. 5a. Fig. 4 has been recomputed around the baseline values, varying each parameter by ×0.2 and ×5; the baseline now gives 0.20% at 168 h, matching Fig. 5a. [Confirm that the baseline equals the calibrated values in Table 2.]</w:t>
+              <w:t>The original sweeps used k_f = 100, k_d = 30 and k_ORR = 1.0, not the optimised values, giving 0.39% at 168 h against about 0.19% in Fig. 5a. Fig. 4 has been recomputed around the baseline values; the baseline now gives 0.20% at 168 h, matching Fig. 5a.</w:t>
             </w:r>
             <w:proofErr w:type="spellStart"/>
             <w:proofErr w:type="spellEnd"/>
@@ -4307,7 +4307,7 @@
                 <w:color w:val="000000"/>
                 <w:sz w:val="20"/>
               </w:rPr>
-              <w:t>In progress</w:t>
+              <w:t>Closed</w:t>
             </w:r>
           </w:p>
         </w:tc>

</xml_diff>

<commit_message>
Response doc: close A5.1, A5.2 with final BO; update A1.3, B3.1 for new Fig. 4 baseline
Co-Authored-By: Claude Sonnet 5.5 <noreply@anthropic.com>
Claude-Session: https://claude.ai/code/session_01Y1g9vByMLTE8eGJ9K81zt6
</commit_message>
<xml_diff>
--- a/review_response/Response_to_Reviewer_Comments.docx
+++ b/review_response/Response_to_Reviewer_Comments.docx
@@ -380,7 +380,7 @@
                 <w:color w:val="000000"/>
                 <w:sz w:val="20"/>
               </w:rPr>
-              <w:t>Fig. 4 has been recomputed around the baseline values. At 168 h, the ORR ceilings for k_ORR = 0.04, 0.16 and 1 are 0.06, 0.24 and 1.5%, above the simulated mass losses of 0.04, 0.20 and 0.63%.</w:t>
+              <w:t>Fig. 4 has been recomputed around a baseline of k_f = 35, k_d = 27 and k_ORR = 0.5, with sweeps of k_ORR = 0.1, 0.5 and 2.5. At 168 h, the ORR ceilings for these values are 0.15, 0.75 and 3.75%, above the simulated mass losses of 0.04, 0.20 and 0.63%.</w:t>
             </w:r>
             <w:proofErr w:type="spellStart"/>
             <w:proofErr w:type="spellEnd"/>
@@ -2452,7 +2452,7 @@
                 <w:color w:val="808080"/>
                 <w:sz w:val="20"/>
               </w:rPr>
-              <w:t>[To be completed]</w:t>
+              <w:t>The final BO was rerun with all three phases scored on mass loss only (two independent repeats, 28 evaluations each: 12-point Latin hypercube, 8 expected-improvement and 8 local points), so the earlier 0.046% / 0.042% comparison no longer applies (Fig. 3b, Table S10). The best RMSE is 0.0173% (repeat 1, iteration 25, local phase) and 0.0178% (repeat 2, iteration 20, EI phase). Neither optimum is a Latin-hypercube point: the best Phase 1 values are 0.0192% (repeat 1) and 0.0240% (repeat 2), so the guided phases improve RMSE by 10% and 26%. The flat landscape is a result, not a convergence failure. All points within 1.5× the best RMSE (25 of 56) have k_ORR confined to 0.15–0.19, while k_f spans 2.2–96 and k_d 0.6–93. Mass loss therefore constrains k_ORR but not k_f or k_d individually (Results, Section 3.3). The two repeats agree on k_ORR (0.161 vs 0.156), and their best RMSEs differ by 3%, far below the experimental scatter (SD = 0.115% at 28 days). Selecting the repeat 1 optimum for Table 2 is therefore immaterial for the predictions.</w:t>
             </w:r>
           </w:p>
         </w:tc>
@@ -2465,7 +2465,7 @@
               <w:rPr>
                 <w:sz w:val="20"/>
               </w:rPr>
-              <w:t>Open</w:t>
+              <w:t>Closed</w:t>
             </w:r>
           </w:p>
         </w:tc>
@@ -2519,7 +2519,7 @@
                 <w:color w:val="000000"/>
                 <w:sz w:val="20"/>
               </w:rPr>
-              <w:t>k_f is the least influential of the three calibrated parameters (Fig. 3a), consistent with its bounded effect on mass loss (see A2.2). [Add parameter correlations and profile or bootstrap intervals once BO is re-run; k_ORR is expected to be well constrained and k_f and k_d only through their ratio.]</w:t>
+              <w:t>A formal profile likelihood or posterior was not computed. The BO evaluations give an equivalent picture. Among the 25 evaluations within 1.5× the best RMSE (both repeats), k_ORR is tightly constrained (0.15–0.19, a ±12% range), whereas k_f (2.2–96) and k_d (0.6–93) span more than one decade each. The Spearman rank correlations (log10 values) are weak between k_f and k_d (0.11) and moderate between k_d and k_ORR (−0.50), so k_f and k_d are unconstrained rather than degenerate through their ratio. This is stated in the Results and Limitations: only k_ORR is reported as identified, and k_f and k_d are treated as effective parameters whose individual values are not interpreted. The predictions are insensitive to this, because the near-optimal points all reproduce the 0–336 h mass loss.</w:t>
             </w:r>
             <w:proofErr w:type="spellStart"/>
             <w:proofErr w:type="spellEnd"/>
@@ -2540,7 +2540,7 @@
               <w:rPr>
                 <w:sz w:val="20"/>
               </w:rPr>
-              <w:t>In progress</w:t>
+              <w:t>Closed</w:t>
             </w:r>
           </w:p>
         </w:tc>
@@ -4283,7 +4283,7 @@
                 <w:color w:val="000000"/>
                 <w:sz w:val="20"/>
               </w:rPr>
-              <w:t>The original sweeps used k_f = 100, k_d = 30 and k_ORR = 1.0, not the optimised values, giving 0.39% at 168 h against about 0.19% in Fig. 5a. Fig. 4 has been recomputed around the baseline values; the baseline now gives 0.20% at 168 h, matching Fig. 5a.</w:t>
+              <w:t>The original sweeps used k_f = 100, k_d = 30 and k_ORR = 1.0, giving 0.39% at 168 h against about 0.19% in Fig. 5a. Fig. 4 has been recomputed around k_f = 35, k_d = 27 and k_ORR = 0.5 (middle curves); the baseline now gives 0.20% at 168 h, matching Fig. 5a. Each parameter is varied above and below this baseline (k_f = 5–150, k_d = 5–120, k_ORR = 0.1–2.5) with the others held fixed.</w:t>
             </w:r>
             <w:proofErr w:type="spellStart"/>
             <w:proofErr w:type="spellEnd"/>

</xml_diff>

<commit_message>
Response doc: close A4.1
Co-Authored-By: Claude Sonnet 5.5 <noreply@anthropic.com>
Claude-Session: https://claude.ai/code/session_01Y1g9vByMLTE8eGJ9K81zt6
</commit_message>
<xml_diff>
--- a/review_response/Response_to_Reviewer_Comments.docx
+++ b/review_response/Response_to_Reviewer_Comments.docx
@@ -1881,7 +1881,7 @@
                 <w:color w:val="000000"/>
                 <w:sz w:val="20"/>
               </w:rPr>
-              <w:t>This is why there is a difference in RMSE.</w:t>
+              <w:t>The calibration (r-SBF, Tris-buffered, 14 days) and validation (HBSS, 28 days) media differ chemically, which contributes to the difference in RMSE. The calibration data also show rapid mass loss towards the end of the 336 h period. The authors attribute this to localized corrosion, but cleaning inaccuracies and complex corrosion-product formation may contribute as well. The model does not represent these effects, and this is acknowledged as a limitation.</w:t>
             </w:r>
           </w:p>
         </w:tc>
@@ -1894,7 +1894,7 @@
               <w:rPr>
                 <w:sz w:val="20"/>
               </w:rPr>
-              <w:t>Open</w:t>
+              <w:t>Closed</w:t>
             </w:r>
           </w:p>
         </w:tc>

</xml_diff>

<commit_message>
Response doc: close A4.3
Co-Authored-By: Claude Sonnet 5.5 <noreply@anthropic.com>
Claude-Session: https://claude.ai/code/session_01Y1g9vByMLTE8eGJ9K81zt6
</commit_message>
<xml_diff>
--- a/review_response/Response_to_Reviewer_Comments.docx
+++ b/review_response/Response_to_Reviewer_Comments.docx
@@ -2024,7 +2024,7 @@
                 <w:color w:val="000000"/>
                 <w:sz w:val="20"/>
               </w:rPr>
-              <w:t>The calibration data (Liu et al.) were measured in r-SBF and the validation data in Ca/Mg-free HBSS. r-SBF has more complex chemistry (extra ions, Tris buffer, more precipitation), whereas HBSS is simpler and closer to the single effective ZnO phase assumed by the model, which explains the lower validation RMSE (0.0159% vs 0.042%). The validation error is also small relative to the experimental scatter (SD = 0.115% at 28 days, n = 3), so the two RMSE values are not directly comparable.</w:t>
+              <w:t>With the final calibration the two errors are comparable: the calibration RMSE is 0.0173% (Fig. 3b, Table 2) and the validation RMSE is 0.0159%, so the validation error is not unusually low. The earlier gap (0.042% vs 0.0159%) arose from an earlier calibration that also scored non-mass-loss targets. The remaining small difference is expected. The calibration data (Liu et al.) were measured in r-SBF, which has more complex chemistry (extra ions, Tris buffer, more precipitation), whereas the validation data were measured in Ca/Mg-free HBSS, which is simpler and closer to the single effective ZnO phase assumed by the model. The two RMSE values are also not directly comparable, because the validation error is small relative to the experimental scatter (SD = 0.115% at 28 days, n = 3), so the validation cannot discriminate between parameter sets that differ by less than this scatter.</w:t>
             </w:r>
           </w:p>
         </w:tc>
@@ -2037,7 +2037,7 @@
               <w:rPr>
                 <w:sz w:val="20"/>
               </w:rPr>
-              <w:t>Draft</w:t>
+              <w:t>Closed</w:t>
             </w:r>
           </w:p>
         </w:tc>

</xml_diff>

<commit_message>
Response doc: close A5.3
Co-Authored-By: Claude Sonnet 5.5 <noreply@anthropic.com>
Claude-Session: https://claude.ai/code/session_01Y1g9vByMLTE8eGJ9K81zt6
</commit_message>
<xml_diff>
--- a/review_response/Response_to_Reviewer_Comments.docx
+++ b/review_response/Response_to_Reviewer_Comments.docx
@@ -2600,7 +2600,7 @@
                 <w:color w:val="808080"/>
                 <w:sz w:val="20"/>
               </w:rPr>
-              <w:t>[To be completed]</w:t>
+              <w:t>The GSA targeted the parameters that are uncertain and enter the calibration (kinetic constants, O₂ concentration and diffusivities; ranges in Table S5). ε and τ were fixed because they are not readily available from the literature or experiments, so literature-based estimates were used. F_max was not an independent parameter: it was calculated from the Langmuir saturation formulation given in the manuscript (F_max = ρ_film(1 − ε)). [Zn]_sat was taken from the literature, with the reference listed in the manuscript. The role of the corrosion-product mechanism was assessed separately: removing corrosion-product formation entirely raises the 672 h mass loss from 0.33% to 0.74% (A2.2), and the k_f and k_d sweeps (Fig. 4) show its effect on mass loss, saturation and interfacial O₂. Because ε and τ are fixed estimates, the absolute corrosion-product transport resistance is uncertain, which is stated in the Limitations.</w:t>
             </w:r>
           </w:p>
         </w:tc>
@@ -2613,7 +2613,7 @@
               <w:rPr>
                 <w:sz w:val="20"/>
               </w:rPr>
-              <w:t>Open</w:t>
+              <w:t>Closed</w:t>
             </w:r>
           </w:p>
         </w:tc>

</xml_diff>

<commit_message>
Response doc: close A5.4
Co-Authored-By: Claude Sonnet 5.5 <noreply@anthropic.com>
Claude-Session: https://claude.ai/code/session_01Y1g9vByMLTE8eGJ9K81zt6
</commit_message>
<xml_diff>
--- a/review_response/Response_to_Reviewer_Comments.docx
+++ b/review_response/Response_to_Reviewer_Comments.docx
@@ -2673,7 +2673,7 @@
                 <w:color w:val="000000"/>
                 <w:sz w:val="20"/>
               </w:rPr>
-              <w:t>Oxygen-reduction-limited dissolution is a model assumption (Eqs. 1–2), so the Morris ranking alone does not show that oxygen controls degradation. The Methods state it as the modelling premise, and its support comes from data not used in calibration: the 28-day immersion data (RMSE = 0.0159%) and the stent prediction (about 6%). The model also allows a reaction-limited stage (v_n is the limiting of three velocities). This supports the assumption within the tested conditions but does not prove oxygen control in vivo. [Soften ‘demonstrates’ in the Abstract and ‘primary driver’ in the Conclusions.]</w:t>
+              <w:t>Oxygen-reduction-limited dissolution is a modelling premise (Eqs. 1–2), built on experimentally observed oxygen control of Zn degradation, so the Morris ranking alone does not show that oxygen controls degradation; it only shows how the model responds to O₂. The test that the model captures this behaviour is therefore not the sensitivity ranking but its agreement with data not used in calibration: the 28-day immersion data (RMSE = 0.0159%) and the stent prediction (about 6%). These results show that the oxygen-controlled formulation reproduces the measured mass loss. The model also allows a reaction-limited stage (v_n is the limiting of three velocities), so oxygen control is not forced at all times. This supports the assumption within the tested conditions but does not prove oxygen control in vivo.</w:t>
             </w:r>
             <w:proofErr w:type="spellStart"/>
             <w:proofErr w:type="spellEnd"/>
@@ -2703,7 +2703,7 @@
                 <w:color w:val="000000"/>
                 <w:sz w:val="20"/>
               </w:rPr>
-              <w:t>In progress</w:t>
+              <w:t>Closed</w:t>
             </w:r>
           </w:p>
         </w:tc>

</xml_diff>

<commit_message>
Response doc: close A6.1
Co-Authored-By: Claude Sonnet 5.5 <noreply@anthropic.com>
Claude-Session: https://claude.ai/code/session_01Y1g9vByMLTE8eGJ9K81zt6
</commit_message>
<xml_diff>
--- a/review_response/Response_to_Reviewer_Comments.docx
+++ b/review_response/Response_to_Reviewer_Comments.docx
@@ -2917,7 +2917,7 @@
                 <w:color w:val="000000"/>
                 <w:sz w:val="20"/>
               </w:rPr>
-              <w:t>The disc area from the mesh (219.9 mm²) matches the ideal 10 × 2 mm geometry (SA:V = 1.40 mm⁻¹), and the stent mesh gives 0.361 mm³ and 19.46 mm² (SA:V = 53.9 mm⁻¹), a ratio of 38.5. Scaling the 672 h disc mass loss (0.333% simulated, 0.311% measured) gives an SA:V-extrapolated stent value of 12.8% (12.0% from experiment), about twice the model’s 6.0%. The model recedes less (mean depth 1.1 µm vs 2.4 µm for the disc) because oxygen transport is restricted in the dense stent geometry. Table S4 has been corrected.</w:t>
+              <w:t>The disc area from the mesh (219.9 mm²) matches the ideal 10 × 2 mm geometry (SA:V = 1.40 mm⁻¹), and the stent mesh gives 0.361 mm³ and 19.46 mm² (SA:V = 53.9 mm⁻¹), a ratio of 38.5. Scaling the 672 h disc mass loss (0.333% simulated, 0.311% measured) gives an SA:V-extrapolated stent value of 12.8% (12.0% from experiment), about twice the model’s 6.0%. The model recedes less (mean depth 1.1 µm vs 2.4 µm for the disc) because oxygen transport is restricted in the dense stent geometry. Table S4 has been corrected. The near-linear dependence of mass loss on SA:V is expected and is reported in the literature, so a similar or higher SA:V-scaled value is not evidence against the model. The model's added value is that transport control reduces the overall stent mass loss only moderately relative to this scaling (6.0% vs 12.8%) but changes where material is lost strongly: recession is concentrated on the oxygen-accessible outer surface and suppressed in the confined regions (Figs. 7–8), which SA:V scaling cannot capture.</w:t>
             </w:r>
             <w:proofErr w:type="gramStart"/>
             <w:proofErr w:type="gramEnd"/>
@@ -2940,7 +2940,7 @@
                 <w:color w:val="000000"/>
                 <w:sz w:val="20"/>
               </w:rPr>
-              <w:t>In progress</w:t>
+              <w:t>Closed</w:t>
             </w:r>
           </w:p>
         </w:tc>

</xml_diff>

<commit_message>
Response doc: close A6.2
Co-Authored-By: Claude Sonnet 5.5 <noreply@anthropic.com>
Claude-Session: https://claude.ai/code/session_01Y1g9vByMLTE8eGJ9K81zt6
</commit_message>
<xml_diff>
--- a/review_response/Response_to_Reviewer_Comments.docx
+++ b/review_response/Response_to_Reviewer_Comments.docx
@@ -2984,25 +2984,22 @@
               <w:rPr>
                 <w:sz w:val="20"/>
               </w:rPr>
-              <w:t xml:space="preserve">This is </w:t>
-            </w:r>
-            <w:r>
-              <w:rPr>
-                <w:sz w:val="20"/>
-              </w:rPr>
-              <w:t>shown</w:t>
-            </w:r>
-            <w:r>
-              <w:rPr>
-                <w:sz w:val="20"/>
-              </w:rPr>
-              <w:t xml:space="preserve"> with the individual simulations</w:t>
-            </w:r>
-            <w:r>
-              <w:rPr>
-                <w:sz w:val="20"/>
-              </w:rPr>
-              <w:t xml:space="preserve"> when compared with baselines</w:t>
+              <w:t>The spatial distribution of degradation is the main added value of the model. It is shown by the individual simulations (Figs. 7 and 8), each compared with its baseline: the six-crown stent against the disc (Fig. 6) and the curved and spaced structures against the straight, widely spaced reference (Fig. 8). The baseline comparisons show that global mass loss changes only modestly, whereas the spatial distribution of recession changes strongly.</w:t>
+            </w:r>
+            <w:r>
+              <w:rPr>
+                <w:sz w:val="20"/>
+              </w:rPr>
+            </w:r>
+            <w:r>
+              <w:rPr>
+                <w:sz w:val="20"/>
+              </w:rPr>
+            </w:r>
+            <w:r>
+              <w:rPr>
+                <w:sz w:val="20"/>
+              </w:rPr>
             </w:r>
             <w:r>
               <w:rPr>
@@ -3010,7 +3007,6 @@
                 <w:color w:val="808080"/>
                 <w:sz w:val="20"/>
               </w:rPr>
-              <w:t xml:space="preserve"> </w:t>
             </w:r>
           </w:p>
         </w:tc>
@@ -3024,7 +3020,7 @@
                 <w:color w:val="000000"/>
                 <w:sz w:val="20"/>
               </w:rPr>
-              <w:t>In progress</w:t>
+              <w:t>Closed</w:t>
             </w:r>
           </w:p>
         </w:tc>

</xml_diff>

<commit_message>
Response doc: close B5.2
Co-Authored-By: Claude Sonnet 5.5 <noreply@anthropic.com>
Claude-Session: https://claude.ai/code/session_01Y1g9vByMLTE8eGJ9K81zt6
</commit_message>
<xml_diff>
--- a/review_response/Response_to_Reviewer_Comments.docx
+++ b/review_response/Response_to_Reviewer_Comments.docx
@@ -4794,7 +4794,7 @@
                 <w:color w:val="808080"/>
                 <w:sz w:val="20"/>
               </w:rPr>
-              <w:t>[To be completed]</w:t>
+              <w:t>The corrosion products were removed with chromic acid at room temperature for 10 min. The discs were immersed lying flat (horizontal orientation). No CO₂ incubator was used; the immersion was static at 37 °C. The HBSS pH was 7.4 and is now stated in the Methods.</w:t>
             </w:r>
           </w:p>
         </w:tc>
@@ -4807,7 +4807,7 @@
               <w:rPr>
                 <w:sz w:val="20"/>
               </w:rPr>
-              <w:t>Open</w:t>
+              <w:t>Closed</w:t>
             </w:r>
           </w:p>
         </w:tc>

</xml_diff>

<commit_message>
Response doc: close B5.1
Co-Authored-By: Claude Sonnet 5.5 <noreply@anthropic.com>
Claude-Session: https://claude.ai/code/session_01Y1g9vByMLTE8eGJ9K81zt6
</commit_message>
<xml_diff>
--- a/review_response/Response_to_Reviewer_Comments.docx
+++ b/review_response/Response_to_Reviewer_Comments.docx
@@ -4735,7 +4735,7 @@
                 <w:color w:val="808080"/>
                 <w:sz w:val="20"/>
               </w:rPr>
-              <w:t>[To be completed]</w:t>
+              <w:t>The balance resolution was 0.1 mg. Blank cleaning controls were not performed; however, all samples were cleaned using the same protocol (chromic acid at room temperature for 10 min), minimizing systematic bias between groups. The 0.1 mg resolution is small relative to the measured mass losses, and the experimental scatter (SD = 0.115% at 28 days, n = 3) is much larger than the balance resolution. The absence of blank controls means any cleaning-induced loss of bare Zn is not quantified separately.</w:t>
             </w:r>
           </w:p>
         </w:tc>
@@ -4748,7 +4748,7 @@
               <w:rPr>
                 <w:sz w:val="20"/>
               </w:rPr>
-              <w:t>Open</w:t>
+              <w:t>Closed</w:t>
             </w:r>
           </w:p>
         </w:tc>

</xml_diff>

<commit_message>
Response doc: update A4.7, A5.1
Co-Authored-By: Claude Sonnet 5.5 <noreply@anthropic.com>
Claude-Session: https://claude.ai/code/session_01Y1g9vByMLTE8eGJ9K81zt6
</commit_message>
<xml_diff>
--- a/review_response/Response_to_Reviewer_Comments.docx
+++ b/review_response/Response_to_Reviewer_Comments.docx
@@ -2292,7 +2292,7 @@
                 <w:color w:val="000000"/>
                 <w:sz w:val="20"/>
               </w:rPr>
-              <w:t>Pearson r has been removed from the Results, since a correlation coefficient is not meaningful for two monotonic saturating curves. Errors at 336 h are reported instead (Zn²⁺ 44%, pH 2.8%, i.e. 0.21 pH units). [Revise the pH and Zn²⁺ discussion: the OH⁻ sources are not unit-consistent and the model has no buffer, so pH is qualitative.]</w:t>
+              <w:t>Pearson r has been removed from the Zn²⁺ and pH comparison, since a correlation coefficient is not meaningful for two monotonic saturating curves. Errors at 336 h are reported instead (Zn²⁺ 44%, pH 2.8%, i.e. 0.21 pH units). The Zn²⁺ and pH comparisons are interpreted qualitatively: the model has no buffer, whereas the literature medium (r-SBF) is Tris-buffered and forms further precipitates, which limits the late-stage rise of both quantities (as stated in the Results).</w:t>
             </w:r>
             <w:proofErr w:type="gramStart"/>
             <w:proofErr w:type="gramEnd"/>
@@ -2452,7 +2452,7 @@
                 <w:color w:val="808080"/>
                 <w:sz w:val="20"/>
               </w:rPr>
-              <w:t>The final BO was rerun with all three phases scored on mass loss only (two independent repeats, 28 evaluations each: 12-point Latin hypercube, 8 expected-improvement and 8 local points), so the earlier 0.046% / 0.042% comparison no longer applies (Fig. 3b, Table S10). The best RMSE is 0.0173% (repeat 1, iteration 25, local phase) and 0.0178% (repeat 2, iteration 20, EI phase). Neither optimum is a Latin-hypercube point: the best Phase 1 values are 0.0192% (repeat 1) and 0.0240% (repeat 2), so the guided phases improve RMSE by 10% and 26%. The flat landscape is a result, not a convergence failure. All points within 1.5× the best RMSE (25 of 56) have k_ORR confined to 0.15–0.19, while k_f spans 2.2–96 and k_d 0.6–93. Mass loss therefore constrains k_ORR but not k_f or k_d individually (Results, Section 3.3). The two repeats agree on k_ORR (0.161 vs 0.156), and their best RMSEs differ by 3%, far below the experimental scatter (SD = 0.115% at 28 days). Selecting the repeat 1 optimum for Table 2 is therefore immaterial for the predictions.</w:t>
+              <w:t>The results reported in Fig. 3b, Table 2 and Table S10 are those of the final BO run. The final BO was rerun with all three phases scored on mass loss only (two independent repeats, 28 evaluations each: 12-point Latin hypercube, 8 expected-improvement and 8 local points), so the earlier 0.046% / 0.042% comparison no longer applies (Fig. 3b, Table S10). The best RMSE is 0.0173% (repeat 1, iteration 25, local phase) and 0.0178% (repeat 2, iteration 20, EI phase). Neither optimum is a Latin-hypercube point: the best Phase 1 values are 0.0192% (repeat 1) and 0.0240% (repeat 2), so the guided phases improve RMSE by 10% and 26%. The flat landscape is a result, not a convergence failure. All points within 1.5× the best RMSE (25 of 56) have k_ORR confined to 0.15–0.19, while k_f spans 2.2–96 and k_d 0.6–93. Mass loss therefore constrains k_ORR but not k_f or k_d individually (Results, Section 3.3). The two repeats agree on k_ORR (0.161 vs 0.156), and their best RMSEs differ by 3%, far below the experimental scatter (SD = 0.115% at 28 days). Selecting the repeat 1 optimum for Table 2 is therefore immaterial for the predictions.</w:t>
             </w:r>
           </w:p>
         </w:tc>

</xml_diff>

<commit_message>
Response doc: concise rewrite of all responses
Co-Authored-By: Claude Sonnet 5.5 <noreply@anthropic.com>
Claude-Session: https://claude.ai/code/session_01Y1g9vByMLTE8eGJ9K81zt6
</commit_message>
<xml_diff>
--- a/review_response/Response_to_Reviewer_Comments.docx
+++ b/review_response/Response_to_Reviewer_Comments.docx
@@ -236,7 +236,7 @@
                 <w:color w:val="000000"/>
                 <w:sz w:val="20"/>
               </w:rPr>
-              <w:t>The original estimate of 0.009 mm yr⁻¹ uses molar C_O₂. However, the solver uses the O₂ mass concentration without molar-mass conversion, making the simulated velocity approximately 32× higher. Eqs. 15–16 have been corrected to include M_O₂ explicitly and clarify the mass/molar basis and effective units of k_ORR. The corrected ORR ceiling is 0.29 mm yr⁻¹, above the simulated disc and stent rates of 0.12 and 0.155 mm yr⁻¹. Therefore, the results remain consistent; the issue was with the printed equations and unit definitions, not the simulations.</w:t>
+              <w:t>The original 0.009 mm yr⁻¹ used molar C_O₂, but the solver uses mass concentration (≈32× higher). Eqs. 15–16 now include M_O₂ explicitly. Corrected ceiling: 0.29 mm yr⁻¹, above the simulated 0.12 and 0.155 mm yr⁻¹. The error was in the printed equations, not the simulations.</w:t>
             </w:r>
             <w:proofErr w:type="spellStart"/>
             <w:proofErr w:type="spellEnd"/>
@@ -307,7 +307,7 @@
                 <w:color w:val="000000"/>
                 <w:sz w:val="20"/>
               </w:rPr>
-              <w:t>See A1.1. The simulated corrosion rates in Figs. 5b and 6b (0.12 and 0.155 mm yr⁻¹) lie below the corrected ceiling of 0.29 mm yr⁻¹.</w:t>
+              <w:t>See A1.1. Simulated rates (0.12 and 0.155 mm yr⁻¹) are below the corrected ceiling.</w:t>
             </w:r>
           </w:p>
         </w:tc>
@@ -380,7 +380,7 @@
                 <w:color w:val="000000"/>
                 <w:sz w:val="20"/>
               </w:rPr>
-              <w:t>Fig. 4 has been recomputed around a baseline of k_f = 35, k_d = 27 and k_ORR = 0.5, with sweeps of k_ORR = 0.1, 0.5 and 2.5. At 168 h, the ORR ceilings for these values are 0.15, 0.75 and 3.75%, above the simulated mass losses of 0.04, 0.20 and 0.63%.</w:t>
+              <w:t>Fig. 4 recomputed around k_ORR = 0.5 (sweep 0.1–2.5). Ceilings at 168 h (0.15, 0.75, 3.75%) exceed simulated mass losses (0.04, 0.20, 0.63%).</w:t>
             </w:r>
             <w:proofErr w:type="spellStart"/>
             <w:proofErr w:type="spellEnd"/>
@@ -469,7 +469,7 @@
                 <w:color w:val="000000"/>
                 <w:sz w:val="20"/>
               </w:rPr>
-              <w:t>A global O₂ mass balance has been added (Section S8, Table S13). The O₂ consumed at the interface is about 1/32 of the stoichiometric requirement at 24 h and about 1/24 at 168 h, so the M_O₂ factor acts as an effective one and Zn recession is not stoichiometrically coupled to O₂ consumption. This is now stated in the Methods and Limitations.</w:t>
+              <w:t>Global O₂ mass balance added (Section S8, Table S13). O₂ consumed is ~1/32 (24 h) and ~1/24 (168 h) of the stoichiometric need, so recession is not stoichiometrically coupled to O₂ consumption. Stated in Methods and Limitations.</w:t>
             </w:r>
             <w:proofErr w:type="spellStart"/>
             <w:proofErr w:type="spellEnd"/>
@@ -546,7 +546,7 @@
                 <w:color w:val="000000"/>
                 <w:sz w:val="20"/>
               </w:rPr>
-              <w:t>Confirmed. The estimate is correct for Eq. 15 as originally printed (see A1.1). Eqs. 15–16 now include M_O₂ and reproduce the simulated rates.</w:t>
+              <w:t>Confirmed. The estimate is right for Eq. 15 as originally printed (see A1.1); Eqs. 15–16 are now corrected.</w:t>
             </w:r>
           </w:p>
         </w:tc>
@@ -760,8 +760,7 @@
                 <w:color w:val="000000"/>
                 <w:sz w:val="20"/>
               </w:rPr>
-              <w:lastRenderedPageBreak/>
-              <w:t xml:space="preserve">Figure 5c was </w:t>
+              <w:t>The Fig. 5c label was wrong: the colour bar is F (g mm⁻³), not F/F_max. Maximum F/F_max = 0.713, so D_eff/D = 0.376 (62% reduction). Label, caption and text corrected.</w:t>
             </w:r>
             <w:proofErr w:type="spellStart"/>
             <w:r>
@@ -769,7 +768,6 @@
                 <w:color w:val="000000"/>
                 <w:sz w:val="20"/>
               </w:rPr>
-              <w:t>mislabelled</w:t>
             </w:r>
             <w:proofErr w:type="spellEnd"/>
             <w:r>
@@ -777,7 +775,6 @@
                 <w:color w:val="000000"/>
                 <w:sz w:val="20"/>
               </w:rPr>
-              <w:t xml:space="preserve">: the </w:t>
             </w:r>
             <w:proofErr w:type="spellStart"/>
             <w:r>
@@ -785,7 +782,6 @@
                 <w:color w:val="000000"/>
                 <w:sz w:val="20"/>
               </w:rPr>
-              <w:t>colour</w:t>
             </w:r>
             <w:proofErr w:type="spellEnd"/>
             <w:r>
@@ -793,15 +789,12 @@
                 <w:color w:val="000000"/>
                 <w:sz w:val="20"/>
               </w:rPr>
-              <w:t xml:space="preserve"> bar represents dimensional FFF (g mm⁻³), not </w:t>
             </w:r>
             <w:r>
               <w:rPr>
                 <w:color w:val="000000"/>
                 <w:sz w:val="20"/>
               </w:rPr>
-              <w:lastRenderedPageBreak/>
-              <w:t>F/Fmax​. The maximum value corresponds to F/Fmax=0.713, giving Deff/D=0.376, or a 62% diffusivity reduction. The label, caption, and discussion have been corrected accordingly.</w:t>
             </w:r>
           </w:p>
         </w:tc>
@@ -887,7 +880,7 @@
                 <w:color w:val="000000"/>
                 <w:sz w:val="20"/>
               </w:rPr>
-              <w:t xml:space="preserve">The modest mass-loss variation across </w:t>
+              <w:t>The small k_f effect reflects saturation. Removing corrosion-product formation raises 672 h mass loss from 0.33% to 0.74%, so its influence is substantial.</w:t>
             </w:r>
             <w:proofErr w:type="spellStart"/>
             <w:r>
@@ -895,7 +888,6 @@
                 <w:color w:val="000000"/>
                 <w:sz w:val="20"/>
               </w:rPr>
-              <w:t>kf</w:t>
             </w:r>
             <w:proofErr w:type="spellEnd"/>
             <w:r>
@@ -903,21 +895,18 @@
                 <w:color w:val="000000"/>
                 <w:sz w:val="20"/>
               </w:rPr>
-              <w:t>=50–200</w:t>
             </w:r>
             <w:r>
               <w:rPr>
                 <w:color w:val="000000"/>
                 <w:sz w:val="20"/>
               </w:rPr>
-              <w:t xml:space="preserve"> </w:t>
             </w:r>
             <w:r>
               <w:rPr>
                 <w:color w:val="000000"/>
                 <w:sz w:val="20"/>
               </w:rPr>
-              <w:t xml:space="preserve">reflects saturation rather than an insignificant corrosion-product effect. Removing corrosion-product formation entirely increases the </w:t>
             </w:r>
             <w:proofErr w:type="gramStart"/>
             <w:r>
@@ -925,7 +914,6 @@
                 <w:color w:val="000000"/>
                 <w:sz w:val="20"/>
               </w:rPr>
-              <w:t>672 h</w:t>
             </w:r>
             <w:proofErr w:type="gramEnd"/>
             <w:r>
@@ -933,7 +921,6 @@
                 <w:color w:val="000000"/>
                 <w:sz w:val="20"/>
               </w:rPr>
-              <w:t xml:space="preserve"> mass loss from 0.33% to 0.74%, demonstrating its substantial influence on degradation.</w:t>
             </w:r>
           </w:p>
         </w:tc>
@@ -1005,7 +992,7 @@
                 <w:color w:val="000000"/>
                 <w:sz w:val="20"/>
               </w:rPr>
-              <w:t>Figure 5c represents a diffuse, volumetric corrosion-product accumulation rather than a physically resolved surface film. The terminology has therefore been revised throughout the manuscript to describe FFF as a homogenized corrosion-product field that modifies local diffusivity.</w:t>
+              <w:t>Fig. 5c shows a diffuse, volumetric corrosion-product field, not a surface film. Terminology revised throughout.</w:t>
             </w:r>
           </w:p>
         </w:tc>
@@ -1063,49 +1050,43 @@
                 <w:color w:val="000000"/>
                 <w:sz w:val="20"/>
               </w:rPr>
-              <w:t xml:space="preserve">Oxygen depletion in the static electrolyte contributes to the observed </w:t>
+              <w:t>O₂ depletion contributes but does not explain the deceleration alone. Removing the corrosion-product effect changes the time exponent from 0.4 to 0.69 and raises 672 h mass loss from 0.333% to 0.744%.</w:t>
             </w:r>
             <w:r>
               <w:rPr>
                 <w:color w:val="000000"/>
                 <w:sz w:val="20"/>
               </w:rPr>
-              <w:t>deceleration but</w:t>
             </w:r>
             <w:r>
               <w:rPr>
                 <w:color w:val="000000"/>
                 <w:sz w:val="20"/>
               </w:rPr>
-              <w:t xml:space="preserve"> does not fully explain it. Removing the corrosion-product effect increases the time exponent from n=0.4</w:t>
             </w:r>
             <w:r>
               <w:rPr>
                 <w:color w:val="000000"/>
                 <w:sz w:val="20"/>
               </w:rPr>
-              <w:t xml:space="preserve"> </w:t>
             </w:r>
             <w:r>
               <w:rPr>
                 <w:color w:val="000000"/>
                 <w:sz w:val="20"/>
               </w:rPr>
-              <w:t xml:space="preserve">to 0.69 and raises the </w:t>
             </w:r>
             <w:r>
               <w:rPr>
                 <w:color w:val="000000"/>
                 <w:sz w:val="20"/>
               </w:rPr>
-              <w:t>672-h</w:t>
             </w:r>
             <w:r>
               <w:rPr>
                 <w:color w:val="000000"/>
                 <w:sz w:val="20"/>
               </w:rPr>
-              <w:t xml:space="preserve"> mass loss from 0.333% to 0.744%, indicating that the corrosion-product field provides an additional resistance that becomes progressively more important over time.</w:t>
             </w:r>
           </w:p>
         </w:tc>
@@ -1177,7 +1158,7 @@
                 <w:color w:val="000000"/>
                 <w:sz w:val="20"/>
               </w:rPr>
-              <w:t xml:space="preserve">Ablation simulations confirm that the deceleration arises from both oxygen depletion in the static electrolyte and progressive corrosion-product accumulation. Setting </w:t>
+              <w:t>Ablations show both O₂ depletion and corrosion-product accumulation cause the deceleration (D_eff = D: 0.744%; k_f = 0: 0.730%, vs 0.333% baseline at 672 h).</w:t>
             </w:r>
             <w:proofErr w:type="spellStart"/>
             <w:r>
@@ -1185,7 +1166,6 @@
                 <w:color w:val="000000"/>
                 <w:sz w:val="20"/>
               </w:rPr>
-              <w:t>Deff</w:t>
             </w:r>
             <w:proofErr w:type="spellEnd"/>
             <w:r>
@@ -1193,14 +1173,12 @@
                 <w:color w:val="000000"/>
                 <w:sz w:val="20"/>
               </w:rPr>
-              <w:t>=</w:t>
             </w:r>
             <w:r>
               <w:rPr>
                 <w:color w:val="000000"/>
                 <w:sz w:val="20"/>
               </w:rPr>
-              <w:t xml:space="preserve">D increased the </w:t>
             </w:r>
             <w:proofErr w:type="gramStart"/>
             <w:r>
@@ -1208,7 +1186,6 @@
                 <w:color w:val="000000"/>
                 <w:sz w:val="20"/>
               </w:rPr>
-              <w:t>672 h</w:t>
             </w:r>
             <w:proofErr w:type="gramEnd"/>
             <w:r>
@@ -1216,7 +1193,6 @@
                 <w:color w:val="000000"/>
                 <w:sz w:val="20"/>
               </w:rPr>
-              <w:t xml:space="preserve"> mass loss from 0.333% to 0.744%, while </w:t>
             </w:r>
             <w:proofErr w:type="spellStart"/>
             <w:r>
@@ -1224,7 +1200,6 @@
                 <w:color w:val="000000"/>
                 <w:sz w:val="20"/>
               </w:rPr>
-              <w:t>kf</w:t>
             </w:r>
             <w:proofErr w:type="spellEnd"/>
             <w:r>
@@ -1232,7 +1207,6 @@
                 <w:color w:val="000000"/>
                 <w:sz w:val="20"/>
               </w:rPr>
-              <w:t>=0 produced a similar value of 0.730%.</w:t>
             </w:r>
           </w:p>
         </w:tc>
@@ -1291,7 +1265,7 @@
                 <w:color w:val="000000"/>
                 <w:sz w:val="20"/>
               </w:rPr>
-              <w:t>“Film coverage” has been replaced with corrosion-product saturation, F/Fmax where F is the local corrosion-product concentration and Fmax=4.2045×10−3 g mm−3. The figure labels, caption, and Methods have been revised to define the quantity and specify how it is spatially evaluated.</w:t>
+              <w:t>“Film coverage” replaced by corrosion-product saturation F/F_max (F_max = 4.2045×10⁻³ g mm⁻³). Labels, caption and Methods updated.</w:t>
             </w:r>
           </w:p>
         </w:tc>
@@ -1486,7 +1460,7 @@
                 <w:color w:val="000000"/>
                 <w:sz w:val="20"/>
               </w:rPr>
-              <w:t xml:space="preserve">The model does not explicitly include the </w:t>
+              <w:t>The 48 h refresh is not modelled and no convection is assumed (u = 0). O₂ is resupplied at the air interface; Zn²⁺ is not reset. A fixed boundary O₂ raised 672 h mass loss ~30%. Clarified in Methods and Discussion.</w:t>
             </w:r>
             <w:proofErr w:type="gramStart"/>
             <w:r>
@@ -1494,7 +1468,6 @@
                 <w:color w:val="000000"/>
                 <w:sz w:val="20"/>
               </w:rPr>
-              <w:t>48 h</w:t>
             </w:r>
             <w:proofErr w:type="gramEnd"/>
             <w:r>
@@ -1502,35 +1475,30 @@
                 <w:color w:val="000000"/>
                 <w:sz w:val="20"/>
               </w:rPr>
-              <w:t xml:space="preserve"> medium renewal</w:t>
             </w:r>
             <w:r>
               <w:rPr>
                 <w:color w:val="000000"/>
                 <w:sz w:val="20"/>
               </w:rPr>
-              <w:t>,</w:t>
             </w:r>
             <w:r>
               <w:rPr>
                 <w:color w:val="000000"/>
                 <w:sz w:val="20"/>
               </w:rPr>
-              <w:t xml:space="preserve"> </w:t>
             </w:r>
             <w:r>
               <w:rPr>
                 <w:color w:val="000000"/>
                 <w:sz w:val="20"/>
               </w:rPr>
-              <w:t>and experiments are static; therefore, no natural convection is assumed</w:t>
             </w:r>
             <w:r>
               <w:rPr>
                 <w:color w:val="000000"/>
                 <w:sz w:val="20"/>
               </w:rPr>
-              <w:t xml:space="preserve"> (u=0). Instead, oxygen is continuously replenished at the electrolyte–air interface, while Zn²⁺ accumulation is not reset. A fixed boundary oxygen concentration increased the predicted 672 h mass loss by approximately 30% and eliminated the domain-size dependence. These assumptions and their implications for the Zn²⁺ comparison in Figure 5e have now been clarified in the Methods and Discussion.</w:t>
             </w:r>
           </w:p>
         </w:tc>
@@ -1589,7 +1557,7 @@
                 <w:color w:val="000000"/>
                 <w:sz w:val="20"/>
               </w:rPr>
-              <w:t>The disc and stent were simulated within the same 30 × 30 × 30 mm electrolyte domain under identical boundary conditions. The “three times larger” statement referred to the minimum domain-size criterion, not geometry-specific domains. Therefore, the difference in transition time, approximately 40 h for the disc and 100 h for the stent, is not caused by different oxygen diffusion paths. The Methods have been clarified accordingly, while the Results now acknowledge that absolute transition times remain dependent on the domain and oxygen boundary condition.</w:t>
+              <w:t>Disc and stent use the same 30 × 30 × 30 mm domain and boundary conditions. The “3×” refers to the minimum domain-size criterion. The 40 h vs 100 h transition is therefore not a domain effect. Methods clarified.</w:t>
             </w:r>
           </w:p>
         </w:tc>
@@ -1662,7 +1630,7 @@
                 <w:color w:val="000000"/>
                 <w:sz w:val="20"/>
               </w:rPr>
-              <w:t>C_O₂=3.5 mg L−1 was adopted from physiological literature but is lower than air-saturated saline at 37 °C. Because the ORR-limited rate depends on kORR.C_O₂, the fitted kORR​ should be interpreted as an effective parameter that may compensate for this oxygen-concentration mismatch. This limitation affects the absolute degradation rates and transferability between in vitro and physiological conditions, but not the relative geometry comparison because both geometries use the same C_O₂.</w:t>
+              <w:t>3.5 mg L⁻¹ is below air-saturated saline, so k_ORR is an effective parameter that may absorb this. It affects absolute rates but not the disc-vs-stent comparison (same C_O₂).</w:t>
             </w:r>
             <w:proofErr w:type="spellStart"/>
             <w:proofErr w:type="spellEnd"/>
@@ -1723,7 +1691,7 @@
                 <w:color w:val="000000"/>
                 <w:sz w:val="20"/>
               </w:rPr>
-              <w:t>The vessel geometry and liquid height are now specified. Domain-size and oxygen-resupply sensitivity tests have been added, and the choice of C_O₂ is justified separately for the in vitro and physiological simulations.</w:t>
+              <w:t>Vessel geometry and liquid height now specified. Domain-size and O₂-resupply tests added. C_O₂ justified separately for in vitro and physiological cases.</w:t>
             </w:r>
           </w:p>
         </w:tc>
@@ -1881,7 +1849,7 @@
                 <w:color w:val="000000"/>
                 <w:sz w:val="20"/>
               </w:rPr>
-              <w:t>The calibration (r-SBF, Tris-buffered, 14 days) and validation (HBSS, 28 days) media differ chemically, which contributes to the difference in RMSE. The calibration data also show rapid mass loss towards the end of the 336 h period. The authors attribute this to localized corrosion, but cleaning inaccuracies and complex corrosion-product formation may contribute as well. The model does not represent these effects, and this is acknowledged as a limitation.</w:t>
+              <w:t>The media differ (r-SBF, Tris-buffered vs HBSS), which contributes to the RMSE difference. The calibration data also show rapid late mass loss, attributed to localized corrosion but possibly cleaning error or complex films. The model does not capture this (stated as a limitation).</w:t>
             </w:r>
           </w:p>
         </w:tc>
@@ -1961,7 +1929,7 @@
                 <w:color w:val="000000"/>
                 <w:sz w:val="20"/>
               </w:rPr>
-              <w:t>The in vivo timescale cannot justify a ZnO-only representation for the in vitro simulations, as additional corrosion products form within hours to days. The in vivo justification has therefore been removed, and the model is now described as a homogenized ZnO-based representation that does not explicitly resolve phosphate-, carbonate-, calcium-, or chloride-containing phases. This has been added to limitations</w:t>
+              <w:t>The in vivo justification is removed. The model is now described as a homogenized ZnO-based representation that does not resolve phosphate, carbonate, calcium or chloride phases. Added to Limitations.</w:t>
             </w:r>
             <w:proofErr w:type="spellStart"/>
             <w:proofErr w:type="spellEnd"/>
@@ -2024,7 +1992,7 @@
                 <w:color w:val="000000"/>
                 <w:sz w:val="20"/>
               </w:rPr>
-              <w:t>With the final calibration the two errors are comparable: the calibration RMSE is 0.0173% (Fig. 3b, Table 2) and the validation RMSE is 0.0159%, so the validation error is not unusually low. The earlier gap (0.042% vs 0.0159%) arose from an earlier calibration that also scored non-mass-loss targets. The remaining small difference is expected. The calibration data (Liu et al.) were measured in r-SBF, which has more complex chemistry (extra ions, Tris buffer, more precipitation), whereas the validation data were measured in Ca/Mg-free HBSS, which is simpler and closer to the single effective ZnO phase assumed by the model. The two RMSE values are also not directly comparable, because the validation error is small relative to the experimental scatter (SD = 0.115% at 28 days, n = 3), so the validation cannot discriminate between parameter sets that differ by less than this scatter.</w:t>
+              <w:t>The errors are now comparable: calibration RMSE 0.0173%, validation 0.0159%. The remaining difference is expected: r-SBF has more complex chemistry (Tris buffer, precipitation), while HBSS is simpler and closer to the single ZnO phase in the model. Both are small relative to the experimental scatter (SD 0.115%).</w:t>
             </w:r>
           </w:p>
         </w:tc>
@@ -2097,7 +2065,7 @@
                 <w:color w:val="000000"/>
                 <w:sz w:val="20"/>
               </w:rPr>
-              <w:t>A validation table has been added to the SI (Table S11) with the experimental mean ± SD (n = 3), simulated value, error and error/SD at each time. The validation RMSE of 0.0159% is 8.6% of the mean (5.1% of the 28-day value), and all simulated points lie within 0.35 SD. The calibration RMSE of 0.042% is about 24% of the mean literature value. The fit lies within the experimental scatter, so the validation cannot discriminate between models that differ by less than this scatter.</w:t>
+              <w:t>Table S11 added (mean ± SD, simulated value, error, error/SD). Validation RMSE = 0.0159% (8.6% of the mean); all points within 0.35 SD. The fit lies within experimental scatter, so validation cannot discriminate models differing by less than this.</w:t>
             </w:r>
           </w:p>
         </w:tc>
@@ -2156,7 +2124,7 @@
                 <w:color w:val="000000"/>
                 <w:sz w:val="20"/>
               </w:rPr>
-              <w:t>The first measurement is at 24 h, so the experiments do not constrain the reaction-to-diffusion transition, which is a model prediction. The simulations resolve this period (Δt = 0.25 h, saved hourly), so the Damköhler number and corrosion rate (Fig. 5b) are resolved from the first hours. The predicted transition times (about 40 h for the disc, about 100 h for the stent) are therefore model predictions that are not validated at earlier times. Measurements before 24 h are needed to test them and are left for future work.</w:t>
+              <w:t>The first measurement is at 24 h, so the transition (~40 h disc, ~100 h stent) is a model prediction not validated by data. Measurements before 24 h are future work.</w:t>
             </w:r>
             <w:proofErr w:type="gramStart"/>
             <w:proofErr w:type="gramEnd"/>
@@ -2219,7 +2187,7 @@
                 <w:color w:val="000000"/>
                 <w:sz w:val="20"/>
               </w:rPr>
-              <w:t>The 14- and 28-day masses (3.03 ± 0.74 and 3.67 ± 1.33 mg, n = 3; p ≈ 0.5) are not statistically distinguishable, so the later change lies within the experimental scatter. The manuscript does not claim a plateau: it describes a high initial mass loss (about 67% of the 28-day loss in the first week) followed by deceleration.</w:t>
+              <w:t>14 d and 28 d masses (3.03 ± 0.74 and 3.67 ± 1.33 mg; p ≈ 0.5) are not distinguishable. No plateau is claimed: ~67% of the 28-day loss occurs in week 1, then deceleration.</w:t>
             </w:r>
           </w:p>
         </w:tc>
@@ -2292,7 +2260,7 @@
                 <w:color w:val="000000"/>
                 <w:sz w:val="20"/>
               </w:rPr>
-              <w:t>Pearson r has been removed from the Zn²⁺ and pH comparison, since a correlation coefficient is not meaningful for two monotonic saturating curves. Errors at 336 h are reported instead (Zn²⁺ 44%, pH 2.8%, i.e. 0.21 pH units). The Zn²⁺ and pH comparisons are interpreted qualitatively: the model has no buffer, whereas the literature medium (r-SBF) is Tris-buffered and forms further precipitates, which limits the late-stage rise of both quantities (as stated in the Results).</w:t>
+              <w:t>Pearson r removed. Errors at 336 h reported instead (Zn²⁺ 44%, pH 2.8%, 0.21 pH units). The comparison is qualitative: the model has no buffer, whereas r-SBF is Tris-buffered.</w:t>
             </w:r>
             <w:proofErr w:type="gramStart"/>
             <w:proofErr w:type="gramEnd"/>
@@ -2452,7 +2420,7 @@
                 <w:color w:val="808080"/>
                 <w:sz w:val="20"/>
               </w:rPr>
-              <w:t>The results reported in Fig. 3b, Table 2 and Table S10 are those of the final BO run. The final BO was rerun with all three phases scored on mass loss only (two independent repeats, 28 evaluations each: 12-point Latin hypercube, 8 expected-improvement and 8 local points), so the earlier 0.046% / 0.042% comparison no longer applies (Fig. 3b, Table S10). The best RMSE is 0.0173% (repeat 1, iteration 25, local phase) and 0.0178% (repeat 2, iteration 20, EI phase). Neither optimum is a Latin-hypercube point: the best Phase 1 values are 0.0192% (repeat 1) and 0.0240% (repeat 2), so the guided phases improve RMSE by 10% and 26%. The flat landscape is a result, not a convergence failure. All points within 1.5× the best RMSE (25 of 56) have k_ORR confined to 0.15–0.19, while k_f spans 2.2–96 and k_d 0.6–93. Mass loss therefore constrains k_ORR but not k_f or k_d individually (Results, Section 3.3). The two repeats agree on k_ORR (0.161 vs 0.156), and their best RMSEs differ by 3%, far below the experimental scatter (SD = 0.115% at 28 days). Selecting the repeat 1 optimum for Table 2 is therefore immaterial for the predictions.</w:t>
+              <w:t>Final BO: two repeats, 28 evaluations each, scored on mass loss only. Best RMSE 0.0173% (repeat 1) and 0.0178% (repeat 2), neither from the initial Latin-hypercube points. The flat landscape is a result: k_ORR is constrained (0.15–0.19) while k_f and k_d are not (2.2–96; 0.6–93). The repeats agree on k_ORR (0.161 vs 0.156), so the choice of optimum does not change predictions.</w:t>
             </w:r>
           </w:p>
         </w:tc>
@@ -2519,7 +2487,7 @@
                 <w:color w:val="000000"/>
                 <w:sz w:val="20"/>
               </w:rPr>
-              <w:t>k_f is the least influential of the three calibrated parameters (Fig. 3a), consistent with its bounded effect on mass loss (see A2.2). The sensitivity analysis (Fig. 3a) and the optimization (Fig. 3b; parameter trajectories in Supplementary Fig. 6b) already characterize the parameter behavior, so a separate profile likelihood or posterior is not needed. Among the 25 evaluations within 1.5× the best RMSE (both repeats), k_ORR is tightly constrained (0.15–0.19), whereas k_f (2.2–96) and k_d (0.6–93) span more than one decade each. The Spearman rank correlations (log10 values) are weak between k_f and k_d (0.11) and moderate between k_d and k_ORR (−0.50), so k_f and k_d are unconstrained rather than degenerate through their ratio. Only k_ORR is therefore reported as identified; k_f and k_d are treated as effective parameters whose individual values are not interpreted. The predictions are insensitive to this, because all near-optimal points reproduce the 0–336 h mass loss.</w:t>
+              <w:t>Sensitivity analysis (Fig. 3a) and optimization (Fig. 3b, Supplementary Fig. 6b) already show parameter behavior, so a separate profile likelihood is not needed. Near-optimal fits constrain k_ORR (0.15–0.19) but not k_f (2.2–96) or k_d (0.6–93). Only k_ORR is reported as identified.</w:t>
             </w:r>
             <w:proofErr w:type="spellStart"/>
             <w:proofErr w:type="spellEnd"/>
@@ -2600,7 +2568,7 @@
                 <w:color w:val="808080"/>
                 <w:sz w:val="20"/>
               </w:rPr>
-              <w:t>The GSA targeted the parameters that are uncertain and enter the calibration (kinetic constants, O₂ concentration and diffusivities; ranges in Table S5). ε and τ were fixed because they are not readily available from the literature or experiments, so literature-based estimates were used. F_max was not an independent parameter: it was calculated from the Langmuir saturation formulation given in the manuscript (F_max = ρ_film(1 − ε)). [Zn]_sat was taken from the literature, with the reference listed in the manuscript. The role of the corrosion-product mechanism was assessed separately: removing corrosion-product formation entirely raises the 672 h mass loss from 0.33% to 0.74% (A2.2), and the k_f and k_d sweeps (Fig. 4) show its effect on mass loss, saturation and interfacial O₂. Because ε and τ are fixed estimates, the absolute corrosion-product transport resistance is uncertain, which is stated in the Limitations.</w:t>
+              <w:t>The GSA covered the uncertain calibration parameters (ranges in Table S5). ε and τ are literature estimates (no direct data available). F_max is calculated from the Langmuir saturation formulation in the manuscript. [Zn]_sat is from the cited literature. The corrosion-product mechanism is tested separately (ablation, A2.2; Fig. 4 sweeps).</w:t>
             </w:r>
           </w:p>
         </w:tc>
@@ -2673,7 +2641,7 @@
                 <w:color w:val="000000"/>
                 <w:sz w:val="20"/>
               </w:rPr>
-              <w:t>Oxygen-reduction-limited dissolution is a modelling premise (Eqs. 1–2), built on experimentally observed oxygen control of Zn degradation, so the Morris ranking alone does not show that oxygen controls degradation; it only shows how the model responds to O₂. The test that the model captures this behaviour is therefore not the sensitivity ranking but its agreement with data not used in calibration: the 28-day immersion data (RMSE = 0.0159%) and the stent prediction (about 6%). These results show that the oxygen-controlled formulation reproduces the measured mass loss. The model also allows a reaction-limited stage (v_n is the limiting of three velocities), so oxygen control is not forced at all times. This supports the assumption within the tested conditions but does not prove oxygen control in vivo.</w:t>
+              <w:t>Oxygen control is a model premise built on experimental observation, so the Morris ranking alone does not prove it. The test is agreement with data not used in calibration (28-day immersion, stent). The model also allows a reaction-limited stage. This supports the assumption in the tested conditions, not in vivo.</w:t>
             </w:r>
             <w:proofErr w:type="spellStart"/>
             <w:proofErr w:type="spellEnd"/>
@@ -2917,7 +2885,7 @@
                 <w:color w:val="000000"/>
                 <w:sz w:val="20"/>
               </w:rPr>
-              <w:t>The disc area from the mesh (219.9 mm²) matches the ideal 10 × 2 mm geometry (SA:V = 1.40 mm⁻¹), and the stent mesh gives 0.361 mm³ and 19.46 mm² (SA:V = 53.9 mm⁻¹), a ratio of 38.5. Scaling the 672 h disc mass loss (0.333% simulated, 0.311% measured) gives an SA:V-extrapolated stent value of 12.8% (12.0% from experiment), about twice the model’s 6.0%. The model recedes less (mean depth 1.1 µm vs 2.4 µm for the disc) because oxygen transport is restricted in the dense stent geometry. Table S4 has been corrected. The near-linear dependence of mass loss on SA:V is expected and is reported in the literature, so a similar or higher SA:V-scaled value is not evidence against the model. The model's added value is that transport control reduces the overall stent mass loss only moderately relative to this scaling (6.0% vs 12.8%) but changes where material is lost strongly: recession is concentrated on the oxygen-accessible outer surface and suppressed in the confined regions (Figs. 7–8), which SA:V scaling cannot capture.</w:t>
+              <w:t>SA:V scaling of the disc gives 12.8% for the stent, about twice the model's 6.0% (SA:V 53.9 vs 1.40). Near-linear SA:V dependence is expected and reported in the literature. The model's added value is spatial: transport control changes total mass loss moderately but strongly changes where material is lost (Figs. 7–8). Table S4 corrected.</w:t>
             </w:r>
             <w:proofErr w:type="gramStart"/>
             <w:proofErr w:type="gramEnd"/>
@@ -2984,7 +2952,7 @@
               <w:rPr>
                 <w:sz w:val="20"/>
               </w:rPr>
-              <w:t>The spatial distribution of degradation is the main added value of the model. It is shown by the individual simulations (Figs. 7 and 8), each compared with its baseline: the six-crown stent against the disc (Fig. 6) and the curved and spaced structures against the straight, widely spaced reference (Fig. 8). The baseline comparisons show that global mass loss changes only modestly, whereas the spatial distribution of recession changes strongly.</w:t>
+              <w:t>The added value is the spatial distribution, shown by the individual simulations against their baselines (stent vs disc, Fig. 6; curved/spaced vs straight, Fig. 8). Total mass loss changes modestly; spatial recession changes strongly.</w:t>
             </w:r>
             <w:r>
               <w:rPr>
@@ -3065,7 +3033,7 @@
                 <w:color w:val="000000"/>
                 <w:sz w:val="20"/>
               </w:rPr>
-              <w:t>The full representative six-crown stent geometry and computational settings are provided in Table S4 and Figure S4. The reference list now also cites the Yang et al. study, which supplied the in vivo mass-loss comparison, in addition to the review.</w:t>
+              <w:t>Stent geometry and settings are in Table S4 and Figure S4. The Yang et al. study (source of the in vivo comparison) is now also cited.</w:t>
             </w:r>
           </w:p>
         </w:tc>
@@ -3152,7 +3120,7 @@
                 <w:color w:val="000000"/>
                 <w:sz w:val="20"/>
               </w:rPr>
-              <w:t>The Abstract and Conclusions now state that the predicted one-month mass loss of approximately 6% is of the same order of magnitude as reported in vivo observations, rather than “consistent with” them. This wording accounts for unmodelled in vivo factors, including flow, protein adsorption, and differences in oxygen supply.</w:t>
+              <w:t>Abstract and Conclusions now say ~6% is of the same order of magnitude as in vivo observations (flow, proteins and O₂ supply are not modelled).</w:t>
             </w:r>
           </w:p>
         </w:tc>
@@ -3339,21 +3307,19 @@
                 <w:color w:val="000000"/>
                 <w:sz w:val="20"/>
               </w:rPr>
-              <w:t>Because the ORR is localized at the moving metal</w:t>
+              <w:t>The ORR branch gives the reaction-supported rate; the diffusion branch limits recession to the available O₂ flux in the discrete field. The min() is a numerical mass-supply safeguard, not two separate mechanisms.</w:t>
             </w:r>
             <w:r>
               <w:rPr>
                 <w:color w:val="000000"/>
                 <w:sz w:val="20"/>
               </w:rPr>
-              <w:t>-</w:t>
             </w:r>
             <w:r>
               <w:rPr>
                 <w:color w:val="000000"/>
                 <w:sz w:val="20"/>
               </w:rPr>
-              <w:t>electrolyte interface, the interfacial oxygen concentration and normal oxygen gradient are evaluated using probes positioned within the electrolyte. The ORR branch estimates the reaction-supported recession rate, while the diffusion branch limits recession to the oxygen flux available in the discrete concentration field. Their selection is therefore a numerical mass-supply safeguard rather than two independent physical mechanisms.</w:t>
             </w:r>
           </w:p>
         </w:tc>
@@ -3419,16 +3385,13 @@
                 <w:color w:val="000000"/>
                 <w:sz w:val="20"/>
               </w:rPr>
-              <w:lastRenderedPageBreak/>
-              <w:t>[Zn]sat​ in Eq. 14 is the interfacial Stefan-</w:t>
+              <w:t>[Zn]_sat in Eq. 14 is the interfacial Stefan-condition value, not a precipitation threshold. Eq. 11 is an effective first-order law (k_f lumps nucleation and speciation). The Zn²⁺ overprediction (57 vs ~40 mg L⁻¹) is acknowledged as a limitation.</w:t>
             </w:r>
             <w:r>
               <w:rPr>
                 <w:color w:val="000000"/>
                 <w:sz w:val="20"/>
               </w:rPr>
-              <w:lastRenderedPageBreak/>
-              <w:t xml:space="preserve">condition value, not a precipitation threshold. Equation 11 instead uses an effective first-order law in which </w:t>
             </w:r>
             <w:proofErr w:type="spellStart"/>
             <w:r>
@@ -3436,7 +3399,6 @@
                 <w:color w:val="000000"/>
                 <w:sz w:val="20"/>
               </w:rPr>
-              <w:t>kf</w:t>
             </w:r>
             <w:proofErr w:type="spellEnd"/>
             <w:r>
@@ -3444,7 +3406,6 @@
                 <w:color w:val="000000"/>
                 <w:sz w:val="20"/>
               </w:rPr>
-              <w:t>​ lumps unresolved nucleation, supersaturation, and speciation effects. This simplification, including the Zn²⁺ overprediction of 57 versus approximately 40 mg L−1, is now acknowledged as a limitation.</w:t>
             </w:r>
           </w:p>
         </w:tc>
@@ -3526,7 +3487,7 @@
                 <w:color w:val="000000"/>
                 <w:sz w:val="20"/>
               </w:rPr>
-              <w:t>The implementation is mass-based: F and F_max are in g mm⁻³ (F_max = ρ_film(1−ε)), and Cl⁻ enters the dissolution rate as a molar concentration, so k_d has units L² mol⁻² h⁻¹. The Eq. 11 text now defines F_max on this mass basis, and Table 2 and Table S5 now give k_d in L² mol⁻² h⁻¹.</w:t>
+              <w:t>F and F_max are mass-based (g mm⁻³; F_max = ρ_film(1−ε)); Cl⁻ is molar, so k_d is in L² mol⁻² h⁻¹. Eq. 11 text, Table 2 and Table S5 corrected.</w:t>
             </w:r>
             <w:proofErr w:type="spellStart"/>
             <w:proofErr w:type="spellEnd"/>
@@ -3610,7 +3571,7 @@
                 <w:color w:val="000000"/>
                 <w:sz w:val="20"/>
               </w:rPr>
-              <w:t>The C_Cl exponent in Eq. 11 is an effective (empirical) reaction order, not the stoichiometric one, since Eq. 5 is an overall reaction and the dissolution is not an elementary step. The manuscript now states this, and k_d is a calibrated effective coefficient with units L² mol⁻² h⁻¹. Cl⁻ is treated as conserved (Eq. 8 has no sink) because it is in large excess (142.3 mmol L⁻¹): the upper-bound consumption is about 6% for the disc and below 1% for the stent. ‘Catalytic’ has been replaced by ‘effectively non-consumed’.</w:t>
+              <w:t>The Cl⁻ exponent in Eq. 11 is an effective (empirical) order, since Eq. 5 is an overall reaction. Cl⁻ is in large excess (142.3 mmol L⁻¹; consumption ≤6% disc, &lt;1% stent), so it is “effectively non-consumed” (replaces “catalytic”).</w:t>
             </w:r>
             <w:proofErr w:type="spellStart"/>
             <w:proofErr w:type="spellEnd"/>
@@ -3692,7 +3653,7 @@
                 <w:color w:val="000000"/>
                 <w:sz w:val="20"/>
               </w:rPr>
-              <w:t>The film is a homogenised, volumetric field on a fixed mesh that forms wherever Zn²⁺ is present on the electrolyte side of the level set and reduces the local diffusivity (Eq. 12). It is not attached to the receding interface, and the ZnO/Zn volume ratio (about 1.6) is not represented. This is stated as a limitation.</w:t>
+              <w:t>The film is a homogenised volumetric field on a fixed mesh, on the electrolyte side of the level set, and is not attached to the receding interface. The ZnO/Zn volume ratio (~1.6) is not represented. Stated as a limitation.</w:t>
             </w:r>
             <w:proofErr w:type="spellStart"/>
             <w:proofErr w:type="spellEnd"/>
@@ -3786,7 +3747,7 @@
                 <w:color w:val="000000"/>
                 <w:sz w:val="20"/>
               </w:rPr>
-              <w:t>δ_Γ is a sharp surface integral over the zero level set of the P1 signed-distance function (FreeFEM int2d with the levelset option), with no smoothing parameter. A smoothed delta (width equal to the minimum mesh size) is used only in post-processing averages. This is stated in the Methods.</w:t>
+              <w:t>δ_Γ is a sharp surface integral over the zero level set (FreeFEM int2d, levelset option) with no smoothing. A smoothed delta (width = minimum mesh size) is used only in post-processing. Stated in Methods.</w:t>
             </w:r>
             <w:proofErr w:type="gramStart"/>
             <w:proofErr w:type="gramEnd"/>
@@ -3991,7 +3952,7 @@
                 <w:color w:val="000000"/>
                 <w:sz w:val="20"/>
               </w:rPr>
-              <w:t>‘Low-dimensional’ and ‘three-parameter’ have been removed from the Abstract, since parameter count and mesh size are separate. The 18.9-million-element mesh is used only for the final validation run (68.9 h on 50 cores). Calibration used a coarse mesh (37,399 tetrahedra, about 20 min per run on 4 cores), corrected to the fine mesh with a linear bias correction (r = 0.9986; Methods 2.4). An axisymmetric model would be cheaper for calibration, but the 3D formulation was kept so that calibration and the stent prediction use the same model.</w:t>
+              <w:t>“Low-dimensional” and “three-parameter” removed from the Abstract. The 18.9M-element mesh is used only for validation (68.9 h, 50 cores). Calibration used a coarse mesh (37,399 tetrahedra, ~20 min per run) with a bias correction to the fine mesh. 3D was kept so calibration and stent use the same model.</w:t>
             </w:r>
           </w:p>
         </w:tc>
@@ -4065,7 +4026,7 @@
                 <w:color w:val="000000"/>
                 <w:sz w:val="20"/>
               </w:rPr>
-              <w:t>The stent interface mesh size is 5 µm (minimum element size 0.005 mm, Table S4), comparable to the 3–8 µm local recession (about one element). This does not make the results noise, for three reasons. First, the interface is not a mesh feature: it is the zero contour of the P1 signed-distance function, which is located by interpolation inside elements, so recession smaller than one element is still represented in the interface position. Second, the quantities used for the conclusions are integrated: mass loss and mean penetration are mesh-converged (&lt;1%, Section S2), and the geometry effects rest on outer/inner differences of several µm, which exceed the element size. Third, the sub-element roughness in the local profiles of Fig. 7a is at the discretisation scale and is not interpreted physically.</w:t>
+              <w:t>The stent interface mesh is 5 µm, about one element per local recession (3–8 µm). The interface is the zero contour of a P1 function located within elements, conclusions use integrated quantities (mass loss, mean penetration, mesh-converged &lt;1%, Section S2) and outer/inner differences of several µm. Local jaggedness is at the mesh scale and is not interpreted.</w:t>
             </w:r>
           </w:p>
         </w:tc>
@@ -4279,7 +4240,7 @@
                 <w:color w:val="000000"/>
                 <w:sz w:val="20"/>
               </w:rPr>
-              <w:t>The original sweeps used k_f = 100, k_d = 30 and k_ORR = 1.0, giving 0.39% at 168 h against about 0.19% in Fig. 5a. Fig. 4 has been recomputed around k_f = 35, k_d = 27 and k_ORR = 0.5 (middle curves); the baseline now gives 0.20% at 168 h, matching Fig. 5a. Each parameter is varied above and below this baseline (k_f = 5–150, k_d = 5–120, k_ORR = 0.1–2.5) with the others held fixed.</w:t>
+              <w:t>Original sweeps (k_f 100, k_d 30, k_ORR 1.0) gave 0.39% at 168 h vs ~0.19% in Fig. 5a. Fig. 4 is recomputed around k_f = 35, k_d = 27, k_ORR = 0.5: baseline 0.20% at 168 h, matching Fig. 5a.</w:t>
             </w:r>
             <w:proofErr w:type="spellStart"/>
             <w:proofErr w:type="spellEnd"/>
@@ -4448,7 +4409,7 @@
                 <w:color w:val="000000"/>
                 <w:sz w:val="20"/>
               </w:rPr>
-              <w:t>The text ranges were wrong. From the Fig. 8c data, mean penetration depth is 2.4–2.7 µm for the curved wires and 2.1–2.4 µm for the spacing configurations. The Results now give these ranges.</w:t>
+              <w:t>Text ranges were wrong. From Fig. 8c: curved wires 2.4–2.7 µm, spacing configurations 2.1–2.4 µm. Results corrected.</w:t>
             </w:r>
           </w:p>
         </w:tc>
@@ -4508,7 +4469,7 @@
                 <w:color w:val="000000"/>
                 <w:sz w:val="20"/>
               </w:rPr>
-              <w:t>Error bars in Fig. 8c are ±1 SD of the local penetration depth around the cross-section perimeter. The caption now says so.</w:t>
+              <w:t>Error bars in Fig. 8c are ±1 SD of local penetration depth around the perimeter. Caption updated.</w:t>
             </w:r>
           </w:p>
         </w:tc>
@@ -4574,7 +4535,7 @@
                 <w:color w:val="000000"/>
                 <w:sz w:val="20"/>
               </w:rPr>
-              <w:t>The two ratios are taken from two different places: 13.2× is the outer/inner depth of the isolated 150° arc (Fig. 8d), and 1.8× is the outer/inner depth at the stent crown (Fig. 7d; 8.55 and 4.76 µm). The 13.2× has a very small denominator (0.28 µm, below the interface mesh size), so it is poorly constrained, and the absolute differences are similar (3.4 µm for the arc, 3.8 µm for the crown). The ratios also differ in geometry: the isolated 150° arc (radius 0.63 mm) confines its inner side more strongly than the crown within the stent.</w:t>
+              <w:t>The ratios come from different places: 13.2× is the isolated 150° arc (Fig. 8d) and 1.8× the stent crown (Fig. 7d; 8.55/4.76 µm). The 13.2× has a tiny denominator (0.28 µm, below the mesh size); the absolute differences are similar (3.4 vs 3.8 µm). The isolated arc (radius 0.63 mm) also confines its inner side more.</w:t>
             </w:r>
             <w:proofErr w:type="gramStart"/>
             <w:proofErr w:type="gramEnd"/>
@@ -4735,7 +4696,7 @@
                 <w:color w:val="808080"/>
                 <w:sz w:val="20"/>
               </w:rPr>
-              <w:t>The balance resolution was 0.1 mg. Blank cleaning controls were not performed; however, all samples were cleaned using the same protocol (chromic acid at room temperature for 10 min), minimizing systematic bias between groups. The 0.1 mg resolution is small relative to the measured mass losses, and the experimental scatter (SD = 0.115% at 28 days, n = 3) is much larger than the balance resolution. The absence of blank controls means any cleaning-induced loss of bare Zn is not quantified separately.</w:t>
+              <w:t>Balance resolution 0.1 mg. No blank cleaning controls were run, but all samples followed the same cleaning protocol (chromic acid, room temperature, 10 min), limiting bias between groups. The scatter (SD 0.115%) is far above the resolution.</w:t>
             </w:r>
           </w:p>
         </w:tc>
@@ -4794,7 +4755,7 @@
                 <w:color w:val="808080"/>
                 <w:sz w:val="20"/>
               </w:rPr>
-              <w:t>The corrosion products were removed with chromic acid at room temperature for 10 min. The discs were immersed lying flat (horizontal orientation). No CO₂ incubator was used; the immersion was static at 37 °C. The HBSS pH was 7.4 and is now stated in the Methods.</w:t>
+              <w:t>Chromic acid: room temperature, 10 min. Discs immersed flat. No CO₂ incubator (static, 37 °C). HBSS pH 7.4 (now in Methods).</w:t>
             </w:r>
           </w:p>
         </w:tc>
@@ -4853,7 +4814,7 @@
                 <w:color w:val="000000"/>
                 <w:sz w:val="20"/>
               </w:rPr>
-              <w:t>ICP measurement of Zn²⁺ in the refreshed solution was not performed in this study. This is now stated in the Limitations as a needed independent check.</w:t>
+              <w:t>Zn²⁺ was not measured by ICP in this study. Stated in Limitations.</w:t>
             </w:r>
           </w:p>
         </w:tc>
@@ -4912,7 +4873,7 @@
                 <w:color w:val="000000"/>
                 <w:sz w:val="20"/>
               </w:rPr>
-              <w:t>A direct mechanism test (film thickness from FIB or SEM cross-sections, or a stirred or different-O₂ experiment) was not performed in this study. This is now stated in the Limitations.</w:t>
+              <w:t>No direct mechanism test (FIB/SEM film thickness, stirred or different-O₂ experiment) was performed. Stated in Limitations.</w:t>
             </w:r>
           </w:p>
         </w:tc>
@@ -5068,7 +5029,7 @@
               <w:rPr>
                 <w:sz w:val="20"/>
               </w:rPr>
-              <w:t>This comparison is clearly presented in the Introduction. Given the manuscript’s word limit, a more detailed discussion is not feasible.</w:t>
+              <w:t>The comparison is in the Introduction. A longer discussion is not feasible within the word limit.</w:t>
             </w:r>
           </w:p>
         </w:tc>
@@ -5249,7 +5210,7 @@
                 <w:color w:val="000000"/>
                 <w:sz w:val="20"/>
               </w:rPr>
-              <w:t>The Code Availability statement has been removed, and a Data Availability Statement (Zenodo repository, DOI 10.5281/zenodo.23053517) is now included in the manuscript.</w:t>
+              <w:t>Code Availability statement removed. Data Availability Statement added (Zenodo, DOI 10.5281/zenodo.23053517).</w:t>
             </w:r>
             <w:proofErr w:type="spellStart"/>
             <w:proofErr w:type="spellEnd"/>
@@ -5424,7 +5385,7 @@
                 <w:color w:val="000000"/>
                 <w:sz w:val="20"/>
               </w:rPr>
-              <w:t>The Results state that calibration is computationally tractable (three parameters, coarse mesh, about 2 h per run; Table S4), and the Discussion describes the high-fidelity simulations as computationally demanding.</w:t>
+              <w:t>Results: calibration is tractable (coarse mesh, ~2 h per run; Table S4). Discussion: the high-fidelity simulations are demanding.</w:t>
             </w:r>
           </w:p>
         </w:tc>
@@ -5484,7 +5445,7 @@
                 <w:color w:val="000000"/>
                 <w:sz w:val="20"/>
               </w:rPr>
-              <w:t>Section headings are numbered automatically in the submission file, and ‘Section 2.3’ is Numerical Implementation and Simulation Setup. The numbers may have been lost in the reviewer’s version.</w:t>
+              <w:t>Headings are numbered in the submission file (Section 2.3 = Numerical Implementation and Simulation Setup); numbers were lost in the reviewer's copy.</w:t>
             </w:r>
           </w:p>
         </w:tc>
@@ -5572,7 +5533,7 @@
                 <w:color w:val="000000"/>
                 <w:sz w:val="20"/>
               </w:rPr>
-              <w:t>‘a R²’ is now ‘an R²’ and ‘shown in (Figure 4g–i)’ is now ‘shown in Figure 4g–i’. The capitalised ‘Literature’ appears only in a reference title, so it is unchanged.</w:t>
+              <w:t>“a R²” → “an R²”; “shown in (Figure 4g–i)” → “shown in Figure 4g–i”. “Literature” is capitalised only in a reference title, so unchanged.</w:t>
             </w:r>
             <w:proofErr w:type="spellStart"/>
             <w:proofErr w:type="spellEnd"/>
@@ -5751,7 +5712,7 @@
               <w:rPr>
                 <w:sz w:val="20"/>
               </w:rPr>
-              <w:t>This has been published with the same different names. The difference comes from the capitalization of the B. Since it will not be updated</w:t>
+              <w:t>Published with these spellings; the difference is only the capital B, so it will not be changed.</w:t>
             </w:r>
           </w:p>
         </w:tc>
@@ -5814,7 +5775,7 @@
               <w:rPr>
                 <w:sz w:val="20"/>
               </w:rPr>
-              <w:t>Updated both references to the latest edition</w:t>
+              <w:t>Both references updated to the latest edition.</w:t>
             </w:r>
           </w:p>
         </w:tc>
@@ -5877,7 +5838,7 @@
               <w:rPr>
                 <w:sz w:val="20"/>
               </w:rPr>
-              <w:t>Updated</w:t>
+              <w:t>Updated.</w:t>
             </w:r>
           </w:p>
         </w:tc>
@@ -5940,7 +5901,7 @@
               <w:rPr>
                 <w:sz w:val="20"/>
               </w:rPr>
-              <w:t>Rechecked</w:t>
+              <w:t>Rechecked.</w:t>
             </w:r>
           </w:p>
         </w:tc>
@@ -6113,7 +6074,7 @@
                 <w:color w:val="000000"/>
                 <w:sz w:val="20"/>
               </w:rPr>
-              <w:t>The Damköhler number is defined in the SI (Eq. S3, Section S1) as the ratio of oxygen consumption to oxygen transport. Da &lt; 1 indicates reaction control and Da &gt; 1 diffusion control; the transition is at Da = 1 (about 40 h for the disc). The main text cites Eq. S3 and Section S1.</w:t>
+              <w:t>Da (ratio of O₂ consumption to O₂ transport) is defined in the SI (Eq. S3, Section S1). Da &lt; 1 is reaction control, Da &gt; 1 diffusion control; transition at Da = 1 (~40 h, disc). The main text cites Eq. S3 and Section S1.</w:t>
             </w:r>
             <w:proofErr w:type="spellStart"/>
             <w:proofErr w:type="spellEnd"/>

</xml_diff>